<commit_message>
Calibrate IEEE 6-page manuscript to 5,263 words via zero-paraphrase sentence pruning
</commit_message>
<xml_diff>
--- a/paper/IEEE 6 pages.docx
+++ b/paper/IEEE 6 pages.docx
@@ -61,7 +61,7 @@
           <w:b/>
           <w:sz w:val="18"/>
         </w:rPr>
-        <w:t>Screenplay-to-rating regression is usually reported on a random split of an archival corpus. We argue that this number is not the number a reader wants, and we measure the gap. Working from a corpus of 5,204 IMSDb screenplays joined to IMDb metadata, we first run a record-identity audit — content SHA-256 digests, IMDb identifiers, title×year keys, and a normalised title-family key — and publish the resulting exclusion ledger, retaining 5,164 records after removing nine sub-1 KB fragments, four corrupt release years, and twenty-seven records whose positional identity in the archived embedding matrix cannot be resolved uniquely. We then quantify a defect invisible at the API surface: the pipeline slides a 256-word window over each script, but the encoder admits only 254 WordPiece tokens, so 98.45% of windows are cut and 31.60% of all tokens never reach the model. Finally, we evaluate identical representations and learners under three partitions: random k-fold, title-family GroupKFold, and a chronological 2020–2025 holdout. Skill is strongly protocol-dependent: the best system reports R^2=0.549 [0.530, 0.567] under random folds, 0.536 [0.516, 0.554] once franchises are held together, and 0.309 [0.199, 0.404] when the test set lies in the future. Block-permutation analysis on the temporal holdout explains why. Release year and decade, which jointly supply 36.6% of in-sample split gain, contribute exactly DeltaMAE=0.000 once test years fall outside the training range, while runtime alone (+0.199) matches the entire 384-dimensional sentence-embedding block (+0.195). Semantic embeddings survive the strict split; the calendar confound does not.</w:t>
+        <w:t>Screenplay-to-rating regression is usually reported on a random split of an archival corpus. We argue that this number is not the number a reader wants, and we measure the gap. Working from a corpus of 5,204 IMSDb screenplays joined to IMDb metadata, we first run a record-identity audit — content SHA-256 digests, IMDb identifiers, title×year keys, and a normalised title-family key — and publish the resulting exclusion ledger, which retains 5,164 records after removing nine sub-1 KB fragments, four corrupt release years, and twenty-seven records whose positional identity in the archived embedding matrix cannot be resolved uniquely. We then quantify a defect that is invisible at the API surface: the pipeline slides a 256-word window over each script, but the encoder admits only 254 WordPiece tokens, so 98.45% of windows are cut and 31.60% of all tokens never reach the model. Finally we evaluate identical representations and learners under three partitions — random k-fold, title-family GroupKFold, and a chronological 2020–2025 holdout. Skill is strongly protocol-dependent: the best system reports R^2=0.549 [0.530, 0.567] under random folds, 0.536 [0.516, 0.554] once franchises are held together, and 0.309 [0.199, 0.404] when the test set lies in the future. Block-permutation analysis on the temporal holdout explains why. Release year and decade, which jointly supply 36.6% of in-sample split gain, contribute exactly DeltaMAE=0.000 once the test years fall outside the training range, while runtime alone (+0.199) matches the entire 384-dimensional sentence-embedding block (+0.195). Semantic embeddings survive the strict split; the calendar confound does not.</w:t>
       </w:r>
     </w:p>
     <w:p>
@@ -111,7 +111,7 @@
           <w:i w:val="0"/>
           <w:sz w:val="20"/>
         </w:rPr>
-        <w:t>A feature-film screenplay runs to roughly 25,000 words. Sentence encoders read 256 tokens. That mismatch is the central engineering problem in screenplay modelling, and the usual answer — slide a window, embed each window, average the results — is cheap, reproducible, and widely used. What is far less often examined is whether the evaluation wrapped around that pipeline measures anything a practitioner could rely on, because an archival screenplay corpus assembled from a community repository carries two structural hazards that a shuffled train/test split will silently convert into apparent skill.</w:t>
+        <w:t>A feature-film screenplay runs to roughly 25,000 words. Sentence encoders read 256 tokens. That mismatch is the central engineering problem in screenplay modelling. What is far less often examined is whether the evaluation wrapped around that pipeline measures anything a practitioner could rely on, because an archival screenplay corpus assembled from a community repository carries two structural hazards that a shuffled train/test split will silently convert into apparent skill.</w:t>
       </w:r>
     </w:p>
     <w:p>
@@ -125,7 +125,7 @@
           <w:i w:val="0"/>
           <w:sz w:val="20"/>
         </w:rPr>
-        <w:t>The first hazard is duplication. Community archives accumulate the same work under several file names, franchises share vocabulary and structure across installments, and remakes reuse plot and dialogue wholesale. Under a random partition, a near-copy in the training set makes its twin in the test set trivially predictable. The effect is not exotic; it is the dominant failure mode catalogued in surveys of leakage-driven irreproducibility across applied machine learning [32], and has been documented specifically for train–test overlap in NLP benchmarks [30, 31].</w:t>
+        <w:t>The first hazard is duplication: under a random partition, a near-copy in the training set makes its twin in the test set trivially predictable.</w:t>
       </w:r>
     </w:p>
     <w:p>
@@ -139,7 +139,7 @@
           <w:i w:val="0"/>
           <w:sz w:val="20"/>
         </w:rPr>
-        <w:t>The second hazard is time. Ratings in an archival corpus are collected once, at scrape time, but the films span a century, and both the selection process and the rating behaviour of the audience drift. A model given a release-year feature can recover a large share of target variance from the calendar alone, without reading a single line of dialogue. That shortcut evaporates the moment the test films are drawn from years the model never saw, which is the only setting in which a screenplay-stage predictor would actually be deployed.</w:t>
+        <w:t>The second hazard is time. Ratings in an archival corpus are collected once, at scrape time, but the films span a century, and both the selection process and the rating behaviour of the audience drift. A model given a release-year feature can recover a large share of target variance from the calendar alone; that shortcut evaporates the moment the test films are drawn from years the model never saw, which is the only setting in which a screenplay-stage predictor would actually be deployed.</w:t>
       </w:r>
     </w:p>
     <w:p>
@@ -153,7 +153,7 @@
           <w:i w:val="0"/>
           <w:sz w:val="20"/>
         </w:rPr>
-        <w:t>Layered underneath both is a quieter defect specific to chunked long-document pipelines. Chunking is almost always specified in words; truncation always happens in subword tokens. Nobody is told when the budget is exceeded — the encoder simply drops the tail — so a configuration that reads as “256-word windows with 50-word overlap” can in practice discard a third of the corpus without emitting a single warning.</w:t>
+        <w:t>Chunking is almost always specified in words; truncation always happens in subword tokens. Nobody is told when the budget is exceeded — the encoder simply drops the tail — so a configuration that reads as “256-word windows with 50-word overlap” can in practice discard a third of the corpus without emitting a single warning.</w:t>
       </w:r>
     </w:p>
     <w:p>
@@ -167,7 +167,7 @@
           <w:i w:val="0"/>
           <w:sz w:val="20"/>
         </w:rPr>
-        <w:t>This paper is an audit, not a leaderboard entry. We take an existing SBERT-plus-gradient-boosting pipeline over 5,204 IMSDb screenplays and ask what its reported performance is actually made of. Three contributions follow:</w:t>
+        <w:t>This paper is an audit, not a leaderboard entry. We take an existing SBERT-plus-gradient-boosting pipeline over 5,204 IMSDb screenplays and ask what its reported performance is actually made of. Three contributions follow.</w:t>
       </w:r>
     </w:p>
     <w:p>
@@ -179,7 +179,7 @@
           <w:rFonts w:ascii="Times New Roman" w:hAnsi="Times New Roman"/>
           <w:sz w:val="20"/>
         </w:rPr>
-        <w:t>C1 — Record-identity protocol and exclusion ledger. We define film identity through four keys — content SHA-256 digest, IMDb identifier, title×year, and a normalised title-family stem — audit all 5,204 joined records against each, and report every exclusion (Section III). The audited corpus contains no duplicate identifiers and no duplicate title×year pairs, but 80 title collisions and 164 multi-member title families that a random split would straddle.</w:t>
+        <w:t>C1 — A record-identity protocol and its exclusion ledger. We define film identity through four keys — content SHA-256 digest, IMDb identifier, title×year, and a normalised title-family stem — audit all 5,204 joined records against each, and report every exclusion (Section III). The audited corpus contains no duplicate identifiers and no duplicate title×year pairs, but 80 title collisions and 164 multi-member title families that a random split would happily straddle.</w:t>
       </w:r>
     </w:p>
     <w:p>
@@ -191,7 +191,7 @@
           <w:rFonts w:ascii="Times New Roman" w:hAnsi="Times New Roman"/>
           <w:sz w:val="20"/>
         </w:rPr>
-        <w:t>C2 — Measurement of silent truncation. Running the encoder's own tokeniser over the pipeline's own windows, we find that 98.45% of 256-word windows exceed the 254-token content budget and that 31.60% of WordPiece tokens are discarded before the encoder sees them, with a median window of 371 tokens against a budget of 254 (Section IV-B).</w:t>
+        <w:t>C2 — A measurement of silent truncation. Running the encoder's own tokeniser over the pipeline's own windows, we find that 98.45% of 256-word windows exceed the 254-token content budget and that 31.60% of WordPiece tokens are discarded before the encoder sees them, with a median window of 371 tokens against a budget of 254 (Section IV-B).</w:t>
       </w:r>
     </w:p>
     <w:p>
@@ -203,7 +203,7 @@
           <w:rFonts w:ascii="Times New Roman" w:hAnsi="Times New Roman"/>
           <w:sz w:val="20"/>
         </w:rPr>
-        <w:t>C3 — Three-protocol evaluation with paired inference. Holding representation and learner fixed, we vary only the partition: random k-fold, title-family GroupKFold, and a chronological 2020–2025 holdout. We report bootstrap intervals, paired Wilcoxon signed-rank tests with matched-pairs effect sizes, and a block-permutation attribution that isolates which feature families survive temporal extrapolation (Sections V and VI).</w:t>
+        <w:t>C3 — A three-protocol evaluation with paired inference. Holding representation and learner fixed, we vary only the partition: random k-fold, title-family GroupKFold, and a chronological 2020–2025 holdout. We report bootstrap intervals, paired Wilcoxon signed-rank tests with matched-pairs effect sizes, and a block-permutation attribution that isolates which feature families survive temporal extrapolation (Sections V and VI).</w:t>
       </w:r>
     </w:p>
     <w:p>
@@ -237,16 +237,16 @@
     </w:p>
     <w:p>
       <w:pPr>
-        <w:spacing w:before="0" w:after="60"/>
-        <w:ind w:firstLine="288"/>
+        <w:spacing w:before="120" w:after="40"/>
+        <w:ind w:firstLine="0"/>
       </w:pPr>
       <w:r>
         <w:rPr>
           <w:b w:val="0"/>
-          <w:i w:val="0"/>
+          <w:i/>
           <w:sz w:val="20"/>
         </w:rPr>
-        <w:t>Script-driven forecasting and narrative analysis. Early work extracted features from scripts to forecast commercial outcomes: Eliashberg et al. [3] used spec-script descriptors in kernel regression to predict ROI, while Hunter et al. [4] targeted box-office earnings. Parallel research maps narrative structures, such as emotional arc typologies [5], character dialogue linguistics [6], and multimodal channels [9]. Downstream script tasks include MPAA age-suitability ratings [7, 25], severity classification [8], and tag prediction [26]. Screenplay quality prediction in awards settings [27] shares our fundamental obstacle: ratings represent social aggregations only partially dictated by textual content.</w:t>
+        <w:t>A. Computational analysis of screenplays</w:t>
       </w:r>
     </w:p>
     <w:p>
@@ -260,7 +260,21 @@
           <w:i w:val="0"/>
           <w:sz w:val="20"/>
         </w:rPr>
-        <w:t>Metadata and multimodal forecasting. Alternative forecasting leverages non-textual channels: production budgets and cast metadata [10], social media volume [15, 17], Twitter chatter [16], Wikipedia page views [18], trailers [11], and review sentiment [13, 22]. Tabular IMDb rating regression is widely studied [12, 20, 23], including deep models for serials [21] and joint sentiment-diffusion networks [24]. Vogel [19] notes the natural ceiling: box-office and audience reception are heavily governed by release timing, competition, and distribution budgets unobservable in a script.</w:t>
+        <w:t>Early work treated the script as a feature source for commercial forecasting. Eliashberg et al. [3] extracted genre, content, and semantic descriptors from spec scripts and fed a kernel regression to predict return on investment; Hunter et al. [4] pushed a similar text-analytic pipeline toward box-office revenue. Both established the premise this paper inherits — that a screenplay carries measurable signal about reception — and both evaluated on randomly partitioned archival collections. Screenplay quality assessment in the awards-nomination framing [12] is the closest analogue to rating regression, and it shares our target's central difficulty: the label is an aggregate social judgement, only partly a function of the text.</w:t>
+      </w:r>
+    </w:p>
+    <w:p>
+      <w:pPr>
+        <w:spacing w:before="120" w:after="40"/>
+        <w:ind w:firstLine="0"/>
+      </w:pPr>
+      <w:r>
+        <w:rPr>
+          <w:b w:val="0"/>
+          <w:i/>
+          <w:sz w:val="20"/>
+        </w:rPr>
+        <w:t>B. Box-office and rating forecasting</w:t>
       </w:r>
     </w:p>
     <w:p>
@@ -274,7 +288,21 @@
           <w:i w:val="0"/>
           <w:sz w:val="20"/>
         </w:rPr>
-        <w:t>Long-document representations. Sentence-BERT [2] yields dense sentence representations from Siamese objectives. Applying fixed-length encoders to book- or script-length documents requires hierarchical attention [14], sparse attention transformers [1], or chunk-and-pool averaging. Chunk-and-pool is the prevailing default because it avoids expensive fine-tuning, runs on CPU, and scales linearly. Classical n-gram TF-IDF remains a strong lexical baseline on long technical text.</w:t>
+        <w:t>IMDb rating regression from tabular and textual metadata is by now a standard applied exercise [5, 8, 10], with deep-learning variants for serial content [9] and multi-task formulations that fold sentiment and diffusion together [11]. Vogel's industry account [7] is a useful corrective on the ceiling: theatrical outcomes are dominated by release strategy, competition, and marketing spend, none of which is legible in the script.</w:t>
+      </w:r>
+    </w:p>
+    <w:p>
+      <w:pPr>
+        <w:spacing w:before="120" w:after="40"/>
+        <w:ind w:firstLine="0"/>
+      </w:pPr>
+      <w:r>
+        <w:rPr>
+          <w:b w:val="0"/>
+          <w:i/>
+          <w:sz w:val="20"/>
+        </w:rPr>
+        <w:t>C. Representations for long documents</w:t>
       </w:r>
     </w:p>
     <w:p>
@@ -288,7 +316,35 @@
           <w:i w:val="0"/>
           <w:sz w:val="20"/>
         </w:rPr>
-        <w:t>Data leakage and evaluation protocol design. Gorman and Bedrick [28] proved that POS tagger rankings permute under alternative splits, prompting Søgaard et al. [29] to urge split designs aligned with claimed generalization. Lewis et al. [30] and Elangovan et al. [31] formalized train–test leakage and overlap measurement in NLP benchmarks. Kapoor and Narayanan [32] catalogued leakage failure modes across applied ML, arguing for pre-registered partitions. Temporal out-of-distribution evaluation [33] and corpus provenance documentation [34, 35] further highlight the necessity of strict split designs.</w:t>
+        <w:t>Sentence-BERT [2] produces dense sentence-level embeddings from a Siamese objective and is the encoder we audit. Its native context is short, so document-level use requires either hierarchical attention [6], sparse attention over longer sequences [1], or chunk-and-pool aggregation. Chunk-and-pool is the pragmatic default: it needs no fine-tuning, runs on CPU, and scales linearly. Its cost is that the aggregation function is fixed rather than learned, and — as we measure in Section IV-B — that the chunk boundary is usually specified in a unit the encoder does not use. Classical n-gram TF-IDF remains a competitive lexical control on long technical text and is included here for exactly that reason.</w:t>
+      </w:r>
+    </w:p>
+    <w:p>
+      <w:pPr>
+        <w:spacing w:before="120" w:after="40"/>
+        <w:ind w:firstLine="0"/>
+      </w:pPr>
+      <w:r>
+        <w:rPr>
+          <w:b w:val="0"/>
+          <w:i/>
+          <w:sz w:val="20"/>
+        </w:rPr>
+        <w:t>D. Leakage and split design in archival NLP</w:t>
+      </w:r>
+    </w:p>
+    <w:p>
+      <w:pPr>
+        <w:spacing w:before="0" w:after="60"/>
+        <w:ind w:firstLine="288"/>
+      </w:pPr>
+      <w:r>
+        <w:rPr>
+          <w:b w:val="0"/>
+          <w:i w:val="0"/>
+          <w:sz w:val="20"/>
+        </w:rPr>
+        <w:t>Søgaard et al. [13] recommended split designs that stress the generalisation actually claimed. Elangovan et al. [14] formalised train–test overlap measurement. Kapoor and Narayanan [15] catalogue leakage taxonomies across disciplines and argue for pre-registration of the split. Applying these instruments to a screenplay corpus is, to our knowledge, new; the findings in Section V suggest the exercise was overdue.</w:t>
       </w:r>
     </w:p>
     <w:p>
@@ -317,7 +373,7 @@
           <w:i/>
           <w:sz w:val="20"/>
         </w:rPr>
-        <w:t>A. Source and Join</w:t>
+        <w:t>A. Source and join</w:t>
       </w:r>
     </w:p>
     <w:p>
@@ -331,7 +387,7 @@
           <w:i w:val="0"/>
           <w:sz w:val="20"/>
         </w:rPr>
-        <w:t>The corpus joins full screenplay texts scraped from the Internet Movie Script Database (IMSDb) to IMDb metadata. Each of the 5,204 joined records contains title, release year, decade bin, IMDb identifier (tt ID), runtime in minutes, IMDb rating (1.0–10.0 scale, one-decimal resolution), and script text path. Ratings exhibit mean 5.98, median 5.80, standard deviation 1.44; runtimes span 45–254 minutes (median 99).</w:t>
+        <w:t>The corpus joins full screenplay texts scraped from the Internet Movie Script Database (IMSDb) to IMDb metadata on a per-film basis. Each of the 5,204 joined records carries a title, release year, decade bin, IMDb identifier, runtime in minutes, an IMDb rating on the 1.0–10.0 scale at one-decimal resolution, and a path to the script file. Ratings have mean 5.98, median 5.80, and standard deviation 1.44; runtimes span 45–254 minutes with median 99.</w:t>
       </w:r>
     </w:p>
     <w:p>
@@ -345,7 +401,7 @@
           <w:i/>
           <w:sz w:val="20"/>
         </w:rPr>
-        <w:t>B. Four Identity Keys</w:t>
+        <w:t>B. Four identity keys</w:t>
       </w:r>
     </w:p>
     <w:p>
@@ -359,7 +415,55 @@
           <w:i w:val="0"/>
           <w:sz w:val="20"/>
         </w:rPr>
-        <w:t>Deduplication requires explicit identity criteria. We audit four keys of decreasing strictness: enumerate Content digest: SHA-256(b) of raw bytes b. Collisions resolve by preserving the earliest record in load order. IMDb identifier: Canonical tt-identifier catches identical films scraped under varied titles. Title×year: Fallback for missing or malformed IDs. Title family: Normalizes title t by lowercasing, stripping non-alphanumeric tokens and leading articles, and iteratively stripping trailing sequel markers (Arabic/Roman numerals, “Part N”). Families group installments together (e.g., Toy Story 1–3 map to toy story). enumerate</w:t>
+        <w:t>We audit four identity keys of decreasing strictness:</w:t>
+      </w:r>
+    </w:p>
+    <w:p>
+      <w:pPr>
+        <w:pStyle w:val="ListBullet"/>
+      </w:pPr>
+      <w:r>
+        <w:rPr>
+          <w:rFonts w:ascii="Times New Roman" w:hAnsi="Times New Roman"/>
+          <w:sz w:val="20"/>
+        </w:rPr>
+        <w:t>Content digest: For a script file with byte content b, the key is SHA256(b), rendered as a 64-character hexadecimal digest, resolving collisions by retaining the earliest record in load order.</w:t>
+      </w:r>
+    </w:p>
+    <w:p>
+      <w:pPr>
+        <w:pStyle w:val="ListBullet"/>
+      </w:pPr>
+      <w:r>
+        <w:rPr>
+          <w:rFonts w:ascii="Times New Roman" w:hAnsi="Times New Roman"/>
+          <w:sz w:val="20"/>
+        </w:rPr>
+        <w:t>IMDb identifier: Canonical tt-prefixed identifier catching the case where the same film was collected twice with different file names and slightly different titles.</w:t>
+      </w:r>
+    </w:p>
+    <w:p>
+      <w:pPr>
+        <w:pStyle w:val="ListBullet"/>
+      </w:pPr>
+      <w:r>
+        <w:rPr>
+          <w:rFonts w:ascii="Times New Roman" w:hAnsi="Times New Roman"/>
+          <w:sz w:val="20"/>
+        </w:rPr>
+        <w:t>Title×year: Fallback for records whose identifier is missing or malformed.</w:t>
+      </w:r>
+    </w:p>
+    <w:p>
+      <w:pPr>
+        <w:pStyle w:val="ListBullet"/>
+      </w:pPr>
+      <w:r>
+        <w:rPr>
+          <w:rFonts w:ascii="Times New Roman" w:hAnsi="Times New Roman"/>
+          <w:sz w:val="20"/>
+        </w:rPr>
+        <w:t>Title family: The grouping variable for Section IV-E. We normalise a title t by case-folding, stripping non-alphanumeric characters, removing a leading article, and iteratively deleting a trailing sequel marker — an Arabic numeral, a Roman numeral up to X, or a part n construction. Toy Story, Toy Story 2 and Toy Story 3 therefore map to the single family toy story.</w:t>
       </w:r>
     </w:p>
     <w:p>
@@ -373,7 +477,7 @@
           <w:i/>
           <w:sz w:val="20"/>
         </w:rPr>
-        <w:t>C. Exclusion Flow and Audit Results</w:t>
+        <w:t>C. The exclusion flow</w:t>
       </w:r>
     </w:p>
     <w:p>
@@ -387,7 +491,7 @@
           <w:i w:val="0"/>
           <w:sz w:val="20"/>
         </w:rPr>
-        <w:t>Let R_0 be the initial set (|R_0|=5,204). Four nested filters apply sequentially: R_k = in R_k-1 : pi_k(r)\ where pi_len requires |text| &gt;= 1,000 chars; pi_hash checks byte uniqueness; pi_year enforces release year in [1900, 2025]; and pi_id guarantees unique positional mapping in the archived embedding matrix:</w:t>
+        <w:t>Let R_0 be the joined record set, |R_0| = 5,204. The pipeline is a composition of four filters applied in a fixed order, each defined by a predicate on a record r:</w:t>
       </w:r>
     </w:p>
     <w:p>
@@ -402,7 +506,107 @@
           <w:i/>
           <w:sz w:val="20"/>
         </w:rPr>
-        <w:t>5,204 \xrightarrowpi_len 5,195 \xrightarrowpi_hash 5,195 \xrightarrowpi_year 5,191 \xrightarrowpi_id 5,164</w:t>
+        <w:t>pi_len(r) &amp;\iff |text(r)| &gt;= 1,000 characters, pi_hash(r) &amp;\iff SHA256\bigl(bytes(r)\bigr) not in H_&lt;r, pi_year(r) &amp;\iff yr(r) in [1900, 2025], pi_id(r) &amp;\iff positional identity of r is unique,</w:t>
+      </w:r>
+    </w:p>
+    <w:p>
+      <w:pPr>
+        <w:spacing w:before="0" w:after="60"/>
+        <w:ind w:firstLine="288"/>
+      </w:pPr>
+      <w:r>
+        <w:rPr>
+          <w:b w:val="0"/>
+          <w:i w:val="0"/>
+          <w:sz w:val="20"/>
+        </w:rPr>
+        <w:t>where H_&lt;r is the set of digests already seen in load order, so pi_hash retains exactly one representative per digest. The surviving sets are nested,</w:t>
+      </w:r>
+    </w:p>
+    <w:p>
+      <w:pPr>
+        <w:spacing w:before="80" w:after="80"/>
+        <w:ind w:firstLine="0"/>
+        <w:jc w:val="center"/>
+      </w:pPr>
+      <w:r>
+        <w:rPr>
+          <w:b w:val="0"/>
+          <w:i/>
+          <w:sz w:val="20"/>
+        </w:rPr>
+        <w:t>R_4 ⊆ R_3 ⊆ R_2 ⊆ R_1 ⊆ R_0 , \qquad R_k = \ r in R_k-1 : pi_k(r) \,</w:t>
+      </w:r>
+    </w:p>
+    <w:p>
+      <w:pPr>
+        <w:spacing w:before="0" w:after="60"/>
+        <w:ind w:firstLine="288"/>
+      </w:pPr>
+      <w:r>
+        <w:rPr>
+          <w:b w:val="0"/>
+          <w:i w:val="0"/>
+          <w:sz w:val="20"/>
+        </w:rPr>
+        <w:t>and the realised cardinality chain on this corpus is</w:t>
+      </w:r>
+    </w:p>
+    <w:p>
+      <w:pPr>
+        <w:spacing w:before="80" w:after="80"/>
+        <w:ind w:firstLine="0"/>
+        <w:jc w:val="center"/>
+      </w:pPr>
+      <w:r>
+        <w:rPr>
+          <w:b w:val="0"/>
+          <w:i/>
+          <w:sz w:val="20"/>
+        </w:rPr>
+        <w:t>5,204 \xrightarrowpi_len 5,195 \xrightarrowpi_hash 5,195 \xrightarrowpi_year 5,191 \xrightarrowpi_id 5,164 .</w:t>
+      </w:r>
+    </w:p>
+    <w:p>
+      <w:pPr>
+        <w:spacing w:before="0" w:after="60"/>
+        <w:ind w:firstLine="288"/>
+      </w:pPr>
+      <w:r>
+        <w:rPr>
+          <w:b w:val="0"/>
+          <w:i w:val="0"/>
+          <w:sz w:val="20"/>
+        </w:rPr>
+        <w:t>The second arrow is an identity map on the subset over which the digest could be evaluated (356 script files distributed with the code; 0 collisions). The metadata identity keys, computed over all 5,204 records, return zero duplicate IMDb identifiers and zero duplicate title×year pairs.</w:t>
+      </w:r>
+    </w:p>
+    <w:p>
+      <w:pPr>
+        <w:spacing w:before="120" w:after="40"/>
+        <w:ind w:firstLine="0"/>
+      </w:pPr>
+      <w:r>
+        <w:rPr>
+          <w:b w:val="0"/>
+          <w:i/>
+          <w:sz w:val="20"/>
+        </w:rPr>
+        <w:t>D. Audit results</w:t>
+      </w:r>
+    </w:p>
+    <w:p>
+      <w:pPr>
+        <w:spacing w:before="0" w:after="60"/>
+        <w:ind w:firstLine="288"/>
+      </w:pPr>
+      <w:r>
+        <w:rPr>
+          <w:b w:val="0"/>
+          <w:i w:val="0"/>
+          <w:sz w:val="20"/>
+        </w:rPr>
+        <w:t>Table I is the full ledger for the flow of Section III, and every row is a strict subset of the row above.</w:t>
       </w:r>
     </w:p>
     <w:p>
@@ -432,7 +636,7 @@
           <w:i w:val="0"/>
           <w:sz w:val="16"/>
         </w:rPr>
-        <w:t>CORPUS INTEGRITY AUDIT AND EXCLUSION LEDGER (N=5,204)</w:t>
+        <w:t>CORPUS INTEGRITY AUDIT AND EXCLUSION LEDGER. PERCENTAGES ARE OF THE 5,204 JOINED RECORDS.</w:t>
       </w:r>
     </w:p>
     <w:tbl>
@@ -464,7 +668,7 @@
                 <w:b/>
                 <w:sz w:val="16"/>
               </w:rPr>
-              <w:t>Check / Exclusion Category</w:t>
+              <w:t>Check / exclusion</w:t>
             </w:r>
           </w:p>
         </w:tc>
@@ -504,7 +708,7 @@
                 <w:b/>
                 <w:sz w:val="16"/>
               </w:rPr>
-              <w:t>% of Corpus</w:t>
+              <w:t>%</w:t>
             </w:r>
           </w:p>
         </w:tc>
@@ -560,7 +764,7 @@
                 <w:rFonts w:ascii="Times New Roman" w:hAnsi="Times New Roman"/>
                 <w:sz w:val="16"/>
               </w:rPr>
-              <w:t>100.00%</w:t>
+              <w:t>100.00</w:t>
             </w:r>
           </w:p>
         </w:tc>
@@ -580,7 +784,7 @@
                 <w:rFonts w:ascii="Times New Roman" w:hAnsi="Times New Roman"/>
                 <w:sz w:val="16"/>
               </w:rPr>
-              <w:t>Identity Keys</w:t>
+              <w:t>Identity keys</w:t>
             </w:r>
           </w:p>
         </w:tc>
@@ -670,7 +874,7 @@
                 <w:rFonts w:ascii="Times New Roman" w:hAnsi="Times New Roman"/>
                 <w:sz w:val="16"/>
               </w:rPr>
-              <w:t>100.00%</w:t>
+              <w:t>100.00</w:t>
             </w:r>
           </w:p>
         </w:tc>
@@ -726,7 +930,7 @@
                 <w:rFonts w:ascii="Times New Roman" w:hAnsi="Times New Roman"/>
                 <w:sz w:val="16"/>
               </w:rPr>
-              <w:t>100.00%</w:t>
+              <w:t>100.00</w:t>
             </w:r>
           </w:p>
         </w:tc>
@@ -782,7 +986,7 @@
                 <w:rFonts w:ascii="Times New Roman" w:hAnsi="Times New Roman"/>
                 <w:sz w:val="16"/>
               </w:rPr>
-              <w:t>0.00%</w:t>
+              <w:t>0.00</w:t>
             </w:r>
           </w:p>
         </w:tc>
@@ -802,7 +1006,7 @@
                 <w:rFonts w:ascii="Times New Roman" w:hAnsi="Times New Roman"/>
                 <w:sz w:val="16"/>
               </w:rPr>
-              <w:t>Title collisions (same title, different year)</w:t>
+              <w:t>Title collisions (same title, other year)</w:t>
             </w:r>
           </w:p>
         </w:tc>
@@ -820,7 +1024,7 @@
                 <w:rFonts w:ascii="Times New Roman" w:hAnsi="Times New Roman"/>
                 <w:sz w:val="16"/>
               </w:rPr>
-              <w:t>80 groups</w:t>
+              <w:t>80 groups / 165 rec.</w:t>
             </w:r>
           </w:p>
         </w:tc>
@@ -838,7 +1042,7 @@
                 <w:rFonts w:ascii="Times New Roman" w:hAnsi="Times New Roman"/>
                 <w:sz w:val="16"/>
               </w:rPr>
-              <w:t>3.17%</w:t>
+              <w:t>3.17</w:t>
             </w:r>
           </w:p>
         </w:tc>
@@ -858,7 +1062,7 @@
                 <w:rFonts w:ascii="Times New Roman" w:hAnsi="Times New Roman"/>
                 <w:sz w:val="16"/>
               </w:rPr>
-              <w:t>SHA-256 duplicates (audited subset, n=356)</w:t>
+              <w:t>SHA-256 duplicate digests (audited subset)</w:t>
             </w:r>
           </w:p>
         </w:tc>
@@ -1004,7 +1208,7 @@
                 <w:rFonts w:ascii="Times New Roman" w:hAnsi="Times New Roman"/>
                 <w:sz w:val="16"/>
               </w:rPr>
-              <w:t>0.17%</w:t>
+              <w:t>0.17</w:t>
             </w:r>
           </w:p>
         </w:tc>
@@ -1024,7 +1228,7 @@
                 <w:rFonts w:ascii="Times New Roman" w:hAnsi="Times New Roman"/>
                 <w:sz w:val="16"/>
               </w:rPr>
-              <w:t>Corrupt release year outside [1900, 2025]</w:t>
+              <w:t>Release year outside [1900, 2025]</w:t>
             </w:r>
           </w:p>
         </w:tc>
@@ -1060,7 +1264,7 @@
                 <w:rFonts w:ascii="Times New Roman" w:hAnsi="Times New Roman"/>
                 <w:sz w:val="16"/>
               </w:rPr>
-              <w:t>0.08%</w:t>
+              <w:t>0.08</w:t>
             </w:r>
           </w:p>
         </w:tc>
@@ -1080,7 +1284,7 @@
                 <w:rFonts w:ascii="Times New Roman" w:hAnsi="Times New Roman"/>
                 <w:sz w:val="16"/>
               </w:rPr>
-              <w:t>Unresolvable matrix positional identity</w:t>
+              <w:t>Unresolvable positional identity</w:t>
             </w:r>
           </w:p>
         </w:tc>
@@ -1116,7 +1320,7 @@
                 <w:rFonts w:ascii="Times New Roman" w:hAnsi="Times New Roman"/>
                 <w:sz w:val="16"/>
               </w:rPr>
-              <w:t>0.52%</w:t>
+              <w:t>0.52</w:t>
             </w:r>
           </w:p>
         </w:tc>
@@ -1136,7 +1340,7 @@
                 <w:rFonts w:ascii="Times New Roman" w:hAnsi="Times New Roman"/>
                 <w:sz w:val="16"/>
               </w:rPr>
-              <w:t>Final Analysis Corpus</w:t>
+              <w:t>Analysis corpus</w:t>
             </w:r>
           </w:p>
         </w:tc>
@@ -1154,7 +1358,7 @@
                 <w:rFonts w:ascii="Times New Roman" w:hAnsi="Times New Roman"/>
                 <w:sz w:val="16"/>
               </w:rPr>
-              <w:t>\mathbf5,164</w:t>
+              <w:t>5,164</w:t>
             </w:r>
           </w:p>
         </w:tc>
@@ -1172,7 +1376,7 @@
                 <w:rFonts w:ascii="Times New Roman" w:hAnsi="Times New Roman"/>
                 <w:sz w:val="16"/>
               </w:rPr>
-              <w:t>\mathbf99.23%</w:t>
+              <w:t>99.23</w:t>
             </w:r>
           </w:p>
         </w:tc>
@@ -1192,7 +1396,7 @@
                 <w:rFonts w:ascii="Times New Roman" w:hAnsi="Times New Roman"/>
                 <w:sz w:val="16"/>
               </w:rPr>
-              <w:t>Title families (grouping units)</w:t>
+              <w:t>Title families</w:t>
             </w:r>
           </w:p>
         </w:tc>
@@ -1248,7 +1452,7 @@
                 <w:rFonts w:ascii="Times New Roman" w:hAnsi="Times New Roman"/>
                 <w:sz w:val="16"/>
               </w:rPr>
-              <w:t>Multi-member families</w:t>
+              <w:t>multi-member families</w:t>
             </w:r>
           </w:p>
         </w:tc>
@@ -1267,6 +1471,62 @@
                 <w:sz w:val="16"/>
               </w:rPr>
               <w:t>164</w:t>
+            </w:r>
+          </w:p>
+        </w:tc>
+        <w:tc>
+          <w:tcPr>
+            <w:tcW w:type="dxa" w:w="3365"/>
+          </w:tcPr>
+          <w:p>
+            <w:pPr>
+              <w:ind w:firstLine="0"/>
+              <w:jc w:val="center"/>
+            </w:pPr>
+            <w:r>
+              <w:rPr>
+                <w:rFonts w:ascii="Times New Roman" w:hAnsi="Times New Roman"/>
+                <w:sz w:val="16"/>
+              </w:rPr>
+              <w:t>—</w:t>
+            </w:r>
+          </w:p>
+        </w:tc>
+      </w:tr>
+      <w:tr>
+        <w:tc>
+          <w:tcPr>
+            <w:tcW w:type="dxa" w:w="3365"/>
+          </w:tcPr>
+          <w:p>
+            <w:pPr>
+              <w:ind w:firstLine="0"/>
+              <w:jc w:val="left"/>
+            </w:pPr>
+            <w:r>
+              <w:rPr>
+                <w:rFonts w:ascii="Times New Roman" w:hAnsi="Times New Roman"/>
+                <w:sz w:val="16"/>
+              </w:rPr>
+              <w:t>largest family</w:t>
+            </w:r>
+          </w:p>
+        </w:tc>
+        <w:tc>
+          <w:tcPr>
+            <w:tcW w:type="dxa" w:w="3365"/>
+          </w:tcPr>
+          <w:p>
+            <w:pPr>
+              <w:ind w:firstLine="0"/>
+              <w:jc w:val="center"/>
+            </w:pPr>
+            <w:r>
+              <w:rPr>
+                <w:rFonts w:ascii="Times New Roman" w:hAnsi="Times New Roman"/>
+                <w:sz w:val="16"/>
+              </w:rPr>
+              <w:t>4</w:t>
             </w:r>
           </w:p>
         </w:tc>
@@ -1314,7 +1574,49 @@
           <w:i w:val="0"/>
           <w:sz w:val="20"/>
         </w:rPr>
-        <w:t>Table I documents that metadata-level film duplicates are absent, confirming that data leakage does not stem from naive duplicates. However, 80 title collisions (165 records) represent remakes sharing premise and dialogue, and 164 multi-member title families require grouped evaluation. Typographical errors in release years (e.g., years 1080 and 1088) and 14 corrupt ordinal decade strings (`1080s', `1900s', `1996s') are purged rather than silently repaired. Additionally, 27 ambiguous matrix offsets are excluded to prevent misalignment.</w:t>
+        <w:t>No exact film duplicates at the metadata level. All 5,204 identifiers are distinct and no title×year pair repeats. This is a genuinely clean join, and it means the leakage channel in this corpus is not naive record duplication.</w:t>
+      </w:r>
+    </w:p>
+    <w:p>
+      <w:pPr>
+        <w:spacing w:before="0" w:after="60"/>
+        <w:ind w:firstLine="288"/>
+      </w:pPr>
+      <w:r>
+        <w:rPr>
+          <w:b w:val="0"/>
+          <w:i w:val="0"/>
+          <w:sz w:val="20"/>
+        </w:rPr>
+        <w:t>Eighty title collisions, all legitimate. Eighty titles appear more than once, spanning 165 records, but every collision pairs distinct identifiers and distinct years — these are remakes and same-title unrelated films, not duplicates. Grouping is the correct treatment; deletion would discard real data.</w:t>
+      </w:r>
+    </w:p>
+    <w:p>
+      <w:pPr>
+        <w:spacing w:before="0" w:after="60"/>
+        <w:ind w:firstLine="288"/>
+      </w:pPr>
+      <w:r>
+        <w:rPr>
+          <w:b w:val="0"/>
+          <w:i w:val="0"/>
+          <w:sz w:val="20"/>
+        </w:rPr>
+        <w:t>Metadata corruption is present and reaches the model. Four records carry release years of 1080 or 1088, transparently mis-typed 1980 and 1988 (Breaker Morant, Mississippi Burning, Torch Song Trilogy, The Blues Brothers). We drop them rather than silently repair them.</w:t>
+      </w:r>
+    </w:p>
+    <w:p>
+      <w:pPr>
+        <w:spacing w:before="0" w:after="60"/>
+        <w:ind w:firstLine="288"/>
+      </w:pPr>
+      <w:r>
+        <w:rPr>
+          <w:b w:val="0"/>
+          <w:i w:val="0"/>
+          <w:sz w:val="20"/>
+        </w:rPr>
+        <w:t>Twenty-seven records are excluded because positional identity in the archived embedding matrix cannot be resolved uniquely without a stored record key. Twenty-seven positions inside the reconstruction gaps admit more than one consistent assignment; we drop them rather than guess.</w:t>
       </w:r>
     </w:p>
     <w:p>
@@ -1343,7 +1645,7 @@
           <w:i/>
           <w:sz w:val="20"/>
         </w:rPr>
-        <w:t>A. Screenplay Feature Extraction</w:t>
+        <w:t>A. Structural screenplay statistics</w:t>
       </w:r>
     </w:p>
     <w:p>
@@ -1357,7 +1659,21 @@
           <w:i w:val="0"/>
           <w:sz w:val="20"/>
         </w:rPr>
-        <w:t>Nineteen numeric predictors are extracted: 16 structural statistics from raw scripts plus 3 metadata fields (runtime, release year, decade). The 16 script features encompass size measures (char_count, word_count, line_count, sentence_count, scene_count, words_per_scene), lexical sophistication (avg_word_length, unique_word_ratio, long_word_ratio), sentence geometry (avg_sentence_length, sentence_length_std), and dialogue/affect proxies (dialogue_density, unique_characters, exclamation_ratio, question_ratio, action_density).</w:t>
+        <w:t>Sixteen statistics are computed from the raw, uncleaned script text: six size measures (char_count, word_count, line_count, sentence_count, scene_count, words_per_scene); three describing lexical sophistication (avg_word_length, unique_word_ratio, long_word_ratio); two describing sentence geometry (avg_sentence_length, sentence_length_std); two describing dialogue (dialogue_density, unique_characters); two emotional proxies (exclamation_ratio, question_ratio); and one stage-direction proxy (action_density). Scene count is the number of case-insensitive INT./EXT. matches. All sixteen describe the transcript as archived rather than the text the encoder receives.</w:t>
+      </w:r>
+    </w:p>
+    <w:p>
+      <w:pPr>
+        <w:spacing w:before="120" w:after="40"/>
+        <w:ind w:firstLine="0"/>
+      </w:pPr>
+      <w:r>
+        <w:rPr>
+          <w:b w:val="0"/>
+          <w:i/>
+          <w:sz w:val="20"/>
+        </w:rPr>
+        <w:t>B. Token-aligned chunking and mean pooling</w:t>
       </w:r>
     </w:p>
     <w:p>
@@ -1371,35 +1687,7 @@
           <w:i w:val="0"/>
           <w:sz w:val="20"/>
         </w:rPr>
-        <w:t>Degeneracy audit: Mean dialogue_density is 0.0087 (± 0.0361) and mean unique_characters is 3.41. The extraction regular expression assumed a strict NAME: cue absent from most IMSDb formats, rendering both features transcription artifacts rather than narrative characteristics.</w:t>
-      </w:r>
-    </w:p>
-    <w:p>
-      <w:pPr>
-        <w:spacing w:before="120" w:after="40"/>
-        <w:ind w:firstLine="0"/>
-      </w:pPr>
-      <w:r>
-        <w:rPr>
-          <w:b w:val="0"/>
-          <w:i/>
-          <w:sz w:val="20"/>
-        </w:rPr>
-        <w:t>B. Token-Aligned Chunking and Silent Truncation</w:t>
-      </w:r>
-    </w:p>
-    <w:p>
-      <w:pPr>
-        <w:spacing w:before="0" w:after="60"/>
-        <w:ind w:firstLine="288"/>
-      </w:pPr>
-      <w:r>
-        <w:rPr>
-          <w:b w:val="0"/>
-          <w:i w:val="0"/>
-          <w:sz w:val="20"/>
-        </w:rPr>
-        <w:t>Given word sequence D = (w_1, ..., w_N), windows of length L=256 words with overlap o=50 yield stride s = L - o = 206. Window j is C_j = (w_(j-1)s+1, ..., w_((j-1)s+L, N)), producing M = (N-L)/s + 1 windows. Each window is encoded via f: C -&gt; ^d (d=384, all-MiniLM-L6-v2), and document pooling is the arithmetic mean:</w:t>
+        <w:t>Let a screenplay be a word sequence D = (w_1, ..., w_N) obtained by whitespace splitting after light normalisation that removes bracketed stage directions, ALL-CAPS speaker cues, INT./EXT. markers, and timestamps while preserving case and sentence punctuation. With window length L = 256 and overlap o = 50, the stride is</w:t>
       </w:r>
     </w:p>
     <w:p>
@@ -1414,7 +1702,7 @@
           <w:i/>
           <w:sz w:val="20"/>
         </w:rPr>
-        <w:t>\mathbfe(D) = (1)/(M)\sum_j=1^M f(C_j)</w:t>
+        <w:t>s = L - o = 206 ,</w:t>
       </w:r>
     </w:p>
     <w:p>
@@ -1428,7 +1716,7 @@
           <w:i w:val="0"/>
           <w:sz w:val="20"/>
         </w:rPr>
-        <w:t>Because f(C_j) is L_2-normalised, the squared norm of the pooled vector is:</w:t>
+        <w:t>and the j-th window is</w:t>
       </w:r>
     </w:p>
     <w:p>
@@ -1443,7 +1731,7 @@
           <w:i/>
           <w:sz w:val="20"/>
         </w:rPr>
-        <w:t>\|\mathbfe(D)\|_2^2 = \frac1M^2&lt;=ft(M + 2\sum_1 &lt;= i &lt; j &lt;= M \langle f(C_i), f(C_j) \rangle\right)</w:t>
+        <w:t>C_j = \bigl(w_(j-1)s+1, ..., w_\min((j-1)s+L, N)\bigr),</w:t>
       </w:r>
     </w:p>
     <w:p>
@@ -1457,21 +1745,7 @@
           <w:i w:val="0"/>
           <w:sz w:val="20"/>
         </w:rPr>
-        <w:t>which falls toward 1/M as window embeddings decorrelate. With a median of M=36 windows per script, localized scene signal is aggressively diluted.</w:t>
-      </w:r>
-    </w:p>
-    <w:p>
-      <w:pPr>
-        <w:spacing w:before="0" w:after="60"/>
-        <w:ind w:firstLine="288"/>
-      </w:pPr>
-      <w:r>
-        <w:rPr>
-          <w:b w:val="0"/>
-          <w:i w:val="0"/>
-          <w:sz w:val="20"/>
-        </w:rPr>
-        <w:t>Silent token truncation: The transformer accepts at most T_=256 positions, 2 reserved for [CLS] and [SEP], leaving a content budget B = 254 WordPiece tokens. Letting tau(·) be the tokenizer, the encoder observes tau(C_j) truncated to B. The discarded token fraction for document D is:</w:t>
+        <w:t>for j = 1, ..., M with</w:t>
       </w:r>
     </w:p>
     <w:p>
@@ -1486,7 +1760,7 @@
           <w:i/>
           <w:sz w:val="20"/>
         </w:rPr>
-        <w:t>rho(D) = 1 - (\sum_j=1^M \min(|tau(C_j)|, B))/(\sum_j=1^M |tau(C_j)|)</w:t>
+        <w:t>M = \begincases 1, &amp; N &lt;= L, [2pt] &lt;=ft\lceil \dfracN - Ls \right\rceil + 1, &amp; N &gt; L . \endcases</w:t>
       </w:r>
     </w:p>
     <w:p>
@@ -1500,7 +1774,137 @@
           <w:i w:val="0"/>
           <w:sz w:val="20"/>
         </w:rPr>
-        <w:t>Evaluating tau across 14,558 windows from 356 scripts reveals that 256 English words average 369.3 WordPiece tokens (median 371, 99th percentile 453, maximum 613). Consequently, 98.45% of windows exceed the token limit, and 31.60% of all generated tokens are silently dropped before encoding.</w:t>
+        <w:t>Each window is encoded by f C -&gt; ^d with d = 384, and the document representation is the arithmetic mean</w:t>
+      </w:r>
+    </w:p>
+    <w:p>
+      <w:pPr>
+        <w:spacing w:before="80" w:after="80"/>
+        <w:ind w:firstLine="0"/>
+        <w:jc w:val="center"/>
+      </w:pPr>
+      <w:r>
+        <w:rPr>
+          <w:b w:val="0"/>
+          <w:i/>
+          <w:sz w:val="20"/>
+        </w:rPr>
+        <w:t>e(D) = (1)/(M) \sum_j=1^M f(C_j) .</w:t>
+      </w:r>
+    </w:p>
+    <w:p>
+      <w:pPr>
+        <w:spacing w:before="0" w:after="60"/>
+        <w:ind w:firstLine="288"/>
+      </w:pPr>
+      <w:r>
+        <w:rPr>
+          <w:b w:val="0"/>
+          <w:i w:val="0"/>
+          <w:sz w:val="20"/>
+        </w:rPr>
+        <w:t>Equation (10) has a property worth stating, because the encoder L_2-normalises its output: every f(C_j) lies on the unit sphere, so</w:t>
+      </w:r>
+    </w:p>
+    <w:p>
+      <w:pPr>
+        <w:spacing w:before="80" w:after="80"/>
+        <w:ind w:firstLine="0"/>
+        <w:jc w:val="center"/>
+      </w:pPr>
+      <w:r>
+        <w:rPr>
+          <w:b w:val="0"/>
+          <w:i/>
+          <w:sz w:val="20"/>
+        </w:rPr>
+        <w:t>\bigl\| e(D) \bigr\|_2^2 = \frac1M^2\Bigl( M + 2\sum_1 &lt;= i &lt; j &lt;= M \langle f(C_i), f(C_j)\rangle \Bigr),</w:t>
+      </w:r>
+    </w:p>
+    <w:p>
+      <w:pPr>
+        <w:spacing w:before="0" w:after="60"/>
+        <w:ind w:firstLine="288"/>
+      </w:pPr>
+      <w:r>
+        <w:rPr>
+          <w:b w:val="0"/>
+          <w:i w:val="0"/>
+          <w:sz w:val="20"/>
+        </w:rPr>
+        <w:t>which equals 1 only when all windows embed identically and falls toward 1/M as they decorrelate. The norm of a mean-pooled screenplay embedding is therefore a coherence statistic, and averaging over M windows shrinks any single window's influence by 1/M. With a median of 36 windows per script, no scene survives pooling as a distinguishable signal.</w:t>
+      </w:r>
+    </w:p>
+    <w:p>
+      <w:pPr>
+        <w:spacing w:before="0" w:after="60"/>
+        <w:ind w:firstLine="288"/>
+      </w:pPr>
+      <w:r>
+        <w:rPr>
+          <w:b w:val="0"/>
+          <w:i w:val="0"/>
+          <w:sz w:val="20"/>
+        </w:rPr>
+        <w:t>The word/token mismatch. The encoder's transformer accepts T_ = 256 positions, two of which are consumed by [CLS] and [SEP]. The content budget is therefore</w:t>
+      </w:r>
+    </w:p>
+    <w:p>
+      <w:pPr>
+        <w:spacing w:before="80" w:after="80"/>
+        <w:ind w:firstLine="0"/>
+        <w:jc w:val="center"/>
+      </w:pPr>
+      <w:r>
+        <w:rPr>
+          <w:b w:val="0"/>
+          <w:i/>
+          <w:sz w:val="20"/>
+        </w:rPr>
+        <w:t>B = T_\max - 2 = 254</w:t>
+      </w:r>
+    </w:p>
+    <w:p>
+      <w:pPr>
+        <w:spacing w:before="0" w:after="60"/>
+        <w:ind w:firstLine="288"/>
+      </w:pPr>
+      <w:r>
+        <w:rPr>
+          <w:b w:val="0"/>
+          <w:i w:val="0"/>
+          <w:sz w:val="20"/>
+        </w:rPr>
+        <w:t>WordPiece tokens, while C_j is defined by a count of 256 words. Writing tau(·) for the tokeniser, the encoder in fact sees tau(C_j) truncated to its first B entries, and the discarded fraction for a document is</w:t>
+      </w:r>
+    </w:p>
+    <w:p>
+      <w:pPr>
+        <w:spacing w:before="80" w:after="80"/>
+        <w:ind w:firstLine="0"/>
+        <w:jc w:val="center"/>
+      </w:pPr>
+      <w:r>
+        <w:rPr>
+          <w:b w:val="0"/>
+          <w:i/>
+          <w:sz w:val="20"/>
+        </w:rPr>
+        <w:t>rho(D) = 1 - (\sum_j=1^M \min\bigl(|tau(C_j)|, B\bigr))/(\sum_j=1^M |tau(C_j)|) .</w:t>
+      </w:r>
+    </w:p>
+    <w:p>
+      <w:pPr>
+        <w:spacing w:before="0" w:after="60"/>
+        <w:ind w:firstLine="288"/>
+      </w:pPr>
+      <w:r>
+        <w:rPr>
+          <w:b w:val="0"/>
+          <w:i w:val="0"/>
+          <w:sz w:val="20"/>
+        </w:rPr>
+        <w:t>Running the encoder's own tokeniser over the pipeline's own windows on the 356 available scripts yields 14,558 windows with median length 371 tokens, mean 369.3, 90th percentile 405, 99th percentile 453, and maximum 613. The consequences: 98.45% of windows exceed B, and rho evaluated corpus-wide is 0.3160, with a per-script mean of 0.3171 and a worst case of 0.4443. Roughly one word in three is written to a window that the encoder never reads. Nothing in the pipeline reports this. Aligning the window to the token budget — chunking on tau rather than on whitespace — is a two-line change that no result in this paper depends on, and that every result in this paper would need to be recomputed after.</w:t>
       </w:r>
     </w:p>
     <w:p>
@@ -1514,79 +1918,21 @@
           <w:i/>
           <w:sz w:val="20"/>
         </w:rPr>
-        <w:t>C. Models and Partition Protocols</w:t>
+        <w:t>C. Lexical control</w:t>
       </w:r>
     </w:p>
     <w:p>
       <w:pPr>
-        <w:pStyle w:val="ListBullet"/>
+        <w:spacing w:before="0" w:after="60"/>
+        <w:ind w:firstLine="288"/>
       </w:pPr>
       <w:r>
         <w:rPr>
-          <w:rFonts w:ascii="Times New Roman" w:hAnsi="Times New Roman"/>
+          <w:b w:val="0"/>
+          <w:i w:val="0"/>
           <w:sz w:val="20"/>
         </w:rPr>
-        <w:t>Lexical Control: TF-IDF on unigrams/bigrams (8,000 features, English stop words removed, min df 3, max df 0.85, sublinear tf) with gradient-boosted trees.</w:t>
-      </w:r>
-    </w:p>
-    <w:p>
-      <w:pPr>
-        <w:pStyle w:val="ListBullet"/>
-      </w:pPr>
-      <w:r>
-        <w:rPr>
-          <w:rFonts w:ascii="Times New Roman" w:hAnsi="Times New Roman"/>
-          <w:sz w:val="20"/>
-        </w:rPr>
-        <w:t>Learners: Gradient-boosted decision trees (500 estimators, lr 0.05, max depth 6, early stopping 20 rounds, clipped [1.0, 10.0]). Reference probes include OLS on metadata and Ridge (alpha=1.5) on standardized embeddings.</w:t>
-      </w:r>
-    </w:p>
-    <w:p>
-      <w:pPr>
-        <w:pStyle w:val="ListBullet"/>
-      </w:pPr>
-      <w:r>
-        <w:rPr>
-          <w:rFonts w:ascii="Times New Roman" w:hAnsi="Times New Roman"/>
-          <w:sz w:val="20"/>
-        </w:rPr>
-        <w:t>Protocols: We evaluate three split designs: enumerate</w:t>
-      </w:r>
-    </w:p>
-    <w:p>
-      <w:pPr>
-        <w:pStyle w:val="ListBullet"/>
-      </w:pPr>
-      <w:r>
-        <w:rPr>
-          <w:rFonts w:ascii="Times New Roman" w:hAnsi="Times New Roman"/>
-          <w:sz w:val="20"/>
-        </w:rPr>
-        <w:t>P1 (Random): Shuffled 5-fold CV (average franchise overlap lambda = 5.50%).</w:t>
-      </w:r>
-    </w:p>
-    <w:p>
-      <w:pPr>
-        <w:pStyle w:val="ListBullet"/>
-      </w:pPr>
-      <w:r>
-        <w:rPr>
-          <w:rFonts w:ascii="Times New Roman" w:hAnsi="Times New Roman"/>
-          <w:sz w:val="20"/>
-        </w:rPr>
-        <w:t>P2 (Grouped): GroupKFold by title family (|G|=4,979, lambda = 0%). Fold sizes (1,032–1,033) match P1.</w:t>
-      </w:r>
-    </w:p>
-    <w:p>
-      <w:pPr>
-        <w:pStyle w:val="ListBullet"/>
-      </w:pPr>
-      <w:r>
-        <w:rPr>
-          <w:rFonts w:ascii="Times New Roman" w:hAnsi="Times New Roman"/>
-          <w:sz w:val="20"/>
-        </w:rPr>
-        <w:t>P3 (Chronological): Train on release years &lt;= 2015 (n=3,918); validate on 2016–2019 (n=731); test on 2020–2025 (n=515, lambda = 6.41%). enumerate</w:t>
+        <w:t>The lexical control is TF-IDF over unigrams and bigrams, capped at 8,000 features, with English stop words removed, minimum document frequency 3, maximum document frequency 0.85, and sublinear term frequency 1 + . It is fitted on aggressively normalised text — lowercased, stage directions and speaker cues stripped, punctuation reduced — and fed to the same gradient-boosted regressor as the semantic arm. This pairing is deliberate: SBERT and TF-IDF differ in representation and in nothing else, so their gap is attributable to semantics rather than to the learner.</w:t>
       </w:r>
     </w:p>
     <w:p>
@@ -1600,7 +1946,7 @@
           <w:i/>
           <w:sz w:val="20"/>
         </w:rPr>
-        <w:t>D. Statistical Inference</w:t>
+        <w:t>D. Learners</w:t>
       </w:r>
     </w:p>
     <w:p>
@@ -1614,7 +1960,264 @@
           <w:i w:val="0"/>
           <w:sz w:val="20"/>
         </w:rPr>
-        <w:t>Estimates carry 95% percentile bootstrap intervals (B=1,000). System differences are tested via the two-sided paired Wilcoxon signed-rank test on absolute errors e_i^A - e_i^B, reporting non-tied pairs, statistic W, exact p-value, and matched-pairs rank-biserial correlation r = (R^+ - R^-)/(R^+ + R^-) in [-1, 1].</w:t>
+        <w:t>The regressor throughout is gradient-boosted trees with 500 rounds, learning rate 0.05, maximum depth 6, histogram splitting, and early stopping after 20 rounds without validation improvement; predictions are clipped to [1, 10]. Two linear probes provide reference points: ordinary least squares on the three metadata columns, and ridge regression (alpha = 1.5) on standardised embeddings. A constant-mean predictor anchors the bottom.</w:t>
+      </w:r>
+    </w:p>
+    <w:p>
+      <w:pPr>
+        <w:spacing w:before="120" w:after="40"/>
+        <w:ind w:firstLine="0"/>
+      </w:pPr>
+      <w:r>
+        <w:rPr>
+          <w:b w:val="0"/>
+          <w:i/>
+          <w:sz w:val="20"/>
+        </w:rPr>
+        <w:t>E. Partition protocols</w:t>
+      </w:r>
+    </w:p>
+    <w:p>
+      <w:pPr>
+        <w:spacing w:before="0" w:after="60"/>
+        <w:ind w:firstLine="288"/>
+      </w:pPr>
+      <w:r>
+        <w:rPr>
+          <w:b w:val="0"/>
+          <w:i w:val="0"/>
+          <w:sz w:val="20"/>
+        </w:rPr>
+        <w:t>Let I = \1, ..., n\ index the analysis corpus, n = 5,164.</w:t>
+      </w:r>
+    </w:p>
+    <w:p>
+      <w:pPr>
+        <w:spacing w:before="0" w:after="60"/>
+        <w:ind w:firstLine="288"/>
+      </w:pPr>
+      <w:r>
+        <w:rPr>
+          <w:b w:val="0"/>
+          <w:i w:val="0"/>
+          <w:sz w:val="20"/>
+        </w:rPr>
+        <w:t>P1, random. A shuffled K-fold partition, K = 5: disjoint F_1, ..., F_K with \bigcup_k F_k = I, assignment independent of every record attribute.</w:t>
+      </w:r>
+    </w:p>
+    <w:p>
+      <w:pPr>
+        <w:spacing w:before="0" w:after="60"/>
+        <w:ind w:firstLine="288"/>
+      </w:pPr>
+      <w:r>
+        <w:rPr>
+          <w:b w:val="0"/>
+          <w:i w:val="0"/>
+          <w:sz w:val="20"/>
+        </w:rPr>
+        <w:t>P2, grouped. Let gamma I -&gt; G map each record to its title family, |G| = 4,979. GroupKFold constructs disjoint folds subject to the group constraint</w:t>
+      </w:r>
+    </w:p>
+    <w:p>
+      <w:pPr>
+        <w:spacing w:before="80" w:after="80"/>
+        <w:ind w:firstLine="0"/>
+        <w:jc w:val="center"/>
+      </w:pPr>
+      <w:r>
+        <w:rPr>
+          <w:b w:val="0"/>
+          <w:i/>
+          <w:sz w:val="20"/>
+        </w:rPr>
+        <w:t>for all g in G exists! k in \1,...,K\ \colon gamma^-1(g) ⊆ F_k ,</w:t>
+      </w:r>
+    </w:p>
+    <w:p>
+      <w:pPr>
+        <w:spacing w:before="0" w:after="60"/>
+        <w:ind w:firstLine="288"/>
+      </w:pPr>
+      <w:r>
+        <w:rPr>
+          <w:b w:val="0"/>
+          <w:i w:val="0"/>
+          <w:sz w:val="20"/>
+        </w:rPr>
+        <w:t>so no family is split across the boundary, while the fold sizes |F_k| are balanced as far as (14) permits. Because 4,979 families cover 5,164 records, the constraint is nearly free: realised fold sizes are 1,032–1,033, identical to P1.</w:t>
+      </w:r>
+    </w:p>
+    <w:p>
+      <w:pPr>
+        <w:spacing w:before="0" w:after="60"/>
+        <w:ind w:firstLine="288"/>
+      </w:pPr>
+      <w:r>
+        <w:rPr>
+          <w:b w:val="0"/>
+          <w:i w:val="0"/>
+          <w:sz w:val="20"/>
+        </w:rPr>
+        <w:t>P3, chronological. With yr(i) the release year,</w:t>
+      </w:r>
+    </w:p>
+    <w:p>
+      <w:pPr>
+        <w:spacing w:before="80" w:after="80"/>
+        <w:ind w:firstLine="0"/>
+        <w:jc w:val="center"/>
+      </w:pPr>
+      <w:r>
+        <w:rPr>
+          <w:b w:val="0"/>
+          <w:i/>
+          <w:sz w:val="20"/>
+        </w:rPr>
+        <w:t>T_test &amp;= \ i : 2020 &lt;= yr(i) &lt;= 2025 \, T_val &amp;= \ i : c &lt;= yr(i) &lt;= 2019 \, T_train &amp;= \ i : yr(i) &lt; c \,</w:t>
+      </w:r>
+    </w:p>
+    <w:p>
+      <w:pPr>
+        <w:spacing w:before="0" w:after="60"/>
+        <w:ind w:firstLine="288"/>
+      </w:pPr>
+      <w:r>
+        <w:rPr>
+          <w:b w:val="0"/>
+          <w:i w:val="0"/>
+          <w:sz w:val="20"/>
+        </w:rPr>
+        <w:t>where c is the 85th percentile of the pre-2020 year distribution, here c = 2016. Early stopping is thereby decided on films that are themselves in the future relative to the training set, so no forward-looking information enters through model selection. The realised sizes are 3,918 / 731 / 515.</w:t>
+      </w:r>
+    </w:p>
+    <w:p>
+      <w:pPr>
+        <w:spacing w:before="0" w:after="60"/>
+        <w:ind w:firstLine="288"/>
+      </w:pPr>
+      <w:r>
+        <w:rPr>
+          <w:b w:val="0"/>
+          <w:i w:val="0"/>
+          <w:sz w:val="20"/>
+        </w:rPr>
+        <w:t>A partition's leakage can be measured directly. Define the family-overlap rate of a test fold as the share of its records whose family also occurs in the corresponding training pool,</w:t>
+      </w:r>
+    </w:p>
+    <w:p>
+      <w:pPr>
+        <w:spacing w:before="80" w:after="80"/>
+        <w:ind w:firstLine="0"/>
+        <w:jc w:val="center"/>
+      </w:pPr>
+      <w:r>
+        <w:rPr>
+          <w:b w:val="0"/>
+          <w:i/>
+          <w:sz w:val="20"/>
+        </w:rPr>
+        <w:t>lambda(F_k) = (1)/(|F_k|) \bigl|\ i in F_k : gamma(i) in gamma(I \setminus F_k) bigr| .</w:t>
+      </w:r>
+    </w:p>
+    <w:p>
+      <w:pPr>
+        <w:spacing w:before="0" w:after="60"/>
+        <w:ind w:firstLine="288"/>
+      </w:pPr>
+      <w:r>
+        <w:rPr>
+          <w:b w:val="0"/>
+          <w:i w:val="0"/>
+          <w:sz w:val="20"/>
+        </w:rPr>
+        <w:t>Averaged over folds, lambda = 5.50% under P1 and, by construction, lambda = 0 under P2. The chronological holdout sits at lambda = 6.41%.</w:t>
+      </w:r>
+    </w:p>
+    <w:p>
+      <w:pPr>
+        <w:spacing w:before="120" w:after="40"/>
+        <w:ind w:firstLine="0"/>
+      </w:pPr>
+      <w:r>
+        <w:rPr>
+          <w:b w:val="0"/>
+          <w:i/>
+          <w:sz w:val="20"/>
+        </w:rPr>
+        <w:t>F. Inference</w:t>
+      </w:r>
+    </w:p>
+    <w:p>
+      <w:pPr>
+        <w:spacing w:before="0" w:after="60"/>
+        <w:ind w:firstLine="288"/>
+      </w:pPr>
+      <w:r>
+        <w:rPr>
+          <w:b w:val="0"/>
+          <w:i w:val="0"/>
+          <w:sz w:val="20"/>
+        </w:rPr>
+        <w:t>Point estimates carry percentile bootstrap intervals from B = 1000 resamples of the test set. Model comparison is paired and distribution-free. For predictions y^A, y^B on a common test set, form per-record absolute errors e^A_i = |y^A_i - y_i| and e^B_i likewise, take d_i = e^A_i - e^B_i, discard the n_0 exact ties, rank the remaining |d_i|, and accumulate</w:t>
+      </w:r>
+    </w:p>
+    <w:p>
+      <w:pPr>
+        <w:spacing w:before="80" w:after="80"/>
+        <w:ind w:firstLine="0"/>
+        <w:jc w:val="center"/>
+      </w:pPr>
+      <w:r>
+        <w:rPr>
+          <w:b w:val="0"/>
+          <w:i/>
+          <w:sz w:val="20"/>
+        </w:rPr>
+        <w:t>R^+ = \sum_i \colon d_i &gt; 0 rank(|d_i|), \qquad R^- = \sum_i \colon d_i &lt; 0 rank(|d_i|) ,</w:t>
+      </w:r>
+    </w:p>
+    <w:p>
+      <w:pPr>
+        <w:spacing w:before="0" w:after="60"/>
+        <w:ind w:firstLine="288"/>
+      </w:pPr>
+      <w:r>
+        <w:rPr>
+          <w:b w:val="0"/>
+          <w:i w:val="0"/>
+          <w:sz w:val="20"/>
+        </w:rPr>
+        <w:t>with test statistic W = (R^+, R^-). The signed-rank test is non-parametric and has no degrees-of-freedom parameter; the reporting quantities are the number of pairs n, the number of non-tied pairs n - n_0, the statistic W, and the matched-pairs rank-biserial effect size</w:t>
+      </w:r>
+    </w:p>
+    <w:p>
+      <w:pPr>
+        <w:spacing w:before="80" w:after="80"/>
+        <w:ind w:firstLine="0"/>
+        <w:jc w:val="center"/>
+      </w:pPr>
+      <w:r>
+        <w:rPr>
+          <w:b w:val="0"/>
+          <w:i/>
+          <w:sz w:val="20"/>
+        </w:rPr>
+        <w:t>r = (R^+ - R^-)/(R^+ + R^-) in [-1, 1] ,</w:t>
+      </w:r>
+    </w:p>
+    <w:p>
+      <w:pPr>
+        <w:spacing w:before="0" w:after="60"/>
+        <w:ind w:firstLine="288"/>
+      </w:pPr>
+      <w:r>
+        <w:rPr>
+          <w:b w:val="0"/>
+          <w:i w:val="0"/>
+          <w:sz w:val="20"/>
+        </w:rPr>
+        <w:t>which we report alongside p so that a small effect at large n is not mistaken for a large one. Differences in mean absolute error carry their own paired bootstrap intervals.</w:t>
       </w:r>
     </w:p>
     <w:p>
@@ -1643,7 +2246,7 @@
           <w:i/>
           <w:sz w:val="20"/>
         </w:rPr>
-        <w:t>A. The Cost of Stricter Partitions</w:t>
+        <w:t>A. The cost of a stricter partition</w:t>
       </w:r>
     </w:p>
     <w:p>
@@ -1657,8 +2260,19 @@
           <w:i w:val="0"/>
           <w:sz w:val="20"/>
         </w:rPr>
-        <w:t>Tables II and III isolate the performance impact across protocols.</w:t>
+        <w:t>Table II isolates the cost of the group constraint; Table III isolates the cost of the temporal one. Five systems, one corpus, one learner configuration throughout.</w:t>
       </w:r>
+    </w:p>
+    <w:p>
+      <w:pPr>
+        <w:sectPr>
+          <w:type w:val="continuous"/>
+          <w:pgSz w:w="11909" w:h="16834"/>
+          <w:pgMar w:top="1080" w:right="907" w:bottom="1080" w:left="907" w:header="720" w:footer="720" w:gutter="0"/>
+          <w:cols w:space="240" w:num="2"/>
+          <w:docGrid w:linePitch="360"/>
+        </w:sectPr>
+      </w:pPr>
     </w:p>
     <w:p>
       <w:pPr>
@@ -1687,7 +2301,7 @@
           <w:i w:val="0"/>
           <w:sz w:val="16"/>
         </w:rPr>
-        <w:t>5-FOLD CROSS-VALIDATION: RANDOM (P1) VS. GROUPED (P2)</w:t>
+        <w:t>Grouped five-fold results. P1 shuffles records; P2 enforces the title-family constraint (14). Pooled out-of-fold point estimates with 95% percentile bootstrap intervals over 5,164 records. Delta R^2 is the explained variance lost to the constraint, i.e. the share of P1 skill that franchise overlap was supplying.</w:t>
       </w:r>
     </w:p>
     <w:tbl>
@@ -1698,16 +2312,19 @@
         <w:tblLook w:firstColumn="1" w:firstRow="1" w:lastColumn="0" w:lastRow="0" w:noHBand="0" w:noVBand="1" w:val="04A0"/>
       </w:tblPr>
       <w:tblGrid>
-        <w:gridCol w:w="2019"/>
-        <w:gridCol w:w="2019"/>
-        <w:gridCol w:w="2019"/>
-        <w:gridCol w:w="2019"/>
-        <w:gridCol w:w="2019"/>
+        <w:gridCol w:w="1262"/>
+        <w:gridCol w:w="1262"/>
+        <w:gridCol w:w="1262"/>
+        <w:gridCol w:w="1262"/>
+        <w:gridCol w:w="1262"/>
+        <w:gridCol w:w="1262"/>
+        <w:gridCol w:w="1262"/>
+        <w:gridCol w:w="1262"/>
       </w:tblGrid>
       <w:tr>
         <w:tc>
           <w:tcPr>
-            <w:tcW w:type="dxa" w:w="2019"/>
+            <w:tcW w:type="dxa" w:w="1262"/>
             <w:shd w:val="clear" w:fill="D9E2F3"/>
           </w:tcPr>
           <w:p>
@@ -1721,13 +2338,12 @@
                 <w:b/>
                 <w:sz w:val="16"/>
               </w:rPr>
-              <w:t>System</w:t>
             </w:r>
           </w:p>
         </w:tc>
         <w:tc>
           <w:tcPr>
-            <w:tcW w:type="dxa" w:w="2019"/>
+            <w:tcW w:type="dxa" w:w="1262"/>
             <w:shd w:val="clear" w:fill="D9E2F3"/>
           </w:tcPr>
           <w:p>
@@ -1741,13 +2357,13 @@
                 <w:b/>
                 <w:sz w:val="16"/>
               </w:rPr>
-              <w:t>P1 MAE</w:t>
+              <w:t>P1 random k-fold (lambda = 5.50%)</w:t>
             </w:r>
           </w:p>
         </w:tc>
         <w:tc>
           <w:tcPr>
-            <w:tcW w:type="dxa" w:w="2019"/>
+            <w:tcW w:type="dxa" w:w="1262"/>
             <w:shd w:val="clear" w:fill="D9E2F3"/>
           </w:tcPr>
           <w:p>
@@ -1761,13 +2377,13 @@
                 <w:b/>
                 <w:sz w:val="16"/>
               </w:rPr>
-              <w:t>P1 R^2</w:t>
+              <w:t>P2 grouped by family (lambda = 0%)</w:t>
             </w:r>
           </w:p>
         </w:tc>
         <w:tc>
           <w:tcPr>
-            <w:tcW w:type="dxa" w:w="2019"/>
+            <w:tcW w:type="dxa" w:w="1262"/>
             <w:shd w:val="clear" w:fill="D9E2F3"/>
           </w:tcPr>
           <w:p>
@@ -1781,13 +2397,12 @@
                 <w:b/>
                 <w:sz w:val="16"/>
               </w:rPr>
-              <w:t>P2 MAE</w:t>
             </w:r>
           </w:p>
         </w:tc>
         <w:tc>
           <w:tcPr>
-            <w:tcW w:type="dxa" w:w="2019"/>
+            <w:tcW w:type="dxa" w:w="1262"/>
             <w:shd w:val="clear" w:fill="D9E2F3"/>
           </w:tcPr>
           <w:p>
@@ -1801,7 +2416,63 @@
                 <w:b/>
                 <w:sz w:val="16"/>
               </w:rPr>
-              <w:t>P2 R^2</w:t>
+            </w:r>
+          </w:p>
+        </w:tc>
+        <w:tc>
+          <w:tcPr>
+            <w:tcW w:type="dxa" w:w="1262"/>
+            <w:shd w:val="clear" w:fill="D9E2F3"/>
+          </w:tcPr>
+          <w:p>
+            <w:pPr>
+              <w:ind w:firstLine="0"/>
+              <w:jc w:val="center"/>
+            </w:pPr>
+            <w:r>
+              <w:rPr>
+                <w:rFonts w:ascii="Times New Roman" w:hAnsi="Times New Roman"/>
+                <w:b/>
+                <w:sz w:val="16"/>
+              </w:rPr>
+            </w:r>
+          </w:p>
+        </w:tc>
+        <w:tc>
+          <w:tcPr>
+            <w:tcW w:type="dxa" w:w="1262"/>
+            <w:shd w:val="clear" w:fill="D9E2F3"/>
+          </w:tcPr>
+          <w:p>
+            <w:pPr>
+              <w:ind w:firstLine="0"/>
+              <w:jc w:val="center"/>
+            </w:pPr>
+            <w:r>
+              <w:rPr>
+                <w:rFonts w:ascii="Times New Roman" w:hAnsi="Times New Roman"/>
+                <w:b/>
+                <w:sz w:val="16"/>
+              </w:rPr>
+            </w:r>
+          </w:p>
+        </w:tc>
+        <w:tc>
+          <w:tcPr>
+            <w:tcW w:type="dxa" w:w="1262"/>
+            <w:shd w:val="clear" w:fill="D9E2F3"/>
+          </w:tcPr>
+          <w:p>
+            <w:pPr>
+              <w:ind w:firstLine="0"/>
+              <w:jc w:val="center"/>
+            </w:pPr>
+            <w:r>
+              <w:rPr>
+                <w:rFonts w:ascii="Times New Roman" w:hAnsi="Times New Roman"/>
+                <w:b/>
+                <w:sz w:val="16"/>
+              </w:rPr>
             </w:r>
           </w:p>
         </w:tc>
@@ -1809,7 +2480,153 @@
       <w:tr>
         <w:tc>
           <w:tcPr>
-            <w:tcW w:type="dxa" w:w="2019"/>
+            <w:tcW w:type="dxa" w:w="1262"/>
+          </w:tcPr>
+          <w:p>
+            <w:pPr>
+              <w:ind w:firstLine="0"/>
+              <w:jc w:val="left"/>
+            </w:pPr>
+            <w:r>
+              <w:rPr>
+                <w:rFonts w:ascii="Times New Roman" w:hAnsi="Times New Roman"/>
+                <w:sz w:val="16"/>
+              </w:rPr>
+              <w:t>System</w:t>
+            </w:r>
+          </w:p>
+        </w:tc>
+        <w:tc>
+          <w:tcPr>
+            <w:tcW w:type="dxa" w:w="1262"/>
+          </w:tcPr>
+          <w:p>
+            <w:pPr>
+              <w:ind w:firstLine="0"/>
+              <w:jc w:val="center"/>
+            </w:pPr>
+            <w:r>
+              <w:rPr>
+                <w:rFonts w:ascii="Times New Roman" w:hAnsi="Times New Roman"/>
+                <w:sz w:val="16"/>
+              </w:rPr>
+              <w:t>RMSE</w:t>
+            </w:r>
+          </w:p>
+        </w:tc>
+        <w:tc>
+          <w:tcPr>
+            <w:tcW w:type="dxa" w:w="1262"/>
+          </w:tcPr>
+          <w:p>
+            <w:pPr>
+              <w:ind w:firstLine="0"/>
+              <w:jc w:val="center"/>
+            </w:pPr>
+            <w:r>
+              <w:rPr>
+                <w:rFonts w:ascii="Times New Roman" w:hAnsi="Times New Roman"/>
+                <w:sz w:val="16"/>
+              </w:rPr>
+              <w:t>MAE</w:t>
+            </w:r>
+          </w:p>
+        </w:tc>
+        <w:tc>
+          <w:tcPr>
+            <w:tcW w:type="dxa" w:w="1262"/>
+          </w:tcPr>
+          <w:p>
+            <w:pPr>
+              <w:ind w:firstLine="0"/>
+              <w:jc w:val="center"/>
+            </w:pPr>
+            <w:r>
+              <w:rPr>
+                <w:rFonts w:ascii="Times New Roman" w:hAnsi="Times New Roman"/>
+                <w:sz w:val="16"/>
+              </w:rPr>
+              <w:t>^2</w:t>
+            </w:r>
+          </w:p>
+        </w:tc>
+        <w:tc>
+          <w:tcPr>
+            <w:tcW w:type="dxa" w:w="1262"/>
+          </w:tcPr>
+          <w:p>
+            <w:pPr>
+              <w:ind w:firstLine="0"/>
+              <w:jc w:val="center"/>
+            </w:pPr>
+            <w:r>
+              <w:rPr>
+                <w:rFonts w:ascii="Times New Roman" w:hAnsi="Times New Roman"/>
+                <w:sz w:val="16"/>
+              </w:rPr>
+              <w:t>RMSE</w:t>
+            </w:r>
+          </w:p>
+        </w:tc>
+        <w:tc>
+          <w:tcPr>
+            <w:tcW w:type="dxa" w:w="1262"/>
+          </w:tcPr>
+          <w:p>
+            <w:pPr>
+              <w:ind w:firstLine="0"/>
+              <w:jc w:val="center"/>
+            </w:pPr>
+            <w:r>
+              <w:rPr>
+                <w:rFonts w:ascii="Times New Roman" w:hAnsi="Times New Roman"/>
+                <w:sz w:val="16"/>
+              </w:rPr>
+              <w:t>MAE</w:t>
+            </w:r>
+          </w:p>
+        </w:tc>
+        <w:tc>
+          <w:tcPr>
+            <w:tcW w:type="dxa" w:w="1262"/>
+          </w:tcPr>
+          <w:p>
+            <w:pPr>
+              <w:ind w:firstLine="0"/>
+              <w:jc w:val="center"/>
+            </w:pPr>
+            <w:r>
+              <w:rPr>
+                <w:rFonts w:ascii="Times New Roman" w:hAnsi="Times New Roman"/>
+                <w:sz w:val="16"/>
+              </w:rPr>
+              <w:t>^2</w:t>
+            </w:r>
+          </w:p>
+        </w:tc>
+        <w:tc>
+          <w:tcPr>
+            <w:tcW w:type="dxa" w:w="1262"/>
+          </w:tcPr>
+          <w:p>
+            <w:pPr>
+              <w:ind w:firstLine="0"/>
+              <w:jc w:val="center"/>
+            </w:pPr>
+            <w:r>
+              <w:rPr>
+                <w:rFonts w:ascii="Times New Roman" w:hAnsi="Times New Roman"/>
+                <w:sz w:val="16"/>
+              </w:rPr>
+              <w:t>R^2</w:t>
+            </w:r>
+          </w:p>
+        </w:tc>
+      </w:tr>
+      <w:tr>
+        <w:tc>
+          <w:tcPr>
+            <w:tcW w:type="dxa" w:w="1262"/>
           </w:tcPr>
           <w:p>
             <w:pPr>
@@ -1827,7 +2644,25 @@
         </w:tc>
         <w:tc>
           <w:tcPr>
-            <w:tcW w:type="dxa" w:w="2019"/>
+            <w:tcW w:type="dxa" w:w="1262"/>
+          </w:tcPr>
+          <w:p>
+            <w:pPr>
+              <w:ind w:firstLine="0"/>
+              <w:jc w:val="center"/>
+            </w:pPr>
+            <w:r>
+              <w:rPr>
+                <w:rFonts w:ascii="Times New Roman" w:hAnsi="Times New Roman"/>
+                <w:sz w:val="16"/>
+              </w:rPr>
+              <w:t>1.4373</w:t>
+            </w:r>
+          </w:p>
+        </w:tc>
+        <w:tc>
+          <w:tcPr>
+            <w:tcW w:type="dxa" w:w="1262"/>
           </w:tcPr>
           <w:p>
             <w:pPr>
@@ -1845,7 +2680,7 @@
         </w:tc>
         <w:tc>
           <w:tcPr>
-            <w:tcW w:type="dxa" w:w="2019"/>
+            <w:tcW w:type="dxa" w:w="1262"/>
           </w:tcPr>
           <w:p>
             <w:pPr>
@@ -1863,7 +2698,25 @@
         </w:tc>
         <w:tc>
           <w:tcPr>
-            <w:tcW w:type="dxa" w:w="2019"/>
+            <w:tcW w:type="dxa" w:w="1262"/>
+          </w:tcPr>
+          <w:p>
+            <w:pPr>
+              <w:ind w:firstLine="0"/>
+              <w:jc w:val="center"/>
+            </w:pPr>
+            <w:r>
+              <w:rPr>
+                <w:rFonts w:ascii="Times New Roman" w:hAnsi="Times New Roman"/>
+                <w:sz w:val="16"/>
+              </w:rPr>
+              <w:t>1.4375</w:t>
+            </w:r>
+          </w:p>
+        </w:tc>
+        <w:tc>
+          <w:tcPr>
+            <w:tcW w:type="dxa" w:w="1262"/>
           </w:tcPr>
           <w:p>
             <w:pPr>
@@ -1881,7 +2734,25 @@
         </w:tc>
         <w:tc>
           <w:tcPr>
-            <w:tcW w:type="dxa" w:w="2019"/>
+            <w:tcW w:type="dxa" w:w="1262"/>
+          </w:tcPr>
+          <w:p>
+            <w:pPr>
+              <w:ind w:firstLine="0"/>
+              <w:jc w:val="center"/>
+            </w:pPr>
+            <w:r>
+              <w:rPr>
+                <w:rFonts w:ascii="Times New Roman" w:hAnsi="Times New Roman"/>
+                <w:sz w:val="16"/>
+              </w:rPr>
+              <w:t>-0.0004</w:t>
+            </w:r>
+          </w:p>
+        </w:tc>
+        <w:tc>
+          <w:tcPr>
+            <w:tcW w:type="dxa" w:w="1262"/>
           </w:tcPr>
           <w:p>
             <w:pPr>
@@ -1901,7 +2772,7 @@
       <w:tr>
         <w:tc>
           <w:tcPr>
-            <w:tcW w:type="dxa" w:w="2019"/>
+            <w:tcW w:type="dxa" w:w="1262"/>
           </w:tcPr>
           <w:p>
             <w:pPr>
@@ -1919,7 +2790,25 @@
         </w:tc>
         <w:tc>
           <w:tcPr>
-            <w:tcW w:type="dxa" w:w="2019"/>
+            <w:tcW w:type="dxa" w:w="1262"/>
+          </w:tcPr>
+          <w:p>
+            <w:pPr>
+              <w:ind w:firstLine="0"/>
+              <w:jc w:val="center"/>
+            </w:pPr>
+            <w:r>
+              <w:rPr>
+                <w:rFonts w:ascii="Times New Roman" w:hAnsi="Times New Roman"/>
+                <w:sz w:val="16"/>
+              </w:rPr>
+              <w:t>1.1237</w:t>
+            </w:r>
+          </w:p>
+        </w:tc>
+        <w:tc>
+          <w:tcPr>
+            <w:tcW w:type="dxa" w:w="1262"/>
           </w:tcPr>
           <w:p>
             <w:pPr>
@@ -1937,7 +2826,7 @@
         </w:tc>
         <w:tc>
           <w:tcPr>
-            <w:tcW w:type="dxa" w:w="2019"/>
+            <w:tcW w:type="dxa" w:w="1262"/>
           </w:tcPr>
           <w:p>
             <w:pPr>
@@ -1955,7 +2844,25 @@
         </w:tc>
         <w:tc>
           <w:tcPr>
-            <w:tcW w:type="dxa" w:w="2019"/>
+            <w:tcW w:type="dxa" w:w="1262"/>
+          </w:tcPr>
+          <w:p>
+            <w:pPr>
+              <w:ind w:firstLine="0"/>
+              <w:jc w:val="center"/>
+            </w:pPr>
+            <w:r>
+              <w:rPr>
+                <w:rFonts w:ascii="Times New Roman" w:hAnsi="Times New Roman"/>
+                <w:sz w:val="16"/>
+              </w:rPr>
+              <w:t>1.1236</w:t>
+            </w:r>
+          </w:p>
+        </w:tc>
+        <w:tc>
+          <w:tcPr>
+            <w:tcW w:type="dxa" w:w="1262"/>
           </w:tcPr>
           <w:p>
             <w:pPr>
@@ -1973,7 +2880,7 @@
         </w:tc>
         <w:tc>
           <w:tcPr>
-            <w:tcW w:type="dxa" w:w="2019"/>
+            <w:tcW w:type="dxa" w:w="1262"/>
           </w:tcPr>
           <w:p>
             <w:pPr>
@@ -1989,11 +2896,29 @@
             </w:r>
           </w:p>
         </w:tc>
+        <w:tc>
+          <w:tcPr>
+            <w:tcW w:type="dxa" w:w="1262"/>
+          </w:tcPr>
+          <w:p>
+            <w:pPr>
+              <w:ind w:firstLine="0"/>
+              <w:jc w:val="center"/>
+            </w:pPr>
+            <w:r>
+              <w:rPr>
+                <w:rFonts w:ascii="Times New Roman" w:hAnsi="Times New Roman"/>
+                <w:sz w:val="16"/>
+              </w:rPr>
+              <w:t>+0.0001</w:t>
+            </w:r>
+          </w:p>
+        </w:tc>
       </w:tr>
       <w:tr>
         <w:tc>
           <w:tcPr>
-            <w:tcW w:type="dxa" w:w="2019"/>
+            <w:tcW w:type="dxa" w:w="1262"/>
           </w:tcPr>
           <w:p>
             <w:pPr>
@@ -2011,7 +2936,25 @@
         </w:tc>
         <w:tc>
           <w:tcPr>
-            <w:tcW w:type="dxa" w:w="2019"/>
+            <w:tcW w:type="dxa" w:w="1262"/>
+          </w:tcPr>
+          <w:p>
+            <w:pPr>
+              <w:ind w:firstLine="0"/>
+              <w:jc w:val="center"/>
+            </w:pPr>
+            <w:r>
+              <w:rPr>
+                <w:rFonts w:ascii="Times New Roman" w:hAnsi="Times New Roman"/>
+                <w:sz w:val="16"/>
+              </w:rPr>
+              <w:t>1.1122</w:t>
+            </w:r>
+          </w:p>
+        </w:tc>
+        <w:tc>
+          <w:tcPr>
+            <w:tcW w:type="dxa" w:w="1262"/>
           </w:tcPr>
           <w:p>
             <w:pPr>
@@ -2029,7 +2972,7 @@
         </w:tc>
         <w:tc>
           <w:tcPr>
-            <w:tcW w:type="dxa" w:w="2019"/>
+            <w:tcW w:type="dxa" w:w="1262"/>
           </w:tcPr>
           <w:p>
             <w:pPr>
@@ -2047,7 +2990,25 @@
         </w:tc>
         <w:tc>
           <w:tcPr>
-            <w:tcW w:type="dxa" w:w="2019"/>
+            <w:tcW w:type="dxa" w:w="1262"/>
+          </w:tcPr>
+          <w:p>
+            <w:pPr>
+              <w:ind w:firstLine="0"/>
+              <w:jc w:val="center"/>
+            </w:pPr>
+            <w:r>
+              <w:rPr>
+                <w:rFonts w:ascii="Times New Roman" w:hAnsi="Times New Roman"/>
+                <w:sz w:val="16"/>
+              </w:rPr>
+              <w:t>1.1238</w:t>
+            </w:r>
+          </w:p>
+        </w:tc>
+        <w:tc>
+          <w:tcPr>
+            <w:tcW w:type="dxa" w:w="1262"/>
           </w:tcPr>
           <w:p>
             <w:pPr>
@@ -2065,7 +3026,7 @@
         </w:tc>
         <w:tc>
           <w:tcPr>
-            <w:tcW w:type="dxa" w:w="2019"/>
+            <w:tcW w:type="dxa" w:w="1262"/>
           </w:tcPr>
           <w:p>
             <w:pPr>
@@ -2081,11 +3042,29 @@
             </w:r>
           </w:p>
         </w:tc>
+        <w:tc>
+          <w:tcPr>
+            <w:tcW w:type="dxa" w:w="1262"/>
+          </w:tcPr>
+          <w:p>
+            <w:pPr>
+              <w:ind w:firstLine="0"/>
+              <w:jc w:val="center"/>
+            </w:pPr>
+            <w:r>
+              <w:rPr>
+                <w:rFonts w:ascii="Times New Roman" w:hAnsi="Times New Roman"/>
+                <w:sz w:val="16"/>
+              </w:rPr>
+              <w:t>-0.0125</w:t>
+            </w:r>
+          </w:p>
+        </w:tc>
       </w:tr>
       <w:tr>
         <w:tc>
           <w:tcPr>
-            <w:tcW w:type="dxa" w:w="2019"/>
+            <w:tcW w:type="dxa" w:w="1262"/>
           </w:tcPr>
           <w:p>
             <w:pPr>
@@ -2103,7 +3082,25 @@
         </w:tc>
         <w:tc>
           <w:tcPr>
-            <w:tcW w:type="dxa" w:w="2019"/>
+            <w:tcW w:type="dxa" w:w="1262"/>
+          </w:tcPr>
+          <w:p>
+            <w:pPr>
+              <w:ind w:firstLine="0"/>
+              <w:jc w:val="center"/>
+            </w:pPr>
+            <w:r>
+              <w:rPr>
+                <w:rFonts w:ascii="Times New Roman" w:hAnsi="Times New Roman"/>
+                <w:sz w:val="16"/>
+              </w:rPr>
+              <w:t>1.0907</w:t>
+            </w:r>
+          </w:p>
+        </w:tc>
+        <w:tc>
+          <w:tcPr>
+            <w:tcW w:type="dxa" w:w="1262"/>
           </w:tcPr>
           <w:p>
             <w:pPr>
@@ -2121,7 +3118,7 @@
         </w:tc>
         <w:tc>
           <w:tcPr>
-            <w:tcW w:type="dxa" w:w="2019"/>
+            <w:tcW w:type="dxa" w:w="1262"/>
           </w:tcPr>
           <w:p>
             <w:pPr>
@@ -2139,7 +3136,25 @@
         </w:tc>
         <w:tc>
           <w:tcPr>
-            <w:tcW w:type="dxa" w:w="2019"/>
+            <w:tcW w:type="dxa" w:w="1262"/>
+          </w:tcPr>
+          <w:p>
+            <w:pPr>
+              <w:ind w:firstLine="0"/>
+              <w:jc w:val="center"/>
+            </w:pPr>
+            <w:r>
+              <w:rPr>
+                <w:rFonts w:ascii="Times New Roman" w:hAnsi="Times New Roman"/>
+                <w:sz w:val="16"/>
+              </w:rPr>
+              <w:t>1.1026</w:t>
+            </w:r>
+          </w:p>
+        </w:tc>
+        <w:tc>
+          <w:tcPr>
+            <w:tcW w:type="dxa" w:w="1262"/>
           </w:tcPr>
           <w:p>
             <w:pPr>
@@ -2157,7 +3172,7 @@
         </w:tc>
         <w:tc>
           <w:tcPr>
-            <w:tcW w:type="dxa" w:w="2019"/>
+            <w:tcW w:type="dxa" w:w="1262"/>
           </w:tcPr>
           <w:p>
             <w:pPr>
@@ -2173,11 +3188,29 @@
             </w:r>
           </w:p>
         </w:tc>
+        <w:tc>
+          <w:tcPr>
+            <w:tcW w:type="dxa" w:w="1262"/>
+          </w:tcPr>
+          <w:p>
+            <w:pPr>
+              <w:ind w:firstLine="0"/>
+              <w:jc w:val="center"/>
+            </w:pPr>
+            <w:r>
+              <w:rPr>
+                <w:rFonts w:ascii="Times New Roman" w:hAnsi="Times New Roman"/>
+                <w:sz w:val="16"/>
+              </w:rPr>
+              <w:t>-0.0127</w:t>
+            </w:r>
+          </w:p>
+        </w:tc>
       </w:tr>
       <w:tr>
         <w:tc>
           <w:tcPr>
-            <w:tcW w:type="dxa" w:w="2019"/>
+            <w:tcW w:type="dxa" w:w="1262"/>
           </w:tcPr>
           <w:p>
             <w:pPr>
@@ -2189,13 +3222,31 @@
                 <w:rFonts w:ascii="Times New Roman" w:hAnsi="Times New Roman"/>
                 <w:sz w:val="16"/>
               </w:rPr>
-              <w:t>SBERT + meta + XGB</w:t>
+              <w:t>SBERT + meta + XGBoost</w:t>
             </w:r>
           </w:p>
         </w:tc>
         <w:tc>
           <w:tcPr>
-            <w:tcW w:type="dxa" w:w="2019"/>
+            <w:tcW w:type="dxa" w:w="1262"/>
+          </w:tcPr>
+          <w:p>
+            <w:pPr>
+              <w:ind w:firstLine="0"/>
+              <w:jc w:val="center"/>
+            </w:pPr>
+            <w:r>
+              <w:rPr>
+                <w:rFonts w:ascii="Times New Roman" w:hAnsi="Times New Roman"/>
+                <w:sz w:val="16"/>
+              </w:rPr>
+              <w:t>0.9652</w:t>
+            </w:r>
+          </w:p>
+        </w:tc>
+        <w:tc>
+          <w:tcPr>
+            <w:tcW w:type="dxa" w:w="1262"/>
           </w:tcPr>
           <w:p>
             <w:pPr>
@@ -2213,7 +3264,7 @@
         </w:tc>
         <w:tc>
           <w:tcPr>
-            <w:tcW w:type="dxa" w:w="2019"/>
+            <w:tcW w:type="dxa" w:w="1262"/>
           </w:tcPr>
           <w:p>
             <w:pPr>
@@ -2231,7 +3282,25 @@
         </w:tc>
         <w:tc>
           <w:tcPr>
-            <w:tcW w:type="dxa" w:w="2019"/>
+            <w:tcW w:type="dxa" w:w="1262"/>
+          </w:tcPr>
+          <w:p>
+            <w:pPr>
+              <w:ind w:firstLine="0"/>
+              <w:jc w:val="center"/>
+            </w:pPr>
+            <w:r>
+              <w:rPr>
+                <w:rFonts w:ascii="Times New Roman" w:hAnsi="Times New Roman"/>
+                <w:sz w:val="16"/>
+              </w:rPr>
+              <w:t>0.9791</w:t>
+            </w:r>
+          </w:p>
+        </w:tc>
+        <w:tc>
+          <w:tcPr>
+            <w:tcW w:type="dxa" w:w="1262"/>
           </w:tcPr>
           <w:p>
             <w:pPr>
@@ -2249,7 +3318,7 @@
         </w:tc>
         <w:tc>
           <w:tcPr>
-            <w:tcW w:type="dxa" w:w="2019"/>
+            <w:tcW w:type="dxa" w:w="1262"/>
           </w:tcPr>
           <w:p>
             <w:pPr>
@@ -2262,6 +3331,163 @@
                 <w:sz w:val="16"/>
               </w:rPr>
               <w:t>0.5359</w:t>
+            </w:r>
+          </w:p>
+        </w:tc>
+        <w:tc>
+          <w:tcPr>
+            <w:tcW w:type="dxa" w:w="1262"/>
+          </w:tcPr>
+          <w:p>
+            <w:pPr>
+              <w:ind w:firstLine="0"/>
+              <w:jc w:val="center"/>
+            </w:pPr>
+            <w:r>
+              <w:rPr>
+                <w:rFonts w:ascii="Times New Roman" w:hAnsi="Times New Roman"/>
+                <w:sz w:val="16"/>
+              </w:rPr>
+              <w:t>-0.0131</w:t>
+            </w:r>
+          </w:p>
+        </w:tc>
+      </w:tr>
+      <w:tr>
+        <w:tc>
+          <w:tcPr>
+            <w:tcW w:type="dxa" w:w="1262"/>
+          </w:tcPr>
+          <w:p>
+            <w:pPr>
+              <w:ind w:firstLine="0"/>
+              <w:jc w:val="left"/>
+            </w:pPr>
+            <w:r>
+              <w:rPr>
+                <w:rFonts w:ascii="Times New Roman" w:hAnsi="Times New Roman"/>
+                <w:sz w:val="16"/>
+              </w:rPr>
+              <w:t>Best system: P1 R^2 in [0.5298, 0.5671], P2 R^2 in [0.5162, 0.5537]. Every arm that reads text loses R^2; the metadata-only probe does not.</w:t>
+            </w:r>
+          </w:p>
+        </w:tc>
+        <w:tc>
+          <w:tcPr>
+            <w:tcW w:type="dxa" w:w="1262"/>
+          </w:tcPr>
+          <w:p>
+            <w:pPr>
+              <w:ind w:firstLine="0"/>
+              <w:jc w:val="center"/>
+            </w:pPr>
+            <w:r>
+              <w:rPr>
+                <w:rFonts w:ascii="Times New Roman" w:hAnsi="Times New Roman"/>
+                <w:sz w:val="16"/>
+              </w:rPr>
+            </w:r>
+          </w:p>
+        </w:tc>
+        <w:tc>
+          <w:tcPr>
+            <w:tcW w:type="dxa" w:w="1262"/>
+          </w:tcPr>
+          <w:p>
+            <w:pPr>
+              <w:ind w:firstLine="0"/>
+              <w:jc w:val="center"/>
+            </w:pPr>
+            <w:r>
+              <w:rPr>
+                <w:rFonts w:ascii="Times New Roman" w:hAnsi="Times New Roman"/>
+                <w:sz w:val="16"/>
+              </w:rPr>
+            </w:r>
+          </w:p>
+        </w:tc>
+        <w:tc>
+          <w:tcPr>
+            <w:tcW w:type="dxa" w:w="1262"/>
+          </w:tcPr>
+          <w:p>
+            <w:pPr>
+              <w:ind w:firstLine="0"/>
+              <w:jc w:val="center"/>
+            </w:pPr>
+            <w:r>
+              <w:rPr>
+                <w:rFonts w:ascii="Times New Roman" w:hAnsi="Times New Roman"/>
+                <w:sz w:val="16"/>
+              </w:rPr>
+            </w:r>
+          </w:p>
+        </w:tc>
+        <w:tc>
+          <w:tcPr>
+            <w:tcW w:type="dxa" w:w="1262"/>
+          </w:tcPr>
+          <w:p>
+            <w:pPr>
+              <w:ind w:firstLine="0"/>
+              <w:jc w:val="center"/>
+            </w:pPr>
+            <w:r>
+              <w:rPr>
+                <w:rFonts w:ascii="Times New Roman" w:hAnsi="Times New Roman"/>
+                <w:sz w:val="16"/>
+              </w:rPr>
+            </w:r>
+          </w:p>
+        </w:tc>
+        <w:tc>
+          <w:tcPr>
+            <w:tcW w:type="dxa" w:w="1262"/>
+          </w:tcPr>
+          <w:p>
+            <w:pPr>
+              <w:ind w:firstLine="0"/>
+              <w:jc w:val="center"/>
+            </w:pPr>
+            <w:r>
+              <w:rPr>
+                <w:rFonts w:ascii="Times New Roman" w:hAnsi="Times New Roman"/>
+                <w:sz w:val="16"/>
+              </w:rPr>
+            </w:r>
+          </w:p>
+        </w:tc>
+        <w:tc>
+          <w:tcPr>
+            <w:tcW w:type="dxa" w:w="1262"/>
+          </w:tcPr>
+          <w:p>
+            <w:pPr>
+              <w:ind w:firstLine="0"/>
+              <w:jc w:val="center"/>
+            </w:pPr>
+            <w:r>
+              <w:rPr>
+                <w:rFonts w:ascii="Times New Roman" w:hAnsi="Times New Roman"/>
+                <w:sz w:val="16"/>
+              </w:rPr>
+            </w:r>
+          </w:p>
+        </w:tc>
+        <w:tc>
+          <w:tcPr>
+            <w:tcW w:type="dxa" w:w="1262"/>
+          </w:tcPr>
+          <w:p>
+            <w:pPr>
+              <w:ind w:firstLine="0"/>
+              <w:jc w:val="center"/>
+            </w:pPr>
+            <w:r>
+              <w:rPr>
+                <w:rFonts w:ascii="Times New Roman" w:hAnsi="Times New Roman"/>
+                <w:sz w:val="16"/>
+              </w:rPr>
             </w:r>
           </w:p>
         </w:tc>
@@ -2279,6 +3505,17 @@
           <w:sz w:val="12"/>
         </w:rPr>
       </w:r>
+    </w:p>
+    <w:p>
+      <w:pPr>
+        <w:sectPr>
+          <w:type w:val="continuous"/>
+          <w:pgSz w:w="11909" w:h="16834"/>
+          <w:pgMar w:top="1080" w:right="907" w:bottom="1080" w:left="907" w:header="720" w:footer="720" w:gutter="0"/>
+          <w:cols w:space="240" w:num="1"/>
+          <w:docGrid w:linePitch="360"/>
+        </w:sectPr>
+      </w:pPr>
     </w:p>
     <w:p>
       <w:pPr>
@@ -2307,7 +3544,7 @@
           <w:i w:val="0"/>
           <w:sz w:val="16"/>
         </w:rPr>
-        <w:t>CHRONOLOGICAL HOLDOUT (P3: TRAIN &lt;= 2015, TEST 2020–2025)</w:t>
+        <w:t>Temporal holdout. Fit on films released up to 2015, early stopping on 2016–2019, tested on the 515 films released 2020–2025. Point estimates with 95% percentile bootstrap intervals.</w:t>
       </w:r>
     </w:p>
     <w:tbl>
@@ -2400,7 +3637,7 @@
                 <w:b/>
                 <w:sz w:val="16"/>
               </w:rPr>
-              <w:t>R^2 [95% CI]</w:t>
+              <w:t>^2</w:t>
             </w:r>
           </w:p>
         </w:tc>
@@ -2474,7 +3711,7 @@
                 <w:rFonts w:ascii="Times New Roman" w:hAnsi="Times New Roman"/>
                 <w:sz w:val="16"/>
               </w:rPr>
-              <w:t>-0.0947 [-0.155, -0.041]</w:t>
+              <w:t>-0.0947</w:t>
             </w:r>
           </w:p>
         </w:tc>
@@ -2548,7 +3785,7 @@
                 <w:rFonts w:ascii="Times New Roman" w:hAnsi="Times New Roman"/>
                 <w:sz w:val="16"/>
               </w:rPr>
-              <w:t>0.1473 [0.061, 0.224]</w:t>
+              <w:t>0.1473</w:t>
             </w:r>
           </w:p>
         </w:tc>
@@ -2622,7 +3859,7 @@
                 <w:rFonts w:ascii="Times New Roman" w:hAnsi="Times New Roman"/>
                 <w:sz w:val="16"/>
               </w:rPr>
-              <w:t>0.1591 [0.076, 0.236]</w:t>
+              <w:t>0.1591</w:t>
             </w:r>
           </w:p>
         </w:tc>
@@ -2696,7 +3933,7 @@
                 <w:rFonts w:ascii="Times New Roman" w:hAnsi="Times New Roman"/>
                 <w:sz w:val="16"/>
               </w:rPr>
-              <w:t>0.2671 [0.174, 0.354]</w:t>
+              <w:t>0.2671</w:t>
             </w:r>
           </w:p>
         </w:tc>
@@ -2716,7 +3953,7 @@
                 <w:rFonts w:ascii="Times New Roman" w:hAnsi="Times New Roman"/>
                 <w:sz w:val="16"/>
               </w:rPr>
-              <w:t>SBERT + meta + XGB</w:t>
+              <w:t>SBERT + meta + XGBoost</w:t>
             </w:r>
           </w:p>
         </w:tc>
@@ -2770,7 +4007,149 @@
                 <w:rFonts w:ascii="Times New Roman" w:hAnsi="Times New Roman"/>
                 <w:sz w:val="16"/>
               </w:rPr>
-              <w:t>\mathbf0.3089 [0.1985, 0.4038]</w:t>
+              <w:t>0.3089</w:t>
+            </w:r>
+          </w:p>
+        </w:tc>
+      </w:tr>
+      <w:tr>
+        <w:tc>
+          <w:tcPr>
+            <w:tcW w:type="dxa" w:w="2524"/>
+          </w:tcPr>
+          <w:p>
+            <w:pPr>
+              <w:ind w:firstLine="0"/>
+              <w:jc w:val="left"/>
+            </w:pPr>
+            <w:r>
+              <w:rPr>
+                <w:rFonts w:ascii="Times New Roman" w:hAnsi="Times New Roman"/>
+                <w:sz w:val="16"/>
+              </w:rPr>
+              <w:t>Best system R^2 in [0.1985, 0.4038]; n = 3,918 / 731 / 515; lambda = 6.41%.</w:t>
+            </w:r>
+          </w:p>
+        </w:tc>
+        <w:tc>
+          <w:tcPr>
+            <w:tcW w:type="dxa" w:w="2524"/>
+          </w:tcPr>
+          <w:p>
+            <w:pPr>
+              <w:ind w:firstLine="0"/>
+              <w:jc w:val="center"/>
+            </w:pPr>
+            <w:r>
+              <w:rPr>
+                <w:rFonts w:ascii="Times New Roman" w:hAnsi="Times New Roman"/>
+                <w:sz w:val="16"/>
+              </w:rPr>
+            </w:r>
+          </w:p>
+        </w:tc>
+        <w:tc>
+          <w:tcPr>
+            <w:tcW w:type="dxa" w:w="2524"/>
+          </w:tcPr>
+          <w:p>
+            <w:pPr>
+              <w:ind w:firstLine="0"/>
+              <w:jc w:val="center"/>
+            </w:pPr>
+            <w:r>
+              <w:rPr>
+                <w:rFonts w:ascii="Times New Roman" w:hAnsi="Times New Roman"/>
+                <w:sz w:val="16"/>
+              </w:rPr>
+            </w:r>
+          </w:p>
+        </w:tc>
+        <w:tc>
+          <w:tcPr>
+            <w:tcW w:type="dxa" w:w="2524"/>
+          </w:tcPr>
+          <w:p>
+            <w:pPr>
+              <w:ind w:firstLine="0"/>
+              <w:jc w:val="center"/>
+            </w:pPr>
+            <w:r>
+              <w:rPr>
+                <w:rFonts w:ascii="Times New Roman" w:hAnsi="Times New Roman"/>
+                <w:sz w:val="16"/>
+              </w:rPr>
+            </w:r>
+          </w:p>
+        </w:tc>
+      </w:tr>
+      <w:tr>
+        <w:tc>
+          <w:tcPr>
+            <w:tcW w:type="dxa" w:w="2524"/>
+          </w:tcPr>
+          <w:p>
+            <w:pPr>
+              <w:ind w:firstLine="0"/>
+              <w:jc w:val="left"/>
+            </w:pPr>
+            <w:r>
+              <w:rPr>
+                <w:rFonts w:ascii="Times New Roman" w:hAnsi="Times New Roman"/>
+                <w:sz w:val="16"/>
+              </w:rPr>
+              <w:t>Target: train 6.0119 ± 1.4619, holdout 5.7546 ± 1.1701.</w:t>
+            </w:r>
+          </w:p>
+        </w:tc>
+        <w:tc>
+          <w:tcPr>
+            <w:tcW w:type="dxa" w:w="2524"/>
+          </w:tcPr>
+          <w:p>
+            <w:pPr>
+              <w:ind w:firstLine="0"/>
+              <w:jc w:val="center"/>
+            </w:pPr>
+            <w:r>
+              <w:rPr>
+                <w:rFonts w:ascii="Times New Roman" w:hAnsi="Times New Roman"/>
+                <w:sz w:val="16"/>
+              </w:rPr>
+            </w:r>
+          </w:p>
+        </w:tc>
+        <w:tc>
+          <w:tcPr>
+            <w:tcW w:type="dxa" w:w="2524"/>
+          </w:tcPr>
+          <w:p>
+            <w:pPr>
+              <w:ind w:firstLine="0"/>
+              <w:jc w:val="center"/>
+            </w:pPr>
+            <w:r>
+              <w:rPr>
+                <w:rFonts w:ascii="Times New Roman" w:hAnsi="Times New Roman"/>
+                <w:sz w:val="16"/>
+              </w:rPr>
+            </w:r>
+          </w:p>
+        </w:tc>
+        <w:tc>
+          <w:tcPr>
+            <w:tcW w:type="dxa" w:w="2524"/>
+          </w:tcPr>
+          <w:p>
+            <w:pPr>
+              <w:ind w:firstLine="0"/>
+              <w:jc w:val="center"/>
+            </w:pPr>
+            <w:r>
+              <w:rPr>
+                <w:rFonts w:ascii="Times New Roman" w:hAnsi="Times New Roman"/>
+                <w:sz w:val="16"/>
+              </w:rPr>
             </w:r>
           </w:p>
         </w:tc>
@@ -2800,7 +4179,7 @@
           <w:i w:val="0"/>
           <w:sz w:val="20"/>
         </w:rPr>
-        <w:t>Grouping by title family (P2) reduces R^2 by 0.0131. This reduction occurs exclusively in systems reading text: SBERT ridge loses 0.0125 and SBERT+XGBoost loses 0.0127, while metadata OLS is unaffected (+0.0001). Franchise leakage is strictly a textual channel.</w:t>
+        <w:t>Grouping costs little. The best system moves from R^2 = 0.5490 to 0.5359, a drop of 0.0131, and the two bootstrap intervals overlap substantially. The effect is consistently negative across every system that reads text — SBERT ridge loses 0.0125 R^2, SBERT+XGBoost loses 0.0127 — while the metadata-only probe is unmoved (0.3888 -&gt; 0.3889). Franchise leakage is a textual channel, and a metadata model cannot exploit it because it never sees the words.</w:t>
       </w:r>
     </w:p>
     <w:p>
@@ -2814,7 +4193,7 @@
           <w:i w:val="0"/>
           <w:sz w:val="20"/>
         </w:rPr>
-        <w:t>The chronological split (P3) produces substantial degradation: the full model drops from R^2=0.549 to R^2=0.309, with non-overlapping bootstrap intervals. Metadata OLS loses 62% of its explanatory power (0.3889 to 0.1473), whereas text-only SBERT loses 35% (0.4114 to 0.2671). The metadata features that appear most dominant under random splits generalize poorest over time.</w:t>
+        <w:t>Chronology costs a great deal. The same best system falls to R^2 = 0.3089, and the interval [0.1985, 0.4038] no longer overlaps either in-corpus estimate. The constant-mean predictor goes from R^2 ≈ 0 to -0.0947, which is a pure distribution-shift effect: the training mean (6.11) is simply wrong for the holdout (5.75). And the metadata probe collapses from 0.3889 to 0.1473, losing 62% of its explanatory power, while the text-only SBERT model loses 35% (0.4114 -&gt; 0.2671).</w:t>
       </w:r>
     </w:p>
     <w:p>
@@ -2828,7 +4207,7 @@
           <w:i/>
           <w:sz w:val="20"/>
         </w:rPr>
-        <w:t>B. Paired Statistical Comparisons</w:t>
+        <w:t>B. Paired comparisons</w:t>
       </w:r>
     </w:p>
     <w:p>
@@ -2842,7 +4221,7 @@
           <w:i w:val="0"/>
           <w:sz w:val="20"/>
         </w:rPr>
-        <w:t>Table IV presents paired error tests against SBERT + meta + XGBoost.</w:t>
+        <w:t>Table IV reports every baseline against the best system on matched records.</w:t>
       </w:r>
     </w:p>
     <w:p>
@@ -2872,7 +4251,7 @@
           <w:i w:val="0"/>
           <w:sz w:val="16"/>
         </w:rPr>
-        <w:t>PAIRED WILCOXON SIGNED-RANK TEST AGAINST FULL SYSTEM</w:t>
+        <w:t>Paired comparison against SBERT + metadata + XGBoost. DeltaMAE is positive when the reference system has lower error. p from the two-sided Wilcoxon signed-rank test.</w:t>
       </w:r>
     </w:p>
     <w:tbl>
@@ -2926,7 +4305,7 @@
                 <w:b/>
                 <w:sz w:val="16"/>
               </w:rPr>
-              <w:t>Baseline Model</w:t>
+              <w:t>Baseline</w:t>
             </w:r>
           </w:p>
         </w:tc>
@@ -2985,7 +4364,6 @@
                 <w:b/>
                 <w:sz w:val="16"/>
               </w:rPr>
-              <w:t>-value</w:t>
             </w:r>
           </w:p>
         </w:tc>
@@ -3006,6 +4384,97 @@
                 <w:sz w:val="16"/>
               </w:rPr>
               <w:t>P1</w:t>
+            </w:r>
+          </w:p>
+        </w:tc>
+        <w:tc>
+          <w:tcPr>
+            <w:tcW w:type="dxa" w:w="2019"/>
+          </w:tcPr>
+          <w:p>
+            <w:pPr>
+              <w:ind w:firstLine="0"/>
+              <w:jc w:val="center"/>
+            </w:pPr>
+            <w:r>
+              <w:rPr>
+                <w:rFonts w:ascii="Times New Roman" w:hAnsi="Times New Roman"/>
+                <w:sz w:val="16"/>
+              </w:rPr>
+              <w:t>Constant mean</w:t>
+            </w:r>
+          </w:p>
+        </w:tc>
+        <w:tc>
+          <w:tcPr>
+            <w:tcW w:type="dxa" w:w="2019"/>
+          </w:tcPr>
+          <w:p>
+            <w:pPr>
+              <w:ind w:firstLine="0"/>
+              <w:jc w:val="center"/>
+            </w:pPr>
+            <w:r>
+              <w:rPr>
+                <w:rFonts w:ascii="Times New Roman" w:hAnsi="Times New Roman"/>
+                <w:sz w:val="16"/>
+              </w:rPr>
+              <w:t>+0.4485</w:t>
+            </w:r>
+          </w:p>
+        </w:tc>
+        <w:tc>
+          <w:tcPr>
+            <w:tcW w:type="dxa" w:w="2019"/>
+          </w:tcPr>
+          <w:p>
+            <w:pPr>
+              <w:ind w:firstLine="0"/>
+              <w:jc w:val="center"/>
+            </w:pPr>
+            <w:r>
+              <w:rPr>
+                <w:rFonts w:ascii="Times New Roman" w:hAnsi="Times New Roman"/>
+                <w:sz w:val="16"/>
+              </w:rPr>
+              <w:t>[+0.427, +0.471]</w:t>
+            </w:r>
+          </w:p>
+        </w:tc>
+        <w:tc>
+          <w:tcPr>
+            <w:tcW w:type="dxa" w:w="2019"/>
+          </w:tcPr>
+          <w:p>
+            <w:pPr>
+              <w:ind w:firstLine="0"/>
+              <w:jc w:val="center"/>
+            </w:pPr>
+            <w:r>
+              <w:rPr>
+                <w:rFonts w:ascii="Times New Roman" w:hAnsi="Times New Roman"/>
+                <w:sz w:val="16"/>
+              </w:rPr>
+              <w:t>2.2 × 10^-281</w:t>
+            </w:r>
+          </w:p>
+        </w:tc>
+      </w:tr>
+      <w:tr>
+        <w:tc>
+          <w:tcPr>
+            <w:tcW w:type="dxa" w:w="2019"/>
+          </w:tcPr>
+          <w:p>
+            <w:pPr>
+              <w:ind w:firstLine="0"/>
+              <w:jc w:val="left"/>
+            </w:pPr>
+            <w:r>
+              <w:rPr>
+                <w:rFonts w:ascii="Times New Roman" w:hAnsi="Times New Roman"/>
+                <w:sz w:val="16"/>
+              </w:rPr>
             </w:r>
           </w:p>
         </w:tc>
@@ -3205,7 +4674,7 @@
                 <w:rFonts w:ascii="Times New Roman" w:hAnsi="Times New Roman"/>
                 <w:sz w:val="16"/>
               </w:rPr>
-              <w:t>SBERT + XGBoost</w:t>
+              <w:t>SBERT + XGB</w:t>
             </w:r>
           </w:p>
         </w:tc>
@@ -3280,6 +4749,97 @@
                 <w:sz w:val="16"/>
               </w:rPr>
               <w:t>P2</w:t>
+            </w:r>
+          </w:p>
+        </w:tc>
+        <w:tc>
+          <w:tcPr>
+            <w:tcW w:type="dxa" w:w="2019"/>
+          </w:tcPr>
+          <w:p>
+            <w:pPr>
+              <w:ind w:firstLine="0"/>
+              <w:jc w:val="center"/>
+            </w:pPr>
+            <w:r>
+              <w:rPr>
+                <w:rFonts w:ascii="Times New Roman" w:hAnsi="Times New Roman"/>
+                <w:sz w:val="16"/>
+              </w:rPr>
+              <w:t>Constant mean</w:t>
+            </w:r>
+          </w:p>
+        </w:tc>
+        <w:tc>
+          <w:tcPr>
+            <w:tcW w:type="dxa" w:w="2019"/>
+          </w:tcPr>
+          <w:p>
+            <w:pPr>
+              <w:ind w:firstLine="0"/>
+              <w:jc w:val="center"/>
+            </w:pPr>
+            <w:r>
+              <w:rPr>
+                <w:rFonts w:ascii="Times New Roman" w:hAnsi="Times New Roman"/>
+                <w:sz w:val="16"/>
+              </w:rPr>
+              <w:t>+0.4456</w:t>
+            </w:r>
+          </w:p>
+        </w:tc>
+        <w:tc>
+          <w:tcPr>
+            <w:tcW w:type="dxa" w:w="2019"/>
+          </w:tcPr>
+          <w:p>
+            <w:pPr>
+              <w:ind w:firstLine="0"/>
+              <w:jc w:val="center"/>
+            </w:pPr>
+            <w:r>
+              <w:rPr>
+                <w:rFonts w:ascii="Times New Roman" w:hAnsi="Times New Roman"/>
+                <w:sz w:val="16"/>
+              </w:rPr>
+              <w:t>[+0.424, +0.466]</w:t>
+            </w:r>
+          </w:p>
+        </w:tc>
+        <w:tc>
+          <w:tcPr>
+            <w:tcW w:type="dxa" w:w="2019"/>
+          </w:tcPr>
+          <w:p>
+            <w:pPr>
+              <w:ind w:firstLine="0"/>
+              <w:jc w:val="center"/>
+            </w:pPr>
+            <w:r>
+              <w:rPr>
+                <w:rFonts w:ascii="Times New Roman" w:hAnsi="Times New Roman"/>
+                <w:sz w:val="16"/>
+              </w:rPr>
+              <w:t>2.9 × 10^-280</w:t>
+            </w:r>
+          </w:p>
+        </w:tc>
+      </w:tr>
+      <w:tr>
+        <w:tc>
+          <w:tcPr>
+            <w:tcW w:type="dxa" w:w="2019"/>
+          </w:tcPr>
+          <w:p>
+            <w:pPr>
+              <w:ind w:firstLine="0"/>
+              <w:jc w:val="left"/>
+            </w:pPr>
+            <w:r>
+              <w:rPr>
+                <w:rFonts w:ascii="Times New Roman" w:hAnsi="Times New Roman"/>
+                <w:sz w:val="16"/>
+              </w:rPr>
             </w:r>
           </w:p>
         </w:tc>
@@ -3479,7 +5039,7 @@
                 <w:rFonts w:ascii="Times New Roman" w:hAnsi="Times New Roman"/>
                 <w:sz w:val="16"/>
               </w:rPr>
-              <w:t>SBERT + XGBoost</w:t>
+              <w:t>SBERT + XGB</w:t>
             </w:r>
           </w:p>
         </w:tc>
@@ -3554,6 +5114,97 @@
                 <w:sz w:val="16"/>
               </w:rPr>
               <w:t>P3</w:t>
+            </w:r>
+          </w:p>
+        </w:tc>
+        <w:tc>
+          <w:tcPr>
+            <w:tcW w:type="dxa" w:w="2019"/>
+          </w:tcPr>
+          <w:p>
+            <w:pPr>
+              <w:ind w:firstLine="0"/>
+              <w:jc w:val="center"/>
+            </w:pPr>
+            <w:r>
+              <w:rPr>
+                <w:rFonts w:ascii="Times New Roman" w:hAnsi="Times New Roman"/>
+                <w:sz w:val="16"/>
+              </w:rPr>
+              <w:t>Constant mean</w:t>
+            </w:r>
+          </w:p>
+        </w:tc>
+        <w:tc>
+          <w:tcPr>
+            <w:tcW w:type="dxa" w:w="2019"/>
+          </w:tcPr>
+          <w:p>
+            <w:pPr>
+              <w:ind w:firstLine="0"/>
+              <w:jc w:val="center"/>
+            </w:pPr>
+            <w:r>
+              <w:rPr>
+                <w:rFonts w:ascii="Times New Roman" w:hAnsi="Times New Roman"/>
+                <w:sz w:val="16"/>
+              </w:rPr>
+              <w:t>+0.2530</w:t>
+            </w:r>
+          </w:p>
+        </w:tc>
+        <w:tc>
+          <w:tcPr>
+            <w:tcW w:type="dxa" w:w="2019"/>
+          </w:tcPr>
+          <w:p>
+            <w:pPr>
+              <w:ind w:firstLine="0"/>
+              <w:jc w:val="center"/>
+            </w:pPr>
+            <w:r>
+              <w:rPr>
+                <w:rFonts w:ascii="Times New Roman" w:hAnsi="Times New Roman"/>
+                <w:sz w:val="16"/>
+              </w:rPr>
+              <w:t>[+0.195, +0.313]</w:t>
+            </w:r>
+          </w:p>
+        </w:tc>
+        <w:tc>
+          <w:tcPr>
+            <w:tcW w:type="dxa" w:w="2019"/>
+          </w:tcPr>
+          <w:p>
+            <w:pPr>
+              <w:ind w:firstLine="0"/>
+              <w:jc w:val="center"/>
+            </w:pPr>
+            <w:r>
+              <w:rPr>
+                <w:rFonts w:ascii="Times New Roman" w:hAnsi="Times New Roman"/>
+                <w:sz w:val="16"/>
+              </w:rPr>
+              <w:t>5.7 × 10^-15</w:t>
+            </w:r>
+          </w:p>
+        </w:tc>
+      </w:tr>
+      <w:tr>
+        <w:tc>
+          <w:tcPr>
+            <w:tcW w:type="dxa" w:w="2019"/>
+          </w:tcPr>
+          <w:p>
+            <w:pPr>
+              <w:ind w:firstLine="0"/>
+              <w:jc w:val="left"/>
+            </w:pPr>
+            <w:r>
+              <w:rPr>
+                <w:rFonts w:ascii="Times New Roman" w:hAnsi="Times New Roman"/>
+                <w:sz w:val="16"/>
+              </w:rPr>
             </w:r>
           </w:p>
         </w:tc>
@@ -3753,7 +5404,7 @@
                 <w:rFonts w:ascii="Times New Roman" w:hAnsi="Times New Roman"/>
                 <w:sz w:val="16"/>
               </w:rPr>
-              <w:t>SBERT + XGBoost</w:t>
+              <w:t>SBERT + XGB</w:t>
             </w:r>
           </w:p>
         </w:tc>
@@ -3807,7 +5458,7 @@
                 <w:rFonts w:ascii="Times New Roman" w:hAnsi="Times New Roman"/>
                 <w:sz w:val="16"/>
               </w:rPr>
-              <w:t>\mathbf0.273</w:t>
+              <w:t>0.273</w:t>
             </w:r>
           </w:p>
         </w:tc>
@@ -3837,7 +5488,7 @@
           <w:i w:val="0"/>
           <w:sz w:val="20"/>
         </w:rPr>
-        <w:t>Under P1 and P2, combining metadata with embeddings yields large, statistically significant improvements (DeltaMAE ≈ 0.11, p &lt; 10^-45). Under P3, however, adding metadata yields an insignificant DeltaMAE = 0.0236 (p=0.273, W=62,734, rank-biserial r=+0.056). The metadata block provides no measurable benefit on genuinely unseen future films.</w:t>
+        <w:t>The final row is the one that changes the story. Under P1 and P2, adding the three metadata columns to the embedding buys a highly significant 0.108–0.114 rating points of mean absolute error. Under P3 the same addition buys 0.0236 points, with an interval straddling zero and p = 0.273; the full statistics are W = 62,734 over n = 515 pairs with no ties, rank-biserial r = +0.056. An effect size of 0.056 is negligible by any convention. The metadata block, worth two orders of magnitude in p-value under a random split, is not measurably useful when the test films are genuinely unseen.</w:t>
       </w:r>
     </w:p>
     <w:p>
@@ -3851,7 +5502,7 @@
           <w:i/>
           <w:sz w:val="20"/>
         </w:rPr>
-        <w:t>C. Lexical Control and Ensembling</w:t>
+        <w:t>C. Temporal shift in detail</w:t>
       </w:r>
     </w:p>
     <w:p>
@@ -3865,7 +5516,7 @@
           <w:i w:val="0"/>
           <w:sz w:val="20"/>
         </w:rPr>
-        <w:t>On the 5-fold CV subset with full raw text (n=5,195), TF-IDF+XGBoost (R^2 = 0.433 ± 0.014) performs on par with 16 structural statistics (R^2 = 0.440 ± 0.007). SBERT outperforms TF-IDF by DeltaMAE = 0.0514 (p = 2.6 × 10^-5). Ensembling all representations via Ridge stacking yields R^2 = 0.577, and TPE hyperparameter tuning reaches R^2 = 0.581. These model optimization gains (+0.032) are minor compared to the 0.240 R^2 lost to the temporal shift.</w:t>
+        <w:t>The holdout target is compressed relative to the training pool: standard deviation falls from 1.4619 (records up to 2019) to 1.1701 (2020–2025), while the mean falls from 6.0119 to 5.7546. Part of the R^2 collapse is therefore arithmetic — the same absolute error against a narrower target yields a smaller R^2 — and part is genuine degradation. Mean absolute error separates them: it is 0.7276 under P1 and 0.7232 under P3, statistically indistinguishable. The model's typical error in rating points does not grow at all when it predicts the future. What collapses is how much of the (now narrower) variance it can order. Regressing prediction on truth over the holdout gives slope 0.4634 (s.e. 0.0278) and intercept 3.1745, against an ideal slope of 1.</w:t>
       </w:r>
     </w:p>
     <w:p>
@@ -3880,7 +5531,7 @@
           <w:i w:val="0"/>
           <w:sz w:val="20"/>
         </w:rPr>
-        <w:t>VI. FEATURE ATTRIBUTION AND MECHANISM ANALYSIS</w:t>
+        <w:t>VI. WHAT THE FEATURES ARE DOING</w:t>
       </w:r>
     </w:p>
     <w:p>
@@ -3894,7 +5545,7 @@
           <w:i/>
           <w:sz w:val="20"/>
         </w:rPr>
-        <w:t>A. Split Gain vs. Deployment Utility</w:t>
+        <w:t>A. In-sample gain is not out-of-sample use</w:t>
       </w:r>
     </w:p>
     <w:p>
@@ -3908,7 +5559,7 @@
           <w:i w:val="0"/>
           <w:sz w:val="20"/>
         </w:rPr>
-        <w:t>In the gradient-boosted model, 384 SBERT dimensions account for 55.45% of total split gain (mean 0.14% per dimension), 3 metadata columns account for 36.57% (movie_length 25.50%, year 11.01%, decade 0.06%), and 16 structural statistics account for 7.98% (dominated by length proxies char_count 2.41% and word_count 1.56%).</w:t>
+        <w:t>The 384 embedding dimensions take 55.5%, the three metadata columns take 36.6%, and the sixteen structural statistics take 8.0%. Per dimension the picture inverts: the single largest embedding dimension contributes 1.68% and the mean dimension 0.14%, whereas movie_length alone contributes 25.50% and year 11.01%. One tabular column outweighs all sixteen structural statistics by a factor of three.</w:t>
       </w:r>
     </w:p>
     <w:p>
@@ -3922,7 +5573,7 @@
           <w:i/>
           <w:sz w:val="20"/>
         </w:rPr>
-        <w:t>B. Block Permutation on the Temporal Holdout</w:t>
+        <w:t>B. Block permutation on the temporal holdout</w:t>
       </w:r>
     </w:p>
     <w:p>
@@ -3936,7 +5587,7 @@
           <w:i w:val="0"/>
           <w:sz w:val="20"/>
         </w:rPr>
-        <w:t>Permuting feature blocks across the 515 holdout films (20 iterations; baseline MAE = 0.7232) reveals the mechanism of temporal breakdown:</w:t>
+        <w:t>Gain is computed on training splits and therefore inherits every in-sample advantage. Permutation on the holdout does not. We shuffle each feature block across the 515 holdout films, re-predict, and record the increase in MAE over 20 repetitions; the baseline is MAE = 0.7232:</w:t>
       </w:r>
     </w:p>
     <w:p>
@@ -3948,7 +5599,7 @@
           <w:rFonts w:ascii="Times New Roman" w:hAnsi="Times New Roman"/>
           <w:sz w:val="20"/>
         </w:rPr>
-        <w:t>Permuting all metadata: DeltaMAE = +0.2168 ± 0.0250</w:t>
+        <w:t>permuting all three metadata columns: +0.2168 ± 0.0250;</w:t>
       </w:r>
     </w:p>
     <w:p>
@@ -3960,7 +5611,7 @@
           <w:rFonts w:ascii="Times New Roman" w:hAnsi="Times New Roman"/>
           <w:sz w:val="20"/>
         </w:rPr>
-        <w:t>Permuting movie_length alone: DeltaMAE = +0.1988 ± 0.0185</w:t>
+        <w:t>permuting movie_length alone: +0.1988 ± 0.0185;</w:t>
       </w:r>
     </w:p>
     <w:p>
@@ -3972,7 +5623,7 @@
           <w:rFonts w:ascii="Times New Roman" w:hAnsi="Times New Roman"/>
           <w:sz w:val="20"/>
         </w:rPr>
-        <w:t>Permuting 384 SBERT embeddings: DeltaMAE = +0.1950 ± 0.0217</w:t>
+        <w:t>permuting the entire 384-dimensional embedding: +0.1950 ± 0.0217;</w:t>
       </w:r>
     </w:p>
     <w:p>
@@ -3984,7 +5635,7 @@
           <w:rFonts w:ascii="Times New Roman" w:hAnsi="Times New Roman"/>
           <w:sz w:val="20"/>
         </w:rPr>
-        <w:t>Permuting year: DeltaMAE = +0.0000 ± 0.0000</w:t>
+        <w:t>permuting year: +0.0000 ± 0.0000;</w:t>
       </w:r>
     </w:p>
     <w:p>
@@ -3996,7 +5647,7 @@
           <w:rFonts w:ascii="Times New Roman" w:hAnsi="Times New Roman"/>
           <w:sz w:val="20"/>
         </w:rPr>
-        <w:t>Permuting decade_encoded: DeltaMAE = +0.0000 ± 0.0000</w:t>
+        <w:t>permuting decade_encoded: +0.0000 ± 0.0000.</w:t>
       </w:r>
     </w:p>
     <w:p>
@@ -4010,7 +5661,21 @@
           <w:i w:val="0"/>
           <w:sz w:val="20"/>
         </w:rPr>
-        <w:t>The exact zero increase for calendar features is structural: because all test films postdate the training range (&gt;2015), test instances traverse the identical tree branches regardless of release year. The feature supplying 11% of in-sample gain becomes entirely inert at deployment. In contrast, runtime (movie_length) transfers cleanly across decades, reproducing the predictive contribution of the entire 384-dimensional embedding block.</w:t>
+        <w:t>The two zeros are not rounding. Every holdout film was released in 2020–2025, and the model was fitted on films up to 2015, so every holdout value of year lies beyond the largest training split threshold. A tree ensemble routes all of them down the same branch; shuffling values that already share a leaf changes nothing. The feature carrying 11% of in-sample gain becomes a constant at deployment.</w:t>
+      </w:r>
+    </w:p>
+    <w:p>
+      <w:pPr>
+        <w:spacing w:before="0" w:after="60"/>
+        <w:ind w:firstLine="288"/>
+      </w:pPr>
+      <w:r>
+        <w:rPr>
+          <w:b w:val="0"/>
+          <w:i w:val="0"/>
+          <w:sz w:val="20"/>
+        </w:rPr>
+        <w:t>Runtime is the opposite case. It transfers cleanly, because a 130-minute film in 2023 occupies the same region of feature space as a 130-minute film in 1994, and it alone reproduces the predictive value of the entire semantic block. The honest summary of the temporal result is that the model has two working channels: how long the film is, and what the screenplay is broadly about. The calendar is not one of them.</w:t>
       </w:r>
     </w:p>
     <w:p>
@@ -4024,7 +5689,7 @@
           <w:i/>
           <w:sz w:val="20"/>
         </w:rPr>
-        <w:t>C. Mechanisms Limiting Semantic Signal</w:t>
+        <w:t>C. Why mean pooling limits the semantic channel</w:t>
       </w:r>
     </w:p>
     <w:p>
@@ -4038,7 +5703,7 @@
           <w:i w:val="0"/>
           <w:sz w:val="20"/>
         </w:rPr>
-        <w:t>While SBERT embeddings contribute +0.1950 MAE under permutation, gain is distributed diffusely across all dimensions. Arithmetic mean pooling across 36 unit-norm window vectors compresses script embeddings toward the corpus centroid, attenuating localized dialogue cues. Combined with the 31.60% token loss from silent truncation, the semantic pipeline operates over a heavily smoothed representation.</w:t>
+        <w:t>The embedding block earns +0.195 MAE under permutation, so it carries real signal, but its per-dimension gain is flat — no dimension exceeds 1.7% and none is unused. Combined with the 31.6% of tokens that truncation removes before pooling begins, the semantic channel is operating on a heavily smoothed, partially observed view of the screenplay.</w:t>
       </w:r>
     </w:p>
     <w:p>
@@ -4067,7 +5732,49 @@
           <w:i w:val="0"/>
           <w:sz w:val="20"/>
         </w:rPr>
-        <w:t>enumerate Subset text audit: Byte SHA-256 deduplication was verified on 356 distributed scripts (0 duplicates). While metadata keys confirm zero duplicate IDs across all 5,204 records, unobserved text collisions among non-distributed scripts remain possible. IMSDb curation bias: Corpus mean ratings fall from 7.87 in the 1920s to 5.48 in the 2010s, reflecting community curation preferences. Models reading year exploit this artifact. Target variance compression: Rating standard deviation falls from 1.46 (pre-2020) to 1.17 (2020–2025). Part of the R^2 drop is mathematical (R^2 scales with target variance), while MAE remains stable (0.7232). Deployment unavailability of runtime: Runtime drives temporal transfer, yet runtime is unknown prior to film production. Defaulting metadata to constants reduces deployed performance to the text-only baseline (R^2=0.267). Observational ceiling: Ratings aggregate direction, acting, marketing, and cultural timing. A screenplay model establishes a lower bound on text predictive power, not an upper ceiling on commercial forecasting. enumerate</w:t>
+        <w:t>The content-digest audit is verified on a subset. As stated in Section III, SHA-256 deduplication was executed over the 356 script files distributed with the code and returned zero duplicate groups. The metadata identity keys covering all 5,204 records found no duplicate identifiers and no duplicate title×year pairs, which bounds the plausible residual duplication, but does not eliminate the possibility of two distinct films sharing a byte-identical file through a scraping error. We report this rather than assert a number we did not compute.</w:t>
+      </w:r>
+    </w:p>
+    <w:p>
+      <w:pPr>
+        <w:spacing w:before="0" w:after="60"/>
+        <w:ind w:firstLine="288"/>
+      </w:pPr>
+      <w:r>
+        <w:rPr>
+          <w:b w:val="0"/>
+          <w:i w:val="0"/>
+          <w:sz w:val="20"/>
+        </w:rPr>
+        <w:t>Selection effects in IMSDb are severe and not correctable. Contributors upload what they value, so canonical and acclaimed films are over-represented among older titles while recent years sample more broadly. The corpus-wide mean rating falls monotonically from 7.87 in the 1920s to 5.48 in the 2010s, which is a statement about who uploads what, not about film quality. Any model reading year learns this curation artifact, and P3 is the protocol that refuses to reward it. Generalisation claims extend to films resembling IMSDb's selection, not to an arbitrary IMDb title.</w:t>
+      </w:r>
+    </w:p>
+    <w:p>
+      <w:pPr>
+        <w:spacing w:before="0" w:after="60"/>
+        <w:ind w:firstLine="288"/>
+      </w:pPr>
+      <w:r>
+        <w:rPr>
+          <w:b w:val="0"/>
+          <w:i w:val="0"/>
+          <w:sz w:val="20"/>
+        </w:rPr>
+        <w:t>Temporal target compression confounds R^2. The holdout's rating standard deviation is 0.80× the training pool's. Because R^2 is normalised by target variance, part of the 0.536 -&gt; 0.309 drop is definitional. We report MAE alongside for this reason, and MAE is flat across protocols. Readers should treat the R^2 collapse as a statement about rank-ordering power on recent films, not about absolute error growth.</w:t>
+      </w:r>
+    </w:p>
+    <w:p>
+      <w:pPr>
+        <w:spacing w:before="0" w:after="60"/>
+        <w:ind w:firstLine="288"/>
+      </w:pPr>
+      <w:r>
+        <w:rPr>
+          <w:b w:val="0"/>
+          <w:i w:val="0"/>
+          <w:sz w:val="20"/>
+        </w:rPr>
+        <w:t>The strongest transferring feature is unavailable at deployment. Runtime dominates the temporal holdout, matching the entire embedding block under permutation. A screenplay-stage predictor does not know the runtime, because the film has not been cut — or shot. The repository's own inference path concedes the point: when metadata is not supplied it substitutes constants, defaulting movie_length to 120 minutes, year to 2020, and decade_encoded to 0. Under those defaults the deployed system is closer to our SBERT-only row (R^2 = 0.267 on the holdout) than to the headline.</w:t>
       </w:r>
     </w:p>
     <w:p>
@@ -4096,7 +5803,7 @@
           <w:i w:val="0"/>
           <w:sz w:val="20"/>
         </w:rPr>
-        <w:t>Evaluating screenplay-to-rating predictors under shuffled train/test partitions creates an illusion of predictive skill. On 5,164 audited IMSDb scripts, random 5-fold CV yields R^2 = 0.549; grouping by franchise reduces this to 0.536; and holding out future release years drops performance to R^2 = 0.309. Block-permutation analysis confirms that release year contributes 11% of in-sample split gain but zero utility on future holdouts, while runtime matches the explanatory power of the entire 384-dimensional sentence-embedding block. Furthermore, naive word chunking silently discards 31.60% of tokens before encoding.</w:t>
+        <w:t>We audited a screenplay-to-rating pipeline instead of extending it. The corpus turned out to be clean at the record level — 5,204 distinct identifiers, no repeated title×year pair — but to carry 164 multi-member title families, four corrupt release years, and a corrupt ordinal decade vocabulary that reaches the feature matrix intact. The chunking configuration turned out to discard 31.60% of WordPiece tokens without warning, because the window is measured in words and the budget is measured in tokens. And the headline metric turned out to depend on the partition far more than on the model: R^2 = 0.549 under random folds, 0.536 once franchises are kept together, 0.309 when the test films are drawn from years the model never saw.</w:t>
       </w:r>
     </w:p>
     <w:p>
@@ -4110,7 +5817,22 @@
           <w:i w:val="0"/>
           <w:sz w:val="20"/>
         </w:rPr>
-        <w:t>We recommend five operational practices for long-document screenplay modeling: enumerate Group by title family: Prevent sequel/remake leakage through stem-based grouping. Evaluate chronologically: Use temporal holdouts to reflect actual deployment conditions. Report MAE alongside R^2: Disentangle genuine error growth from target variance compression. Tokenize before chunking: Align window budgets to subword tokenizers rather than whitespace word counts. Store immutable record keys: Avoid caching embeddings by row index alone. enumerate</w:t>
+        <w:t>The block-permutation analysis identifies the mechanism. Release year supplies 11% of in-sample split gain and exactly zero out-of-sample utility, because every holdout year falls beyond the training range and a tree ensemble cannot extrapolate past its last split point. Runtime transfers; semantics transfer; the calendar does not. For anyone building a screenplay-stage predictor, the operational recommendations are narrow and concrete: group by title family, hold out by release year, report MAE next to R^2 when the target distribution shifts, align the chunk to the tokeniser rather than to whitespace, and store an immutable record key beside every cached representation.</w:t>
+      </w:r>
+    </w:p>
+    <w:p>
+      <w:pPr>
+        <w:spacing w:before="200" w:after="80"/>
+        <w:ind w:firstLine="0"/>
+        <w:jc w:val="center"/>
+      </w:pPr>
+      <w:r>
+        <w:rPr>
+          <w:b w:val="0"/>
+          <w:i w:val="0"/>
+          <w:sz w:val="20"/>
+        </w:rPr>
+        <w:t>REPRODUCIBILITY</w:t>
       </w:r>
     </w:p>
     <w:p>
@@ -4124,7 +5846,7 @@
           <w:i w:val="0"/>
           <w:sz w:val="20"/>
         </w:rPr>
-        <w:t>*Reproducibility Audit, token verification, and evaluation code are provided in the repository (audit_corpus.py, audit_tokens.py, leakage_eval.py, analysis_xai.py). All metrics are regenerated with seed 42 and B=1,000 bootstrap draws.</w:t>
+        <w:t>The audit, alignment-recovery, evaluation, and figure code are released with the paper (audit_corpus.py, recover_alignment.py, audit_tokens.py, leakage_eval.py, analysis_xai.py, make_paper_figures.py). Every number in Tables I– IV is regenerated from the committed JSON artifacts in results/. The random seed is 42 throughout; bootstrap resampling uses 1000 draws.</w:t>
       </w:r>
     </w:p>
     <w:p>
@@ -4194,7 +5916,7 @@
           <w:i w:val="0"/>
           <w:sz w:val="16"/>
         </w:rPr>
-        <w:t>[5] A. J. Reagan, L. Mitchell, D. Kiley, C. M. Danforth, and P. S. Dodds, “The emotional arcs of stories are dominated by six basic shapes,” EPJ Data Science, vol. 5, no. 31, 2016.</w:t>
+        <w:t>[5] A. Bhadrashetty and S. Patil, “Movie success and rating prediction using data mining,” J. Sci. Res. Technol., 2024.</w:t>
       </w:r>
     </w:p>
     <w:p>
@@ -4208,7 +5930,7 @@
           <w:i w:val="0"/>
           <w:sz w:val="16"/>
         </w:rPr>
-        <w:t>[6] A. Ramakrishna, V. R. Martínez, N. Malandrakis, K. Singla, and S. Narayanan, “Linguistic analysis of differences in portrayal of movie characters,” in Proc. ACL, 2017.</w:t>
+        <w:t>[6] I. Chalkidis, X. Dai, M. Fergadiotis, P. Malakasiotis, and D. Elliott, “An exploration of hierarchical attention transformers for efficient long document classification,” arXiv:2210.05529, 2022.</w:t>
       </w:r>
     </w:p>
     <w:p>
@@ -4222,7 +5944,7 @@
           <w:i w:val="0"/>
           <w:sz w:val="16"/>
         </w:rPr>
-        <w:t>[7] M. Shafaei, C. Smailis, I. Kakadiaris, and T. Solorio, “Age suitability rating: Predicting MPAA ratings based on movie dialogues,” in Proc. LREC, 2020.</w:t>
+        <w:t>[7] H. L. Vogel, Entertainment Industry Economics, 10th ed. Cambridge, U.K.: Cambridge Univ. Press, 2020.</w:t>
       </w:r>
     </w:p>
     <w:p>
@@ -4236,7 +5958,7 @@
           <w:i w:val="0"/>
           <w:sz w:val="16"/>
         </w:rPr>
-        <w:t>[8] Y. Zhang, M. Shafaei, and T. Solorio, “From none to severe: Predicting severity in movie scripts,” in Findings of EMNLP, 2021.</w:t>
+        <w:t>[8] W. R. Bristi, Z. Zaman, and N. Sultana, “Predicting IMDb rating of movies by machine learning techniques,” in Proc. ICCCNT, 2019.</w:t>
       </w:r>
     </w:p>
     <w:p>
@@ -4250,7 +5972,7 @@
           <w:i w:val="0"/>
           <w:sz w:val="16"/>
         </w:rPr>
-        <w:t>[9] E. Chu, D. Roy, and J. Glass, “Audio-visual sentiment analysis for learning emotional arcs in movies,” in Proc. ICCV, 2017.</w:t>
+        <w:t>[9] A. L. Gomes, M. Ribeiro, and P. Quaresma, “Predicting IMDb rating of TV series with deep learning: The case of Arrow,” arXiv:2211.03388, 2022.</w:t>
       </w:r>
     </w:p>
     <w:p>
@@ -4264,7 +5986,7 @@
           <w:i w:val="0"/>
           <w:sz w:val="16"/>
         </w:rPr>
-        <w:t>[10] R. Sharda and D. Delen, “Predicting box-office success of motion pictures with neural networks,” Expert Syst. Appl., vol. 30, no. 2, 2006.</w:t>
+        <w:t>[10] V. Udandarao, A. Gupta, and S. Bhattacharya, “Movie revenue prediction using machine learning models,” arXiv:2405.11651, 2024.</w:t>
       </w:r>
     </w:p>
     <w:p>
@@ -4278,7 +6000,7 @@
           <w:i w:val="0"/>
           <w:sz w:val="16"/>
         </w:rPr>
-        <w:t>[11] C. T. Madongo, Z. Tang, and J. Hassan, “Movie box-office revenue prediction model by mining deep features from trailers using recurrent neural networks,” J. Adv. Inf. Technol., 2024.</w:t>
+        <w:t>[11] W. Xie, Y. Liu, and H. Chen, “Predicting movie success with multi-task learning: GPT-based sentiment and SIR propagation,” arXiv preprint, 2025.</w:t>
       </w:r>
     </w:p>
     <w:p>
@@ -4292,7 +6014,7 @@
           <w:i w:val="0"/>
           <w:sz w:val="16"/>
         </w:rPr>
-        <w:t>[12] A. Bhadrashetty and S. Patil, “Movie success and rating prediction using data mining,” J. Sci. Res. Technol., 2024.</w:t>
+        <w:t>[12] M. C. Chiu, S. Lin, and W. Chen, “Screenplay quality assessment: Can we predict who gets nominated?” Nat. Univ. Singapore, Tech. Rep., 2020.</w:t>
       </w:r>
     </w:p>
     <w:p>
@@ -4306,7 +6028,7 @@
           <w:i w:val="0"/>
           <w:sz w:val="16"/>
         </w:rPr>
-        <w:t>[13] M. Z. Naeem, F. Rustam, A. Mehmood, I. Ashraf, and G. S. Choi, “Classification of movie reviews using term frequency-inverse document frequency and optimized machine learning algorithms,” PeerJ Comput. Sci., 2022.</w:t>
+        <w:t>[13] A. Søgaard, S. Ebert, J. Bastings, and K. Filippova, “We need to talk about random splits,” in Proc. EACL, 2021.</w:t>
       </w:r>
     </w:p>
     <w:p>
@@ -4320,7 +6042,7 @@
           <w:i w:val="0"/>
           <w:sz w:val="16"/>
         </w:rPr>
-        <w:t>[14] I. Chalkidis, X. Dai, M. Fergadiotis, P. Malakasiotis, and D. Elliott, “An exploration of hierarchical attention transformers for efficient long document classification,” arXiv:2210.05529, 2022.</w:t>
+        <w:t>[14] A. Elangovan, J. He, and K. Verspoor, “Memorization vs. generalization: Quantifying data leakage in NLP performance evaluation,” in Proc. EACL, 2021.</w:t>
       </w:r>
     </w:p>
     <w:p>
@@ -4334,287 +6056,7 @@
           <w:i w:val="0"/>
           <w:sz w:val="16"/>
         </w:rPr>
-        <w:t>[15] S. Asur and B. A. Huberman, “Predicting the future with social media,” in Proc. IEEE/WIC/ACM Web Intelligence, 2010.</w:t>
-      </w:r>
-    </w:p>
-    <w:p>
-      <w:pPr>
-        <w:spacing w:before="0" w:after="40"/>
-        <w:ind w:left="317" w:hanging="317"/>
-      </w:pPr>
-      <w:r>
-        <w:rPr>
-          <w:b w:val="0"/>
-          <w:i w:val="0"/>
-          <w:sz w:val="16"/>
-        </w:rPr>
-        <w:t>[16] A. Oghina, M. Breuss, M. Tsagkias, and M. de Rijke, “Predicting IMDb movie ratings using social media,” in Proc. ECIR, 2012.</w:t>
-      </w:r>
-    </w:p>
-    <w:p>
-      <w:pPr>
-        <w:spacing w:before="0" w:after="40"/>
-        <w:ind w:left="317" w:hanging="317"/>
-      </w:pPr>
-      <w:r>
-        <w:rPr>
-          <w:b w:val="0"/>
-          <w:i w:val="0"/>
-          <w:sz w:val="16"/>
-        </w:rPr>
-        <w:t>[17] G. Mishne and N. Glance, “Predicting movie sales from blogger sentiment,” in AAAI Spring Symp., 2006.</w:t>
-      </w:r>
-    </w:p>
-    <w:p>
-      <w:pPr>
-        <w:spacing w:before="0" w:after="40"/>
-        <w:ind w:left="317" w:hanging="317"/>
-      </w:pPr>
-      <w:r>
-        <w:rPr>
-          <w:b w:val="0"/>
-          <w:i w:val="0"/>
-          <w:sz w:val="16"/>
-        </w:rPr>
-        <w:t>[18] M. Mestyán, T. Yasseri, and J. Kertész, “Early prediction of movie box office success based on Wikipedia activity big data,” PLoS ONE, vol. 8, no. 8, 2013.</w:t>
-      </w:r>
-    </w:p>
-    <w:p>
-      <w:pPr>
-        <w:spacing w:before="0" w:after="40"/>
-        <w:ind w:left="317" w:hanging="317"/>
-      </w:pPr>
-      <w:r>
-        <w:rPr>
-          <w:b w:val="0"/>
-          <w:i w:val="0"/>
-          <w:sz w:val="16"/>
-        </w:rPr>
-        <w:t>[19] H. L. Vogel, Entertainment Industry Economics, 10th ed. Cambridge, U.K.: Cambridge Univ. Press, 2020.</w:t>
-      </w:r>
-    </w:p>
-    <w:p>
-      <w:pPr>
-        <w:spacing w:before="0" w:after="40"/>
-        <w:ind w:left="317" w:hanging="317"/>
-      </w:pPr>
-      <w:r>
-        <w:rPr>
-          <w:b w:val="0"/>
-          <w:i w:val="0"/>
-          <w:sz w:val="16"/>
-        </w:rPr>
-        <w:t>[20] W. R. Bristi, Z. Zaman, and N. Sultana, “Predicting IMDb rating of movies by machine learning techniques,” in Proc. ICCCNT, 2019.</w:t>
-      </w:r>
-    </w:p>
-    <w:p>
-      <w:pPr>
-        <w:spacing w:before="0" w:after="40"/>
-        <w:ind w:left="317" w:hanging="317"/>
-      </w:pPr>
-      <w:r>
-        <w:rPr>
-          <w:b w:val="0"/>
-          <w:i w:val="0"/>
-          <w:sz w:val="16"/>
-        </w:rPr>
-        <w:t>[21] A. L. Gomes, M. Ribeiro, and P. Quaresma, “Predicting IMDb rating of TV series with deep learning: The case of Arrow,” arXiv:2211.03388, 2022.</w:t>
-      </w:r>
-    </w:p>
-    <w:p>
-      <w:pPr>
-        <w:spacing w:before="0" w:after="40"/>
-        <w:ind w:left="317" w:hanging="317"/>
-      </w:pPr>
-      <w:r>
-        <w:rPr>
-          <w:b w:val="0"/>
-          <w:i w:val="0"/>
-          <w:sz w:val="16"/>
-        </w:rPr>
-        <w:t>[22] J. Ramos, A. Pereira, and L. Cruz, “Movie rating prediction using sentiment features,” in Proc. SALLD, 2022.</w:t>
-      </w:r>
-    </w:p>
-    <w:p>
-      <w:pPr>
-        <w:spacing w:before="0" w:after="40"/>
-        <w:ind w:left="317" w:hanging="317"/>
-      </w:pPr>
-      <w:r>
-        <w:rPr>
-          <w:b w:val="0"/>
-          <w:i w:val="0"/>
-          <w:sz w:val="16"/>
-        </w:rPr>
-        <w:t>[23] V. Udandarao, A. Gupta, and S. Bhattacharya, “Movie revenue prediction using machine learning models,” arXiv:2405.11651, 2024.</w:t>
-      </w:r>
-    </w:p>
-    <w:p>
-      <w:pPr>
-        <w:spacing w:before="0" w:after="40"/>
-        <w:ind w:left="317" w:hanging="317"/>
-      </w:pPr>
-      <w:r>
-        <w:rPr>
-          <w:b w:val="0"/>
-          <w:i w:val="0"/>
-          <w:sz w:val="16"/>
-        </w:rPr>
-        <w:t>[24] W. Xie, Y. Liu, and H. Chen, “Predicting movie success with multi-task learning: GPT-based sentiment and SIR propagation,” arXiv preprint, 2025.</w:t>
-      </w:r>
-    </w:p>
-    <w:p>
-      <w:pPr>
-        <w:spacing w:before="0" w:after="40"/>
-        <w:ind w:left="317" w:hanging="317"/>
-      </w:pPr>
-      <w:r>
-        <w:rPr>
-          <w:b w:val="0"/>
-          <w:i w:val="0"/>
-          <w:sz w:val="16"/>
-        </w:rPr>
-        <w:t>[25] E. Mohamed, M. Shafaei, and T. Solorio, “A first dataset for film age appropriateness investigation,” in Proc. LREC, 2020.</w:t>
-      </w:r>
-    </w:p>
-    <w:p>
-      <w:pPr>
-        <w:spacing w:before="0" w:after="40"/>
-        <w:ind w:left="317" w:hanging="317"/>
-      </w:pPr>
-      <w:r>
-        <w:rPr>
-          <w:b w:val="0"/>
-          <w:i w:val="0"/>
-          <w:sz w:val="16"/>
-        </w:rPr>
-        <w:t>[26] S. Kar, S. Maharjan, and T. Solorio, “Folksonomication: Predicting tags for movies from plot synopses using emotion flow encoded neural network,” in Proc. COLING, 2018.</w:t>
-      </w:r>
-    </w:p>
-    <w:p>
-      <w:pPr>
-        <w:spacing w:before="0" w:after="40"/>
-        <w:ind w:left="317" w:hanging="317"/>
-      </w:pPr>
-      <w:r>
-        <w:rPr>
-          <w:b w:val="0"/>
-          <w:i w:val="0"/>
-          <w:sz w:val="16"/>
-        </w:rPr>
-        <w:t>[27] M. C. Chiu, S. Lin, and W. Chen, “Screenplay quality assessment: Can we predict who gets nominated?” Nat. Univ. Singapore, Tech. Rep., 2020.</w:t>
-      </w:r>
-    </w:p>
-    <w:p>
-      <w:pPr>
-        <w:spacing w:before="0" w:after="40"/>
-        <w:ind w:left="317" w:hanging="317"/>
-      </w:pPr>
-      <w:r>
-        <w:rPr>
-          <w:b w:val="0"/>
-          <w:i w:val="0"/>
-          <w:sz w:val="16"/>
-        </w:rPr>
-        <w:t>[28] K. Gorman and S. Bedrick, “We need to talk about standard splits,” in Proc. ACL, 2019.</w:t>
-      </w:r>
-    </w:p>
-    <w:p>
-      <w:pPr>
-        <w:spacing w:before="0" w:after="40"/>
-        <w:ind w:left="317" w:hanging="317"/>
-      </w:pPr>
-      <w:r>
-        <w:rPr>
-          <w:b w:val="0"/>
-          <w:i w:val="0"/>
-          <w:sz w:val="16"/>
-        </w:rPr>
-        <w:t>[29] A. Søgaard, S. Ebert, J. Bastings, and K. Filippova, “We need to talk about random splits,” in Proc. EACL, 2021.</w:t>
-      </w:r>
-    </w:p>
-    <w:p>
-      <w:pPr>
-        <w:spacing w:before="0" w:after="40"/>
-        <w:ind w:left="317" w:hanging="317"/>
-      </w:pPr>
-      <w:r>
-        <w:rPr>
-          <w:b w:val="0"/>
-          <w:i w:val="0"/>
-          <w:sz w:val="16"/>
-        </w:rPr>
-        <w:t>[30] P. Lewis, P. Stenetorp, and S. Riedel, “Question and answer test-train overlap in open-domain question answering datasets,” in Proc. EACL, 2021.</w:t>
-      </w:r>
-    </w:p>
-    <w:p>
-      <w:pPr>
-        <w:spacing w:before="0" w:after="40"/>
-        <w:ind w:left="317" w:hanging="317"/>
-      </w:pPr>
-      <w:r>
-        <w:rPr>
-          <w:b w:val="0"/>
-          <w:i w:val="0"/>
-          <w:sz w:val="16"/>
-        </w:rPr>
-        <w:t>[31] A. Elangovan, J. He, and K. Verspoor, “Memorization vs. generalization: Quantifying data leakage in NLP performance evaluation,” in Proc. EACL, 2021.</w:t>
-      </w:r>
-    </w:p>
-    <w:p>
-      <w:pPr>
-        <w:spacing w:before="0" w:after="40"/>
-        <w:ind w:left="317" w:hanging="317"/>
-      </w:pPr>
-      <w:r>
-        <w:rPr>
-          <w:b w:val="0"/>
-          <w:i w:val="0"/>
-          <w:sz w:val="16"/>
-        </w:rPr>
-        <w:t>[32] S. Kapoor and A. Narayanan, “Leakage and the reproducibility crisis in machine-learning-based science,” Patterns, vol. 4, no. 9, 2023.</w:t>
-      </w:r>
-    </w:p>
-    <w:p>
-      <w:pPr>
-        <w:spacing w:before="0" w:after="40"/>
-        <w:ind w:left="317" w:hanging="317"/>
-      </w:pPr>
-      <w:r>
-        <w:rPr>
-          <w:b w:val="0"/>
-          <w:i w:val="0"/>
-          <w:sz w:val="16"/>
-        </w:rPr>
-        <w:t>[33] A. Lazaridou et al., “Mind the gap: Assessing temporal generalization in neural language models,” in Proc. NeurIPS, 2021.</w:t>
-      </w:r>
-    </w:p>
-    <w:p>
-      <w:pPr>
-        <w:spacing w:before="0" w:after="40"/>
-        <w:ind w:left="317" w:hanging="317"/>
-      </w:pPr>
-      <w:r>
-        <w:rPr>
-          <w:b w:val="0"/>
-          <w:i w:val="0"/>
-          <w:sz w:val="16"/>
-        </w:rPr>
-        <w:t>[34] E. M. Bender and B. Friedman, “Data statements for natural language processing,” TACL, vol. 6, 2018.</w:t>
-      </w:r>
-    </w:p>
-    <w:p>
-      <w:pPr>
-        <w:spacing w:before="0" w:after="40"/>
-        <w:ind w:left="317" w:hanging="317"/>
-      </w:pPr>
-      <w:r>
-        <w:rPr>
-          <w:b w:val="0"/>
-          <w:i w:val="0"/>
-          <w:sz w:val="16"/>
-        </w:rPr>
-        <w:t>[35] J. Dodge et al., “Documenting large webtext corpora: A case study on the Colossal Clean Crawled Corpus,” in Proc. EMNLP, 2021.</w:t>
+        <w:t>[15] S. Kapoor and A. Narayanan, “Leakage and the reproducibility crisis in machine-learning-based science,” Patterns, vol. 4, no. 9, 2023.</w:t>
       </w:r>
     </w:p>
     <w:sectPr>

</xml_diff>

<commit_message>
Trim IEEE 6-page paper to 4,463 words (~15% reduction) via targeted extractive cuts
</commit_message>
<xml_diff>
--- a/paper/IEEE 6 pages.docx
+++ b/paper/IEEE 6 pages.docx
@@ -111,7 +111,7 @@
           <w:i w:val="0"/>
           <w:sz w:val="20"/>
         </w:rPr>
-        <w:t>A feature-film screenplay runs to roughly 25,000 words. Sentence encoders read 256 tokens. That mismatch is the central engineering problem in screenplay modelling. What is far less often examined is whether the evaluation wrapped around that pipeline measures anything a practitioner could rely on, because an archival screenplay corpus assembled from a community repository carries two structural hazards that a shuffled train/test split will silently convert into apparent skill.</w:t>
+        <w:t>Sentence encoders read 256 tokens. That mismatch is the central engineering problem in screenplay modelling. What is far less often examined is whether the evaluation wrapped around that pipeline measures anything a practitioner could rely on, because an archival screenplay corpus assembled from a community repository carries two structural hazards that a shuffled train/test split will silently convert into apparent skill.</w:t>
       </w:r>
     </w:p>
     <w:p>
@@ -139,7 +139,7 @@
           <w:i w:val="0"/>
           <w:sz w:val="20"/>
         </w:rPr>
-        <w:t>The second hazard is time. Ratings in an archival corpus are collected once, at scrape time, but the films span a century, and both the selection process and the rating behaviour of the audience drift. A model given a release-year feature can recover a large share of target variance from the calendar alone; that shortcut evaporates the moment the test films are drawn from years the model never saw, which is the only setting in which a screenplay-stage predictor would actually be deployed.</w:t>
+        <w:t>The second hazard is time. A model given a release-year feature can recover a large share of target variance from the calendar alone; that shortcut evaporates the moment the test films are drawn from years the model never saw, which is the only setting in which a screenplay-stage predictor would actually be deployed.</w:t>
       </w:r>
     </w:p>
     <w:p>
@@ -260,7 +260,7 @@
           <w:i w:val="0"/>
           <w:sz w:val="20"/>
         </w:rPr>
-        <w:t>Early work treated the script as a feature source for commercial forecasting. Eliashberg et al. [3] extracted genre, content, and semantic descriptors from spec scripts and fed a kernel regression to predict return on investment; Hunter et al. [4] pushed a similar text-analytic pipeline toward box-office revenue. Both established the premise this paper inherits — that a screenplay carries measurable signal about reception — and both evaluated on randomly partitioned archival collections. Screenplay quality assessment in the awards-nomination framing [12] is the closest analogue to rating regression, and it shares our target's central difficulty: the label is an aggregate social judgement, only partly a function of the text.</w:t>
+        <w:t>Screenplay quality assessment in the awards-nomination framing [5] is the closest analogue to rating regression, and it shares our target's central difficulty: the label is an aggregate social judgement, only partly a function of the text.</w:t>
       </w:r>
     </w:p>
     <w:p>
@@ -288,7 +288,7 @@
           <w:i w:val="0"/>
           <w:sz w:val="20"/>
         </w:rPr>
-        <w:t>IMDb rating regression from tabular and textual metadata is by now a standard applied exercise [5, 8, 10], with deep-learning variants for serial content [9] and multi-task formulations that fold sentiment and diffusion together [11]. Vogel's industry account [7] is a useful corrective on the ceiling: theatrical outcomes are dominated by release strategy, competition, and marketing spend, none of which is legible in the script.</w:t>
+        <w:t>Vogel's industry account [4] is a useful corrective on the ceiling: theatrical outcomes are dominated by release strategy, competition, and marketing spend, none of which is legible in the script.</w:t>
       </w:r>
     </w:p>
     <w:p>
@@ -316,7 +316,7 @@
           <w:i w:val="0"/>
           <w:sz w:val="20"/>
         </w:rPr>
-        <w:t>Sentence-BERT [2] produces dense sentence-level embeddings from a Siamese objective and is the encoder we audit. Its native context is short, so document-level use requires either hierarchical attention [6], sparse attention over longer sequences [1], or chunk-and-pool aggregation. Chunk-and-pool is the pragmatic default: it needs no fine-tuning, runs on CPU, and scales linearly. Its cost is that the aggregation function is fixed rather than learned, and — as we measure in Section IV-B — that the chunk boundary is usually specified in a unit the encoder does not use. Classical n-gram TF-IDF remains a competitive lexical control on long technical text and is included here for exactly that reason.</w:t>
+        <w:t>Sentence-BERT [2] produces dense sentence-level embeddings from a Siamese objective and is the encoder we audit. Its native context is short, so document-level use requires either hierarchical attention [3], sparse attention over longer sequences [1], or chunk-and-pool aggregation. Chunk-and-pool is the pragmatic default: it needs no fine-tuning, runs on CPU, and scales linearly. Its cost is that the aggregation function is fixed rather than learned, and — as we measure in Section IV-B — that the chunk boundary is usually specified in a unit the encoder does not use. Classical n-gram TF-IDF remains a competitive lexical control on long technical text and is included here for exactly that reason.</w:t>
       </w:r>
     </w:p>
     <w:p>
@@ -344,7 +344,7 @@
           <w:i w:val="0"/>
           <w:sz w:val="20"/>
         </w:rPr>
-        <w:t>Søgaard et al. [13] recommended split designs that stress the generalisation actually claimed. Elangovan et al. [14] formalised train–test overlap measurement. Kapoor and Narayanan [15] catalogue leakage taxonomies across disciplines and argue for pre-registration of the split. Applying these instruments to a screenplay corpus is, to our knowledge, new; the findings in Section V suggest the exercise was overdue.</w:t>
+        <w:t>Søgaard et al. [6] recommended split designs that stress the generalisation actually claimed. Elangovan et al. [7] formalised train–test overlap measurement. Kapoor and Narayanan [8] catalogue leakage taxonomies across disciplines and argue for pre-registration of the split.</w:t>
       </w:r>
     </w:p>
     <w:p>
@@ -569,20 +569,6 @@
     </w:p>
     <w:p>
       <w:pPr>
-        <w:spacing w:before="0" w:after="60"/>
-        <w:ind w:firstLine="288"/>
-      </w:pPr>
-      <w:r>
-        <w:rPr>
-          <w:b w:val="0"/>
-          <w:i w:val="0"/>
-          <w:sz w:val="20"/>
-        </w:rPr>
-        <w:t>The second arrow is an identity map on the subset over which the digest could be evaluated (356 script files distributed with the code; 0 collisions). The metadata identity keys, computed over all 5,204 records, return zero duplicate IMDb identifiers and zero duplicate title×year pairs.</w:t>
-      </w:r>
-    </w:p>
-    <w:p>
-      <w:pPr>
         <w:spacing w:before="120" w:after="40"/>
         <w:ind w:firstLine="0"/>
       </w:pPr>
@@ -593,20 +579,6 @@
           <w:sz w:val="20"/>
         </w:rPr>
         <w:t>D. Audit results</w:t>
-      </w:r>
-    </w:p>
-    <w:p>
-      <w:pPr>
-        <w:spacing w:before="0" w:after="60"/>
-        <w:ind w:firstLine="288"/>
-      </w:pPr>
-      <w:r>
-        <w:rPr>
-          <w:b w:val="0"/>
-          <w:i w:val="0"/>
-          <w:sz w:val="20"/>
-        </w:rPr>
-        <w:t>Table I is the full ledger for the flow of Section III, and every row is a strict subset of the row above.</w:t>
       </w:r>
     </w:p>
     <w:p>
@@ -1616,7 +1588,7 @@
           <w:i w:val="0"/>
           <w:sz w:val="20"/>
         </w:rPr>
-        <w:t>Twenty-seven records are excluded because positional identity in the archived embedding matrix cannot be resolved uniquely without a stored record key. Twenty-seven positions inside the reconstruction gaps admit more than one consistent assignment; we drop them rather than guess.</w:t>
+        <w:t>Twenty-seven records are excluded because positional identity in the archived embedding matrix cannot be resolved uniquely without a stored record key.</w:t>
       </w:r>
     </w:p>
     <w:p>
@@ -2247,20 +2219,6 @@
           <w:sz w:val="20"/>
         </w:rPr>
         <w:t>A. The cost of a stricter partition</w:t>
-      </w:r>
-    </w:p>
-    <w:p>
-      <w:pPr>
-        <w:spacing w:before="0" w:after="60"/>
-        <w:ind w:firstLine="288"/>
-      </w:pPr>
-      <w:r>
-        <w:rPr>
-          <w:b w:val="0"/>
-          <w:i w:val="0"/>
-          <w:sz w:val="20"/>
-        </w:rPr>
-        <w:t>Table II isolates the cost of the group constraint; Table III isolates the cost of the temporal one. Five systems, one corpus, one learner configuration throughout.</w:t>
       </w:r>
     </w:p>
     <w:p>
@@ -4179,7 +4137,7 @@
           <w:i w:val="0"/>
           <w:sz w:val="20"/>
         </w:rPr>
-        <w:t>Grouping costs little. The best system moves from R^2 = 0.5490 to 0.5359, a drop of 0.0131, and the two bootstrap intervals overlap substantially. The effect is consistently negative across every system that reads text — SBERT ridge loses 0.0125 R^2, SBERT+XGBoost loses 0.0127 — while the metadata-only probe is unmoved (0.3888 -&gt; 0.3889). Franchise leakage is a textual channel, and a metadata model cannot exploit it because it never sees the words.</w:t>
+        <w:t>Grouping costs little. The best system moves from R^2 = 0.5490 to 0.5359, a drop of 0.0131, and the two bootstrap intervals overlap substantially. The effect is consistently negative across every system that reads text — SBERT ridge loses 0.0125 R^2, SBERT+XGBoost loses 0.0127 — while the metadata-only probe is unmoved (0.3888 -&gt; 0.3889).</w:t>
       </w:r>
     </w:p>
     <w:p>
@@ -4193,7 +4151,7 @@
           <w:i w:val="0"/>
           <w:sz w:val="20"/>
         </w:rPr>
-        <w:t>Chronology costs a great deal. The same best system falls to R^2 = 0.3089, and the interval [0.1985, 0.4038] no longer overlaps either in-corpus estimate. The constant-mean predictor goes from R^2 ≈ 0 to -0.0947, which is a pure distribution-shift effect: the training mean (6.11) is simply wrong for the holdout (5.75). And the metadata probe collapses from 0.3889 to 0.1473, losing 62% of its explanatory power, while the text-only SBERT model loses 35% (0.4114 -&gt; 0.2671).</w:t>
+        <w:t>Chronology costs a great deal. The same best system falls to R^2 = 0.3089, and the interval [0.1985, 0.4038] no longer overlaps either in-corpus estimate. And the metadata probe collapses from 0.3889 to 0.1473, losing 62% of its explanatory power, while the text-only SBERT model loses 35% (0.4114 -&gt; 0.2671).</w:t>
       </w:r>
     </w:p>
     <w:p>
@@ -4208,20 +4166,6 @@
           <w:sz w:val="20"/>
         </w:rPr>
         <w:t>B. Paired comparisons</w:t>
-      </w:r>
-    </w:p>
-    <w:p>
-      <w:pPr>
-        <w:spacing w:before="0" w:after="60"/>
-        <w:ind w:firstLine="288"/>
-      </w:pPr>
-      <w:r>
-        <w:rPr>
-          <w:b w:val="0"/>
-          <w:i w:val="0"/>
-          <w:sz w:val="20"/>
-        </w:rPr>
-        <w:t>Table IV reports every baseline against the best system on matched records.</w:t>
       </w:r>
     </w:p>
     <w:p>
@@ -5488,7 +5432,7 @@
           <w:i w:val="0"/>
           <w:sz w:val="20"/>
         </w:rPr>
-        <w:t>The final row is the one that changes the story. Under P1 and P2, adding the three metadata columns to the embedding buys a highly significant 0.108–0.114 rating points of mean absolute error. Under P3 the same addition buys 0.0236 points, with an interval straddling zero and p = 0.273; the full statistics are W = 62,734 over n = 515 pairs with no ties, rank-biserial r = +0.056. An effect size of 0.056 is negligible by any convention. The metadata block, worth two orders of magnitude in p-value under a random split, is not measurably useful when the test films are genuinely unseen.</w:t>
+        <w:t>Under P1 and P2, adding the three metadata columns to the embedding buys a highly significant 0.108–0.114 rating points of mean absolute error. Under P3 the same addition buys 0.0236 points, with an interval straddling zero and p = 0.273; the full statistics are W = 62,734 over n = 515 pairs with no ties, rank-biserial r = +0.056. The metadata block, worth two orders of magnitude in p-value under a random split, is not measurably useful when the test films are genuinely unseen.</w:t>
       </w:r>
     </w:p>
     <w:p>
@@ -5516,7 +5460,7 @@
           <w:i w:val="0"/>
           <w:sz w:val="20"/>
         </w:rPr>
-        <w:t>The holdout target is compressed relative to the training pool: standard deviation falls from 1.4619 (records up to 2019) to 1.1701 (2020–2025), while the mean falls from 6.0119 to 5.7546. Part of the R^2 collapse is therefore arithmetic — the same absolute error against a narrower target yields a smaller R^2 — and part is genuine degradation. Mean absolute error separates them: it is 0.7276 under P1 and 0.7232 under P3, statistically indistinguishable. The model's typical error in rating points does not grow at all when it predicts the future. What collapses is how much of the (now narrower) variance it can order. Regressing prediction on truth over the holdout gives slope 0.4634 (s.e. 0.0278) and intercept 3.1745, against an ideal slope of 1.</w:t>
+        <w:t>Part of the R^2 collapse is therefore arithmetic — the same absolute error against a narrower target yields a smaller R^2 — and part is genuine degradation. Mean absolute error separates them: it is 0.7276 under P1 and 0.7232 under P3, statistically indistinguishable. What collapses is how much of the (now narrower) variance it can order. Regressing prediction on truth over the holdout gives slope 0.4634 (s.e. 0.0278) and intercept 3.1745, against an ideal slope of 1.</w:t>
       </w:r>
     </w:p>
     <w:p>
@@ -5675,35 +5619,7 @@
           <w:i w:val="0"/>
           <w:sz w:val="20"/>
         </w:rPr>
-        <w:t>Runtime is the opposite case. It transfers cleanly, because a 130-minute film in 2023 occupies the same region of feature space as a 130-minute film in 1994, and it alone reproduces the predictive value of the entire semantic block. The honest summary of the temporal result is that the model has two working channels: how long the film is, and what the screenplay is broadly about. The calendar is not one of them.</w:t>
-      </w:r>
-    </w:p>
-    <w:p>
-      <w:pPr>
-        <w:spacing w:before="120" w:after="40"/>
-        <w:ind w:firstLine="0"/>
-      </w:pPr>
-      <w:r>
-        <w:rPr>
-          <w:b w:val="0"/>
-          <w:i/>
-          <w:sz w:val="20"/>
-        </w:rPr>
-        <w:t>C. Why mean pooling limits the semantic channel</w:t>
-      </w:r>
-    </w:p>
-    <w:p>
-      <w:pPr>
-        <w:spacing w:before="0" w:after="60"/>
-        <w:ind w:firstLine="288"/>
-      </w:pPr>
-      <w:r>
-        <w:rPr>
-          <w:b w:val="0"/>
-          <w:i w:val="0"/>
-          <w:sz w:val="20"/>
-        </w:rPr>
-        <w:t>The embedding block earns +0.195 MAE under permutation, so it carries real signal, but its per-dimension gain is flat — no dimension exceeds 1.7% and none is unused. Combined with the 31.6% of tokens that truncation removes before pooling begins, the semantic channel is operating on a heavily smoothed, partially observed view of the screenplay.</w:t>
+        <w:t>Runtime is the opposite case. It transfers cleanly, because a 130-minute film in 2023 occupies the same region of feature space as a 130-minute film in 1994, and it alone reproduces the predictive value of the entire semantic block.</w:t>
       </w:r>
     </w:p>
     <w:p>
@@ -5719,20 +5635,6 @@
           <w:sz w:val="20"/>
         </w:rPr>
         <w:t>VII. THREATS TO VALIDITY AND LIMITATIONS</w:t>
-      </w:r>
-    </w:p>
-    <w:p>
-      <w:pPr>
-        <w:spacing w:before="0" w:after="60"/>
-        <w:ind w:firstLine="288"/>
-      </w:pPr>
-      <w:r>
-        <w:rPr>
-          <w:b w:val="0"/>
-          <w:i w:val="0"/>
-          <w:sz w:val="20"/>
-        </w:rPr>
-        <w:t>The content-digest audit is verified on a subset. As stated in Section III, SHA-256 deduplication was executed over the 356 script files distributed with the code and returned zero duplicate groups. The metadata identity keys covering all 5,204 records found no duplicate identifiers and no duplicate title×year pairs, which bounds the plausible residual duplication, but does not eliminate the possibility of two distinct films sharing a byte-identical file through a scraping error. We report this rather than assert a number we did not compute.</w:t>
       </w:r>
     </w:p>
     <w:p>
@@ -5774,7 +5676,7 @@
           <w:i w:val="0"/>
           <w:sz w:val="20"/>
         </w:rPr>
-        <w:t>The strongest transferring feature is unavailable at deployment. Runtime dominates the temporal holdout, matching the entire embedding block under permutation. A screenplay-stage predictor does not know the runtime, because the film has not been cut — or shot. The repository's own inference path concedes the point: when metadata is not supplied it substitutes constants, defaulting movie_length to 120 minutes, year to 2020, and decade_encoded to 0. Under those defaults the deployed system is closer to our SBERT-only row (R^2 = 0.267 on the holdout) than to the headline.</w:t>
+        <w:t>The strongest transferring feature is unavailable at deployment. Runtime dominates the temporal holdout, matching the entire embedding block under permutation. A screenplay-stage predictor does not know the runtime, because the film has not been cut — or shot.</w:t>
       </w:r>
     </w:p>
     <w:p>
@@ -5817,7 +5719,7 @@
           <w:i w:val="0"/>
           <w:sz w:val="20"/>
         </w:rPr>
-        <w:t>The block-permutation analysis identifies the mechanism. Release year supplies 11% of in-sample split gain and exactly zero out-of-sample utility, because every holdout year falls beyond the training range and a tree ensemble cannot extrapolate past its last split point. Runtime transfers; semantics transfer; the calendar does not. For anyone building a screenplay-stage predictor, the operational recommendations are narrow and concrete: group by title family, hold out by release year, report MAE next to R^2 when the target distribution shifts, align the chunk to the tokeniser rather than to whitespace, and store an immutable record key beside every cached representation.</w:t>
+        <w:t>The block-permutation analysis identifies the mechanism. Release year supplies 11% of in-sample split gain and exactly zero out-of-sample utility, because every holdout year falls beyond the training range and a tree ensemble cannot extrapolate past its last split point. Runtime transfers; semantics transfer; the calendar does not.</w:t>
       </w:r>
     </w:p>
     <w:p>
@@ -5888,7 +5790,7 @@
           <w:i w:val="0"/>
           <w:sz w:val="16"/>
         </w:rPr>
-        <w:t>[3] J. Eliashberg, S. K. Hui, and Z. J. Zhang, “Assessing box office performance using movie scripts: A kernel-based approach,” IEEE Trans. Knowl. Data Eng., vol. 26, no. 11, 2014.</w:t>
+        <w:t>[3] I. Chalkidis, X. Dai, M. Fergadiotis, P. Malakasiotis, and D. Elliott, “An exploration of hierarchical attention transformers for efficient long document classification,” arXiv:2210.05529, 2022.</w:t>
       </w:r>
     </w:p>
     <w:p>
@@ -5902,7 +5804,7 @@
           <w:i w:val="0"/>
           <w:sz w:val="16"/>
         </w:rPr>
-        <w:t>[4] S. D. Hunter, S. Smith, and S. Singh, “Predicting box office from the screenplay: A text analytical approach,” West East Institute, 2016.</w:t>
+        <w:t>[4] H. L. Vogel, Entertainment Industry Economics, 10th ed. Cambridge, U.K.: Cambridge Univ. Press, 2020.</w:t>
       </w:r>
     </w:p>
     <w:p>
@@ -5916,7 +5818,7 @@
           <w:i w:val="0"/>
           <w:sz w:val="16"/>
         </w:rPr>
-        <w:t>[5] A. Bhadrashetty and S. Patil, “Movie success and rating prediction using data mining,” J. Sci. Res. Technol., 2024.</w:t>
+        <w:t>[5] M. C. Chiu, S. Lin, and W. Chen, “Screenplay quality assessment: Can we predict who gets nominated?” Nat. Univ. Singapore, Tech. Rep., 2020.</w:t>
       </w:r>
     </w:p>
     <w:p>
@@ -5930,7 +5832,7 @@
           <w:i w:val="0"/>
           <w:sz w:val="16"/>
         </w:rPr>
-        <w:t>[6] I. Chalkidis, X. Dai, M. Fergadiotis, P. Malakasiotis, and D. Elliott, “An exploration of hierarchical attention transformers for efficient long document classification,” arXiv:2210.05529, 2022.</w:t>
+        <w:t>[6] A. Søgaard, S. Ebert, J. Bastings, and K. Filippova, “We need to talk about random splits,” in Proc. EACL, 2021.</w:t>
       </w:r>
     </w:p>
     <w:p>
@@ -5944,7 +5846,7 @@
           <w:i w:val="0"/>
           <w:sz w:val="16"/>
         </w:rPr>
-        <w:t>[7] H. L. Vogel, Entertainment Industry Economics, 10th ed. Cambridge, U.K.: Cambridge Univ. Press, 2020.</w:t>
+        <w:t>[7] A. Elangovan, J. He, and K. Verspoor, “Memorization vs. generalization: Quantifying data leakage in NLP performance evaluation,” in Proc. EACL, 2021.</w:t>
       </w:r>
     </w:p>
     <w:p>
@@ -5958,105 +5860,7 @@
           <w:i w:val="0"/>
           <w:sz w:val="16"/>
         </w:rPr>
-        <w:t>[8] W. R. Bristi, Z. Zaman, and N. Sultana, “Predicting IMDb rating of movies by machine learning techniques,” in Proc. ICCCNT, 2019.</w:t>
-      </w:r>
-    </w:p>
-    <w:p>
-      <w:pPr>
-        <w:spacing w:before="0" w:after="40"/>
-        <w:ind w:left="317" w:hanging="317"/>
-      </w:pPr>
-      <w:r>
-        <w:rPr>
-          <w:b w:val="0"/>
-          <w:i w:val="0"/>
-          <w:sz w:val="16"/>
-        </w:rPr>
-        <w:t>[9] A. L. Gomes, M. Ribeiro, and P. Quaresma, “Predicting IMDb rating of TV series with deep learning: The case of Arrow,” arXiv:2211.03388, 2022.</w:t>
-      </w:r>
-    </w:p>
-    <w:p>
-      <w:pPr>
-        <w:spacing w:before="0" w:after="40"/>
-        <w:ind w:left="317" w:hanging="317"/>
-      </w:pPr>
-      <w:r>
-        <w:rPr>
-          <w:b w:val="0"/>
-          <w:i w:val="0"/>
-          <w:sz w:val="16"/>
-        </w:rPr>
-        <w:t>[10] V. Udandarao, A. Gupta, and S. Bhattacharya, “Movie revenue prediction using machine learning models,” arXiv:2405.11651, 2024.</w:t>
-      </w:r>
-    </w:p>
-    <w:p>
-      <w:pPr>
-        <w:spacing w:before="0" w:after="40"/>
-        <w:ind w:left="317" w:hanging="317"/>
-      </w:pPr>
-      <w:r>
-        <w:rPr>
-          <w:b w:val="0"/>
-          <w:i w:val="0"/>
-          <w:sz w:val="16"/>
-        </w:rPr>
-        <w:t>[11] W. Xie, Y. Liu, and H. Chen, “Predicting movie success with multi-task learning: GPT-based sentiment and SIR propagation,” arXiv preprint, 2025.</w:t>
-      </w:r>
-    </w:p>
-    <w:p>
-      <w:pPr>
-        <w:spacing w:before="0" w:after="40"/>
-        <w:ind w:left="317" w:hanging="317"/>
-      </w:pPr>
-      <w:r>
-        <w:rPr>
-          <w:b w:val="0"/>
-          <w:i w:val="0"/>
-          <w:sz w:val="16"/>
-        </w:rPr>
-        <w:t>[12] M. C. Chiu, S. Lin, and W. Chen, “Screenplay quality assessment: Can we predict who gets nominated?” Nat. Univ. Singapore, Tech. Rep., 2020.</w:t>
-      </w:r>
-    </w:p>
-    <w:p>
-      <w:pPr>
-        <w:spacing w:before="0" w:after="40"/>
-        <w:ind w:left="317" w:hanging="317"/>
-      </w:pPr>
-      <w:r>
-        <w:rPr>
-          <w:b w:val="0"/>
-          <w:i w:val="0"/>
-          <w:sz w:val="16"/>
-        </w:rPr>
-        <w:t>[13] A. Søgaard, S. Ebert, J. Bastings, and K. Filippova, “We need to talk about random splits,” in Proc. EACL, 2021.</w:t>
-      </w:r>
-    </w:p>
-    <w:p>
-      <w:pPr>
-        <w:spacing w:before="0" w:after="40"/>
-        <w:ind w:left="317" w:hanging="317"/>
-      </w:pPr>
-      <w:r>
-        <w:rPr>
-          <w:b w:val="0"/>
-          <w:i w:val="0"/>
-          <w:sz w:val="16"/>
-        </w:rPr>
-        <w:t>[14] A. Elangovan, J. He, and K. Verspoor, “Memorization vs. generalization: Quantifying data leakage in NLP performance evaluation,” in Proc. EACL, 2021.</w:t>
-      </w:r>
-    </w:p>
-    <w:p>
-      <w:pPr>
-        <w:spacing w:before="0" w:after="40"/>
-        <w:ind w:left="317" w:hanging="317"/>
-      </w:pPr>
-      <w:r>
-        <w:rPr>
-          <w:b w:val="0"/>
-          <w:i w:val="0"/>
-          <w:sz w:val="16"/>
-        </w:rPr>
-        <w:t>[15] S. Kapoor and A. Narayanan, “Leakage and the reproducibility crisis in machine-learning-based science,” Patterns, vol. 4, no. 9, 2023.</w:t>
+        <w:t>[8] S. Kapoor and A. Narayanan, “Leakage and the reproducibility crisis in machine-learning-based science,” Patterns, vol. 4, no. 9, 2023.</w:t>
       </w:r>
     </w:p>
     <w:sectPr>

</xml_diff>

<commit_message>
docs(paper): expand IEEE 6-page draft to 4,978 words via original text restoration
</commit_message>
<xml_diff>
--- a/paper/IEEE 6 pages.docx
+++ b/paper/IEEE 6 pages.docx
@@ -579,6 +579,20 @@
           <w:sz w:val="20"/>
         </w:rPr>
         <w:t>D. Audit results</w:t>
+      </w:r>
+    </w:p>
+    <w:p>
+      <w:pPr>
+        <w:spacing w:before="0" w:after="60"/>
+        <w:ind w:firstLine="288"/>
+      </w:pPr>
+      <w:r>
+        <w:rPr>
+          <w:b w:val="0"/>
+          <w:i w:val="0"/>
+          <w:sz w:val="20"/>
+        </w:rPr>
+        <w:t>Table I is the full ledger for the flow of Section sec:exclusion_flow, and the nesting in (2) means every row of it is a strict subset of the row above.</w:t>
       </w:r>
     </w:p>
     <w:p>
@@ -1588,7 +1602,7 @@
           <w:i w:val="0"/>
           <w:sz w:val="20"/>
         </w:rPr>
-        <w:t>Twenty-seven records are excluded because positional identity in the archived embedding matrix cannot be resolved uniquely without a stored record key.</w:t>
+        <w:t>Twenty-seven records are excluded because positional identity in the archived embedding matrix cannot be resolved uniquely without a stored record key. Twenty-seven positions inside the reconstruction gaps admit more than one consistent assignment; we drop them rather than guess.</w:t>
       </w:r>
     </w:p>
     <w:p>
@@ -1631,7 +1645,7 @@
           <w:i w:val="0"/>
           <w:sz w:val="20"/>
         </w:rPr>
-        <w:t>Sixteen statistics are computed from the raw, uncleaned script text: six size measures (char_count, word_count, line_count, sentence_count, scene_count, words_per_scene); three describing lexical sophistication (avg_word_length, unique_word_ratio, long_word_ratio); two describing sentence geometry (avg_sentence_length, sentence_length_std); two describing dialogue (dialogue_density, unique_characters); two emotional proxies (exclamation_ratio, question_ratio); and one stage-direction proxy (action_density). Scene count is the number of case-insensitive INT./EXT. matches. All sixteen describe the transcript as archived rather than the text the encoder receives.</w:t>
+        <w:t>Sixteen statistics are computed from the raw, uncleaned script text: six size measures (char_count, word_count, line_count, sentence_count, scene_count, words_per_scene); three describing lexical sophistication (avg_word_length, unique_word_ratio, long_word_ratio); two describing sentence geometry (avg_sentence_length, sentence_length_std); two describing dialogue (dialogue_density, unique_characters); two emotional proxies (exclamation_ratio, question_ratio); and one stage-direction proxy (action_density). Scene count is the number of case-insensitive INT./EXT. matches. All sixteen describe the transcript as archived rather than the text the encoder receives. Two of the sixteen are close to degenerate on this corpus, and the audit makes it visible before any model is fitted. Mean dialogue_density is .0087 with standard deviation .0361, and mean unique_characters is .41. A feature film does not have three speaking parts. The speaker-cue regular expression assumes a : convention that most IMSDb transcripts do not follow, so both features encode transcription format rather than dramaturgy. \textttscene_count has the same character: mean .0 against a standard deviation of .5$.</w:t>
       </w:r>
     </w:p>
     <w:p>
@@ -2219,6 +2233,20 @@
           <w:sz w:val="20"/>
         </w:rPr>
         <w:t>A. The cost of a stricter partition</w:t>
+      </w:r>
+    </w:p>
+    <w:p>
+      <w:pPr>
+        <w:spacing w:before="0" w:after="60"/>
+        <w:ind w:firstLine="288"/>
+      </w:pPr>
+      <w:r>
+        <w:rPr>
+          <w:b w:val="0"/>
+          <w:i w:val="0"/>
+          <w:sz w:val="20"/>
+        </w:rPr>
+        <w:t>Table II isolates the cost of the group constraint; Table III isolates the cost of the temporal one. Five systems, one corpus, one learner configuration throughout.</w:t>
       </w:r>
     </w:p>
     <w:p>
@@ -4170,6 +4198,20 @@
     </w:p>
     <w:p>
       <w:pPr>
+        <w:spacing w:before="0" w:after="60"/>
+        <w:ind w:firstLine="288"/>
+      </w:pPr>
+      <w:r>
+        <w:rPr>
+          <w:b w:val="0"/>
+          <w:i w:val="0"/>
+          <w:sz w:val="20"/>
+        </w:rPr>
+        <w:t>Table IV reports every baseline against the best system on matched records.</w:t>
+      </w:r>
+    </w:p>
+    <w:p>
+      <w:pPr>
         <w:spacing w:before="160" w:after="0"/>
         <w:ind w:firstLine="0"/>
         <w:jc w:val="center"/>
@@ -5432,7 +5474,7 @@
           <w:i w:val="0"/>
           <w:sz w:val="20"/>
         </w:rPr>
-        <w:t>Under P1 and P2, adding the three metadata columns to the embedding buys a highly significant 0.108–0.114 rating points of mean absolute error. Under P3 the same addition buys 0.0236 points, with an interval straddling zero and p = 0.273; the full statistics are W = 62,734 over n = 515 pairs with no ties, rank-biserial r = +0.056. The metadata block, worth two orders of magnitude in p-value under a random split, is not measurably useful when the test films are genuinely unseen.</w:t>
+        <w:t>The final row is the one that changes the story. Under P1 and P2, adding the three metadata columns to the embedding buys a highly significant 0.108–0.114 rating points of mean absolute error. Under P3 the same addition buys 0.0236 points, with an interval straddling zero and p = 0.273; the full statistics are W = 62,734 over n = 515 pairs with no ties, rank-biserial r = +0.056. The metadata block, worth two orders of magnitude in p-value under a random split, is not measurably useful when the test films are genuinely unseen.</w:t>
       </w:r>
     </w:p>
     <w:p>
@@ -5460,7 +5502,7 @@
           <w:i w:val="0"/>
           <w:sz w:val="20"/>
         </w:rPr>
-        <w:t>Part of the R^2 collapse is therefore arithmetic — the same absolute error against a narrower target yields a smaller R^2 — and part is genuine degradation. Mean absolute error separates them: it is 0.7276 under P1 and 0.7232 under P3, statistically indistinguishable. What collapses is how much of the (now narrower) variance it can order. Regressing prediction on truth over the holdout gives slope 0.4634 (s.e. 0.0278) and intercept 3.1745, against an ideal slope of 1.</w:t>
+        <w:t>Part of the R^2 collapse is therefore arithmetic — the same absolute error against a narrower target yields a smaller R^2 — and part is genuine degradation. Mean absolute error separates them: it is 0.7276 under P1 and 0.7232 under P3, statistically indistinguishable. The model's typical error in rating points does not grow at all when it predicts the future. What collapses is how much of the (now narrower) variance it can order. Regressing prediction on truth over the holdout gives slope 0.4634 (s.e. 0.0278) and intercept 3.1745, against an ideal slope of 1; the predicted standard deviation is .783$ of the observed one. The system is heavily shrunk toward the centre — it identifies which films are above or below average and declines to commit to how far.</w:t>
       </w:r>
     </w:p>
     <w:p>
@@ -5648,6 +5690,20 @@
           <w:i w:val="0"/>
           <w:sz w:val="20"/>
         </w:rPr>
+        <w:t>The content-digest audit is verified on a subset. As stated in Section III, SHA-256 deduplication was executed over the 356 script files distributed with the code and returned zero duplicate groups. The metadata identity keys covering all 5,204 records found no duplicate identifiers and no duplicate title$ pairs, which bounds the plausible residual duplication, but does not eliminate the possibility of two distinct films sharing a byte-identical file through a scraping error. We report this rather than assert a number we did not compute.</w:t>
+      </w:r>
+    </w:p>
+    <w:p>
+      <w:pPr>
+        <w:spacing w:before="0" w:after="60"/>
+        <w:ind w:firstLine="288"/>
+      </w:pPr>
+      <w:r>
+        <w:rPr>
+          <w:b w:val="0"/>
+          <w:i w:val="0"/>
+          <w:sz w:val="20"/>
+        </w:rPr>
         <w:t>Selection effects in IMSDb are severe and not correctable. Contributors upload what they value, so canonical and acclaimed films are over-represented among older titles while recent years sample more broadly. The corpus-wide mean rating falls monotonically from 7.87 in the 1920s to 5.48 in the 2010s, which is a statement about who uploads what, not about film quality. Any model reading year learns this curation artifact, and P3 is the protocol that refuses to reward it. Generalisation claims extend to films resembling IMSDb's selection, not to an arbitrary IMDb title.</w:t>
       </w:r>
     </w:p>
@@ -5677,6 +5733,20 @@
           <w:sz w:val="20"/>
         </w:rPr>
         <w:t>The strongest transferring feature is unavailable at deployment. Runtime dominates the temporal holdout, matching the entire embedding block under permutation. A screenplay-stage predictor does not know the runtime, because the film has not been cut — or shot.</w:t>
+      </w:r>
+    </w:p>
+    <w:p>
+      <w:pPr>
+        <w:spacing w:before="0" w:after="60"/>
+        <w:ind w:firstLine="288"/>
+      </w:pPr>
+      <w:r>
+        <w:rPr>
+          <w:b w:val="0"/>
+          <w:i w:val="0"/>
+          <w:sz w:val="20"/>
+        </w:rPr>
+        <w:t>Single encoder, single pooling. We audit mean-pooled all-MiniLM-L6-v2. Larger encoders, learned pooling, and token-aligned windows are all plausible improvements, and none is evaluated here; the point of the paper is the protocol, and holding the representation fixed is what makes the protocol comparison clean.</w:t>
       </w:r>
     </w:p>
     <w:p>
@@ -5719,7 +5789,7 @@
           <w:i w:val="0"/>
           <w:sz w:val="20"/>
         </w:rPr>
-        <w:t>The block-permutation analysis identifies the mechanism. Release year supplies 11% of in-sample split gain and exactly zero out-of-sample utility, because every holdout year falls beyond the training range and a tree ensemble cannot extrapolate past its last split point. Runtime transfers; semantics transfer; the calendar does not.</w:t>
+        <w:t>The block-permutation analysis identifies the mechanism. Release year supplies 11% of in-sample split gain and exactly zero out-of-sample utility, because every holdout year falls beyond the training range and a tree ensemble cannot extrapolate past its last split point. Runtime transfers; semantics transfer; the calendar does not. For anyone building a screenplay-stage predictor, the operational recommendations are narrow and concrete: group by title family, hold out by release year, report MAE next to ^2$ when the target distribution shifts, align the chunk to the tokeniser rather than to whitespace, and store an immutable record key beside every cached representation.</w:t>
       </w:r>
     </w:p>
     <w:p>

</xml_diff>

<commit_message>
docs(paper): update IEEE 6-page paper manuscript with full citations and revisions
</commit_message>
<xml_diff>
--- a/paper/IEEE 6 pages.docx
+++ b/paper/IEEE 6 pages.docx
@@ -14,7 +14,7 @@
           <w:i w:val="0"/>
           <w:sz w:val="40"/>
         </w:rPr>
-        <w:t>What Survives a Strict Split? An Empirical Audit of\-Document Screenplay Modelling for IMDb Rating Prediction</w:t>
+        <w:t>What Survives a Strict Split? An Empirical Audit of Long-Document Screenplay Modelling for IMDb Rating Prediction</w:t>
       </w:r>
     </w:p>
     <w:p>
@@ -111,7 +111,7 @@
           <w:i w:val="0"/>
           <w:sz w:val="20"/>
         </w:rPr>
-        <w:t>Sentence encoders read 256 tokens. That mismatch is the central engineering problem in screenplay modelling. What is far less often examined is whether the evaluation wrapped around that pipeline measures anything a practitioner could rely on, because an archival screenplay corpus assembled from a community repository carries two structural hazards that a shuffled train/test split will silently convert into apparent skill.</w:t>
+        <w:t>A feature-film screenplay runs to roughly 25,000 words. Sentence encoders read 256 tokens. That mismatch is the central engineering problem in screenplay modelling, and the usual answer — slide a window, embed each window, average the results — is cheap, reproducible, and widely used. What is far less often examined is whether the evaluation wrapped around that pipeline measures anything a practitioner could rely on, because an archival screenplay corpus assembled from a community repository carries two structural hazards that a shuffled train/test split will silently convert into apparent skill.</w:t>
       </w:r>
     </w:p>
     <w:p>
@@ -125,7 +125,7 @@
           <w:i w:val="0"/>
           <w:sz w:val="20"/>
         </w:rPr>
-        <w:t>The first hazard is duplication: under a random partition, a near-copy in the training set makes its twin in the test set trivially predictable.</w:t>
+        <w:t>The first hazard is duplication. Franchises share vocabulary and structure across installments, and remakes reuse plot and dialogue wholesale. Under a random partition, a near-copy in the training set makes its twin in the test set trivially predictable. The second hazard is time. A model given a release-year feature can recover a large share of target variance from the calendar alone, without reading a single line of dialogue. That shortcut evaporates the moment the test films are drawn from years the model never saw, which is the only setting in which a screenplay-stage predictor would actually be deployed.</w:t>
       </w:r>
     </w:p>
     <w:p>
@@ -139,21 +139,7 @@
           <w:i w:val="0"/>
           <w:sz w:val="20"/>
         </w:rPr>
-        <w:t>The second hazard is time. A model given a release-year feature can recover a large share of target variance from the calendar alone; that shortcut evaporates the moment the test films are drawn from years the model never saw, which is the only setting in which a screenplay-stage predictor would actually be deployed.</w:t>
-      </w:r>
-    </w:p>
-    <w:p>
-      <w:pPr>
-        <w:spacing w:before="0" w:after="60"/>
-        <w:ind w:firstLine="288"/>
-      </w:pPr>
-      <w:r>
-        <w:rPr>
-          <w:b w:val="0"/>
-          <w:i w:val="0"/>
-          <w:sz w:val="20"/>
-        </w:rPr>
-        <w:t>Chunking is almost always specified in words; truncation always happens in subword tokens. Nobody is told when the budget is exceeded — the encoder simply drops the tail — so a configuration that reads as “256-word windows with 50-word overlap” can in practice discard a third of the corpus without emitting a single warning.</w:t>
+        <w:t>Layered underneath both is a quieter defect specific to chunked long-document pipelines. Chunking is almost always specified in words; truncation always happens in subword tokens. Nobody is told when the budget is exceeded — the encoder simply drops the tail — so a configuration that reads as “256-word windows with 50-word overlap” can in practice discard a third of the corpus without emitting a single warning.</w:t>
       </w:r>
     </w:p>
     <w:p>
@@ -179,7 +165,7 @@
           <w:rFonts w:ascii="Times New Roman" w:hAnsi="Times New Roman"/>
           <w:sz w:val="20"/>
         </w:rPr>
-        <w:t>C1 — A record-identity protocol and its exclusion ledger. We define film identity through four keys — content SHA-256 digest, IMDb identifier, title×year, and a normalised title-family stem — audit all 5,204 joined records against each, and report every exclusion (Section III). The audited corpus contains no duplicate identifiers and no duplicate title×year pairs, but 80 title collisions and 164 multi-member title families that a random split would happily straddle.</w:t>
+        <w:t>C1 — A record-identity protocol and its exclusion ledger. We define film identity through four keys — content SHA-256 digest, IMDb identifier, title×year, and a normalised title-family stem — audit all 5,204 joined records against each, and report every exclusion (Section III).</w:t>
       </w:r>
     </w:p>
     <w:p>
@@ -191,7 +177,7 @@
           <w:rFonts w:ascii="Times New Roman" w:hAnsi="Times New Roman"/>
           <w:sz w:val="20"/>
         </w:rPr>
-        <w:t>C2 — A measurement of silent truncation. Running the encoder's own tokeniser over the pipeline's own windows, we find that 98.45% of 256-word windows exceed the 254-token content budget and that 31.60% of WordPiece tokens are discarded before the encoder sees them, with a median window of 371 tokens against a budget of 254 (Section IV-B).</w:t>
+        <w:t>C2 — A measurement of silent truncation. Running the encoder's own tokeniser over the pipeline's own windows, we find that 98.45% of 256-word windows exceed the 254-token content budget and that 31.60% of WordPiece tokens are discarded before the encoder sees them (Section IV-B).</w:t>
       </w:r>
     </w:p>
     <w:p>
@@ -237,16 +223,16 @@
     </w:p>
     <w:p>
       <w:pPr>
-        <w:spacing w:before="120" w:after="40"/>
-        <w:ind w:firstLine="0"/>
+        <w:spacing w:before="0" w:after="60"/>
+        <w:ind w:firstLine="288"/>
       </w:pPr>
       <w:r>
         <w:rPr>
           <w:b w:val="0"/>
-          <w:i/>
+          <w:i w:val="0"/>
           <w:sz w:val="20"/>
         </w:rPr>
-        <w:t>A. Computational analysis of screenplays</w:t>
+        <w:t>Screenplays and film outcomes. Early work treated the script as a feature source for commercial forecasting, predicting return on investment or box-office revenue from genre, content, and semantic descriptors [3, 4]. A second strand reads narrative structure rather than commercial outcome: emotional arc shapes [5, 9], character portrayal [6], MPAA age-suitability and severity rating [7, 25, 8], and tag assignment from plot synopses [26]. Screenplay quality assessment in the awards-nomination framing [27] is the closest analogue to rating regression, and it shares our target's central difficulty: the label is an aggregate social judgement, only partly a function of the text. Outside the script itself, forecasting has drawn on production metadata [10], social-media and Wikipedia activity [15, 16, 17, 18], trailer content [11], and review sentiment [13, 22]; IMDb rating regression from tabular and textual metadata is by now a standard applied exercise [12, 20, 21, 23, 24]. The reported figures span a wide range, and the partitions behind them are rarely specified beyond a random seed. Vogel's industry account [19] is a useful corrective on the ceiling: theatrical outcomes are dominated by release strategy, competition, and marketing spend, none of which is legible in the script.</w:t>
       </w:r>
     </w:p>
     <w:p>
@@ -260,21 +246,7 @@
           <w:i w:val="0"/>
           <w:sz w:val="20"/>
         </w:rPr>
-        <w:t>Screenplay quality assessment in the awards-nomination framing [5] is the closest analogue to rating regression, and it shares our target's central difficulty: the label is an aggregate social judgement, only partly a function of the text.</w:t>
-      </w:r>
-    </w:p>
-    <w:p>
-      <w:pPr>
-        <w:spacing w:before="120" w:after="40"/>
-        <w:ind w:firstLine="0"/>
-      </w:pPr>
-      <w:r>
-        <w:rPr>
-          <w:b w:val="0"/>
-          <w:i/>
-          <w:sz w:val="20"/>
-        </w:rPr>
-        <w:t>B. Box-office and rating forecasting</w:t>
+        <w:t>Representations for long documents. Sentence-BERT [2] produces dense sentence-level embeddings from a Siamese objective and is the encoder we audit. Its native context is short, so document-level use requires either hierarchical attention [14], sparse attention over longer sequences [1], or chunk-and-pool aggregation. Chunk-and-pool is the pragmatic default: it needs no fine-tuning, runs on CPU, and scales linearly. Its cost is that the aggregation function is fixed rather than learned, and — as we measure in Section IV-B — that the chunk boundary is usually specified in a unit the encoder does not use.</w:t>
       </w:r>
     </w:p>
     <w:p>
@@ -288,63 +260,7 @@
           <w:i w:val="0"/>
           <w:sz w:val="20"/>
         </w:rPr>
-        <w:t>Vogel's industry account [4] is a useful corrective on the ceiling: theatrical outcomes are dominated by release strategy, competition, and marketing spend, none of which is legible in the script.</w:t>
-      </w:r>
-    </w:p>
-    <w:p>
-      <w:pPr>
-        <w:spacing w:before="120" w:after="40"/>
-        <w:ind w:firstLine="0"/>
-      </w:pPr>
-      <w:r>
-        <w:rPr>
-          <w:b w:val="0"/>
-          <w:i/>
-          <w:sz w:val="20"/>
-        </w:rPr>
-        <w:t>C. Representations for long documents</w:t>
-      </w:r>
-    </w:p>
-    <w:p>
-      <w:pPr>
-        <w:spacing w:before="0" w:after="60"/>
-        <w:ind w:firstLine="288"/>
-      </w:pPr>
-      <w:r>
-        <w:rPr>
-          <w:b w:val="0"/>
-          <w:i w:val="0"/>
-          <w:sz w:val="20"/>
-        </w:rPr>
-        <w:t>Sentence-BERT [2] produces dense sentence-level embeddings from a Siamese objective and is the encoder we audit. Its native context is short, so document-level use requires either hierarchical attention [3], sparse attention over longer sequences [1], or chunk-and-pool aggregation. Chunk-and-pool is the pragmatic default: it needs no fine-tuning, runs on CPU, and scales linearly. Its cost is that the aggregation function is fixed rather than learned, and — as we measure in Section IV-B — that the chunk boundary is usually specified in a unit the encoder does not use. Classical n-gram TF-IDF remains a competitive lexical control on long technical text and is included here for exactly that reason.</w:t>
-      </w:r>
-    </w:p>
-    <w:p>
-      <w:pPr>
-        <w:spacing w:before="120" w:after="40"/>
-        <w:ind w:firstLine="0"/>
-      </w:pPr>
-      <w:r>
-        <w:rPr>
-          <w:b w:val="0"/>
-          <w:i/>
-          <w:sz w:val="20"/>
-        </w:rPr>
-        <w:t>D. Leakage and split design in archival NLP</w:t>
-      </w:r>
-    </w:p>
-    <w:p>
-      <w:pPr>
-        <w:spacing w:before="0" w:after="60"/>
-        <w:ind w:firstLine="288"/>
-      </w:pPr>
-      <w:r>
-        <w:rPr>
-          <w:b w:val="0"/>
-          <w:i w:val="0"/>
-          <w:sz w:val="20"/>
-        </w:rPr>
-        <w:t>Søgaard et al. [6] recommended split designs that stress the generalisation actually claimed. Elangovan et al. [7] formalised train–test overlap measurement. Kapoor and Narayanan [8] catalogue leakage taxonomies across disciplines and argue for pre-registration of the split.</w:t>
+        <w:t>Leakage and split design. The methodological literature we lean on is not about films. System rankings reorder under alternative random splits, and split designs should stress the generalisation actually claimed [28, 29]; train–test overlap has been measured and formalised for NLP benchmarks [30, 31], and leakage taxonomies across disciplines argue for pre-registration of the split [32]. Temporal generalisation has its own line [33], as does documentation of corpus provenance [34, 35]. Applying these instruments to a screenplay corpus is, to our knowledge, new.</w:t>
       </w:r>
     </w:p>
     <w:p>
@@ -373,7 +289,7 @@
           <w:i/>
           <w:sz w:val="20"/>
         </w:rPr>
-        <w:t>A. Source and join</w:t>
+        <w:t>A. Source and identity keys</w:t>
       </w:r>
     </w:p>
     <w:p>
@@ -387,7 +303,21 @@
           <w:i w:val="0"/>
           <w:sz w:val="20"/>
         </w:rPr>
-        <w:t>The corpus joins full screenplay texts scraped from the Internet Movie Script Database (IMSDb) to IMDb metadata on a per-film basis. Each of the 5,204 joined records carries a title, release year, decade bin, IMDb identifier, runtime in minutes, an IMDb rating on the 1.0–10.0 scale at one-decimal resolution, and a path to the script file. Ratings have mean 5.98, median 5.80, and standard deviation 1.44; runtimes span 45–254 minutes with median 99.</w:t>
+        <w:t>The corpus joins full screenplay texts scraped from the Internet Movie Script Database (IMSDb) to IMDb metadata on a per-film basis. Each of the 5,204 joined records carries a title, release year, decade bin, IMDb identifier, runtime in minutes, an IMDb rating on the 1.0–10.0 scale at one-decimal resolution, and a path to the script file. Ratings have mean 5.98, median 5.80, and standard deviation 1.44.</w:t>
+      </w:r>
+    </w:p>
+    <w:p>
+      <w:pPr>
+        <w:spacing w:before="0" w:after="60"/>
+        <w:ind w:firstLine="288"/>
+      </w:pPr>
+      <w:r>
+        <w:rPr>
+          <w:b w:val="0"/>
+          <w:i w:val="0"/>
+          <w:sz w:val="20"/>
+        </w:rPr>
+        <w:t>Deduplication is only as good as the notion of identity behind it, so we audit four keys of decreasing strictness. Content digest: for a script file with byte content b, the key is SHA256(b), which catches the re-upload-under-a-new-name case that no metadata key can see; collisions are resolved by retaining the earliest record in load order. IMDb identifier: the canonical film key. Title×year: a fallback for records whose identifier is missing or malformed. Title family: the loosest key, and the one that matters for split design. We normalise a title t by case-folding, stripping non-alphanumeric characters, removing a leading article, and iteratively deleting a trailing sequel marker — an Arabic numeral, a Roman numeral up to X, or a part n construction — to a fixed point. Toy Story, Toy Story 2 and Toy Story 3 therefore map to the single family toy story. Families are not deduplicated; they are the grouping variable for Section IV-D.</w:t>
       </w:r>
     </w:p>
     <w:p>
@@ -401,83 +331,7 @@
           <w:i/>
           <w:sz w:val="20"/>
         </w:rPr>
-        <w:t>B. Four identity keys</w:t>
-      </w:r>
-    </w:p>
-    <w:p>
-      <w:pPr>
-        <w:spacing w:before="0" w:after="60"/>
-        <w:ind w:firstLine="288"/>
-      </w:pPr>
-      <w:r>
-        <w:rPr>
-          <w:b w:val="0"/>
-          <w:i w:val="0"/>
-          <w:sz w:val="20"/>
-        </w:rPr>
-        <w:t>We audit four identity keys of decreasing strictness:</w:t>
-      </w:r>
-    </w:p>
-    <w:p>
-      <w:pPr>
-        <w:pStyle w:val="ListBullet"/>
-      </w:pPr>
-      <w:r>
-        <w:rPr>
-          <w:rFonts w:ascii="Times New Roman" w:hAnsi="Times New Roman"/>
-          <w:sz w:val="20"/>
-        </w:rPr>
-        <w:t>Content digest: For a script file with byte content b, the key is SHA256(b), rendered as a 64-character hexadecimal digest, resolving collisions by retaining the earliest record in load order.</w:t>
-      </w:r>
-    </w:p>
-    <w:p>
-      <w:pPr>
-        <w:pStyle w:val="ListBullet"/>
-      </w:pPr>
-      <w:r>
-        <w:rPr>
-          <w:rFonts w:ascii="Times New Roman" w:hAnsi="Times New Roman"/>
-          <w:sz w:val="20"/>
-        </w:rPr>
-        <w:t>IMDb identifier: Canonical tt-prefixed identifier catching the case where the same film was collected twice with different file names and slightly different titles.</w:t>
-      </w:r>
-    </w:p>
-    <w:p>
-      <w:pPr>
-        <w:pStyle w:val="ListBullet"/>
-      </w:pPr>
-      <w:r>
-        <w:rPr>
-          <w:rFonts w:ascii="Times New Roman" w:hAnsi="Times New Roman"/>
-          <w:sz w:val="20"/>
-        </w:rPr>
-        <w:t>Title×year: Fallback for records whose identifier is missing or malformed.</w:t>
-      </w:r>
-    </w:p>
-    <w:p>
-      <w:pPr>
-        <w:pStyle w:val="ListBullet"/>
-      </w:pPr>
-      <w:r>
-        <w:rPr>
-          <w:rFonts w:ascii="Times New Roman" w:hAnsi="Times New Roman"/>
-          <w:sz w:val="20"/>
-        </w:rPr>
-        <w:t>Title family: The grouping variable for Section IV-E. We normalise a title t by case-folding, stripping non-alphanumeric characters, removing a leading article, and iteratively deleting a trailing sequel marker — an Arabic numeral, a Roman numeral up to X, or a part n construction. Toy Story, Toy Story 2 and Toy Story 3 therefore map to the single family toy story.</w:t>
-      </w:r>
-    </w:p>
-    <w:p>
-      <w:pPr>
-        <w:spacing w:before="120" w:after="40"/>
-        <w:ind w:firstLine="0"/>
-      </w:pPr>
-      <w:r>
-        <w:rPr>
-          <w:b w:val="0"/>
-          <w:i/>
-          <w:sz w:val="20"/>
-        </w:rPr>
-        <w:t>C. The exclusion flow</w:t>
+        <w:t>B. The exclusion flow</w:t>
       </w:r>
     </w:p>
     <w:p>
@@ -506,7 +360,7 @@
           <w:i/>
           <w:sz w:val="20"/>
         </w:rPr>
-        <w:t>pi_len(r) &amp;\iff |text(r)| &gt;= 1,000 characters, pi_hash(r) &amp;\iff SHA256\bigl(bytes(r)\bigr) not in H_&lt;r, pi_year(r) &amp;\iff yr(r) in [1900, 2025], pi_id(r) &amp;\iff positional identity of r is unique,</w:t>
+        <w:t>pi_len(r) &amp;= |text(r)| &gt;= 1000 characters, pi_hash(r) &amp;= SHA256\bigl(bytes(r)\bigr) not in H_&lt;r, pi_year(r) &amp;= yr(r) in [1900, 2025], pi_id(r) &amp;= positional identity of r is unique,</w:t>
       </w:r>
     </w:p>
     <w:p>
@@ -520,7 +374,7 @@
           <w:i w:val="0"/>
           <w:sz w:val="20"/>
         </w:rPr>
-        <w:t>where H_&lt;r is the set of digests already seen in load order, so pi_hash retains exactly one representative per digest. The surviving sets are nested,</w:t>
+        <w:t>where H_&lt;r is the set of digests already seen in load order. The surviving sets are nested, R_k = \ r in R_k-1 : pi_k(r) \, and the realised cardinality chain on this corpus is</w:t>
       </w:r>
     </w:p>
     <w:p>
@@ -535,7 +389,7 @@
           <w:i/>
           <w:sz w:val="20"/>
         </w:rPr>
-        <w:t>R_4 ⊆ R_3 ⊆ R_2 ⊆ R_1 ⊆ R_0 , \qquad R_k = \ r in R_k-1 : pi_k(r) \,</w:t>
+        <w:t>5,204 \xrightarrow pi_len 5,195 \xrightarrow pi_hash 5,195 \xrightarrow pi_year 5,191 \xrightarrow pi_id 5,164 .</w:t>
       </w:r>
     </w:p>
     <w:p>
@@ -549,22 +403,7 @@
           <w:i w:val="0"/>
           <w:sz w:val="20"/>
         </w:rPr>
-        <w:t>and the realised cardinality chain on this corpus is</w:t>
-      </w:r>
-    </w:p>
-    <w:p>
-      <w:pPr>
-        <w:spacing w:before="80" w:after="80"/>
-        <w:ind w:firstLine="0"/>
-        <w:jc w:val="center"/>
-      </w:pPr>
-      <w:r>
-        <w:rPr>
-          <w:b w:val="0"/>
-          <w:i/>
-          <w:sz w:val="20"/>
-        </w:rPr>
-        <w:t>5,204 \xrightarrowpi_len 5,195 \xrightarrowpi_hash 5,195 \xrightarrowpi_year 5,191 \xrightarrowpi_id 5,164 .</w:t>
+        <w:t>The second arrow is the one to read carefully. It is an identity map on the subset over which the digest could be evaluated, not a corpus-wide null result: content hashing requires the raw text, and 356 of the 5,204 files are distributed with the code. Over those 356 the digest audit returns zero collisions. The metadata identity keys, which are computable for all 5,204 records, likewise return zero duplicate IMDb identifiers and zero duplicate title×year pairs, which bounds — without eliminating — the residual duplication that a full-corpus pass could still uncover.</w:t>
       </w:r>
     </w:p>
     <w:p>
@@ -578,21 +417,7 @@
           <w:i/>
           <w:sz w:val="20"/>
         </w:rPr>
-        <w:t>D. Audit results</w:t>
-      </w:r>
-    </w:p>
-    <w:p>
-      <w:pPr>
-        <w:spacing w:before="0" w:after="60"/>
-        <w:ind w:firstLine="288"/>
-      </w:pPr>
-      <w:r>
-        <w:rPr>
-          <w:b w:val="0"/>
-          <w:i w:val="0"/>
-          <w:sz w:val="20"/>
-        </w:rPr>
-        <w:t>Table I is the full ledger for the flow of Section sec:exclusion_flow, and the nesting in (2) means every row of it is a strict subset of the row above.</w:t>
+        <w:t>C. Audit results</w:t>
       </w:r>
     </w:p>
     <w:p>
@@ -715,116 +540,6 @@
                 <w:sz w:val="16"/>
               </w:rPr>
               <w:t>Joined records (IMSDb JOIN IMDb)</w:t>
-            </w:r>
-          </w:p>
-        </w:tc>
-        <w:tc>
-          <w:tcPr>
-            <w:tcW w:type="dxa" w:w="3365"/>
-          </w:tcPr>
-          <w:p>
-            <w:pPr>
-              <w:ind w:firstLine="0"/>
-              <w:jc w:val="center"/>
-            </w:pPr>
-            <w:r>
-              <w:rPr>
-                <w:rFonts w:ascii="Times New Roman" w:hAnsi="Times New Roman"/>
-                <w:sz w:val="16"/>
-              </w:rPr>
-              <w:t>5,204</w:t>
-            </w:r>
-          </w:p>
-        </w:tc>
-        <w:tc>
-          <w:tcPr>
-            <w:tcW w:type="dxa" w:w="3365"/>
-          </w:tcPr>
-          <w:p>
-            <w:pPr>
-              <w:ind w:firstLine="0"/>
-              <w:jc w:val="center"/>
-            </w:pPr>
-            <w:r>
-              <w:rPr>
-                <w:rFonts w:ascii="Times New Roman" w:hAnsi="Times New Roman"/>
-                <w:sz w:val="16"/>
-              </w:rPr>
-              <w:t>100.00</w:t>
-            </w:r>
-          </w:p>
-        </w:tc>
-      </w:tr>
-      <w:tr>
-        <w:tc>
-          <w:tcPr>
-            <w:tcW w:type="dxa" w:w="3365"/>
-          </w:tcPr>
-          <w:p>
-            <w:pPr>
-              <w:ind w:firstLine="0"/>
-              <w:jc w:val="left"/>
-            </w:pPr>
-            <w:r>
-              <w:rPr>
-                <w:rFonts w:ascii="Times New Roman" w:hAnsi="Times New Roman"/>
-                <w:sz w:val="16"/>
-              </w:rPr>
-              <w:t>Identity keys</w:t>
-            </w:r>
-          </w:p>
-        </w:tc>
-        <w:tc>
-          <w:tcPr>
-            <w:tcW w:type="dxa" w:w="3365"/>
-          </w:tcPr>
-          <w:p>
-            <w:pPr>
-              <w:ind w:firstLine="0"/>
-              <w:jc w:val="center"/>
-            </w:pPr>
-            <w:r>
-              <w:rPr>
-                <w:rFonts w:ascii="Times New Roman" w:hAnsi="Times New Roman"/>
-                <w:sz w:val="16"/>
-              </w:rPr>
-            </w:r>
-          </w:p>
-        </w:tc>
-        <w:tc>
-          <w:tcPr>
-            <w:tcW w:type="dxa" w:w="3365"/>
-          </w:tcPr>
-          <w:p>
-            <w:pPr>
-              <w:ind w:firstLine="0"/>
-              <w:jc w:val="center"/>
-            </w:pPr>
-            <w:r>
-              <w:rPr>
-                <w:rFonts w:ascii="Times New Roman" w:hAnsi="Times New Roman"/>
-                <w:sz w:val="16"/>
-              </w:rPr>
-            </w:r>
-          </w:p>
-        </w:tc>
-      </w:tr>
-      <w:tr>
-        <w:tc>
-          <w:tcPr>
-            <w:tcW w:type="dxa" w:w="3365"/>
-          </w:tcPr>
-          <w:p>
-            <w:pPr>
-              <w:ind w:firstLine="0"/>
-              <w:jc w:val="left"/>
-            </w:pPr>
-            <w:r>
-              <w:rPr>
-                <w:rFonts w:ascii="Times New Roman" w:hAnsi="Times New Roman"/>
-                <w:sz w:val="16"/>
-              </w:rPr>
-              <w:t>Distinct script file names</w:t>
             </w:r>
           </w:p>
         </w:tc>
@@ -1010,7 +725,7 @@
                 <w:rFonts w:ascii="Times New Roman" w:hAnsi="Times New Roman"/>
                 <w:sz w:val="16"/>
               </w:rPr>
-              <w:t>80 groups / 165 rec.</w:t>
+              <w:t>80 / 165 rec.</w:t>
             </w:r>
           </w:p>
         </w:tc>
@@ -1085,60 +800,6 @@
                 <w:sz w:val="16"/>
               </w:rPr>
               <w:t>—</w:t>
-            </w:r>
-          </w:p>
-        </w:tc>
-      </w:tr>
-      <w:tr>
-        <w:tc>
-          <w:tcPr>
-            <w:tcW w:type="dxa" w:w="3365"/>
-          </w:tcPr>
-          <w:p>
-            <w:pPr>
-              <w:ind w:firstLine="0"/>
-              <w:jc w:val="left"/>
-            </w:pPr>
-            <w:r>
-              <w:rPr>
-                <w:rFonts w:ascii="Times New Roman" w:hAnsi="Times New Roman"/>
-                <w:sz w:val="16"/>
-              </w:rPr>
-              <w:t>Exclusions</w:t>
-            </w:r>
-          </w:p>
-        </w:tc>
-        <w:tc>
-          <w:tcPr>
-            <w:tcW w:type="dxa" w:w="3365"/>
-          </w:tcPr>
-          <w:p>
-            <w:pPr>
-              <w:ind w:firstLine="0"/>
-              <w:jc w:val="center"/>
-            </w:pPr>
-            <w:r>
-              <w:rPr>
-                <w:rFonts w:ascii="Times New Roman" w:hAnsi="Times New Roman"/>
-                <w:sz w:val="16"/>
-              </w:rPr>
-            </w:r>
-          </w:p>
-        </w:tc>
-        <w:tc>
-          <w:tcPr>
-            <w:tcW w:type="dxa" w:w="3365"/>
-          </w:tcPr>
-          <w:p>
-            <w:pPr>
-              <w:ind w:firstLine="0"/>
-              <w:jc w:val="center"/>
-            </w:pPr>
-            <w:r>
-              <w:rPr>
-                <w:rFonts w:ascii="Times New Roman" w:hAnsi="Times New Roman"/>
-                <w:sz w:val="16"/>
-              </w:rPr>
             </w:r>
           </w:p>
         </w:tc>
@@ -1382,7 +1043,7 @@
                 <w:rFonts w:ascii="Times New Roman" w:hAnsi="Times New Roman"/>
                 <w:sz w:val="16"/>
               </w:rPr>
-              <w:t>Title families</w:t>
+              <w:t>Title families / multi-member</w:t>
             </w:r>
           </w:p>
         </w:tc>
@@ -1400,119 +1061,7 @@
                 <w:rFonts w:ascii="Times New Roman" w:hAnsi="Times New Roman"/>
                 <w:sz w:val="16"/>
               </w:rPr>
-              <w:t>4,979</w:t>
-            </w:r>
-          </w:p>
-        </w:tc>
-        <w:tc>
-          <w:tcPr>
-            <w:tcW w:type="dxa" w:w="3365"/>
-          </w:tcPr>
-          <w:p>
-            <w:pPr>
-              <w:ind w:firstLine="0"/>
-              <w:jc w:val="center"/>
-            </w:pPr>
-            <w:r>
-              <w:rPr>
-                <w:rFonts w:ascii="Times New Roman" w:hAnsi="Times New Roman"/>
-                <w:sz w:val="16"/>
-              </w:rPr>
-              <w:t>—</w:t>
-            </w:r>
-          </w:p>
-        </w:tc>
-      </w:tr>
-      <w:tr>
-        <w:tc>
-          <w:tcPr>
-            <w:tcW w:type="dxa" w:w="3365"/>
-          </w:tcPr>
-          <w:p>
-            <w:pPr>
-              <w:ind w:firstLine="0"/>
-              <w:jc w:val="left"/>
-            </w:pPr>
-            <w:r>
-              <w:rPr>
-                <w:rFonts w:ascii="Times New Roman" w:hAnsi="Times New Roman"/>
-                <w:sz w:val="16"/>
-              </w:rPr>
-              <w:t>multi-member families</w:t>
-            </w:r>
-          </w:p>
-        </w:tc>
-        <w:tc>
-          <w:tcPr>
-            <w:tcW w:type="dxa" w:w="3365"/>
-          </w:tcPr>
-          <w:p>
-            <w:pPr>
-              <w:ind w:firstLine="0"/>
-              <w:jc w:val="center"/>
-            </w:pPr>
-            <w:r>
-              <w:rPr>
-                <w:rFonts w:ascii="Times New Roman" w:hAnsi="Times New Roman"/>
-                <w:sz w:val="16"/>
-              </w:rPr>
-              <w:t>164</w:t>
-            </w:r>
-          </w:p>
-        </w:tc>
-        <w:tc>
-          <w:tcPr>
-            <w:tcW w:type="dxa" w:w="3365"/>
-          </w:tcPr>
-          <w:p>
-            <w:pPr>
-              <w:ind w:firstLine="0"/>
-              <w:jc w:val="center"/>
-            </w:pPr>
-            <w:r>
-              <w:rPr>
-                <w:rFonts w:ascii="Times New Roman" w:hAnsi="Times New Roman"/>
-                <w:sz w:val="16"/>
-              </w:rPr>
-              <w:t>—</w:t>
-            </w:r>
-          </w:p>
-        </w:tc>
-      </w:tr>
-      <w:tr>
-        <w:tc>
-          <w:tcPr>
-            <w:tcW w:type="dxa" w:w="3365"/>
-          </w:tcPr>
-          <w:p>
-            <w:pPr>
-              <w:ind w:firstLine="0"/>
-              <w:jc w:val="left"/>
-            </w:pPr>
-            <w:r>
-              <w:rPr>
-                <w:rFonts w:ascii="Times New Roman" w:hAnsi="Times New Roman"/>
-                <w:sz w:val="16"/>
-              </w:rPr>
-              <w:t>largest family</w:t>
-            </w:r>
-          </w:p>
-        </w:tc>
-        <w:tc>
-          <w:tcPr>
-            <w:tcW w:type="dxa" w:w="3365"/>
-          </w:tcPr>
-          <w:p>
-            <w:pPr>
-              <w:ind w:firstLine="0"/>
-              <w:jc w:val="center"/>
-            </w:pPr>
-            <w:r>
-              <w:rPr>
-                <w:rFonts w:ascii="Times New Roman" w:hAnsi="Times New Roman"/>
-                <w:sz w:val="16"/>
-              </w:rPr>
-              <w:t>4</w:t>
+              <w:t>4,979 / 164</w:t>
             </w:r>
           </w:p>
         </w:tc>
@@ -1560,7 +1109,7 @@
           <w:i w:val="0"/>
           <w:sz w:val="20"/>
         </w:rPr>
-        <w:t>No exact film duplicates at the metadata level. All 5,204 identifiers are distinct and no title×year pair repeats. This is a genuinely clean join, and it means the leakage channel in this corpus is not naive record duplication.</w:t>
+        <w:t>Table I is the full ledger for the flow of Section III-B. All 5,204 identifiers are distinct and no title×year pair repeats. This is a genuinely clean join, and it means the leakage channel in this corpus is not naive record duplication. Eighty titles appear more than once, spanning 165 records, but every collision pairs distinct identifiers and distinct years — these are remakes and same-title unrelated films, not duplicates. We retain them and place them in a shared family, because a remake shares premise, character names, and often substantial dialogue with its predecessor.</w:t>
       </w:r>
     </w:p>
     <w:p>
@@ -1574,7 +1123,7 @@
           <w:i w:val="0"/>
           <w:sz w:val="20"/>
         </w:rPr>
-        <w:t>Eighty title collisions, all legitimate. Eighty titles appear more than once, spanning 165 records, but every collision pairs distinct identifiers and distinct years — these are remakes and same-title unrelated films, not duplicates. Grouping is the correct treatment; deletion would discard real data.</w:t>
+        <w:t>Metadata corruption is present and reaches the model. Four records carry release years of 1080 or 1088, transparently mis-typed 1980 and 1988. We drop them rather than silently repair them. The derived decade column is worse: the label encoder fitted by the shipped pipeline holds 14 distinct decade strings, among them 1080s, 1900s and 1996s, and it encodes them as an ordinal integer.</w:t>
       </w:r>
     </w:p>
     <w:p>
@@ -1588,21 +1137,7 @@
           <w:i w:val="0"/>
           <w:sz w:val="20"/>
         </w:rPr>
-        <w:t>Metadata corruption is present and reaches the model. Four records carry release years of 1080 or 1088, transparently mis-typed 1980 and 1988 (Breaker Morant, Mississippi Burning, Torch Song Trilogy, The Blues Brothers). We drop them rather than silently repair them.</w:t>
-      </w:r>
-    </w:p>
-    <w:p>
-      <w:pPr>
-        <w:spacing w:before="0" w:after="60"/>
-        <w:ind w:firstLine="288"/>
-      </w:pPr>
-      <w:r>
-        <w:rPr>
-          <w:b w:val="0"/>
-          <w:i w:val="0"/>
-          <w:sz w:val="20"/>
-        </w:rPr>
-        <w:t>Twenty-seven records are excluded because positional identity in the archived embedding matrix cannot be resolved uniquely without a stored record key. Twenty-seven positions inside the reconstruction gaps admit more than one consistent assignment; we drop them rather than guess.</w:t>
+        <w:t>Twenty-seven further records are excluded for a reproducibility reason rather than a data-quality one. The archived embedding matrix stores rows in loader order without a record key, and the loader had already dropped nine sub-1 KB scripts, so row i of the matrix is not record i of the spreadsheet. We reconstruct the offset function from the committed split bookkeeping — 780 test records anchor it exactly through their file names, 779 validation records constrain it further through title-and-rating agreement — and recover a mapping consistent with all 1,559 anchors. Twenty-seven positions inside the reconstruction gaps admit more than one consistent assignment; we drop them rather than guess.</w:t>
       </w:r>
     </w:p>
     <w:p>
@@ -1645,7 +1180,7 @@
           <w:i w:val="0"/>
           <w:sz w:val="20"/>
         </w:rPr>
-        <w:t>Sixteen statistics are computed from the raw, uncleaned script text: six size measures (char_count, word_count, line_count, sentence_count, scene_count, words_per_scene); three describing lexical sophistication (avg_word_length, unique_word_ratio, long_word_ratio); two describing sentence geometry (avg_sentence_length, sentence_length_std); two describing dialogue (dialogue_density, unique_characters); two emotional proxies (exclamation_ratio, question_ratio); and one stage-direction proxy (action_density). Scene count is the number of case-insensitive INT./EXT. matches. All sixteen describe the transcript as archived rather than the text the encoder receives. Two of the sixteen are close to degenerate on this corpus, and the audit makes it visible before any model is fitted. Mean dialogue_density is .0087 with standard deviation .0361, and mean unique_characters is .41. A feature film does not have three speaking parts. The speaker-cue regular expression assumes a : convention that most IMSDb transcripts do not follow, so both features encode transcription format rather than dramaturgy. \textttscene_count has the same character: mean .0 against a standard deviation of .5$.</w:t>
+        <w:t>Sixteen statistics are computed from the raw, uncleaned script text: six size measures (char_count, word_count, line_count, sentence_count, scene_count, words_per_scene); three describing lexical sophistication (avg_word_length, unique_word_ratio, long_word_ratio); two describing sentence geometry (avg_sentence_length, sentence_length_std); two describing dialogue (dialogue_density, the share of lines that match an ALL-CAPS speaker-cue pattern, and unique_characters); two emotional proxies (exclamation_ratio, question_ratio); and one stage-direction proxy (action_density). Two of the sixteen are close to degenerate on this corpus. Mean dialogue_density is 0.0087 with standard deviation 0.0361, and mean unique_characters is 3.41. A feature film does not have three speaking parts. The speaker-cue regular expression assumes a NAME: convention that most IMSDb transcripts do not follow, so both features encode transcription format rather than dramaturgy.</w:t>
       </w:r>
     </w:p>
     <w:p>
@@ -1673,7 +1208,7 @@
           <w:i w:val="0"/>
           <w:sz w:val="20"/>
         </w:rPr>
-        <w:t>Let a screenplay be a word sequence D = (w_1, ..., w_N) obtained by whitespace splitting after light normalisation that removes bracketed stage directions, ALL-CAPS speaker cues, INT./EXT. markers, and timestamps while preserving case and sentence punctuation. With window length L = 256 and overlap o = 50, the stride is</w:t>
+        <w:t>Let a screenplay be a word sequence D = (w_1, ..., w_N) obtained by whitespace splitting after light normalisation that removes bracketed stage directions, ALL-CAPS speaker cues, INT./EXT. markers, and timestamps. With window length L = 256 and overlap o = 50, the stride is s = L - o = 206, and the j-th window is</w:t>
       </w:r>
     </w:p>
     <w:p>
@@ -1688,7 +1223,7 @@
           <w:i/>
           <w:sz w:val="20"/>
         </w:rPr>
-        <w:t>s = L - o = 206 ,</w:t>
+        <w:t>C_j = \bigl(w_(j-1)s+1, ..., w_\min\(j-1)s+L, N bigr),</w:t>
       </w:r>
     </w:p>
     <w:p>
@@ -1702,65 +1237,7 @@
           <w:i w:val="0"/>
           <w:sz w:val="20"/>
         </w:rPr>
-        <w:t>and the j-th window is</w:t>
-      </w:r>
-    </w:p>
-    <w:p>
-      <w:pPr>
-        <w:spacing w:before="80" w:after="80"/>
-        <w:ind w:firstLine="0"/>
-        <w:jc w:val="center"/>
-      </w:pPr>
-      <w:r>
-        <w:rPr>
-          <w:b w:val="0"/>
-          <w:i/>
-          <w:sz w:val="20"/>
-        </w:rPr>
-        <w:t>C_j = \bigl(w_(j-1)s+1, ..., w_\min((j-1)s+L, N)\bigr),</w:t>
-      </w:r>
-    </w:p>
-    <w:p>
-      <w:pPr>
-        <w:spacing w:before="0" w:after="60"/>
-        <w:ind w:firstLine="288"/>
-      </w:pPr>
-      <w:r>
-        <w:rPr>
-          <w:b w:val="0"/>
-          <w:i w:val="0"/>
-          <w:sz w:val="20"/>
-        </w:rPr>
-        <w:t>for j = 1, ..., M with</w:t>
-      </w:r>
-    </w:p>
-    <w:p>
-      <w:pPr>
-        <w:spacing w:before="80" w:after="80"/>
-        <w:ind w:firstLine="0"/>
-        <w:jc w:val="center"/>
-      </w:pPr>
-      <w:r>
-        <w:rPr>
-          <w:b w:val="0"/>
-          <w:i/>
-          <w:sz w:val="20"/>
-        </w:rPr>
-        <w:t>M = \begincases 1, &amp; N &lt;= L, [2pt] &lt;=ft\lceil \dfracN - Ls \right\rceil + 1, &amp; N &gt; L . \endcases</w:t>
-      </w:r>
-    </w:p>
-    <w:p>
-      <w:pPr>
-        <w:spacing w:before="0" w:after="60"/>
-        <w:ind w:firstLine="288"/>
-      </w:pPr>
-      <w:r>
-        <w:rPr>
-          <w:b w:val="0"/>
-          <w:i w:val="0"/>
-          <w:sz w:val="20"/>
-        </w:rPr>
-        <w:t>Each window is encoded by f C -&gt; ^d with d = 384, and the document representation is the arithmetic mean</w:t>
+        <w:t>for j = 1, ..., M with M = 1 if N &lt;= L and M = (N - L)/s + 1 otherwise. Each window is encoded by f: C -&gt; ^d with d = 384, and the document representation is the arithmetic mean</w:t>
       </w:r>
     </w:p>
     <w:p>
@@ -1789,7 +1266,7 @@
           <w:i w:val="0"/>
           <w:sz w:val="20"/>
         </w:rPr>
-        <w:t>Equation (10) has a property worth stating, because the encoder L_2-normalises its output: every f(C_j) lies on the unit sphere, so</w:t>
+        <w:t>Because the encoder L2-normalises its output, every f(C_j) lies on the unit sphere, so</w:t>
       </w:r>
     </w:p>
     <w:p>
@@ -1818,7 +1295,7 @@
           <w:i w:val="0"/>
           <w:sz w:val="20"/>
         </w:rPr>
-        <w:t>which equals 1 only when all windows embed identically and falls toward 1/M as they decorrelate. The norm of a mean-pooled screenplay embedding is therefore a coherence statistic, and averaging over M windows shrinks any single window's influence by 1/M. With a median of 36 windows per script, no scene survives pooling as a distinguishable signal.</w:t>
+        <w:t>which equals 1 only when all windows embed identically and falls toward 1/ as they decorrelate. With a median of 36 windows per script, no scene survives pooling as a distinguishable signal.</w:t>
       </w:r>
     </w:p>
     <w:p>
@@ -1832,7 +1309,7 @@
           <w:i w:val="0"/>
           <w:sz w:val="20"/>
         </w:rPr>
-        <w:t>The word/token mismatch. The encoder's transformer accepts T_ = 256 positions, two of which are consumed by [CLS] and [SEP]. The content budget is therefore</w:t>
+        <w:t>The word/token mismatch. The encoder's transformer accepts T_ = 256 positions, two of which are consumed by [CLS] and [SEP]. The content budget is therefore B = T_ - 2 = 254 WordPiece tokens, while C_j is defined by a count of 256 words. Writing tau(·) for the tokeniser, the encoder in fact sees tau(C_j) truncated to its first B entries, and the discarded fraction for a document is</w:t>
       </w:r>
     </w:p>
     <w:p>
@@ -1847,7 +1324,7 @@
           <w:i/>
           <w:sz w:val="20"/>
         </w:rPr>
-        <w:t>B = T_\max - 2 = 254</w:t>
+        <w:t>rho(D) = 1 - \frac\sum_j=1^M \min\bigl\|tau(C_j)|, B\bigr\ \sum_j=1^M |tau(C_j)| .</w:t>
       </w:r>
     </w:p>
     <w:p>
@@ -1861,14 +1338,68 @@
           <w:i w:val="0"/>
           <w:sz w:val="20"/>
         </w:rPr>
-        <w:t>WordPiece tokens, while C_j is defined by a count of 256 words. Writing tau(·) for the tokeniser, the encoder in fact sees tau(C_j) truncated to its first B entries, and the discarded fraction for a document is</w:t>
+        <w:t>Running the encoder's own tokeniser over the pipeline's own windows on the 356 available scripts yields 14,558 windows with median length 371 tokens, 90th percentile 405, and maximum 613 (Fig. 1). The consequences: 98.45% of windows exceed B, and rho evaluated corpus-wide is 0.3160, with a worst case of 0.4443. Roughly one word in three is written to a window that the encoder never reads. Nothing in the pipeline reports this.</w:t>
       </w:r>
     </w:p>
     <w:p>
       <w:pPr>
-        <w:spacing w:before="80" w:after="80"/>
         <w:ind w:firstLine="0"/>
         <w:jc w:val="center"/>
+      </w:pPr>
+      <w:r>
+        <w:drawing>
+          <wp:inline xmlns:a="http://schemas.openxmlformats.org/drawingml/2006/main" xmlns:pic="http://schemas.openxmlformats.org/drawingml/2006/picture">
+            <wp:extent cx="2926080" cy="1877932"/>
+            <wp:docPr id="1" name="Picture 1"/>
+            <wp:cNvGraphicFramePr>
+              <a:graphicFrameLocks noChangeAspect="1"/>
+            </wp:cNvGraphicFramePr>
+            <a:graphic>
+              <a:graphicData uri="http://schemas.openxmlformats.org/drawingml/2006/picture">
+                <pic:pic>
+                  <pic:nvPicPr>
+                    <pic:cNvPr id="0" name="12_token_budget.png"/>
+                    <pic:cNvPicPr/>
+                  </pic:nvPicPr>
+                  <pic:blipFill>
+                    <a:blip r:embed="rId9"/>
+                    <a:stretch>
+                      <a:fillRect/>
+                    </a:stretch>
+                  </pic:blipFill>
+                  <pic:spPr>
+                    <a:xfrm>
+                      <a:off x="0" y="0"/>
+                      <a:ext cx="2926080" cy="1877932"/>
+                    </a:xfrm>
+                    <a:prstGeom prst="rect"/>
+                  </pic:spPr>
+                </pic:pic>
+              </a:graphicData>
+            </a:graphic>
+          </wp:inline>
+        </w:drawing>
+      </w:r>
+    </w:p>
+    <w:p>
+      <w:pPr>
+        <w:spacing w:before="0" w:after="160"/>
+        <w:ind w:firstLine="0"/>
+        <w:jc w:val="center"/>
+      </w:pPr>
+      <w:r>
+        <w:rPr>
+          <w:b w:val="0"/>
+          <w:i w:val="0"/>
+          <w:sz w:val="16"/>
+        </w:rPr>
+        <w:t>Fig. 1.  Window length in WordPiece tokens against the 254-token content budget, over 14,558 windows from 356 screenplays. The window is specified in words; truncation happens in tokens.</w:t>
+      </w:r>
+    </w:p>
+    <w:p>
+      <w:pPr>
+        <w:spacing w:before="120" w:after="40"/>
+        <w:ind w:firstLine="0"/>
       </w:pPr>
       <w:r>
         <w:rPr>
@@ -1876,7 +1407,7 @@
           <w:i/>
           <w:sz w:val="20"/>
         </w:rPr>
-        <w:t>rho(D) = 1 - (\sum_j=1^M \min\bigl(|tau(C_j)|, B\bigr))/(\sum_j=1^M |tau(C_j)|) .</w:t>
+        <w:t>C. Lexical control and learners</w:t>
       </w:r>
     </w:p>
     <w:p>
@@ -1890,7 +1421,21 @@
           <w:i w:val="0"/>
           <w:sz w:val="20"/>
         </w:rPr>
-        <w:t>Running the encoder's own tokeniser over the pipeline's own windows on the 356 available scripts yields 14,558 windows with median length 371 tokens, mean 369.3, 90th percentile 405, 99th percentile 453, and maximum 613. The consequences: 98.45% of windows exceed B, and rho evaluated corpus-wide is 0.3160, with a per-script mean of 0.3171 and a worst case of 0.4443. Roughly one word in three is written to a window that the encoder never reads. Nothing in the pipeline reports this. Aligning the window to the token budget — chunking on tau rather than on whitespace — is a two-line change that no result in this paper depends on, and that every result in this paper would need to be recomputed after.</w:t>
+        <w:t>The lexical control is TF-IDF over unigrams and bigrams, capped at 8,000 features, with English stop words removed, minimum document frequency 3, maximum document frequency 0.85, and sublinear term frequency 1 + tf. It is fed to the same gradient-boosted regressor as the semantic arm. This pairing is deliberate: SBERT and TF-IDF differ in representation and in nothing else, so their gap is attributable to semantics rather than to the learner.</w:t>
+      </w:r>
+    </w:p>
+    <w:p>
+      <w:pPr>
+        <w:spacing w:before="0" w:after="60"/>
+        <w:ind w:firstLine="288"/>
+      </w:pPr>
+      <w:r>
+        <w:rPr>
+          <w:b w:val="0"/>
+          <w:i w:val="0"/>
+          <w:sz w:val="20"/>
+        </w:rPr>
+        <w:t>The regressor throughout is gradient-boosted trees with 500 rounds, learning rate 0.05, maximum depth 6, histogram splitting, and early stopping after 20 rounds without validation improvement; predictions are clipped to [1, 10]. Two linear probes provide reference points: ordinary least squares on the three metadata columns, and ridge regression (alpha = 1.5) on standardised embeddings. A constant-mean predictor anchors the bottom. For the stacked ensemble, a ridge meta-regressor is fitted over four base models — metadata OLS, structural OLS, TF-IDF+XGBoost, SBERT+XGBoost — using inner five-fold out-of-fold meta-features nested within each outer fold.</w:t>
       </w:r>
     </w:p>
     <w:p>
@@ -1904,63 +1449,7 @@
           <w:i/>
           <w:sz w:val="20"/>
         </w:rPr>
-        <w:t>C. Lexical control</w:t>
-      </w:r>
-    </w:p>
-    <w:p>
-      <w:pPr>
-        <w:spacing w:before="0" w:after="60"/>
-        <w:ind w:firstLine="288"/>
-      </w:pPr>
-      <w:r>
-        <w:rPr>
-          <w:b w:val="0"/>
-          <w:i w:val="0"/>
-          <w:sz w:val="20"/>
-        </w:rPr>
-        <w:t>The lexical control is TF-IDF over unigrams and bigrams, capped at 8,000 features, with English stop words removed, minimum document frequency 3, maximum document frequency 0.85, and sublinear term frequency 1 + . It is fitted on aggressively normalised text — lowercased, stage directions and speaker cues stripped, punctuation reduced — and fed to the same gradient-boosted regressor as the semantic arm. This pairing is deliberate: SBERT and TF-IDF differ in representation and in nothing else, so their gap is attributable to semantics rather than to the learner.</w:t>
-      </w:r>
-    </w:p>
-    <w:p>
-      <w:pPr>
-        <w:spacing w:before="120" w:after="40"/>
-        <w:ind w:firstLine="0"/>
-      </w:pPr>
-      <w:r>
-        <w:rPr>
-          <w:b w:val="0"/>
-          <w:i/>
-          <w:sz w:val="20"/>
-        </w:rPr>
-        <w:t>D. Learners</w:t>
-      </w:r>
-    </w:p>
-    <w:p>
-      <w:pPr>
-        <w:spacing w:before="0" w:after="60"/>
-        <w:ind w:firstLine="288"/>
-      </w:pPr>
-      <w:r>
-        <w:rPr>
-          <w:b w:val="0"/>
-          <w:i w:val="0"/>
-          <w:sz w:val="20"/>
-        </w:rPr>
-        <w:t>The regressor throughout is gradient-boosted trees with 500 rounds, learning rate 0.05, maximum depth 6, histogram splitting, and early stopping after 20 rounds without validation improvement; predictions are clipped to [1, 10]. Two linear probes provide reference points: ordinary least squares on the three metadata columns, and ridge regression (alpha = 1.5) on standardised embeddings. A constant-mean predictor anchors the bottom.</w:t>
-      </w:r>
-    </w:p>
-    <w:p>
-      <w:pPr>
-        <w:spacing w:before="120" w:after="40"/>
-        <w:ind w:firstLine="0"/>
-      </w:pPr>
-      <w:r>
-        <w:rPr>
-          <w:b w:val="0"/>
-          <w:i/>
-          <w:sz w:val="20"/>
-        </w:rPr>
-        <w:t>E. Partition protocols</w:t>
+        <w:t>D. Partition protocols</w:t>
       </w:r>
     </w:p>
     <w:p>
@@ -2002,7 +1491,7 @@
           <w:i w:val="0"/>
           <w:sz w:val="20"/>
         </w:rPr>
-        <w:t>P2, grouped. Let gamma I -&gt; G map each record to its title family, |G| = 4,979. GroupKFold constructs disjoint folds subject to the group constraint</w:t>
+        <w:t>P2, grouped. Let gamma: I -&gt; G map each record to its title family, |G| = 4,979. GroupKFold constructs disjoint folds subject to the group constraint</w:t>
       </w:r>
     </w:p>
     <w:p>
@@ -2017,7 +1506,7 @@
           <w:i/>
           <w:sz w:val="20"/>
         </w:rPr>
-        <w:t>for all g in G exists! k in \1,...,K\ \colon gamma^-1(g) ⊆ F_k ,</w:t>
+        <w:t>for all g in G exists! k in \1,...,K\: gamma^-1(g) ⊆ F_k ,</w:t>
       </w:r>
     </w:p>
     <w:p>
@@ -2031,7 +1520,7 @@
           <w:i w:val="0"/>
           <w:sz w:val="20"/>
         </w:rPr>
-        <w:t>so no family is split across the boundary, while the fold sizes |F_k| are balanced as far as (14) permits. Because 4,979 families cover 5,164 records, the constraint is nearly free: realised fold sizes are 1,032–1,033, identical to P1.</w:t>
+        <w:t>so no family is split across the boundary. Because 4,979 families cover 5,164 records, the constraint is nearly free: realised fold sizes are 1,032–1,033, identical to P1.</w:t>
       </w:r>
     </w:p>
     <w:p>
@@ -2060,7 +1549,7 @@
           <w:i/>
           <w:sz w:val="20"/>
         </w:rPr>
-        <w:t>T_test &amp;= \ i : 2020 &lt;= yr(i) &lt;= 2025 \, T_val &amp;= \ i : c &lt;= yr(i) &lt;= 2019 \, T_train &amp;= \ i : yr(i) &lt; c \,</w:t>
+        <w:t>T_test &amp;= \ i : 2020 &lt;= yr(i) &lt;= 2025 \, T_val &amp;= \ i : c &lt;= yr(i) &lt;= 2019 \, T_train&amp;= \ i : yr(i) &lt; c \,</w:t>
       </w:r>
     </w:p>
     <w:p>
@@ -2117,7 +1606,7 @@
           <w:i w:val="0"/>
           <w:sz w:val="20"/>
         </w:rPr>
-        <w:t>Averaged over folds, lambda = 5.50% under P1 and, by construction, lambda = 0 under P2. The chronological holdout sits at lambda = 6.41%.</w:t>
+        <w:t>Averaged over folds, lambda = 5.50% under P1 and, by construction, lambda = 0 under P2. The chronological holdout sits at lambda = 6.41% — a sequel released in 2021 may well have a parent film in the training years.</w:t>
       </w:r>
     </w:p>
     <w:p>
@@ -2131,7 +1620,7 @@
           <w:i/>
           <w:sz w:val="20"/>
         </w:rPr>
-        <w:t>F. Inference</w:t>
+        <w:t>E. Inference</w:t>
       </w:r>
     </w:p>
     <w:p>
@@ -2160,7 +1649,7 @@
           <w:i/>
           <w:sz w:val="20"/>
         </w:rPr>
-        <w:t>R^+ = \sum_i \colon d_i &gt; 0 rank(|d_i|), \qquad R^- = \sum_i \colon d_i &lt; 0 rank(|d_i|) ,</w:t>
+        <w:t>R^+ = \sum_i: d_i &gt; 0 rank(|d_i|), \qquad R^- = \sum_i: d_i &lt; 0 rank(|d_i|) ,</w:t>
       </w:r>
     </w:p>
     <w:p>
@@ -2287,7 +1776,7 @@
           <w:i w:val="0"/>
           <w:sz w:val="16"/>
         </w:rPr>
-        <w:t>Grouped five-fold results. P1 shuffles records; P2 enforces the title-family constraint (14). Pooled out-of-fold point estimates with 95% percentile bootstrap intervals over 5,164 records. Delta R^2 is the explained variance lost to the constraint, i.e. the share of P1 skill that franchise overlap was supplying.</w:t>
+        <w:t>Grouped five-fold results. P1 shuffles records; P2 enforces the title-family constraint (7). Pooled out-of-fold point estimates over 5,164 records. Delta R^2 is the explained variance lost to the constraint, i.e. the share of P1 skill that franchise overlap was supplying.</w:t>
       </w:r>
     </w:p>
     <w:tbl>
@@ -2532,7 +2021,7 @@
                 <w:rFonts w:ascii="Times New Roman" w:hAnsi="Times New Roman"/>
                 <w:sz w:val="16"/>
               </w:rPr>
-              <w:t>^2</w:t>
+              <w:t>R^2</w:t>
             </w:r>
           </w:p>
         </w:tc>
@@ -2586,7 +2075,7 @@
                 <w:rFonts w:ascii="Times New Roman" w:hAnsi="Times New Roman"/>
                 <w:sz w:val="16"/>
               </w:rPr>
-              <w:t>^2</w:t>
+              <w:t>R^2</w:t>
             </w:r>
           </w:p>
         </w:tc>
@@ -2604,7 +2093,7 @@
                 <w:rFonts w:ascii="Times New Roman" w:hAnsi="Times New Roman"/>
                 <w:sz w:val="16"/>
               </w:rPr>
-              <w:t>R^2</w:t>
+              <w:t>Delta R^2</w:t>
             </w:r>
           </w:p>
         </w:tc>
@@ -3354,7 +2843,7 @@
                 <w:rFonts w:ascii="Times New Roman" w:hAnsi="Times New Roman"/>
                 <w:sz w:val="16"/>
               </w:rPr>
-              <w:t>Best system: P1 R^2 in [0.5298, 0.5671], P2 R^2 in [0.5162, 0.5537]. Every arm that reads text loses R^2; the metadata-only probe does not.</w:t>
+              <w:t>Best system: P1 R^2in[0.5298,0.5671], P2 R^2in[0.5162,0.5537]. Every arm that reads text loses R^2; the metadata-only probe does not.</w:t>
             </w:r>
           </w:p>
         </w:tc>
@@ -3530,7 +3019,7 @@
           <w:i w:val="0"/>
           <w:sz w:val="16"/>
         </w:rPr>
-        <w:t>Temporal holdout. Fit on films released up to 2015, early stopping on 2016–2019, tested on the 515 films released 2020–2025. Point estimates with 95% percentile bootstrap intervals.</w:t>
+        <w:t>Temporal holdout. Fit on films released up to 2015, early stopping on 2016–2019, tested on the 515 films released 2020–2025.</w:t>
       </w:r>
     </w:p>
     <w:tbl>
@@ -3623,7 +3112,7 @@
                 <w:b/>
                 <w:sz w:val="16"/>
               </w:rPr>
-              <w:t>^2</w:t>
+              <w:t>R^2</w:t>
             </w:r>
           </w:p>
         </w:tc>
@@ -4013,7 +3502,7 @@
                 <w:rFonts w:ascii="Times New Roman" w:hAnsi="Times New Roman"/>
                 <w:sz w:val="16"/>
               </w:rPr>
-              <w:t>Best system R^2 in [0.1985, 0.4038]; n = 3,918 / 731 / 515; lambda = 6.41%.</w:t>
+              <w:t>Best system R^2in[0.1985,0.4038]; lambda = 6.41%.</w:t>
             </w:r>
           </w:p>
         </w:tc>
@@ -4165,7 +3654,7 @@
           <w:i w:val="0"/>
           <w:sz w:val="20"/>
         </w:rPr>
-        <w:t>Grouping costs little. The best system moves from R^2 = 0.5490 to 0.5359, a drop of 0.0131, and the two bootstrap intervals overlap substantially. The effect is consistently negative across every system that reads text — SBERT ridge loses 0.0125 R^2, SBERT+XGBoost loses 0.0127 — while the metadata-only probe is unmoved (0.3888 -&gt; 0.3889).</w:t>
+        <w:t>Grouping costs little. The best system moves from R^2 = 0.5490 to 0.5359, a drop of 0.0131, and the two bootstrap intervals overlap substantially. That is the expected result for a corpus in which only 164 families have more than one member and the largest has four. The interesting part is that the effect is consistently negative across every system that reads text — SBERT ridge loses 0.0125 R^2, SBERT+XGBoost loses 0.0127 — while the metadata-only probe is unmoved (0.3888 -&gt; 0.3889). Franchise leakage is a textual channel, and a metadata model cannot exploit it because it never sees the words.</w:t>
       </w:r>
     </w:p>
     <w:p>
@@ -4179,7 +3668,7 @@
           <w:i w:val="0"/>
           <w:sz w:val="20"/>
         </w:rPr>
-        <w:t>Chronology costs a great deal. The same best system falls to R^2 = 0.3089, and the interval [0.1985, 0.4038] no longer overlaps either in-corpus estimate. And the metadata probe collapses from 0.3889 to 0.1473, losing 62% of its explanatory power, while the text-only SBERT model loses 35% (0.4114 -&gt; 0.2671).</w:t>
+        <w:t>Chronology costs a great deal. The same best system falls to R^2 = 0.3089, and the interval [0.1985, 0.4038] no longer overlaps either in-corpus estimate. The constant-mean predictor goes from R^2 ≈ 0 to -0.0947, which is a pure distribution-shift effect: the training mean (6.11) is simply wrong for the holdout (5.75). And the metadata probe collapses hardest of all, from 0.3889 to 0.1473, losing 62% of its explanatory power, while the text-only SBERT model loses 35% (0.4114 -&gt; 0.2671). The representation that generalises worst across time is the one that was never about the film.</w:t>
       </w:r>
     </w:p>
     <w:p>
@@ -4311,6 +3800,7 @@
                 <w:b/>
                 <w:sz w:val="16"/>
               </w:rPr>
+              <w:t>DeltaMAE</w:t>
             </w:r>
           </w:p>
         </w:tc>
@@ -4350,6 +3840,7 @@
                 <w:b/>
                 <w:sz w:val="16"/>
               </w:rPr>
+              <w:t>p</w:t>
             </w:r>
           </w:p>
         </w:tc>
@@ -4441,7 +3932,7 @@
                 <w:rFonts w:ascii="Times New Roman" w:hAnsi="Times New Roman"/>
                 <w:sz w:val="16"/>
               </w:rPr>
-              <w:t>2.2 × 10^-281</w:t>
+              <w:t>2.2×10^-281</w:t>
             </w:r>
           </w:p>
         </w:tc>
@@ -4532,7 +4023,7 @@
                 <w:rFonts w:ascii="Times New Roman" w:hAnsi="Times New Roman"/>
                 <w:sz w:val="16"/>
               </w:rPr>
-              <w:t>1.8 × 10^-73</w:t>
+              <w:t>1.8×10^-73</w:t>
             </w:r>
           </w:p>
         </w:tc>
@@ -4623,7 +4114,7 @@
                 <w:rFonts w:ascii="Times New Roman" w:hAnsi="Times New Roman"/>
                 <w:sz w:val="16"/>
               </w:rPr>
-              <w:t>7.0 × 10^-55</w:t>
+              <w:t>7.0×10^-55</w:t>
             </w:r>
           </w:p>
         </w:tc>
@@ -4714,7 +4205,7 @@
                 <w:rFonts w:ascii="Times New Roman" w:hAnsi="Times New Roman"/>
                 <w:sz w:val="16"/>
               </w:rPr>
-              <w:t>4.7 × 10^-46</w:t>
+              <w:t>4.7×10^-46</w:t>
             </w:r>
           </w:p>
         </w:tc>
@@ -4806,7 +4297,7 @@
                 <w:rFonts w:ascii="Times New Roman" w:hAnsi="Times New Roman"/>
                 <w:sz w:val="16"/>
               </w:rPr>
-              <w:t>2.9 × 10^-280</w:t>
+              <w:t>2.9×10^-280</w:t>
             </w:r>
           </w:p>
         </w:tc>
@@ -4897,7 +4388,7 @@
                 <w:rFonts w:ascii="Times New Roman" w:hAnsi="Times New Roman"/>
                 <w:sz w:val="16"/>
               </w:rPr>
-              <w:t>2.8 × 10^-73</w:t>
+              <w:t>2.8×10^-73</w:t>
             </w:r>
           </w:p>
         </w:tc>
@@ -4988,7 +4479,7 @@
                 <w:rFonts w:ascii="Times New Roman" w:hAnsi="Times New Roman"/>
                 <w:sz w:val="16"/>
               </w:rPr>
-              <w:t>2.5 × 10^-61</w:t>
+              <w:t>2.5×10^-61</w:t>
             </w:r>
           </w:p>
         </w:tc>
@@ -5079,7 +4570,7 @@
                 <w:rFonts w:ascii="Times New Roman" w:hAnsi="Times New Roman"/>
                 <w:sz w:val="16"/>
               </w:rPr>
-              <w:t>2.1 × 10^-50</w:t>
+              <w:t>2.1×10^-50</w:t>
             </w:r>
           </w:p>
         </w:tc>
@@ -5171,7 +4662,7 @@
                 <w:rFonts w:ascii="Times New Roman" w:hAnsi="Times New Roman"/>
                 <w:sz w:val="16"/>
               </w:rPr>
-              <w:t>5.7 × 10^-15</w:t>
+              <w:t>5.7×10^-15</w:t>
             </w:r>
           </w:p>
         </w:tc>
@@ -5262,7 +4753,7 @@
                 <w:rFonts w:ascii="Times New Roman" w:hAnsi="Times New Roman"/>
                 <w:sz w:val="16"/>
               </w:rPr>
-              <w:t>2.0 × 10^-4</w:t>
+              <w:t>2.0×10^-4</w:t>
             </w:r>
           </w:p>
         </w:tc>
@@ -5353,7 +4844,7 @@
                 <w:rFonts w:ascii="Times New Roman" w:hAnsi="Times New Roman"/>
                 <w:sz w:val="16"/>
               </w:rPr>
-              <w:t>1.3 × 10^-4</w:t>
+              <w:t>1.3×10^-4</w:t>
             </w:r>
           </w:p>
         </w:tc>
@@ -5474,7 +4965,7 @@
           <w:i w:val="0"/>
           <w:sz w:val="20"/>
         </w:rPr>
-        <w:t>The final row is the one that changes the story. Under P1 and P2, adding the three metadata columns to the embedding buys a highly significant 0.108–0.114 rating points of mean absolute error. Under P3 the same addition buys 0.0236 points, with an interval straddling zero and p = 0.273; the full statistics are W = 62,734 over n = 515 pairs with no ties, rank-biserial r = +0.056. The metadata block, worth two orders of magnitude in p-value under a random split, is not measurably useful when the test films are genuinely unseen.</w:t>
+        <w:t>The final row is the one that changes the story. Under P1 and P2, adding the three metadata columns to the embedding buys a highly significant 0.108–0.114 rating points of mean absolute error. Under P3 the same addition buys 0.0236 points, with an interval straddling zero and p = 0.273; the full statistics are W = 62,734 over n = 515 pairs with no ties, rank-biserial r = +0.056. An effect size of 0.056 is negligible by any convention. The metadata block, worth two orders of magnitude in p-value under a random split, is not measurably useful when the test films are genuinely unseen.</w:t>
       </w:r>
     </w:p>
     <w:p>
@@ -5488,7 +4979,7 @@
           <w:i/>
           <w:sz w:val="20"/>
         </w:rPr>
-        <w:t>C. Temporal shift in detail</w:t>
+        <w:t>C. The lexical and structural arms</w:t>
       </w:r>
     </w:p>
     <w:p>
@@ -5502,7 +4993,703 @@
           <w:i w:val="0"/>
           <w:sz w:val="20"/>
         </w:rPr>
-        <w:t>Part of the R^2 collapse is therefore arithmetic — the same absolute error against a narrower target yields a smaller R^2 — and part is genuine degradation. Mean absolute error separates them: it is 0.7276 under P1 and 0.7232 under P3, statistically indistinguishable. The model's typical error in rating points does not grow at all when it predicts the future. What collapses is how much of the (now narrower) variance it can order. Regressing prediction on truth over the holdout gives slope 0.4634 (s.e. 0.0278) and intercept 3.1745, against an ideal slope of 1; the predicted standard deviation is .783$ of the observed one. The system is heavily shrunk toward the centre — it identifies which films are above or below average and declines to commit to how far.</w:t>
+        <w:t>The lexical control and the structural-feature model can be evaluated only under the random protocol on this corpus, because reconstructing either representation requires the raw script text. Table V reproduces those figures from the archived runs.</w:t>
+      </w:r>
+    </w:p>
+    <w:p>
+      <w:pPr>
+        <w:spacing w:before="160" w:after="0"/>
+        <w:ind w:firstLine="0"/>
+        <w:jc w:val="center"/>
+      </w:pPr>
+      <w:r>
+        <w:rPr>
+          <w:b w:val="0"/>
+          <w:i w:val="0"/>
+          <w:sz w:val="16"/>
+        </w:rPr>
+        <w:t>TABLE V.</w:t>
+      </w:r>
+    </w:p>
+    <w:p>
+      <w:pPr>
+        <w:spacing w:before="0" w:after="60"/>
+        <w:ind w:firstLine="0"/>
+        <w:jc w:val="center"/>
+      </w:pPr>
+      <w:r>
+        <w:rPr>
+          <w:b w:val="0"/>
+          <w:i w:val="0"/>
+          <w:sz w:val="16"/>
+        </w:rPr>
+        <w:t>Random-protocol results for the arms that require raw text (5-fold CV, mean ± s.d.; archived runs over 5,195 records). These are not comparable to Tables II– III.</w:t>
+      </w:r>
+    </w:p>
+    <w:tbl>
+      <w:tblPr>
+        <w:tblStyle w:val="TableGrid"/>
+        <w:tblW w:type="auto" w:w="0"/>
+        <w:jc w:val="center"/>
+        <w:tblLook w:firstColumn="1" w:firstRow="1" w:lastColumn="0" w:lastRow="0" w:noHBand="0" w:noVBand="1" w:val="04A0"/>
+      </w:tblPr>
+      <w:tblGrid>
+        <w:gridCol w:w="2524"/>
+        <w:gridCol w:w="2524"/>
+        <w:gridCol w:w="2524"/>
+        <w:gridCol w:w="2524"/>
+      </w:tblGrid>
+      <w:tr>
+        <w:tc>
+          <w:tcPr>
+            <w:tcW w:type="dxa" w:w="2524"/>
+            <w:shd w:val="clear" w:fill="D9E2F3"/>
+          </w:tcPr>
+          <w:p>
+            <w:pPr>
+              <w:ind w:firstLine="0"/>
+              <w:jc w:val="left"/>
+            </w:pPr>
+            <w:r>
+              <w:rPr>
+                <w:rFonts w:ascii="Times New Roman" w:hAnsi="Times New Roman"/>
+                <w:b/>
+                <w:sz w:val="16"/>
+              </w:rPr>
+              <w:t>System</w:t>
+            </w:r>
+          </w:p>
+        </w:tc>
+        <w:tc>
+          <w:tcPr>
+            <w:tcW w:type="dxa" w:w="2524"/>
+            <w:shd w:val="clear" w:fill="D9E2F3"/>
+          </w:tcPr>
+          <w:p>
+            <w:pPr>
+              <w:ind w:firstLine="0"/>
+              <w:jc w:val="center"/>
+            </w:pPr>
+            <w:r>
+              <w:rPr>
+                <w:rFonts w:ascii="Times New Roman" w:hAnsi="Times New Roman"/>
+                <w:b/>
+                <w:sz w:val="16"/>
+              </w:rPr>
+              <w:t>RMSE</w:t>
+            </w:r>
+          </w:p>
+        </w:tc>
+        <w:tc>
+          <w:tcPr>
+            <w:tcW w:type="dxa" w:w="2524"/>
+            <w:shd w:val="clear" w:fill="D9E2F3"/>
+          </w:tcPr>
+          <w:p>
+            <w:pPr>
+              <w:ind w:firstLine="0"/>
+              <w:jc w:val="center"/>
+            </w:pPr>
+            <w:r>
+              <w:rPr>
+                <w:rFonts w:ascii="Times New Roman" w:hAnsi="Times New Roman"/>
+                <w:b/>
+                <w:sz w:val="16"/>
+              </w:rPr>
+              <w:t>MAE</w:t>
+            </w:r>
+          </w:p>
+        </w:tc>
+        <w:tc>
+          <w:tcPr>
+            <w:tcW w:type="dxa" w:w="2524"/>
+            <w:shd w:val="clear" w:fill="D9E2F3"/>
+          </w:tcPr>
+          <w:p>
+            <w:pPr>
+              <w:ind w:firstLine="0"/>
+              <w:jc w:val="center"/>
+            </w:pPr>
+            <w:r>
+              <w:rPr>
+                <w:rFonts w:ascii="Times New Roman" w:hAnsi="Times New Roman"/>
+                <w:b/>
+                <w:sz w:val="16"/>
+              </w:rPr>
+              <w:t>R^2</w:t>
+            </w:r>
+          </w:p>
+        </w:tc>
+      </w:tr>
+      <w:tr>
+        <w:tc>
+          <w:tcPr>
+            <w:tcW w:type="dxa" w:w="2524"/>
+          </w:tcPr>
+          <w:p>
+            <w:pPr>
+              <w:ind w:firstLine="0"/>
+              <w:jc w:val="left"/>
+            </w:pPr>
+            <w:r>
+              <w:rPr>
+                <w:rFonts w:ascii="Times New Roman" w:hAnsi="Times New Roman"/>
+                <w:sz w:val="16"/>
+              </w:rPr>
+              <w:t>Structural OLS (16 + meta)</w:t>
+            </w:r>
+          </w:p>
+        </w:tc>
+        <w:tc>
+          <w:tcPr>
+            <w:tcW w:type="dxa" w:w="2524"/>
+          </w:tcPr>
+          <w:p>
+            <w:pPr>
+              <w:ind w:firstLine="0"/>
+              <w:jc w:val="center"/>
+            </w:pPr>
+            <w:r>
+              <w:rPr>
+                <w:rFonts w:ascii="Times New Roman" w:hAnsi="Times New Roman"/>
+                <w:sz w:val="16"/>
+              </w:rPr>
+              <w:t>1.076 ± 0.040</w:t>
+            </w:r>
+          </w:p>
+        </w:tc>
+        <w:tc>
+          <w:tcPr>
+            <w:tcW w:type="dxa" w:w="2524"/>
+          </w:tcPr>
+          <w:p>
+            <w:pPr>
+              <w:ind w:firstLine="0"/>
+              <w:jc w:val="center"/>
+            </w:pPr>
+            <w:r>
+              <w:rPr>
+                <w:rFonts w:ascii="Times New Roman" w:hAnsi="Times New Roman"/>
+                <w:sz w:val="16"/>
+              </w:rPr>
+              <w:t>0.833 ± 0.031</w:t>
+            </w:r>
+          </w:p>
+        </w:tc>
+        <w:tc>
+          <w:tcPr>
+            <w:tcW w:type="dxa" w:w="2524"/>
+          </w:tcPr>
+          <w:p>
+            <w:pPr>
+              <w:ind w:firstLine="0"/>
+              <w:jc w:val="center"/>
+            </w:pPr>
+            <w:r>
+              <w:rPr>
+                <w:rFonts w:ascii="Times New Roman" w:hAnsi="Times New Roman"/>
+                <w:sz w:val="16"/>
+              </w:rPr>
+              <w:t>0.440 ± 0.007</w:t>
+            </w:r>
+          </w:p>
+        </w:tc>
+      </w:tr>
+      <w:tr>
+        <w:tc>
+          <w:tcPr>
+            <w:tcW w:type="dxa" w:w="2524"/>
+          </w:tcPr>
+          <w:p>
+            <w:pPr>
+              <w:ind w:firstLine="0"/>
+              <w:jc w:val="left"/>
+            </w:pPr>
+            <w:r>
+              <w:rPr>
+                <w:rFonts w:ascii="Times New Roman" w:hAnsi="Times New Roman"/>
+                <w:sz w:val="16"/>
+              </w:rPr>
+              <w:t>TF-IDF + XGBoost</w:t>
+            </w:r>
+          </w:p>
+        </w:tc>
+        <w:tc>
+          <w:tcPr>
+            <w:tcW w:type="dxa" w:w="2524"/>
+          </w:tcPr>
+          <w:p>
+            <w:pPr>
+              <w:ind w:firstLine="0"/>
+              <w:jc w:val="center"/>
+            </w:pPr>
+            <w:r>
+              <w:rPr>
+                <w:rFonts w:ascii="Times New Roman" w:hAnsi="Times New Roman"/>
+                <w:sz w:val="16"/>
+              </w:rPr>
+              <w:t>1.083 ± 0.034</w:t>
+            </w:r>
+          </w:p>
+        </w:tc>
+        <w:tc>
+          <w:tcPr>
+            <w:tcW w:type="dxa" w:w="2524"/>
+          </w:tcPr>
+          <w:p>
+            <w:pPr>
+              <w:ind w:firstLine="0"/>
+              <w:jc w:val="center"/>
+            </w:pPr>
+            <w:r>
+              <w:rPr>
+                <w:rFonts w:ascii="Times New Roman" w:hAnsi="Times New Roman"/>
+                <w:sz w:val="16"/>
+              </w:rPr>
+              <w:t>0.819 ± 0.022</w:t>
+            </w:r>
+          </w:p>
+        </w:tc>
+        <w:tc>
+          <w:tcPr>
+            <w:tcW w:type="dxa" w:w="2524"/>
+          </w:tcPr>
+          <w:p>
+            <w:pPr>
+              <w:ind w:firstLine="0"/>
+              <w:jc w:val="center"/>
+            </w:pPr>
+            <w:r>
+              <w:rPr>
+                <w:rFonts w:ascii="Times New Roman" w:hAnsi="Times New Roman"/>
+                <w:sz w:val="16"/>
+              </w:rPr>
+              <w:t>0.433 ± 0.014</w:t>
+            </w:r>
+          </w:p>
+        </w:tc>
+      </w:tr>
+      <w:tr>
+        <w:tc>
+          <w:tcPr>
+            <w:tcW w:type="dxa" w:w="2524"/>
+          </w:tcPr>
+          <w:p>
+            <w:pPr>
+              <w:ind w:firstLine="0"/>
+              <w:jc w:val="left"/>
+            </w:pPr>
+            <w:r>
+              <w:rPr>
+                <w:rFonts w:ascii="Times New Roman" w:hAnsi="Times New Roman"/>
+                <w:sz w:val="16"/>
+              </w:rPr>
+              <w:t>SBERT + XGB (weighted)</w:t>
+            </w:r>
+          </w:p>
+        </w:tc>
+        <w:tc>
+          <w:tcPr>
+            <w:tcW w:type="dxa" w:w="2524"/>
+          </w:tcPr>
+          <w:p>
+            <w:pPr>
+              <w:ind w:firstLine="0"/>
+              <w:jc w:val="center"/>
+            </w:pPr>
+            <w:r>
+              <w:rPr>
+                <w:rFonts w:ascii="Times New Roman" w:hAnsi="Times New Roman"/>
+                <w:sz w:val="16"/>
+              </w:rPr>
+              <w:t>1.000 ± 0.027</w:t>
+            </w:r>
+          </w:p>
+        </w:tc>
+        <w:tc>
+          <w:tcPr>
+            <w:tcW w:type="dxa" w:w="2524"/>
+          </w:tcPr>
+          <w:p>
+            <w:pPr>
+              <w:ind w:firstLine="0"/>
+              <w:jc w:val="center"/>
+            </w:pPr>
+            <w:r>
+              <w:rPr>
+                <w:rFonts w:ascii="Times New Roman" w:hAnsi="Times New Roman"/>
+                <w:sz w:val="16"/>
+              </w:rPr>
+              <w:t>0.768 ± 0.024</w:t>
+            </w:r>
+          </w:p>
+        </w:tc>
+        <w:tc>
+          <w:tcPr>
+            <w:tcW w:type="dxa" w:w="2524"/>
+          </w:tcPr>
+          <w:p>
+            <w:pPr>
+              <w:ind w:firstLine="0"/>
+              <w:jc w:val="center"/>
+            </w:pPr>
+            <w:r>
+              <w:rPr>
+                <w:rFonts w:ascii="Times New Roman" w:hAnsi="Times New Roman"/>
+                <w:sz w:val="16"/>
+              </w:rPr>
+              <w:t>0.516 ± 0.026</w:t>
+            </w:r>
+          </w:p>
+        </w:tc>
+      </w:tr>
+      <w:tr>
+        <w:tc>
+          <w:tcPr>
+            <w:tcW w:type="dxa" w:w="2524"/>
+          </w:tcPr>
+          <w:p>
+            <w:pPr>
+              <w:ind w:firstLine="0"/>
+              <w:jc w:val="left"/>
+            </w:pPr>
+            <w:r>
+              <w:rPr>
+                <w:rFonts w:ascii="Times New Roman" w:hAnsi="Times New Roman"/>
+                <w:sz w:val="16"/>
+              </w:rPr>
+              <w:t>SBERT + XGB (unweighted)</w:t>
+            </w:r>
+          </w:p>
+        </w:tc>
+        <w:tc>
+          <w:tcPr>
+            <w:tcW w:type="dxa" w:w="2524"/>
+          </w:tcPr>
+          <w:p>
+            <w:pPr>
+              <w:ind w:firstLine="0"/>
+              <w:jc w:val="center"/>
+            </w:pPr>
+            <w:r>
+              <w:rPr>
+                <w:rFonts w:ascii="Times New Roman" w:hAnsi="Times New Roman"/>
+                <w:sz w:val="16"/>
+              </w:rPr>
+              <w:t>0.958 ± 0.033</w:t>
+            </w:r>
+          </w:p>
+        </w:tc>
+        <w:tc>
+          <w:tcPr>
+            <w:tcW w:type="dxa" w:w="2524"/>
+          </w:tcPr>
+          <w:p>
+            <w:pPr>
+              <w:ind w:firstLine="0"/>
+              <w:jc w:val="center"/>
+            </w:pPr>
+            <w:r>
+              <w:rPr>
+                <w:rFonts w:ascii="Times New Roman" w:hAnsi="Times New Roman"/>
+                <w:sz w:val="16"/>
+              </w:rPr>
+              <w:t>0.720 ± 0.027</w:t>
+            </w:r>
+          </w:p>
+        </w:tc>
+        <w:tc>
+          <w:tcPr>
+            <w:tcW w:type="dxa" w:w="2524"/>
+          </w:tcPr>
+          <w:p>
+            <w:pPr>
+              <w:ind w:firstLine="0"/>
+              <w:jc w:val="center"/>
+            </w:pPr>
+            <w:r>
+              <w:rPr>
+                <w:rFonts w:ascii="Times New Roman" w:hAnsi="Times New Roman"/>
+                <w:sz w:val="16"/>
+              </w:rPr>
+              <w:t>0.556 ± 0.009</w:t>
+            </w:r>
+          </w:p>
+        </w:tc>
+      </w:tr>
+      <w:tr>
+        <w:tc>
+          <w:tcPr>
+            <w:tcW w:type="dxa" w:w="2524"/>
+          </w:tcPr>
+          <w:p>
+            <w:pPr>
+              <w:ind w:firstLine="0"/>
+              <w:jc w:val="left"/>
+            </w:pPr>
+            <w:r>
+              <w:rPr>
+                <w:rFonts w:ascii="Times New Roman" w:hAnsi="Times New Roman"/>
+                <w:sz w:val="16"/>
+              </w:rPr>
+              <w:t>Ridge stack, 4 bases</w:t>
+            </w:r>
+          </w:p>
+        </w:tc>
+        <w:tc>
+          <w:tcPr>
+            <w:tcW w:type="dxa" w:w="2524"/>
+          </w:tcPr>
+          <w:p>
+            <w:pPr>
+              <w:ind w:firstLine="0"/>
+              <w:jc w:val="center"/>
+            </w:pPr>
+            <w:r>
+              <w:rPr>
+                <w:rFonts w:ascii="Times New Roman" w:hAnsi="Times New Roman"/>
+                <w:sz w:val="16"/>
+              </w:rPr>
+              <w:t>0.935 ± 0.032</w:t>
+            </w:r>
+          </w:p>
+        </w:tc>
+        <w:tc>
+          <w:tcPr>
+            <w:tcW w:type="dxa" w:w="2524"/>
+          </w:tcPr>
+          <w:p>
+            <w:pPr>
+              <w:ind w:firstLine="0"/>
+              <w:jc w:val="center"/>
+            </w:pPr>
+            <w:r>
+              <w:rPr>
+                <w:rFonts w:ascii="Times New Roman" w:hAnsi="Times New Roman"/>
+                <w:sz w:val="16"/>
+              </w:rPr>
+              <w:t>0.706 ± 0.028</w:t>
+            </w:r>
+          </w:p>
+        </w:tc>
+        <w:tc>
+          <w:tcPr>
+            <w:tcW w:type="dxa" w:w="2524"/>
+          </w:tcPr>
+          <w:p>
+            <w:pPr>
+              <w:ind w:firstLine="0"/>
+              <w:jc w:val="center"/>
+            </w:pPr>
+            <w:r>
+              <w:rPr>
+                <w:rFonts w:ascii="Times New Roman" w:hAnsi="Times New Roman"/>
+                <w:sz w:val="16"/>
+              </w:rPr>
+              <w:t>0.577 ± 0.010</w:t>
+            </w:r>
+          </w:p>
+        </w:tc>
+      </w:tr>
+      <w:tr>
+        <w:tc>
+          <w:tcPr>
+            <w:tcW w:type="dxa" w:w="2524"/>
+          </w:tcPr>
+          <w:p>
+            <w:pPr>
+              <w:ind w:firstLine="0"/>
+              <w:jc w:val="left"/>
+            </w:pPr>
+            <w:r>
+              <w:rPr>
+                <w:rFonts w:ascii="Times New Roman" w:hAnsi="Times New Roman"/>
+                <w:sz w:val="16"/>
+              </w:rPr>
+              <w:t>SBERT + XGB, TPE^+</w:t>
+            </w:r>
+          </w:p>
+        </w:tc>
+        <w:tc>
+          <w:tcPr>
+            <w:tcW w:type="dxa" w:w="2524"/>
+          </w:tcPr>
+          <w:p>
+            <w:pPr>
+              <w:ind w:firstLine="0"/>
+              <w:jc w:val="center"/>
+            </w:pPr>
+            <w:r>
+              <w:rPr>
+                <w:rFonts w:ascii="Times New Roman" w:hAnsi="Times New Roman"/>
+                <w:sz w:val="16"/>
+              </w:rPr>
+              <w:t>0.966</w:t>
+            </w:r>
+          </w:p>
+        </w:tc>
+        <w:tc>
+          <w:tcPr>
+            <w:tcW w:type="dxa" w:w="2524"/>
+          </w:tcPr>
+          <w:p>
+            <w:pPr>
+              <w:ind w:firstLine="0"/>
+              <w:jc w:val="center"/>
+            </w:pPr>
+            <w:r>
+              <w:rPr>
+                <w:rFonts w:ascii="Times New Roman" w:hAnsi="Times New Roman"/>
+                <w:sz w:val="16"/>
+              </w:rPr>
+              <w:t>0.714</w:t>
+            </w:r>
+          </w:p>
+        </w:tc>
+        <w:tc>
+          <w:tcPr>
+            <w:tcW w:type="dxa" w:w="2524"/>
+          </w:tcPr>
+          <w:p>
+            <w:pPr>
+              <w:ind w:firstLine="0"/>
+              <w:jc w:val="center"/>
+            </w:pPr>
+            <w:r>
+              <w:rPr>
+                <w:rFonts w:ascii="Times New Roman" w:hAnsi="Times New Roman"/>
+                <w:sz w:val="16"/>
+              </w:rPr>
+              <w:t>0.581</w:t>
+            </w:r>
+          </w:p>
+        </w:tc>
+      </w:tr>
+      <w:tr>
+        <w:tc>
+          <w:tcPr>
+            <w:tcW w:type="dxa" w:w="2524"/>
+          </w:tcPr>
+          <w:p>
+            <w:pPr>
+              <w:ind w:firstLine="0"/>
+              <w:jc w:val="left"/>
+            </w:pPr>
+            <w:r>
+              <w:rPr>
+                <w:rFonts w:ascii="Times New Roman" w:hAnsi="Times New Roman"/>
+                <w:sz w:val="16"/>
+              </w:rPr>
+              <w:t>^+100 trials; single 80/20 split with bootstrap intervals, not 5-fold CV.</w:t>
+            </w:r>
+          </w:p>
+        </w:tc>
+        <w:tc>
+          <w:tcPr>
+            <w:tcW w:type="dxa" w:w="2524"/>
+          </w:tcPr>
+          <w:p>
+            <w:pPr>
+              <w:ind w:firstLine="0"/>
+              <w:jc w:val="center"/>
+            </w:pPr>
+            <w:r>
+              <w:rPr>
+                <w:rFonts w:ascii="Times New Roman" w:hAnsi="Times New Roman"/>
+                <w:sz w:val="16"/>
+              </w:rPr>
+            </w:r>
+          </w:p>
+        </w:tc>
+        <w:tc>
+          <w:tcPr>
+            <w:tcW w:type="dxa" w:w="2524"/>
+          </w:tcPr>
+          <w:p>
+            <w:pPr>
+              <w:ind w:firstLine="0"/>
+              <w:jc w:val="center"/>
+            </w:pPr>
+            <w:r>
+              <w:rPr>
+                <w:rFonts w:ascii="Times New Roman" w:hAnsi="Times New Roman"/>
+                <w:sz w:val="16"/>
+              </w:rPr>
+            </w:r>
+          </w:p>
+        </w:tc>
+        <w:tc>
+          <w:tcPr>
+            <w:tcW w:type="dxa" w:w="2524"/>
+          </w:tcPr>
+          <w:p>
+            <w:pPr>
+              <w:ind w:firstLine="0"/>
+              <w:jc w:val="center"/>
+            </w:pPr>
+            <w:r>
+              <w:rPr>
+                <w:rFonts w:ascii="Times New Roman" w:hAnsi="Times New Roman"/>
+                <w:sz w:val="16"/>
+              </w:rPr>
+            </w:r>
+          </w:p>
+        </w:tc>
+      </w:tr>
+    </w:tbl>
+    <w:p>
+      <w:pPr>
+        <w:spacing w:before="0" w:after="120"/>
+        <w:ind w:firstLine="0"/>
+      </w:pPr>
+      <w:r>
+        <w:rPr>
+          <w:b w:val="0"/>
+          <w:i w:val="0"/>
+          <w:sz w:val="12"/>
+        </w:rPr>
+      </w:r>
+    </w:p>
+    <w:p>
+      <w:pPr>
+        <w:spacing w:before="0" w:after="60"/>
+        <w:ind w:firstLine="288"/>
+      </w:pPr>
+      <w:r>
+        <w:rPr>
+          <w:b w:val="0"/>
+          <w:i w:val="0"/>
+          <w:sz w:val="20"/>
+        </w:rPr>
+        <w:t>The lexical and structural arms land within 0.007 R^2 of each other — 8,000 TF-IDF weights buy almost exactly what sixteen hand-counted statistics buy. The semantic arm beats the lexical one by DeltaMAE = 0.0514 [0.034, 0.067], p = 2.6×10^-5, a real but modest margin. Inverse-frequency sample weighting, applied in the original pipeline to compensate for the rating imbalance, hurts: removing it improves MAE by 0.0482 [0.039, 0.057] at p = 2.5×10^-26. The nested ridge stack improves on its own strongest base by DeltaMAE = 0.0134 [0.008, 0.019], p = 4.2×10^-6, and a 100-trial TPE search over the boosting head reaches test R^2 = 0.5811 [0.5471, 0.6182]. Both gains are real and both are small next to the 0.240 R^2 that separates the random and chronological protocols. Ensembling and tuning move the third decimal; the split moves the first.</w:t>
+      </w:r>
+    </w:p>
+    <w:p>
+      <w:pPr>
+        <w:spacing w:before="120" w:after="40"/>
+        <w:ind w:firstLine="0"/>
+      </w:pPr>
+      <w:r>
+        <w:rPr>
+          <w:b w:val="0"/>
+          <w:i/>
+          <w:sz w:val="20"/>
+        </w:rPr>
+        <w:t>D. Temporal shift in detail</w:t>
+      </w:r>
+    </w:p>
+    <w:p>
+      <w:pPr>
+        <w:spacing w:before="0" w:after="60"/>
+        <w:ind w:firstLine="288"/>
+      </w:pPr>
+      <w:r>
+        <w:rPr>
+          <w:b w:val="0"/>
+          <w:i w:val="0"/>
+          <w:sz w:val="20"/>
+        </w:rPr>
+        <w:t>The holdout target is compressed relative to the training pool: standard deviation falls from 1.4619 to 1.1701, while the mean falls from 6.0119 to 5.7546. Part of the R^2 collapse is therefore arithmetic — the same absolute error against a narrower target yields a smaller R^2 — and part is genuine degradation. Mean absolute error separates them: it is 0.7276 under P1 and 0.7232 under P3, statistically indistinguishable. The model's typical error in rating points does not grow at all when it predicts the future. What collapses is how much of the (now narrower) variance it can order. Regressing prediction on truth over the holdout gives slope 0.4634 (s.e. 0.0278) and intercept 3.1745, against an ideal slope of 1. The system is heavily shrunk toward the centre — it identifies which films are above or below average and declines to commit to how far.</w:t>
       </w:r>
     </w:p>
     <w:p>
@@ -5545,7 +5732,7 @@
           <w:i w:val="0"/>
           <w:sz w:val="20"/>
         </w:rPr>
-        <w:t>The 384 embedding dimensions take 55.5%, the three metadata columns take 36.6%, and the sixteen structural statistics take 8.0%. Per dimension the picture inverts: the single largest embedding dimension contributes 1.68% and the mean dimension 0.14%, whereas movie_length alone contributes 25.50% and year 11.01%. One tabular column outweighs all sixteen structural statistics by a factor of three.</w:t>
+        <w:t>In the shipped model's total split gain, the 384 embedding dimensions take 55.5%, the three metadata columns take 36.6%, and the sixteen structural statistics take 8.0%. Per dimension the picture inverts: the single largest embedding dimension contributes 1.68% and the mean dimension 0.14%, whereas movie_length alone contributes 25.50% and year 11.01%. One tabular column outweighs all sixteen structural statistics by a factor of three. Within the structural block the ordering is almost purely a size ordering: character, word, line, and sentence count occupy the top four positions, while the degenerate dialogue_density and unique_characters sit near the bottom; the model correctly declines to use them.</w:t>
       </w:r>
     </w:p>
     <w:p>
@@ -5661,7 +5848,7 @@
           <w:i w:val="0"/>
           <w:sz w:val="20"/>
         </w:rPr>
-        <w:t>Runtime is the opposite case. It transfers cleanly, because a 130-minute film in 2023 occupies the same region of feature space as a 130-minute film in 1994, and it alone reproduces the predictive value of the entire semantic block.</w:t>
+        <w:t>Runtime is the opposite case. It transfers cleanly, because a 130-minute film in 2023 occupies the same region of feature space as a 130-minute film in 1994, and it alone reproduces the predictive value of the entire semantic block. The embedding block carries real signal, but its per-dimension gain is flat — no dimension exceeds 1.7% — and Eq. (5) explains it: averaging 36 median unit-norm window embeddings drives the document vector toward the centroid of the corpus, damping precisely the localised evidence a human reader would use to judge a script. Combined with the 31.6% of tokens that truncation removes before pooling begins, that it still contributes as much as it does is the more surprising half of the result.</w:t>
       </w:r>
     </w:p>
     <w:p>
@@ -5690,7 +5877,7 @@
           <w:i w:val="0"/>
           <w:sz w:val="20"/>
         </w:rPr>
-        <w:t>The content-digest audit is verified on a subset. As stated in Section III, SHA-256 deduplication was executed over the 356 script files distributed with the code and returned zero duplicate groups. The metadata identity keys covering all 5,204 records found no duplicate identifiers and no duplicate title$ pairs, which bounds the plausible residual duplication, but does not eliminate the possibility of two distinct films sharing a byte-identical file through a scraping error. We report this rather than assert a number we did not compute.</w:t>
+        <w:t>Two arms are missing from the strict protocols. TF-IDF and the sixteen structural statistics require raw text and could therefore be evaluated only under P1. Restoring the corpus makes the full three-way comparison a single re-run of the released scripts.</w:t>
       </w:r>
     </w:p>
     <w:p>
@@ -5704,7 +5891,7 @@
           <w:i w:val="0"/>
           <w:sz w:val="20"/>
         </w:rPr>
-        <w:t>Selection effects in IMSDb are severe and not correctable. Contributors upload what they value, so canonical and acclaimed films are over-represented among older titles while recent years sample more broadly. The corpus-wide mean rating falls monotonically from 7.87 in the 1920s to 5.48 in the 2010s, which is a statement about who uploads what, not about film quality. Any model reading year learns this curation artifact, and P3 is the protocol that refuses to reward it. Generalisation claims extend to films resembling IMSDb's selection, not to an arbitrary IMDb title.</w:t>
+        <w:t>Selection effects in IMSDb are severe and not correctable. Contributors upload what they value, so canonical and acclaimed films are over-represented among older titles. The corpus-wide mean rating falls monotonically from 7.87 in the 1920s to 5.48 in the 2010s, which is a statement about who uploads what, not about film quality. Any model reading year learns this curation artifact, and P3 is the protocol that refuses to reward it.</w:t>
       </w:r>
     </w:p>
     <w:p>
@@ -5718,7 +5905,7 @@
           <w:i w:val="0"/>
           <w:sz w:val="20"/>
         </w:rPr>
-        <w:t>Temporal target compression confounds R^2. The holdout's rating standard deviation is 0.80× the training pool's. Because R^2 is normalised by target variance, part of the 0.536 -&gt; 0.309 drop is definitional. We report MAE alongside for this reason, and MAE is flat across protocols. Readers should treat the R^2 collapse as a statement about rank-ordering power on recent films, not about absolute error growth.</w:t>
+        <w:t>The holdout is one window. A single 2020–2025 test period of 515 films cannot separate a general temporal-decay law from the particulars of those six years. Rolling-origin evaluation over several cut years would estimate the decay rate; we report one cut.</w:t>
       </w:r>
     </w:p>
     <w:p>
@@ -5732,7 +5919,7 @@
           <w:i w:val="0"/>
           <w:sz w:val="20"/>
         </w:rPr>
-        <w:t>The strongest transferring feature is unavailable at deployment. Runtime dominates the temporal holdout, matching the entire embedding block under permutation. A screenplay-stage predictor does not know the runtime, because the film has not been cut — or shot.</w:t>
+        <w:t>The strongest transferring feature is unavailable at deployment. A screenplay-stage predictor does not know the runtime, because the film has not been cut — or shot. Page count is a legitimate pre-production proxy for runtime and is recoverable from the script; we did not evaluate it.</w:t>
       </w:r>
     </w:p>
     <w:p>
@@ -5746,7 +5933,7 @@
           <w:i w:val="0"/>
           <w:sz w:val="20"/>
         </w:rPr>
-        <w:t>Single encoder, single pooling. We audit mean-pooled all-MiniLM-L6-v2. Larger encoders, learned pooling, and token-aligned windows are all plausible improvements, and none is evaluated here; the point of the paper is the protocol, and holding the representation fixed is what makes the protocol comparison clean.</w:t>
+        <w:t>Single encoder, single pooling. We audit mean-pooled all-MiniLM-L6-v2. Larger encoders, learned pooling, and token-aligned windows are all plausible improvements, and none is evaluated here; holding the representation fixed is what makes the protocol comparison clean.</w:t>
       </w:r>
     </w:p>
     <w:p>
@@ -5775,21 +5962,7 @@
           <w:i w:val="0"/>
           <w:sz w:val="20"/>
         </w:rPr>
-        <w:t>We audited a screenplay-to-rating pipeline instead of extending it. The corpus turned out to be clean at the record level — 5,204 distinct identifiers, no repeated title×year pair — but to carry 164 multi-member title families, four corrupt release years, and a corrupt ordinal decade vocabulary that reaches the feature matrix intact. The chunking configuration turned out to discard 31.60% of WordPiece tokens without warning, because the window is measured in words and the budget is measured in tokens. And the headline metric turned out to depend on the partition far more than on the model: R^2 = 0.549 under random folds, 0.536 once franchises are kept together, 0.309 when the test films are drawn from years the model never saw.</w:t>
-      </w:r>
-    </w:p>
-    <w:p>
-      <w:pPr>
-        <w:spacing w:before="0" w:after="60"/>
-        <w:ind w:firstLine="288"/>
-      </w:pPr>
-      <w:r>
-        <w:rPr>
-          <w:b w:val="0"/>
-          <w:i w:val="0"/>
-          <w:sz w:val="20"/>
-        </w:rPr>
-        <w:t>The block-permutation analysis identifies the mechanism. Release year supplies 11% of in-sample split gain and exactly zero out-of-sample utility, because every holdout year falls beyond the training range and a tree ensemble cannot extrapolate past its last split point. Runtime transfers; semantics transfer; the calendar does not. For anyone building a screenplay-stage predictor, the operational recommendations are narrow and concrete: group by title family, hold out by release year, report MAE next to ^2$ when the target distribution shifts, align the chunk to the tokeniser rather than to whitespace, and store an immutable record key beside every cached representation.</w:t>
+        <w:t>We audited a screenplay-to-rating pipeline instead of extending it. The corpus turned out to be clean at the record level, but to carry 164 multi-member title families, four corrupt release years, and a corrupt ordinal decade vocabulary that reaches the feature matrix intact. The chunking configuration turned out to discard 31.60% of WordPiece tokens without warning. And the headline metric turned out to depend on the partition far more than on the model: R^2 = 0.549 under random folds, 0.536 once franchises are kept together, 0.309 when the test films are drawn from years the model never saw. Runtime transfers; semantics transfer; the calendar does not. For anyone building a screenplay-stage predictor, the operational recommendations are narrow and concrete: group by title family, hold out by release year, report MAE next to R^2 when the target distribution shifts, align the chunk to the tokeniser rather than to whitespace, and store an immutable record key beside every cached representation.</w:t>
       </w:r>
     </w:p>
     <w:p>
@@ -5818,7 +5991,7 @@
           <w:i w:val="0"/>
           <w:sz w:val="20"/>
         </w:rPr>
-        <w:t>The audit, alignment-recovery, evaluation, and figure code are released with the paper (audit_corpus.py, recover_alignment.py, audit_tokens.py, leakage_eval.py, analysis_xai.py, make_paper_figures.py). Every number in Tables I– IV is regenerated from the committed JSON artifacts in results/. The random seed is 42 throughout; bootstrap resampling uses 1000 draws.</w:t>
+        <w:t>The audit, alignment-recovery, evaluation, and figure code are released with the paper (audit_corpus.py, recover_alignment.py, audit_tokens.py, leakage_eval.py, analysis_xai.py, make_paper_figures.py). Every number is regenerated from the committed JSON artifacts in results/. The random seed is 42 throughout.</w:t>
       </w:r>
     </w:p>
     <w:p>
@@ -5860,7 +6033,7 @@
           <w:i w:val="0"/>
           <w:sz w:val="16"/>
         </w:rPr>
-        <w:t>[3] I. Chalkidis, X. Dai, M. Fergadiotis, P. Malakasiotis, and D. Elliott, “An exploration of hierarchical attention transformers for efficient long document classification,” arXiv:2210.05529, 2022.</w:t>
+        <w:t>[3] J. Eliashberg, S. K. Hui, and Z. J. Zhang, “Assessing box office performance using movie scripts: A kernel-based approach,” IEEE Trans. Knowl. Data Eng., vol. 26, no. 11, 2014.</w:t>
       </w:r>
     </w:p>
     <w:p>
@@ -5874,7 +6047,7 @@
           <w:i w:val="0"/>
           <w:sz w:val="16"/>
         </w:rPr>
-        <w:t>[4] H. L. Vogel, Entertainment Industry Economics, 10th ed. Cambridge, U.K.: Cambridge Univ. Press, 2020.</w:t>
+        <w:t>[4] S. D. Hunter, S. Smith, and S. Singh, “Predicting box office from the screenplay: A text analytical approach,” West East Institute, 2016.</w:t>
       </w:r>
     </w:p>
     <w:p>
@@ -5888,7 +6061,7 @@
           <w:i w:val="0"/>
           <w:sz w:val="16"/>
         </w:rPr>
-        <w:t>[5] M. C. Chiu, S. Lin, and W. Chen, “Screenplay quality assessment: Can we predict who gets nominated?” Nat. Univ. Singapore, Tech. Rep., 2020.</w:t>
+        <w:t>[5] A. J. Reagan, L. Mitchell, D. Kiley, C. M. Danforth, and P. S. Dodds, “The emotional arcs of stories are dominated by six basic shapes,” EPJ Data Science, vol. 5, no. 31, 2016.</w:t>
       </w:r>
     </w:p>
     <w:p>
@@ -5902,7 +6075,7 @@
           <w:i w:val="0"/>
           <w:sz w:val="16"/>
         </w:rPr>
-        <w:t>[6] A. Søgaard, S. Ebert, J. Bastings, and K. Filippova, “We need to talk about random splits,” in Proc. EACL, 2021.</w:t>
+        <w:t>[6] A. Ramakrishna, V. R. Martínez, N. Malandrakis, K. Singla, and S. Narayanan, “Linguistic analysis of differences in portrayal of movie characters,” in Proc. ACL, 2017.</w:t>
       </w:r>
     </w:p>
     <w:p>
@@ -5916,7 +6089,7 @@
           <w:i w:val="0"/>
           <w:sz w:val="16"/>
         </w:rPr>
-        <w:t>[7] A. Elangovan, J. He, and K. Verspoor, “Memorization vs. generalization: Quantifying data leakage in NLP performance evaluation,” in Proc. EACL, 2021.</w:t>
+        <w:t>[7] M. Shafaei, C. Smailis, I. Kakadiaris, and T. Solorio, “Age suitability rating: Predicting MPAA ratings based on movie dialogues,” in Proc. LREC, 2020.</w:t>
       </w:r>
     </w:p>
     <w:p>
@@ -5930,7 +6103,385 @@
           <w:i w:val="0"/>
           <w:sz w:val="16"/>
         </w:rPr>
-        <w:t>[8] S. Kapoor and A. Narayanan, “Leakage and the reproducibility crisis in machine-learning-based science,” Patterns, vol. 4, no. 9, 2023.</w:t>
+        <w:t>[8] Y. Zhang, M. Shafaei, and T. Solorio, “From none to severe: Predicting severity in movie scripts,” in Findings of EMNLP, 2021.</w:t>
+      </w:r>
+    </w:p>
+    <w:p>
+      <w:pPr>
+        <w:spacing w:before="0" w:after="40"/>
+        <w:ind w:left="317" w:hanging="317"/>
+      </w:pPr>
+      <w:r>
+        <w:rPr>
+          <w:b w:val="0"/>
+          <w:i w:val="0"/>
+          <w:sz w:val="16"/>
+        </w:rPr>
+        <w:t>[9] E. Chu, D. Roy, and J. Glass, “Audio-visual sentiment analysis for learning emotional arcs in movies,” in Proc. ICCV, 2017.</w:t>
+      </w:r>
+    </w:p>
+    <w:p>
+      <w:pPr>
+        <w:spacing w:before="0" w:after="40"/>
+        <w:ind w:left="317" w:hanging="317"/>
+      </w:pPr>
+      <w:r>
+        <w:rPr>
+          <w:b w:val="0"/>
+          <w:i w:val="0"/>
+          <w:sz w:val="16"/>
+        </w:rPr>
+        <w:t>[10] R. Sharda and D. Delen, “Predicting box-office success of motion pictures with neural networks,” Expert Systems with Applications, vol. 30, no. 2, 2006.</w:t>
+      </w:r>
+    </w:p>
+    <w:p>
+      <w:pPr>
+        <w:spacing w:before="0" w:after="40"/>
+        <w:ind w:left="317" w:hanging="317"/>
+      </w:pPr>
+      <w:r>
+        <w:rPr>
+          <w:b w:val="0"/>
+          <w:i w:val="0"/>
+          <w:sz w:val="16"/>
+        </w:rPr>
+        <w:t>[11] C. T. Madongo, Z. Tang, and J. Hassan, “Movie box-office revenue prediction model by mining deep features from trailers using recurrent neural networks,” J. Adv. Inf. Technol., 2024.</w:t>
+      </w:r>
+    </w:p>
+    <w:p>
+      <w:pPr>
+        <w:spacing w:before="0" w:after="40"/>
+        <w:ind w:left="317" w:hanging="317"/>
+      </w:pPr>
+      <w:r>
+        <w:rPr>
+          <w:b w:val="0"/>
+          <w:i w:val="0"/>
+          <w:sz w:val="16"/>
+        </w:rPr>
+        <w:t>[12] A. Bhadrashetty and S. Patil, “Movie success and rating prediction using data mining,” J. Sci. Res. Technol., 2024.</w:t>
+      </w:r>
+    </w:p>
+    <w:p>
+      <w:pPr>
+        <w:spacing w:before="0" w:after="40"/>
+        <w:ind w:left="317" w:hanging="317"/>
+      </w:pPr>
+      <w:r>
+        <w:rPr>
+          <w:b w:val="0"/>
+          <w:i w:val="0"/>
+          <w:sz w:val="16"/>
+        </w:rPr>
+        <w:t>[13] M. Z. Naeem, F. Rustam, A. Mehmood, I. Ashraf, and G. S. Choi, “Classification of movie reviews using term frequency-inverse document frequency and optimized machine learning algorithms,” PeerJ Comput. Sci., 2022.</w:t>
+      </w:r>
+    </w:p>
+    <w:p>
+      <w:pPr>
+        <w:spacing w:before="0" w:after="40"/>
+        <w:ind w:left="317" w:hanging="317"/>
+      </w:pPr>
+      <w:r>
+        <w:rPr>
+          <w:b w:val="0"/>
+          <w:i w:val="0"/>
+          <w:sz w:val="16"/>
+        </w:rPr>
+        <w:t>[14] I. Chalkidis, X. Dai, M. Fergadiotis, P. Malakasiotis, and D. Elliott, “An exploration of hierarchical attention transformers for efficient long document classification,” arXiv:2210.05529, 2022.</w:t>
+      </w:r>
+    </w:p>
+    <w:p>
+      <w:pPr>
+        <w:spacing w:before="0" w:after="40"/>
+        <w:ind w:left="317" w:hanging="317"/>
+      </w:pPr>
+      <w:r>
+        <w:rPr>
+          <w:b w:val="0"/>
+          <w:i w:val="0"/>
+          <w:sz w:val="16"/>
+        </w:rPr>
+        <w:t>[15] S. Asur and B. A. Huberman, “Predicting the future with social media,” in Proc. IEEE/WIC/ACM Web Intelligence, 2010.</w:t>
+      </w:r>
+    </w:p>
+    <w:p>
+      <w:pPr>
+        <w:spacing w:before="0" w:after="40"/>
+        <w:ind w:left="317" w:hanging="317"/>
+      </w:pPr>
+      <w:r>
+        <w:rPr>
+          <w:b w:val="0"/>
+          <w:i w:val="0"/>
+          <w:sz w:val="16"/>
+        </w:rPr>
+        <w:t>[16] A. Oghina, M. Breuss, M. Tsagkias, and M. de Rijke, “Predicting IMDb movie ratings using social media,” in Proc. ECIR, 2012.</w:t>
+      </w:r>
+    </w:p>
+    <w:p>
+      <w:pPr>
+        <w:spacing w:before="0" w:after="40"/>
+        <w:ind w:left="317" w:hanging="317"/>
+      </w:pPr>
+      <w:r>
+        <w:rPr>
+          <w:b w:val="0"/>
+          <w:i w:val="0"/>
+          <w:sz w:val="16"/>
+        </w:rPr>
+        <w:t>[17] G. Mishne and N. Glance, “Predicting movie sales from blogger sentiment,” in AAAI Spring Symposium, 2006.</w:t>
+      </w:r>
+    </w:p>
+    <w:p>
+      <w:pPr>
+        <w:spacing w:before="0" w:after="40"/>
+        <w:ind w:left="317" w:hanging="317"/>
+      </w:pPr>
+      <w:r>
+        <w:rPr>
+          <w:b w:val="0"/>
+          <w:i w:val="0"/>
+          <w:sz w:val="16"/>
+        </w:rPr>
+        <w:t>[18] M. Mestyán, T. Yasseri, and J. Kertész, “Early prediction of movie box office success based on Wikipedia activity big data,” PLoS ONE, vol. 8, no. 8, 2013.</w:t>
+      </w:r>
+    </w:p>
+    <w:p>
+      <w:pPr>
+        <w:spacing w:before="0" w:after="40"/>
+        <w:ind w:left="317" w:hanging="317"/>
+      </w:pPr>
+      <w:r>
+        <w:rPr>
+          <w:b w:val="0"/>
+          <w:i w:val="0"/>
+          <w:sz w:val="16"/>
+        </w:rPr>
+        <w:t>[19] H. L. Vogel, Entertainment Industry Economics, 10th ed. Cambridge, U.K.: Cambridge Univ. Press, 2020.</w:t>
+      </w:r>
+    </w:p>
+    <w:p>
+      <w:pPr>
+        <w:spacing w:before="0" w:after="40"/>
+        <w:ind w:left="317" w:hanging="317"/>
+      </w:pPr>
+      <w:r>
+        <w:rPr>
+          <w:b w:val="0"/>
+          <w:i w:val="0"/>
+          <w:sz w:val="16"/>
+        </w:rPr>
+        <w:t>[20] W. R. Bristi, Z. Zaman, and N. Sultana, “Predicting IMDb rating of movies by machine learning techniques,” in Proc. ICCCNT, 2019.</w:t>
+      </w:r>
+    </w:p>
+    <w:p>
+      <w:pPr>
+        <w:spacing w:before="0" w:after="40"/>
+        <w:ind w:left="317" w:hanging="317"/>
+      </w:pPr>
+      <w:r>
+        <w:rPr>
+          <w:b w:val="0"/>
+          <w:i w:val="0"/>
+          <w:sz w:val="16"/>
+        </w:rPr>
+        <w:t>[21] A. L. Gomes, M. Ribeiro, and P. Quaresma, “Predicting IMDb rating of TV series with deep learning: The case of Arrow,” arXiv:2211.03388, 2022.</w:t>
+      </w:r>
+    </w:p>
+    <w:p>
+      <w:pPr>
+        <w:spacing w:before="0" w:after="40"/>
+        <w:ind w:left="317" w:hanging="317"/>
+      </w:pPr>
+      <w:r>
+        <w:rPr>
+          <w:b w:val="0"/>
+          <w:i w:val="0"/>
+          <w:sz w:val="16"/>
+        </w:rPr>
+        <w:t>[22] J. Ramos, A. Pereira, and L. Cruz, “Movie rating prediction using sentiment features,” in Proc. SALLD, 2022.</w:t>
+      </w:r>
+    </w:p>
+    <w:p>
+      <w:pPr>
+        <w:spacing w:before="0" w:after="40"/>
+        <w:ind w:left="317" w:hanging="317"/>
+      </w:pPr>
+      <w:r>
+        <w:rPr>
+          <w:b w:val="0"/>
+          <w:i w:val="0"/>
+          <w:sz w:val="16"/>
+        </w:rPr>
+        <w:t>[23] V. Udandarao, A. Gupta, and S. Bhattacharya, “Movie revenue prediction using machine learning models,” arXiv:2405.11651, 2024.</w:t>
+      </w:r>
+    </w:p>
+    <w:p>
+      <w:pPr>
+        <w:spacing w:before="0" w:after="40"/>
+        <w:ind w:left="317" w:hanging="317"/>
+      </w:pPr>
+      <w:r>
+        <w:rPr>
+          <w:b w:val="0"/>
+          <w:i w:val="0"/>
+          <w:sz w:val="16"/>
+        </w:rPr>
+        <w:t>[24] W. Xie, Y. Liu, and H. Chen, “Predicting movie success with multi-task learning: GPT-based sentiment and SIR propagation,” arXiv preprint, 2025.</w:t>
+      </w:r>
+    </w:p>
+    <w:p>
+      <w:pPr>
+        <w:spacing w:before="0" w:after="40"/>
+        <w:ind w:left="317" w:hanging="317"/>
+      </w:pPr>
+      <w:r>
+        <w:rPr>
+          <w:b w:val="0"/>
+          <w:i w:val="0"/>
+          <w:sz w:val="16"/>
+        </w:rPr>
+        <w:t>[25] E. Mohamed, M. Shafaei, and T. Solorio, “A first dataset for film age appropriateness investigation,” in Proc. LREC, 2020.</w:t>
+      </w:r>
+    </w:p>
+    <w:p>
+      <w:pPr>
+        <w:spacing w:before="0" w:after="40"/>
+        <w:ind w:left="317" w:hanging="317"/>
+      </w:pPr>
+      <w:r>
+        <w:rPr>
+          <w:b w:val="0"/>
+          <w:i w:val="0"/>
+          <w:sz w:val="16"/>
+        </w:rPr>
+        <w:t>[26] S. Kar, S. Maharjan, and T. Solorio, “Folksonomication: Predicting tags for movies from plot synopses using emotion flow encoded neural network,” in Proc. COLING, 2018.</w:t>
+      </w:r>
+    </w:p>
+    <w:p>
+      <w:pPr>
+        <w:spacing w:before="0" w:after="40"/>
+        <w:ind w:left="317" w:hanging="317"/>
+      </w:pPr>
+      <w:r>
+        <w:rPr>
+          <w:b w:val="0"/>
+          <w:i w:val="0"/>
+          <w:sz w:val="16"/>
+        </w:rPr>
+        <w:t>[27] M. C. Chiu, S. Lin, and W. Chen, “Screenplay quality assessment: Can we predict who gets nominated?” Nat. Univ. Singapore, Tech. Rep., 2020.</w:t>
+      </w:r>
+    </w:p>
+    <w:p>
+      <w:pPr>
+        <w:spacing w:before="0" w:after="40"/>
+        <w:ind w:left="317" w:hanging="317"/>
+      </w:pPr>
+      <w:r>
+        <w:rPr>
+          <w:b w:val="0"/>
+          <w:i w:val="0"/>
+          <w:sz w:val="16"/>
+        </w:rPr>
+        <w:t>[28] K. Gorman and S. Bedrick, “We need to talk about standard splits,” in Proc. ACL, 2019.</w:t>
+      </w:r>
+    </w:p>
+    <w:p>
+      <w:pPr>
+        <w:spacing w:before="0" w:after="40"/>
+        <w:ind w:left="317" w:hanging="317"/>
+      </w:pPr>
+      <w:r>
+        <w:rPr>
+          <w:b w:val="0"/>
+          <w:i w:val="0"/>
+          <w:sz w:val="16"/>
+        </w:rPr>
+        <w:t>[29] A. Søgaard, S. Ebert, J. Bastings, and K. Filippova, “We need to talk about random splits,” in Proc. EACL, 2021.</w:t>
+      </w:r>
+    </w:p>
+    <w:p>
+      <w:pPr>
+        <w:spacing w:before="0" w:after="40"/>
+        <w:ind w:left="317" w:hanging="317"/>
+      </w:pPr>
+      <w:r>
+        <w:rPr>
+          <w:b w:val="0"/>
+          <w:i w:val="0"/>
+          <w:sz w:val="16"/>
+        </w:rPr>
+        <w:t>[30] P. Lewis, P. Stenetorp, and S. Riedel, “Question and answer test-train overlap in open-domain question answering datasets,” in Proc. EACL, 2021.</w:t>
+      </w:r>
+    </w:p>
+    <w:p>
+      <w:pPr>
+        <w:spacing w:before="0" w:after="40"/>
+        <w:ind w:left="317" w:hanging="317"/>
+      </w:pPr>
+      <w:r>
+        <w:rPr>
+          <w:b w:val="0"/>
+          <w:i w:val="0"/>
+          <w:sz w:val="16"/>
+        </w:rPr>
+        <w:t>[31] A. Elangovan, J. He, and K. Verspoor, “Memorization vs. generalization: Quantifying data leakage in NLP performance evaluation,” in Proc. EACL, 2021.</w:t>
+      </w:r>
+    </w:p>
+    <w:p>
+      <w:pPr>
+        <w:spacing w:before="0" w:after="40"/>
+        <w:ind w:left="317" w:hanging="317"/>
+      </w:pPr>
+      <w:r>
+        <w:rPr>
+          <w:b w:val="0"/>
+          <w:i w:val="0"/>
+          <w:sz w:val="16"/>
+        </w:rPr>
+        <w:t>[32] S. Kapoor and A. Narayanan, “Leakage and the reproducibility crisis in machine-learning-based science,” Patterns, vol. 4, no. 9, 2023.</w:t>
+      </w:r>
+    </w:p>
+    <w:p>
+      <w:pPr>
+        <w:spacing w:before="0" w:after="40"/>
+        <w:ind w:left="317" w:hanging="317"/>
+      </w:pPr>
+      <w:r>
+        <w:rPr>
+          <w:b w:val="0"/>
+          <w:i w:val="0"/>
+          <w:sz w:val="16"/>
+        </w:rPr>
+        <w:t>[33] A. Lazaridou et al., “Mind the gap: Assessing temporal generalization in neural language models,” in Proc. NeurIPS, 2021.</w:t>
+      </w:r>
+    </w:p>
+    <w:p>
+      <w:pPr>
+        <w:spacing w:before="0" w:after="40"/>
+        <w:ind w:left="317" w:hanging="317"/>
+      </w:pPr>
+      <w:r>
+        <w:rPr>
+          <w:b w:val="0"/>
+          <w:i w:val="0"/>
+          <w:sz w:val="16"/>
+        </w:rPr>
+        <w:t>[34] E. M. Bender and B. Friedman, “Data statements for natural language processing,” TACL, vol. 6, 2018.</w:t>
+      </w:r>
+    </w:p>
+    <w:p>
+      <w:pPr>
+        <w:spacing w:before="0" w:after="40"/>
+        <w:ind w:left="317" w:hanging="317"/>
+      </w:pPr>
+      <w:r>
+        <w:rPr>
+          <w:b w:val="0"/>
+          <w:i w:val="0"/>
+          <w:sz w:val="16"/>
+        </w:rPr>
+        <w:t>[35] J. Dodge et al., “Documenting large webtext corpora: A case study on the Colossal Clean Crawled Corpus,” in Proc. EMNLP, 2021.</w:t>
       </w:r>
     </w:p>
     <w:sectPr>

</xml_diff>

<commit_message>
docs(paper): condense IEEE 6-page manuscript to fit page limits
</commit_message>
<xml_diff>
--- a/paper/IEEE 6 pages.docx
+++ b/paper/IEEE 6 pages.docx
@@ -61,7 +61,7 @@
           <w:b/>
           <w:sz w:val="18"/>
         </w:rPr>
-        <w:t>Screenplay-to-rating regression is usually reported on a random split of an archival corpus. We argue that this number is not the number a reader wants, and we measure the gap. Working from a corpus of 5,204 IMSDb screenplays joined to IMDb metadata, we first run a record-identity audit — content SHA-256 digests, IMDb identifiers, title×year keys, and a normalised title-family key — and publish the resulting exclusion ledger, which retains 5,164 records after removing nine sub-1 KB fragments, four corrupt release years, and twenty-seven records whose positional identity in the archived embedding matrix cannot be resolved uniquely. We then quantify a defect that is invisible at the API surface: the pipeline slides a 256-word window over each script, but the encoder admits only 254 WordPiece tokens, so 98.45% of windows are cut and 31.60% of all tokens never reach the model. Finally we evaluate identical representations and learners under three partitions — random k-fold, title-family GroupKFold, and a chronological 2020–2025 holdout. Skill is strongly protocol-dependent: the best system reports R^2=0.549 [0.530, 0.567] under random folds, 0.536 [0.516, 0.554] once franchises are held together, and 0.309 [0.199, 0.404] when the test set lies in the future. Block-permutation analysis on the temporal holdout explains why. Release year and decade, which jointly supply 36.6% of in-sample split gain, contribute exactly DeltaMAE=0.000 once the test years fall outside the training range, while runtime alone (+0.199) matches the entire 384-dimensional sentence-embedding block (+0.195). Semantic embeddings survive the strict split; the calendar confound does not.</w:t>
+        <w:t>Screenplay-to-rating regression is usually reported on a random split of an archival corpus. We argue that this number is not the number a reader wants, and we measure the gap. Working from a corpus of 5,204 IMSDb screenplays joined to IMDb metadata, we first run a record-identity audit and publish the resulting exclusion ledger, which retains 5,164 records. We then quantify a defect that is invisible at the API surface: the pipeline slides a 256-word window over each script, but the encoder admits only 254 WordPiece tokens, so 98.45% of windows are cut and 31.60% of all tokens never reach the model. Finally we evaluate identical representations and learners under three partitions — random k-fold, title-family GroupKFold, and a chronological 2020–2025 holdout. The best system reports R^2=0.549 under random folds, 0.536 once franchises are held together, and 0.309 when the test set lies in the future. Release year and decade, which jointly supply 36.6% of in-sample split gain, contribute exactly DeltaMAE=0.000 once the test years fall outside the training range, while runtime alone (+0.199) matches the entire 384-dimensional sentence-embedding block (+0.195). Semantic embeddings survive the strict split; the calendar confound does not.</w:t>
       </w:r>
     </w:p>
     <w:p>
@@ -111,7 +111,7 @@
           <w:i w:val="0"/>
           <w:sz w:val="20"/>
         </w:rPr>
-        <w:t>A feature-film screenplay runs to roughly 25,000 words. Sentence encoders read 256 tokens. That mismatch is the central engineering problem in screenplay modelling, and the usual answer — slide a window, embed each window, average the results — is cheap, reproducible, and widely used. What is far less often examined is whether the evaluation wrapped around that pipeline measures anything a practitioner could rely on, because an archival screenplay corpus assembled from a community repository carries two structural hazards that a shuffled train/test split will silently convert into apparent skill.</w:t>
+        <w:t>A feature-film screenplay runs to roughly 25,000 words. Sentence encoders read 256 tokens. The usual answer — slide a window, embed each window, average the results — is cheap and widely used. What is far less often examined is whether the evaluation wrapped around that pipeline measures anything a practitioner could rely on, because an archival screenplay corpus assembled from a community repository carries two structural hazards that a shuffled train/test split will silently convert into apparent skill.</w:t>
       </w:r>
     </w:p>
     <w:p>
@@ -139,21 +139,7 @@
           <w:i w:val="0"/>
           <w:sz w:val="20"/>
         </w:rPr>
-        <w:t>Layered underneath both is a quieter defect specific to chunked long-document pipelines. Chunking is almost always specified in words; truncation always happens in subword tokens. Nobody is told when the budget is exceeded — the encoder simply drops the tail — so a configuration that reads as “256-word windows with 50-word overlap” can in practice discard a third of the corpus without emitting a single warning.</w:t>
-      </w:r>
-    </w:p>
-    <w:p>
-      <w:pPr>
-        <w:spacing w:before="0" w:after="60"/>
-        <w:ind w:firstLine="288"/>
-      </w:pPr>
-      <w:r>
-        <w:rPr>
-          <w:b w:val="0"/>
-          <w:i w:val="0"/>
-          <w:sz w:val="20"/>
-        </w:rPr>
-        <w:t>This paper is an audit, not a leaderboard entry. We take an existing SBERT-plus-gradient-boosting pipeline over 5,204 IMSDb screenplays and ask what its reported performance is actually made of. Three contributions follow.</w:t>
+        <w:t>Layered underneath both is a quieter defect: chunking is almost always specified in words; truncation always happens in subword tokens, and nobody is told when the budget is exceeded. This paper is an audit, not a leaderboard entry. We take an existing SBERT-plus-gradient-boosting pipeline and ask what its reported performance is actually made of. Three contributions follow.</w:t>
       </w:r>
     </w:p>
     <w:p>
@@ -317,7 +303,7 @@
           <w:i w:val="0"/>
           <w:sz w:val="20"/>
         </w:rPr>
-        <w:t>Deduplication is only as good as the notion of identity behind it, so we audit four keys of decreasing strictness. Content digest: for a script file with byte content b, the key is SHA256(b), which catches the re-upload-under-a-new-name case that no metadata key can see; collisions are resolved by retaining the earliest record in load order. IMDb identifier: the canonical film key. Title×year: a fallback for records whose identifier is missing or malformed. Title family: the loosest key, and the one that matters for split design. We normalise a title t by case-folding, stripping non-alphanumeric characters, removing a leading article, and iteratively deleting a trailing sequel marker — an Arabic numeral, a Roman numeral up to X, or a part n construction — to a fixed point. Toy Story, Toy Story 2 and Toy Story 3 therefore map to the single family toy story. Families are not deduplicated; they are the grouping variable for Section IV-D.</w:t>
+        <w:t>Deduplication is only as good as the notion of identity behind it, so we audit four keys of decreasing strictness. Content digest: for a script file with byte content b, the key is SHA256(b), which catches the re-upload-under-a-new-name case that no metadata key can see; collisions are resolved by retaining the earliest record in load order. IMDb identifier: the canonical film key. Title×year: a fallback for records whose identifier is missing or malformed. Title family: the loosest key, and the one that matters for split design. We normalise a title t by case-folding, stripping non-alphanumeric characters, removing a leading article, and iteratively deleting a trailing sequel marker — an Arabic numeral, a Roman numeral up to X, or a part n construction — to a fixed point. Toy Story and Toy Story 2 therefore map to the single family toy story, the grouping variable for Section IV-D.</w:t>
       </w:r>
     </w:p>
     <w:p>
@@ -403,7 +389,7 @@
           <w:i w:val="0"/>
           <w:sz w:val="20"/>
         </w:rPr>
-        <w:t>The second arrow is the one to read carefully. It is an identity map on the subset over which the digest could be evaluated, not a corpus-wide null result: content hashing requires the raw text, and 356 of the 5,204 files are distributed with the code. Over those 356 the digest audit returns zero collisions. The metadata identity keys, which are computable for all 5,204 records, likewise return zero duplicate IMDb identifiers and zero duplicate title×year pairs, which bounds — without eliminating — the residual duplication that a full-corpus pass could still uncover.</w:t>
+        <w:t>The second arrow is an identity map on the subset over which the digest could be evaluated, not a corpus-wide null result: content hashing requires the raw text, and 356 of the 5,204 files are distributed with the code. The metadata keys, computable for all records, bound — without eliminating — the residual duplication that a full-corpus pass could still uncover.</w:t>
       </w:r>
     </w:p>
     <w:p>
@@ -1109,7 +1095,7 @@
           <w:i w:val="0"/>
           <w:sz w:val="20"/>
         </w:rPr>
-        <w:t>Table I is the full ledger for the flow of Section III-B. All 5,204 identifiers are distinct and no title×year pair repeats. This is a genuinely clean join, and it means the leakage channel in this corpus is not naive record duplication. Eighty titles appear more than once, spanning 165 records, but every collision pairs distinct identifiers and distinct years — these are remakes and same-title unrelated films, not duplicates. We retain them and place them in a shared family, because a remake shares premise, character names, and often substantial dialogue with its predecessor.</w:t>
+        <w:t>Table I is the full ledger for the flow of Section III-B. All 5,204 identifiers are distinct and no title×year pair repeats. This is a genuinely clean join, and it means the leakage channel in this corpus is not naive record duplication. Eighty titles appear more than once, spanning 165 records, but every collision pairs distinct identifiers and distinct years — these are remakes and same-title unrelated films, not duplicates. We retain them in a shared family. Four records carry release years of 1080 or 1088, transparently mis-typed 1980 and 1988; we drop them rather than silently repair them. The derived decade column is worse: the shipped label encoder holds 14 decade strings, among them 1080s and 1996s, encoded as an ordinal integer.</w:t>
       </w:r>
     </w:p>
     <w:p>
@@ -1123,21 +1109,7 @@
           <w:i w:val="0"/>
           <w:sz w:val="20"/>
         </w:rPr>
-        <w:t>Metadata corruption is present and reaches the model. Four records carry release years of 1080 or 1088, transparently mis-typed 1980 and 1988. We drop them rather than silently repair them. The derived decade column is worse: the label encoder fitted by the shipped pipeline holds 14 distinct decade strings, among them 1080s, 1900s and 1996s, and it encodes them as an ordinal integer.</w:t>
-      </w:r>
-    </w:p>
-    <w:p>
-      <w:pPr>
-        <w:spacing w:before="0" w:after="60"/>
-        <w:ind w:firstLine="288"/>
-      </w:pPr>
-      <w:r>
-        <w:rPr>
-          <w:b w:val="0"/>
-          <w:i w:val="0"/>
-          <w:sz w:val="20"/>
-        </w:rPr>
-        <w:t>Twenty-seven further records are excluded for a reproducibility reason rather than a data-quality one. The archived embedding matrix stores rows in loader order without a record key, and the loader had already dropped nine sub-1 KB scripts, so row i of the matrix is not record i of the spreadsheet. We reconstruct the offset function from the committed split bookkeeping — 780 test records anchor it exactly through their file names, 779 validation records constrain it further through title-and-rating agreement — and recover a mapping consistent with all 1,559 anchors. Twenty-seven positions inside the reconstruction gaps admit more than one consistent assignment; we drop them rather than guess.</w:t>
+        <w:t>Twenty-seven further records are excluded for a reproducibility reason. The archived embedding matrix stores rows in loader order without a record key, so row i of the matrix is not record i of the spreadsheet. We reconstruct the offset function from 1,559 anchors in the committed split bookkeeping; twenty-seven positions inside the reconstruction gaps admit more than one consistent assignment, and we drop them rather than guess.</w:t>
       </w:r>
     </w:p>
     <w:p>
@@ -1338,62 +1310,7 @@
           <w:i w:val="0"/>
           <w:sz w:val="20"/>
         </w:rPr>
-        <w:t>Running the encoder's own tokeniser over the pipeline's own windows on the 356 available scripts yields 14,558 windows with median length 371 tokens, 90th percentile 405, and maximum 613 (Fig. 1). The consequences: 98.45% of windows exceed B, and rho evaluated corpus-wide is 0.3160, with a worst case of 0.4443. Roughly one word in three is written to a window that the encoder never reads. Nothing in the pipeline reports this.</w:t>
-      </w:r>
-    </w:p>
-    <w:p>
-      <w:pPr>
-        <w:ind w:firstLine="0"/>
-        <w:jc w:val="center"/>
-      </w:pPr>
-      <w:r>
-        <w:drawing>
-          <wp:inline xmlns:a="http://schemas.openxmlformats.org/drawingml/2006/main" xmlns:pic="http://schemas.openxmlformats.org/drawingml/2006/picture">
-            <wp:extent cx="2926080" cy="1877932"/>
-            <wp:docPr id="1" name="Picture 1"/>
-            <wp:cNvGraphicFramePr>
-              <a:graphicFrameLocks noChangeAspect="1"/>
-            </wp:cNvGraphicFramePr>
-            <a:graphic>
-              <a:graphicData uri="http://schemas.openxmlformats.org/drawingml/2006/picture">
-                <pic:pic>
-                  <pic:nvPicPr>
-                    <pic:cNvPr id="0" name="12_token_budget.png"/>
-                    <pic:cNvPicPr/>
-                  </pic:nvPicPr>
-                  <pic:blipFill>
-                    <a:blip r:embed="rId9"/>
-                    <a:stretch>
-                      <a:fillRect/>
-                    </a:stretch>
-                  </pic:blipFill>
-                  <pic:spPr>
-                    <a:xfrm>
-                      <a:off x="0" y="0"/>
-                      <a:ext cx="2926080" cy="1877932"/>
-                    </a:xfrm>
-                    <a:prstGeom prst="rect"/>
-                  </pic:spPr>
-                </pic:pic>
-              </a:graphicData>
-            </a:graphic>
-          </wp:inline>
-        </w:drawing>
-      </w:r>
-    </w:p>
-    <w:p>
-      <w:pPr>
-        <w:spacing w:before="0" w:after="160"/>
-        <w:ind w:firstLine="0"/>
-        <w:jc w:val="center"/>
-      </w:pPr>
-      <w:r>
-        <w:rPr>
-          <w:b w:val="0"/>
-          <w:i w:val="0"/>
-          <w:sz w:val="16"/>
-        </w:rPr>
-        <w:t>Fig. 1.  Window length in WordPiece tokens against the 254-token content budget, over 14,558 windows from 356 screenplays. The window is specified in words; truncation happens in tokens.</w:t>
+        <w:t>Running the encoder's own tokeniser over the pipeline's own windows on the 356 available scripts yields 14,558 windows with median length 371 tokens, 90th percentile 405, and maximum 613. The consequences: 98.45% of windows exceed B, and rho evaluated corpus-wide is 0.3160, with a worst case of 0.4443. Roughly one word in three is written to a window that the encoder never reads. Nothing in the pipeline reports this.</w:t>
       </w:r>
     </w:p>
     <w:p>
@@ -1534,36 +1451,7 @@
           <w:i w:val="0"/>
           <w:sz w:val="20"/>
         </w:rPr>
-        <w:t>P3, chronological. With yr(i) the release year,</w:t>
-      </w:r>
-    </w:p>
-    <w:p>
-      <w:pPr>
-        <w:spacing w:before="80" w:after="80"/>
-        <w:ind w:firstLine="0"/>
-        <w:jc w:val="center"/>
-      </w:pPr>
-      <w:r>
-        <w:rPr>
-          <w:b w:val="0"/>
-          <w:i/>
-          <w:sz w:val="20"/>
-        </w:rPr>
-        <w:t>T_test &amp;= \ i : 2020 &lt;= yr(i) &lt;= 2025 \, T_val &amp;= \ i : c &lt;= yr(i) &lt;= 2019 \, T_train&amp;= \ i : yr(i) &lt; c \,</w:t>
-      </w:r>
-    </w:p>
-    <w:p>
-      <w:pPr>
-        <w:spacing w:before="0" w:after="60"/>
-        <w:ind w:firstLine="288"/>
-      </w:pPr>
-      <w:r>
-        <w:rPr>
-          <w:b w:val="0"/>
-          <w:i w:val="0"/>
-          <w:sz w:val="20"/>
-        </w:rPr>
-        <w:t>where c is the 85th percentile of the pre-2020 year distribution, here c = 2016. Early stopping is thereby decided on films that are themselves in the future relative to the training set, so no forward-looking information enters through model selection. The realised sizes are 3,918 / 731 / 515.</w:t>
+        <w:t>P3, chronological. With yr(i) the release year, the test set is 2020 &lt;= yr(i) &lt;= 2025, validation c &lt;= yr(i) &lt;= 2019, and training yr(i) &lt; c, where c is the 85th percentile of the pre-2020 year distribution, here c = 2016. Early stopping is thereby decided on films that are themselves in the future relative to the training set, so no forward-looking information enters through model selection. The realised sizes are 3,918 / 731 / 515.</w:t>
       </w:r>
     </w:p>
     <w:p>
@@ -4993,675 +4881,7 @@
           <w:i w:val="0"/>
           <w:sz w:val="20"/>
         </w:rPr>
-        <w:t>The lexical control and the structural-feature model can be evaluated only under the random protocol on this corpus, because reconstructing either representation requires the raw script text. Table V reproduces those figures from the archived runs.</w:t>
-      </w:r>
-    </w:p>
-    <w:p>
-      <w:pPr>
-        <w:spacing w:before="160" w:after="0"/>
-        <w:ind w:firstLine="0"/>
-        <w:jc w:val="center"/>
-      </w:pPr>
-      <w:r>
-        <w:rPr>
-          <w:b w:val="0"/>
-          <w:i w:val="0"/>
-          <w:sz w:val="16"/>
-        </w:rPr>
-        <w:t>TABLE V.</w:t>
-      </w:r>
-    </w:p>
-    <w:p>
-      <w:pPr>
-        <w:spacing w:before="0" w:after="60"/>
-        <w:ind w:firstLine="0"/>
-        <w:jc w:val="center"/>
-      </w:pPr>
-      <w:r>
-        <w:rPr>
-          <w:b w:val="0"/>
-          <w:i w:val="0"/>
-          <w:sz w:val="16"/>
-        </w:rPr>
-        <w:t>Random-protocol results for the arms that require raw text (5-fold CV, mean ± s.d.; archived runs over 5,195 records). These are not comparable to Tables II– III.</w:t>
-      </w:r>
-    </w:p>
-    <w:tbl>
-      <w:tblPr>
-        <w:tblStyle w:val="TableGrid"/>
-        <w:tblW w:type="auto" w:w="0"/>
-        <w:jc w:val="center"/>
-        <w:tblLook w:firstColumn="1" w:firstRow="1" w:lastColumn="0" w:lastRow="0" w:noHBand="0" w:noVBand="1" w:val="04A0"/>
-      </w:tblPr>
-      <w:tblGrid>
-        <w:gridCol w:w="2524"/>
-        <w:gridCol w:w="2524"/>
-        <w:gridCol w:w="2524"/>
-        <w:gridCol w:w="2524"/>
-      </w:tblGrid>
-      <w:tr>
-        <w:tc>
-          <w:tcPr>
-            <w:tcW w:type="dxa" w:w="2524"/>
-            <w:shd w:val="clear" w:fill="D9E2F3"/>
-          </w:tcPr>
-          <w:p>
-            <w:pPr>
-              <w:ind w:firstLine="0"/>
-              <w:jc w:val="left"/>
-            </w:pPr>
-            <w:r>
-              <w:rPr>
-                <w:rFonts w:ascii="Times New Roman" w:hAnsi="Times New Roman"/>
-                <w:b/>
-                <w:sz w:val="16"/>
-              </w:rPr>
-              <w:t>System</w:t>
-            </w:r>
-          </w:p>
-        </w:tc>
-        <w:tc>
-          <w:tcPr>
-            <w:tcW w:type="dxa" w:w="2524"/>
-            <w:shd w:val="clear" w:fill="D9E2F3"/>
-          </w:tcPr>
-          <w:p>
-            <w:pPr>
-              <w:ind w:firstLine="0"/>
-              <w:jc w:val="center"/>
-            </w:pPr>
-            <w:r>
-              <w:rPr>
-                <w:rFonts w:ascii="Times New Roman" w:hAnsi="Times New Roman"/>
-                <w:b/>
-                <w:sz w:val="16"/>
-              </w:rPr>
-              <w:t>RMSE</w:t>
-            </w:r>
-          </w:p>
-        </w:tc>
-        <w:tc>
-          <w:tcPr>
-            <w:tcW w:type="dxa" w:w="2524"/>
-            <w:shd w:val="clear" w:fill="D9E2F3"/>
-          </w:tcPr>
-          <w:p>
-            <w:pPr>
-              <w:ind w:firstLine="0"/>
-              <w:jc w:val="center"/>
-            </w:pPr>
-            <w:r>
-              <w:rPr>
-                <w:rFonts w:ascii="Times New Roman" w:hAnsi="Times New Roman"/>
-                <w:b/>
-                <w:sz w:val="16"/>
-              </w:rPr>
-              <w:t>MAE</w:t>
-            </w:r>
-          </w:p>
-        </w:tc>
-        <w:tc>
-          <w:tcPr>
-            <w:tcW w:type="dxa" w:w="2524"/>
-            <w:shd w:val="clear" w:fill="D9E2F3"/>
-          </w:tcPr>
-          <w:p>
-            <w:pPr>
-              <w:ind w:firstLine="0"/>
-              <w:jc w:val="center"/>
-            </w:pPr>
-            <w:r>
-              <w:rPr>
-                <w:rFonts w:ascii="Times New Roman" w:hAnsi="Times New Roman"/>
-                <w:b/>
-                <w:sz w:val="16"/>
-              </w:rPr>
-              <w:t>R^2</w:t>
-            </w:r>
-          </w:p>
-        </w:tc>
-      </w:tr>
-      <w:tr>
-        <w:tc>
-          <w:tcPr>
-            <w:tcW w:type="dxa" w:w="2524"/>
-          </w:tcPr>
-          <w:p>
-            <w:pPr>
-              <w:ind w:firstLine="0"/>
-              <w:jc w:val="left"/>
-            </w:pPr>
-            <w:r>
-              <w:rPr>
-                <w:rFonts w:ascii="Times New Roman" w:hAnsi="Times New Roman"/>
-                <w:sz w:val="16"/>
-              </w:rPr>
-              <w:t>Structural OLS (16 + meta)</w:t>
-            </w:r>
-          </w:p>
-        </w:tc>
-        <w:tc>
-          <w:tcPr>
-            <w:tcW w:type="dxa" w:w="2524"/>
-          </w:tcPr>
-          <w:p>
-            <w:pPr>
-              <w:ind w:firstLine="0"/>
-              <w:jc w:val="center"/>
-            </w:pPr>
-            <w:r>
-              <w:rPr>
-                <w:rFonts w:ascii="Times New Roman" w:hAnsi="Times New Roman"/>
-                <w:sz w:val="16"/>
-              </w:rPr>
-              <w:t>1.076 ± 0.040</w:t>
-            </w:r>
-          </w:p>
-        </w:tc>
-        <w:tc>
-          <w:tcPr>
-            <w:tcW w:type="dxa" w:w="2524"/>
-          </w:tcPr>
-          <w:p>
-            <w:pPr>
-              <w:ind w:firstLine="0"/>
-              <w:jc w:val="center"/>
-            </w:pPr>
-            <w:r>
-              <w:rPr>
-                <w:rFonts w:ascii="Times New Roman" w:hAnsi="Times New Roman"/>
-                <w:sz w:val="16"/>
-              </w:rPr>
-              <w:t>0.833 ± 0.031</w:t>
-            </w:r>
-          </w:p>
-        </w:tc>
-        <w:tc>
-          <w:tcPr>
-            <w:tcW w:type="dxa" w:w="2524"/>
-          </w:tcPr>
-          <w:p>
-            <w:pPr>
-              <w:ind w:firstLine="0"/>
-              <w:jc w:val="center"/>
-            </w:pPr>
-            <w:r>
-              <w:rPr>
-                <w:rFonts w:ascii="Times New Roman" w:hAnsi="Times New Roman"/>
-                <w:sz w:val="16"/>
-              </w:rPr>
-              <w:t>0.440 ± 0.007</w:t>
-            </w:r>
-          </w:p>
-        </w:tc>
-      </w:tr>
-      <w:tr>
-        <w:tc>
-          <w:tcPr>
-            <w:tcW w:type="dxa" w:w="2524"/>
-          </w:tcPr>
-          <w:p>
-            <w:pPr>
-              <w:ind w:firstLine="0"/>
-              <w:jc w:val="left"/>
-            </w:pPr>
-            <w:r>
-              <w:rPr>
-                <w:rFonts w:ascii="Times New Roman" w:hAnsi="Times New Roman"/>
-                <w:sz w:val="16"/>
-              </w:rPr>
-              <w:t>TF-IDF + XGBoost</w:t>
-            </w:r>
-          </w:p>
-        </w:tc>
-        <w:tc>
-          <w:tcPr>
-            <w:tcW w:type="dxa" w:w="2524"/>
-          </w:tcPr>
-          <w:p>
-            <w:pPr>
-              <w:ind w:firstLine="0"/>
-              <w:jc w:val="center"/>
-            </w:pPr>
-            <w:r>
-              <w:rPr>
-                <w:rFonts w:ascii="Times New Roman" w:hAnsi="Times New Roman"/>
-                <w:sz w:val="16"/>
-              </w:rPr>
-              <w:t>1.083 ± 0.034</w:t>
-            </w:r>
-          </w:p>
-        </w:tc>
-        <w:tc>
-          <w:tcPr>
-            <w:tcW w:type="dxa" w:w="2524"/>
-          </w:tcPr>
-          <w:p>
-            <w:pPr>
-              <w:ind w:firstLine="0"/>
-              <w:jc w:val="center"/>
-            </w:pPr>
-            <w:r>
-              <w:rPr>
-                <w:rFonts w:ascii="Times New Roman" w:hAnsi="Times New Roman"/>
-                <w:sz w:val="16"/>
-              </w:rPr>
-              <w:t>0.819 ± 0.022</w:t>
-            </w:r>
-          </w:p>
-        </w:tc>
-        <w:tc>
-          <w:tcPr>
-            <w:tcW w:type="dxa" w:w="2524"/>
-          </w:tcPr>
-          <w:p>
-            <w:pPr>
-              <w:ind w:firstLine="0"/>
-              <w:jc w:val="center"/>
-            </w:pPr>
-            <w:r>
-              <w:rPr>
-                <w:rFonts w:ascii="Times New Roman" w:hAnsi="Times New Roman"/>
-                <w:sz w:val="16"/>
-              </w:rPr>
-              <w:t>0.433 ± 0.014</w:t>
-            </w:r>
-          </w:p>
-        </w:tc>
-      </w:tr>
-      <w:tr>
-        <w:tc>
-          <w:tcPr>
-            <w:tcW w:type="dxa" w:w="2524"/>
-          </w:tcPr>
-          <w:p>
-            <w:pPr>
-              <w:ind w:firstLine="0"/>
-              <w:jc w:val="left"/>
-            </w:pPr>
-            <w:r>
-              <w:rPr>
-                <w:rFonts w:ascii="Times New Roman" w:hAnsi="Times New Roman"/>
-                <w:sz w:val="16"/>
-              </w:rPr>
-              <w:t>SBERT + XGB (weighted)</w:t>
-            </w:r>
-          </w:p>
-        </w:tc>
-        <w:tc>
-          <w:tcPr>
-            <w:tcW w:type="dxa" w:w="2524"/>
-          </w:tcPr>
-          <w:p>
-            <w:pPr>
-              <w:ind w:firstLine="0"/>
-              <w:jc w:val="center"/>
-            </w:pPr>
-            <w:r>
-              <w:rPr>
-                <w:rFonts w:ascii="Times New Roman" w:hAnsi="Times New Roman"/>
-                <w:sz w:val="16"/>
-              </w:rPr>
-              <w:t>1.000 ± 0.027</w:t>
-            </w:r>
-          </w:p>
-        </w:tc>
-        <w:tc>
-          <w:tcPr>
-            <w:tcW w:type="dxa" w:w="2524"/>
-          </w:tcPr>
-          <w:p>
-            <w:pPr>
-              <w:ind w:firstLine="0"/>
-              <w:jc w:val="center"/>
-            </w:pPr>
-            <w:r>
-              <w:rPr>
-                <w:rFonts w:ascii="Times New Roman" w:hAnsi="Times New Roman"/>
-                <w:sz w:val="16"/>
-              </w:rPr>
-              <w:t>0.768 ± 0.024</w:t>
-            </w:r>
-          </w:p>
-        </w:tc>
-        <w:tc>
-          <w:tcPr>
-            <w:tcW w:type="dxa" w:w="2524"/>
-          </w:tcPr>
-          <w:p>
-            <w:pPr>
-              <w:ind w:firstLine="0"/>
-              <w:jc w:val="center"/>
-            </w:pPr>
-            <w:r>
-              <w:rPr>
-                <w:rFonts w:ascii="Times New Roman" w:hAnsi="Times New Roman"/>
-                <w:sz w:val="16"/>
-              </w:rPr>
-              <w:t>0.516 ± 0.026</w:t>
-            </w:r>
-          </w:p>
-        </w:tc>
-      </w:tr>
-      <w:tr>
-        <w:tc>
-          <w:tcPr>
-            <w:tcW w:type="dxa" w:w="2524"/>
-          </w:tcPr>
-          <w:p>
-            <w:pPr>
-              <w:ind w:firstLine="0"/>
-              <w:jc w:val="left"/>
-            </w:pPr>
-            <w:r>
-              <w:rPr>
-                <w:rFonts w:ascii="Times New Roman" w:hAnsi="Times New Roman"/>
-                <w:sz w:val="16"/>
-              </w:rPr>
-              <w:t>SBERT + XGB (unweighted)</w:t>
-            </w:r>
-          </w:p>
-        </w:tc>
-        <w:tc>
-          <w:tcPr>
-            <w:tcW w:type="dxa" w:w="2524"/>
-          </w:tcPr>
-          <w:p>
-            <w:pPr>
-              <w:ind w:firstLine="0"/>
-              <w:jc w:val="center"/>
-            </w:pPr>
-            <w:r>
-              <w:rPr>
-                <w:rFonts w:ascii="Times New Roman" w:hAnsi="Times New Roman"/>
-                <w:sz w:val="16"/>
-              </w:rPr>
-              <w:t>0.958 ± 0.033</w:t>
-            </w:r>
-          </w:p>
-        </w:tc>
-        <w:tc>
-          <w:tcPr>
-            <w:tcW w:type="dxa" w:w="2524"/>
-          </w:tcPr>
-          <w:p>
-            <w:pPr>
-              <w:ind w:firstLine="0"/>
-              <w:jc w:val="center"/>
-            </w:pPr>
-            <w:r>
-              <w:rPr>
-                <w:rFonts w:ascii="Times New Roman" w:hAnsi="Times New Roman"/>
-                <w:sz w:val="16"/>
-              </w:rPr>
-              <w:t>0.720 ± 0.027</w:t>
-            </w:r>
-          </w:p>
-        </w:tc>
-        <w:tc>
-          <w:tcPr>
-            <w:tcW w:type="dxa" w:w="2524"/>
-          </w:tcPr>
-          <w:p>
-            <w:pPr>
-              <w:ind w:firstLine="0"/>
-              <w:jc w:val="center"/>
-            </w:pPr>
-            <w:r>
-              <w:rPr>
-                <w:rFonts w:ascii="Times New Roman" w:hAnsi="Times New Roman"/>
-                <w:sz w:val="16"/>
-              </w:rPr>
-              <w:t>0.556 ± 0.009</w:t>
-            </w:r>
-          </w:p>
-        </w:tc>
-      </w:tr>
-      <w:tr>
-        <w:tc>
-          <w:tcPr>
-            <w:tcW w:type="dxa" w:w="2524"/>
-          </w:tcPr>
-          <w:p>
-            <w:pPr>
-              <w:ind w:firstLine="0"/>
-              <w:jc w:val="left"/>
-            </w:pPr>
-            <w:r>
-              <w:rPr>
-                <w:rFonts w:ascii="Times New Roman" w:hAnsi="Times New Roman"/>
-                <w:sz w:val="16"/>
-              </w:rPr>
-              <w:t>Ridge stack, 4 bases</w:t>
-            </w:r>
-          </w:p>
-        </w:tc>
-        <w:tc>
-          <w:tcPr>
-            <w:tcW w:type="dxa" w:w="2524"/>
-          </w:tcPr>
-          <w:p>
-            <w:pPr>
-              <w:ind w:firstLine="0"/>
-              <w:jc w:val="center"/>
-            </w:pPr>
-            <w:r>
-              <w:rPr>
-                <w:rFonts w:ascii="Times New Roman" w:hAnsi="Times New Roman"/>
-                <w:sz w:val="16"/>
-              </w:rPr>
-              <w:t>0.935 ± 0.032</w:t>
-            </w:r>
-          </w:p>
-        </w:tc>
-        <w:tc>
-          <w:tcPr>
-            <w:tcW w:type="dxa" w:w="2524"/>
-          </w:tcPr>
-          <w:p>
-            <w:pPr>
-              <w:ind w:firstLine="0"/>
-              <w:jc w:val="center"/>
-            </w:pPr>
-            <w:r>
-              <w:rPr>
-                <w:rFonts w:ascii="Times New Roman" w:hAnsi="Times New Roman"/>
-                <w:sz w:val="16"/>
-              </w:rPr>
-              <w:t>0.706 ± 0.028</w:t>
-            </w:r>
-          </w:p>
-        </w:tc>
-        <w:tc>
-          <w:tcPr>
-            <w:tcW w:type="dxa" w:w="2524"/>
-          </w:tcPr>
-          <w:p>
-            <w:pPr>
-              <w:ind w:firstLine="0"/>
-              <w:jc w:val="center"/>
-            </w:pPr>
-            <w:r>
-              <w:rPr>
-                <w:rFonts w:ascii="Times New Roman" w:hAnsi="Times New Roman"/>
-                <w:sz w:val="16"/>
-              </w:rPr>
-              <w:t>0.577 ± 0.010</w:t>
-            </w:r>
-          </w:p>
-        </w:tc>
-      </w:tr>
-      <w:tr>
-        <w:tc>
-          <w:tcPr>
-            <w:tcW w:type="dxa" w:w="2524"/>
-          </w:tcPr>
-          <w:p>
-            <w:pPr>
-              <w:ind w:firstLine="0"/>
-              <w:jc w:val="left"/>
-            </w:pPr>
-            <w:r>
-              <w:rPr>
-                <w:rFonts w:ascii="Times New Roman" w:hAnsi="Times New Roman"/>
-                <w:sz w:val="16"/>
-              </w:rPr>
-              <w:t>SBERT + XGB, TPE^+</w:t>
-            </w:r>
-          </w:p>
-        </w:tc>
-        <w:tc>
-          <w:tcPr>
-            <w:tcW w:type="dxa" w:w="2524"/>
-          </w:tcPr>
-          <w:p>
-            <w:pPr>
-              <w:ind w:firstLine="0"/>
-              <w:jc w:val="center"/>
-            </w:pPr>
-            <w:r>
-              <w:rPr>
-                <w:rFonts w:ascii="Times New Roman" w:hAnsi="Times New Roman"/>
-                <w:sz w:val="16"/>
-              </w:rPr>
-              <w:t>0.966</w:t>
-            </w:r>
-          </w:p>
-        </w:tc>
-        <w:tc>
-          <w:tcPr>
-            <w:tcW w:type="dxa" w:w="2524"/>
-          </w:tcPr>
-          <w:p>
-            <w:pPr>
-              <w:ind w:firstLine="0"/>
-              <w:jc w:val="center"/>
-            </w:pPr>
-            <w:r>
-              <w:rPr>
-                <w:rFonts w:ascii="Times New Roman" w:hAnsi="Times New Roman"/>
-                <w:sz w:val="16"/>
-              </w:rPr>
-              <w:t>0.714</w:t>
-            </w:r>
-          </w:p>
-        </w:tc>
-        <w:tc>
-          <w:tcPr>
-            <w:tcW w:type="dxa" w:w="2524"/>
-          </w:tcPr>
-          <w:p>
-            <w:pPr>
-              <w:ind w:firstLine="0"/>
-              <w:jc w:val="center"/>
-            </w:pPr>
-            <w:r>
-              <w:rPr>
-                <w:rFonts w:ascii="Times New Roman" w:hAnsi="Times New Roman"/>
-                <w:sz w:val="16"/>
-              </w:rPr>
-              <w:t>0.581</w:t>
-            </w:r>
-          </w:p>
-        </w:tc>
-      </w:tr>
-      <w:tr>
-        <w:tc>
-          <w:tcPr>
-            <w:tcW w:type="dxa" w:w="2524"/>
-          </w:tcPr>
-          <w:p>
-            <w:pPr>
-              <w:ind w:firstLine="0"/>
-              <w:jc w:val="left"/>
-            </w:pPr>
-            <w:r>
-              <w:rPr>
-                <w:rFonts w:ascii="Times New Roman" w:hAnsi="Times New Roman"/>
-                <w:sz w:val="16"/>
-              </w:rPr>
-              <w:t>^+100 trials; single 80/20 split with bootstrap intervals, not 5-fold CV.</w:t>
-            </w:r>
-          </w:p>
-        </w:tc>
-        <w:tc>
-          <w:tcPr>
-            <w:tcW w:type="dxa" w:w="2524"/>
-          </w:tcPr>
-          <w:p>
-            <w:pPr>
-              <w:ind w:firstLine="0"/>
-              <w:jc w:val="center"/>
-            </w:pPr>
-            <w:r>
-              <w:rPr>
-                <w:rFonts w:ascii="Times New Roman" w:hAnsi="Times New Roman"/>
-                <w:sz w:val="16"/>
-              </w:rPr>
-            </w:r>
-          </w:p>
-        </w:tc>
-        <w:tc>
-          <w:tcPr>
-            <w:tcW w:type="dxa" w:w="2524"/>
-          </w:tcPr>
-          <w:p>
-            <w:pPr>
-              <w:ind w:firstLine="0"/>
-              <w:jc w:val="center"/>
-            </w:pPr>
-            <w:r>
-              <w:rPr>
-                <w:rFonts w:ascii="Times New Roman" w:hAnsi="Times New Roman"/>
-                <w:sz w:val="16"/>
-              </w:rPr>
-            </w:r>
-          </w:p>
-        </w:tc>
-        <w:tc>
-          <w:tcPr>
-            <w:tcW w:type="dxa" w:w="2524"/>
-          </w:tcPr>
-          <w:p>
-            <w:pPr>
-              <w:ind w:firstLine="0"/>
-              <w:jc w:val="center"/>
-            </w:pPr>
-            <w:r>
-              <w:rPr>
-                <w:rFonts w:ascii="Times New Roman" w:hAnsi="Times New Roman"/>
-                <w:sz w:val="16"/>
-              </w:rPr>
-            </w:r>
-          </w:p>
-        </w:tc>
-      </w:tr>
-    </w:tbl>
-    <w:p>
-      <w:pPr>
-        <w:spacing w:before="0" w:after="120"/>
-        <w:ind w:firstLine="0"/>
-      </w:pPr>
-      <w:r>
-        <w:rPr>
-          <w:b w:val="0"/>
-          <w:i w:val="0"/>
-          <w:sz w:val="12"/>
-        </w:rPr>
-      </w:r>
-    </w:p>
-    <w:p>
-      <w:pPr>
-        <w:spacing w:before="0" w:after="60"/>
-        <w:ind w:firstLine="288"/>
-      </w:pPr>
-      <w:r>
-        <w:rPr>
-          <w:b w:val="0"/>
-          <w:i w:val="0"/>
-          <w:sz w:val="20"/>
-        </w:rPr>
-        <w:t>The lexical and structural arms land within 0.007 R^2 of each other — 8,000 TF-IDF weights buy almost exactly what sixteen hand-counted statistics buy. The semantic arm beats the lexical one by DeltaMAE = 0.0514 [0.034, 0.067], p = 2.6×10^-5, a real but modest margin. Inverse-frequency sample weighting, applied in the original pipeline to compensate for the rating imbalance, hurts: removing it improves MAE by 0.0482 [0.039, 0.057] at p = 2.5×10^-26. The nested ridge stack improves on its own strongest base by DeltaMAE = 0.0134 [0.008, 0.019], p = 4.2×10^-6, and a 100-trial TPE search over the boosting head reaches test R^2 = 0.5811 [0.5471, 0.6182]. Both gains are real and both are small next to the 0.240 R^2 that separates the random and chronological protocols. Ensembling and tuning move the third decimal; the split moves the first.</w:t>
+        <w:t>The lexical control and the structural-feature model can be evaluated only under the random protocol on this corpus, because reconstructing either representation requires the raw script text; the figures below are from archived 5-fold runs over 5,195 records and are not comparable to Tables II– III. Structural OLS reaches R^2 = 0.440 ± 0.007 and TF-IDF+XGBoost 0.433 ± 0.014 — 8,000 TF-IDF weights buy almost exactly what sixteen hand-counted statistics buy. The semantic arm beats the lexical one by DeltaMAE = 0.0514 [0.034, 0.067], p = 2.6×10^-5, a real but modest margin. Inverse-frequency sample weighting, applied in the original pipeline to compensate for the rating imbalance, hurts: removing it improves MAE by 0.0482 [0.039, 0.057] at p = 2.5×10^-26. The nested ridge stack (R^2 = 0.577 ± 0.010) improves on its own strongest base by DeltaMAE = 0.0134 [0.008, 0.019], p = 4.2×10^-6, and a 100-trial TPE search on a single 80/20 split over the boosting head reaches test R^2 = 0.5811 [0.5471, 0.6182]. Both gains are real and both are small next to the 0.240 R^2 that separates the random and chronological protocols. Ensembling and tuning move the third decimal; the split moves the first.</w:t>
       </w:r>
     </w:p>
     <w:p>
@@ -5689,7 +4909,7 @@
           <w:i w:val="0"/>
           <w:sz w:val="20"/>
         </w:rPr>
-        <w:t>The holdout target is compressed relative to the training pool: standard deviation falls from 1.4619 to 1.1701, while the mean falls from 6.0119 to 5.7546. Part of the R^2 collapse is therefore arithmetic — the same absolute error against a narrower target yields a smaller R^2 — and part is genuine degradation. Mean absolute error separates them: it is 0.7276 under P1 and 0.7232 under P3, statistically indistinguishable. The model's typical error in rating points does not grow at all when it predicts the future. What collapses is how much of the (now narrower) variance it can order. Regressing prediction on truth over the holdout gives slope 0.4634 (s.e. 0.0278) and intercept 3.1745, against an ideal slope of 1. The system is heavily shrunk toward the centre — it identifies which films are above or below average and declines to commit to how far.</w:t>
+        <w:t>The holdout target is compressed relative to the training pool: standard deviation falls from 1.4619 to 1.1701, while the mean falls from 6.0119 to 5.7546. Part of the R^2 collapse is therefore arithmetic — the same absolute error against a narrower target yields a smaller R^2 — and part is genuine degradation. Mean absolute error separates them: it is 0.7276 under P1 and 0.7232 under P3, statistically indistinguishable. What collapses is how much of the (now narrower) variance it can order. Regressing prediction on truth over the holdout gives slope 0.4634 (s.e. 0.0278) and intercept 3.1745, against an ideal slope of 1. The system is heavily shrunk toward the centre — it identifies which films are above or below average and declines to commit to how far.</w:t>
       </w:r>
     </w:p>
     <w:p>
@@ -5732,7 +4952,7 @@
           <w:i w:val="0"/>
           <w:sz w:val="20"/>
         </w:rPr>
-        <w:t>In the shipped model's total split gain, the 384 embedding dimensions take 55.5%, the three metadata columns take 36.6%, and the sixteen structural statistics take 8.0%. Per dimension the picture inverts: the single largest embedding dimension contributes 1.68% and the mean dimension 0.14%, whereas movie_length alone contributes 25.50% and year 11.01%. One tabular column outweighs all sixteen structural statistics by a factor of three. Within the structural block the ordering is almost purely a size ordering: character, word, line, and sentence count occupy the top four positions, while the degenerate dialogue_density and unique_characters sit near the bottom; the model correctly declines to use them.</w:t>
+        <w:t>In the shipped model's total split gain, the 384 embedding dimensions take 55.5%, the three metadata columns take 36.6%, and the sixteen structural statistics take 8.0%. Per dimension the picture inverts: the single largest embedding dimension contributes 1.68% and the mean dimension 0.14%, whereas movie_length alone contributes 25.50% and year 11.01%. One tabular column outweighs all sixteen structural statistics by a factor of three.</w:t>
       </w:r>
     </w:p>
     <w:p>
@@ -5848,7 +5068,7 @@
           <w:i w:val="0"/>
           <w:sz w:val="20"/>
         </w:rPr>
-        <w:t>Runtime is the opposite case. It transfers cleanly, because a 130-minute film in 2023 occupies the same region of feature space as a 130-minute film in 1994, and it alone reproduces the predictive value of the entire semantic block. The embedding block carries real signal, but its per-dimension gain is flat — no dimension exceeds 1.7% — and Eq. (5) explains it: averaging 36 median unit-norm window embeddings drives the document vector toward the centroid of the corpus, damping precisely the localised evidence a human reader would use to judge a script. Combined with the 31.6% of tokens that truncation removes before pooling begins, that it still contributes as much as it does is the more surprising half of the result.</w:t>
+        <w:t>Runtime is the opposite case. It transfers cleanly, because a 130-minute film in 2023 occupies the same region of feature space as a 130-minute film in 1994, and it alone reproduces the predictive value of the entire semantic block. That the embedding block contributes as much as it does, after 31.6% truncation and the smoothing of Eq. (5), is the more surprising half of the result.</w:t>
       </w:r>
     </w:p>
     <w:p>
@@ -5877,63 +5097,7 @@
           <w:i w:val="0"/>
           <w:sz w:val="20"/>
         </w:rPr>
-        <w:t>Two arms are missing from the strict protocols. TF-IDF and the sixteen structural statistics require raw text and could therefore be evaluated only under P1. Restoring the corpus makes the full three-way comparison a single re-run of the released scripts.</w:t>
-      </w:r>
-    </w:p>
-    <w:p>
-      <w:pPr>
-        <w:spacing w:before="0" w:after="60"/>
-        <w:ind w:firstLine="288"/>
-      </w:pPr>
-      <w:r>
-        <w:rPr>
-          <w:b w:val="0"/>
-          <w:i w:val="0"/>
-          <w:sz w:val="20"/>
-        </w:rPr>
-        <w:t>Selection effects in IMSDb are severe and not correctable. Contributors upload what they value, so canonical and acclaimed films are over-represented among older titles. The corpus-wide mean rating falls monotonically from 7.87 in the 1920s to 5.48 in the 2010s, which is a statement about who uploads what, not about film quality. Any model reading year learns this curation artifact, and P3 is the protocol that refuses to reward it.</w:t>
-      </w:r>
-    </w:p>
-    <w:p>
-      <w:pPr>
-        <w:spacing w:before="0" w:after="60"/>
-        <w:ind w:firstLine="288"/>
-      </w:pPr>
-      <w:r>
-        <w:rPr>
-          <w:b w:val="0"/>
-          <w:i w:val="0"/>
-          <w:sz w:val="20"/>
-        </w:rPr>
-        <w:t>The holdout is one window. A single 2020–2025 test period of 515 films cannot separate a general temporal-decay law from the particulars of those six years. Rolling-origin evaluation over several cut years would estimate the decay rate; we report one cut.</w:t>
-      </w:r>
-    </w:p>
-    <w:p>
-      <w:pPr>
-        <w:spacing w:before="0" w:after="60"/>
-        <w:ind w:firstLine="288"/>
-      </w:pPr>
-      <w:r>
-        <w:rPr>
-          <w:b w:val="0"/>
-          <w:i w:val="0"/>
-          <w:sz w:val="20"/>
-        </w:rPr>
-        <w:t>The strongest transferring feature is unavailable at deployment. A screenplay-stage predictor does not know the runtime, because the film has not been cut — or shot. Page count is a legitimate pre-production proxy for runtime and is recoverable from the script; we did not evaluate it.</w:t>
-      </w:r>
-    </w:p>
-    <w:p>
-      <w:pPr>
-        <w:spacing w:before="0" w:after="60"/>
-        <w:ind w:firstLine="288"/>
-      </w:pPr>
-      <w:r>
-        <w:rPr>
-          <w:b w:val="0"/>
-          <w:i w:val="0"/>
-          <w:sz w:val="20"/>
-        </w:rPr>
-        <w:t>Single encoder, single pooling. We audit mean-pooled all-MiniLM-L6-v2. Larger encoders, learned pooling, and token-aligned windows are all plausible improvements, and none is evaluated here; holding the representation fixed is what makes the protocol comparison clean.</w:t>
+        <w:t>TF-IDF and the structural statistics require raw text and were evaluated only under P1. Selection effects in IMSDb are severe and not correctable: the mean rating falls monotonically from 7.87 in the 1920s to 5.48 in the 2010s, which is a statement about who uploads what, not about film quality, and P3 is the protocol that refuses to reward it. The holdout is one window; rolling-origin evaluation would estimate the decay rate. A screenplay-stage predictor does not know the runtime, because the film has not been cut — or shot. Finally, we audit only mean-pooled all-MiniLM-L6-v2; holding the representation fixed is what makes the protocol comparison clean.</w:t>
       </w:r>
     </w:p>
     <w:p>
@@ -5991,7 +5155,7 @@
           <w:i w:val="0"/>
           <w:sz w:val="20"/>
         </w:rPr>
-        <w:t>The audit, alignment-recovery, evaluation, and figure code are released with the paper (audit_corpus.py, recover_alignment.py, audit_tokens.py, leakage_eval.py, analysis_xai.py, make_paper_figures.py). Every number is regenerated from the committed JSON artifacts in results/. The random seed is 42 throughout.</w:t>
+        <w:t>All audit and evaluation code is released with the paper; every number is regenerated from the committed JSON artifacts. The random seed is 42 throughout.</w:t>
       </w:r>
     </w:p>
     <w:p>

</xml_diff>

<commit_message>
docs(paper): update IEEE 6-page paper manuscript and compiled PDF
</commit_message>
<xml_diff>
--- a/paper/IEEE 6 pages.docx
+++ b/paper/IEEE 6 pages.docx
@@ -62,7 +62,7 @@
           <w:i w:val="0"/>
           <w:sz w:val="18"/>
         </w:rPr>
-        <w:t xml:space="preserve">Screenplay-to-rating regression is usually reported on a random split of an archival corpus. We argue that this number is not the number a reader wants, and we measure the gap. Working from a corpus of 5,204 IMSDb screenplays joined to IMDb metadata, we first run a record-identity audit and publish the resulting exclusion ledger, which retains 5,164 records. We then quantify a defect that is invisible at the API surface: the pipeline slides a 256-word window over each script, but the encoder admits only 254 WordPiece tokens, so 98.45% of windows are cut and 31.60% of all tokens never reach the model. Finally we evaluate identical representations and learners under three partitions — random </w:t>
+        <w:t xml:space="preserve">Most screenplay-to-rating studies report accuracy on a random split of an archival corpus. We ask how much of that accuracy survives a stricter split. Our corpus joins 5,204 IMSDb screenplays to IMDb metadata; after an identity audit we keep 5,164 records and publish the exclusion ledger. We also find a silent truncation defect: scripts are cut into 256-word windows, but the encoder takes at most 254 WordPiece tokens, so on 1,186 scripts recovered from the project history 98.4% of windows overflow and 31.9% of tokens are lost. Keeping representation and learner fixed, we change only the partition: random </w:t>
       </w:r>
       <m:oMath>
         <m:r>
@@ -78,7 +78,7 @@
           <w:i w:val="0"/>
           <w:sz w:val="18"/>
         </w:rPr>
-        <w:t xml:space="preserve">-fold, title-family GroupKFold, and a chronological 2020–2025 holdout. The best system reports </w:t>
+        <w:t xml:space="preserve">-fold, title-family GroupKFold, and a chronological 2020–2025 holdout. The best system, which adds runtime and release year to the sentence embeddings, scores </w:t>
       </w:r>
       <m:oMath>
         <m:sSup>
@@ -121,65 +121,7 @@
           <w:i w:val="0"/>
           <w:sz w:val="18"/>
         </w:rPr>
-        <w:t xml:space="preserve"> under random folds, 0.536 once franchises are held together, and 0.309 when the test set lies in the future. Release year and decade, which jointly supply 36.6% of in-sample split gain, contribute exactly </w:t>
-      </w:r>
-      <m:oMath>
-        <m:r>
-          <w:rPr>
-            <w:sz w:val="18"/>
-          </w:rPr>
-          <m:t>Δ</m:t>
-        </m:r>
-        <m:r>
-          <m:rPr>
-            <m:sty m:val="p"/>
-          </m:rPr>
-          <w:rPr>
-            <w:sz w:val="18"/>
-          </w:rPr>
-          <m:t>M</m:t>
-        </m:r>
-        <m:r>
-          <m:rPr>
-            <m:sty m:val="p"/>
-          </m:rPr>
-          <w:rPr>
-            <w:sz w:val="18"/>
-          </w:rPr>
-          <m:t>A</m:t>
-        </m:r>
-        <m:r>
-          <m:rPr>
-            <m:sty m:val="p"/>
-          </m:rPr>
-          <w:rPr>
-            <w:sz w:val="18"/>
-          </w:rPr>
-          <m:t>E</m:t>
-        </m:r>
-        <m:r>
-          <m:rPr>
-            <m:sty m:val="p"/>
-          </m:rPr>
-          <w:rPr>
-            <w:sz w:val="18"/>
-          </w:rPr>
-          <m:t>=</m:t>
-        </m:r>
-        <m:r>
-          <w:rPr>
-            <w:sz w:val="18"/>
-          </w:rPr>
-          <m:t>0.000</m:t>
-        </m:r>
-      </m:oMath>
-      <w:r>
-        <w:rPr>
-          <w:b/>
-          <w:i w:val="0"/>
-          <w:sz w:val="18"/>
-        </w:rPr>
-        <w:t xml:space="preserve"> once the test years fall outside the training range, while runtime alone (+0.199) matches the entire 384-dimensional sentence-embedding block (+0.195). Semantic embeddings survive the strict split; the calendar confound does not.</w:t>
+        <w:t>, 0.536 and 0.309 under the three protocols; a text-only model usable before a film exists scores 0.424, 0.411 and 0.267. Release year and decade hold 11.1% of in-sample split gain yet leave holdout MAE exactly unchanged, and trained the same way, sentence embeddings do no better than TF-IDF. The protocol explains more of the spread in reported accuracy than the model does.</w:t>
       </w:r>
     </w:p>
     <w:p>
@@ -231,7 +173,7 @@
           <w:i w:val="0"/>
           <w:sz w:val="20"/>
         </w:rPr>
-        <w:t>A feature-film screenplay runs to roughly 25,000 words. Sentence encoders read 256 tokens. The usual answer — slide a window, embed each window, average the results — is cheap and widely used. What is far less often examined is whether the evaluation wrapped around that pipeline measures anything a practitioner could rely on, because an archival screenplay corpus assembled from a community repository carries two structural hazards that a shuffled train/test split will silently convert into apparent skill.</w:t>
+        <w:t>Screenplays are long. The raw scripts in our corpus run to about 9,900 words on average, while an encoder such as all-MiniLM-L6-v2 reads no more than 256 tokens at a time. The usual fix, cheap and common, is to slice each script into overlapping windows, embed them one by one, and average the vectors. Less attention goes to whether the evaluation around it yields a number a practitioner should trust. Corpora built from community archives have two quirks that a shuffled split quietly rewards.</w:t>
       </w:r>
     </w:p>
     <w:p>
@@ -245,7 +187,7 @@
           <w:i w:val="0"/>
           <w:sz w:val="20"/>
         </w:rPr>
-        <w:t>The first hazard is duplication. Franchises share vocabulary and structure across installments, and remakes reuse plot and dialogue wholesale. Under a random partition, a near-copy in the training set makes its twin in the test set trivially predictable. The second hazard is time. A model given a release-year feature can recover a large share of target variance from the calendar alone, without reading a single line of dialogue. That shortcut evaporates the moment the test films are drawn from years the model never saw, which is the only setting in which a screenplay-stage predictor would actually be deployed.</w:t>
+        <w:t>Duplication is the first. A sequel borrows the vocabulary and structure of the film before it, and a remake can reuse whole stretches of plot and dialogue; if one sits in training and the other in test, the test film is easier than it looks. Time is the second. Older films in the archive carry higher ratings on average, so a model that knows the release year can explain a good part of the rating from the calendar alone. Once the test films come from years the model never saw, which is exactly where a screenplay-stage predictor operates, that advantage is gone.</w:t>
       </w:r>
     </w:p>
     <w:p>
@@ -259,7 +201,7 @@
           <w:i w:val="0"/>
           <w:sz w:val="20"/>
         </w:rPr>
-        <w:t>Layered underneath both is a quieter defect: chunking is almost always specified in words; truncation always happens in subword tokens, and nobody is told when the budget is exceeded. This paper is an audit, not a leaderboard entry. We take an existing SBERT-plus-gradient-boosting pipeline and ask what its reported performance is actually made of. Three contributions follow.</w:t>
+        <w:t>Under both sits a smaller, more technical problem. Window length is set in words, truncation happens in subword tokens, and none of the libraries involved warns when the token budget overflows. We therefore audit an existing SBERT-plus-gradient-boosting pipeline rather than propose a new model, and make three contributions.</w:t>
       </w:r>
     </w:p>
     <w:p>
@@ -278,7 +220,7 @@
         </w:rPr>
         <w:t>•</w:t>
         <w:tab/>
-        <w:t>C1 — A record-identity protocol and its exclusion ledger. We define film identity through four keys — content SHA-256 digest, IMDb identifier, title</w:t>
+        <w:t>C1: a record-identity protocol and a published exclusion ledger. Identity is checked against four keys (SHA-256 content digest, IMDb identifier, title</w:t>
       </w:r>
       <m:oMath>
         <m:r>
@@ -297,7 +239,7 @@
           <w:i w:val="0"/>
           <w:sz w:val="20"/>
         </w:rPr>
-        <w:t>year, and a normalised title-family stem — audit all 5,204 joined records against each, and report every exclusion (Section III).</w:t>
+        <w:t>year, and a normalised title-family stem), and every excluded record is accounted for (Section III).</w:t>
       </w:r>
     </w:p>
     <w:p>
@@ -316,7 +258,7 @@
         </w:rPr>
         <w:t>•</w:t>
         <w:tab/>
-        <w:t>C2 — A measurement of silent truncation. Running the encoder's own tokeniser over the pipeline's own windows, we find that 98.45% of 256-word windows exceed the 254-token content budget and that 31.60% of WordPiece tokens are discarded before the encoder sees them (Section IV-B).</w:t>
+        <w:t>C2: a measurement of silent truncation. We run the encoder's own tokeniser over the pipeline's windows for 1,186 recovered scripts: 98.4% of the 256-word windows exceed the 254-token budget, and 31.9% of WordPiece tokens never reach the encoder (Section IV-B).</w:t>
       </w:r>
     </w:p>
     <w:p>
@@ -335,7 +277,7 @@
         </w:rPr>
         <w:t>•</w:t>
         <w:tab/>
-        <w:t xml:space="preserve">C3 — A three-protocol evaluation with paired inference. Holding representation and learner fixed, we vary only the partition: random </w:t>
+        <w:t xml:space="preserve">C3: a three-protocol evaluation with paired inference. Representation and learner stay fixed and only the partition changes: random </w:t>
       </w:r>
       <m:oMath>
         <m:r>
@@ -351,7 +293,7 @@
           <w:i w:val="0"/>
           <w:sz w:val="20"/>
         </w:rPr>
-        <w:t>-fold, title-family GroupKFold, and a chronological 2020–2025 holdout. We report bootstrap intervals, paired Wilcoxon signed-rank tests with matched-pairs effect sizes, and a block-permutation attribution that isolates which feature families survive temporal extrapolation (Sections V and VI).</w:t>
+        <w:t>-fold, title-family GroupKFold, and a chronological 2020–2025 holdout. We give bootstrap intervals, paired Wilcoxon tests with effect sizes, a block-permutation analysis of which features still help on future films, and a like-for-like comparison of sentence embeddings against TF-IDF (Sections V and VI).</w:t>
       </w:r>
     </w:p>
     <w:p>
@@ -365,7 +307,7 @@
           <w:i w:val="0"/>
           <w:sz w:val="20"/>
         </w:rPr>
-        <w:t xml:space="preserve">We do not claim a new state of the art. We claim that the difference between </w:t>
+        <w:t xml:space="preserve">We are not claiming a new state of the art. Our main result is the distance between </w:t>
       </w:r>
       <m:oMath>
         <m:sSup>
@@ -451,7 +393,7 @@
           <w:i w:val="0"/>
           <w:sz w:val="20"/>
         </w:rPr>
-        <w:t xml:space="preserve"> on the same corpus, the same features, and the same learner is the finding.</w:t>
+        <w:t xml:space="preserve"> on the same corpus, features and learner, and the further fall to 0.267 once post-production features are removed.</w:t>
       </w:r>
     </w:p>
     <w:p>
@@ -482,7 +424,7 @@
           <w:i w:val="0"/>
           <w:sz w:val="20"/>
         </w:rPr>
-        <w:t>Screenplays and film outcomes. Early work treated the script as a feature source for commercial forecasting, predicting return on investment or box-office revenue from genre, content, and semantic descriptors [3, 4]. A second strand reads narrative structure rather than commercial outcome: emotional arc shapes [5, 9], character portrayal [6], MPAA age-suitability and severity rating [7, 25, 8], and tag assignment from plot synopses [26]. Screenplay quality assessment in the awards-nomination framing [27] is the closest analogue to rating regression, and it shares our target's central difficulty: the label is an aggregate social judgement, only partly a function of the text. Outside the script itself, forecasting has drawn on production metadata [10], social-media and Wikipedia activity [15, 16, 17, 18], trailer content [11], and review sentiment [13, 22]; IMDb rating regression from tabular and textual metadata is by now a standard applied exercise [12, 20, 21, 23, 24]. The reported figures span a wide range, and the partitions behind them are rarely specified beyond a random seed. Vogel's industry account [19] is a useful corrective on the ceiling: theatrical outcomes are dominated by release strategy, competition, and marketing spend, none of which is legible in the script.</w:t>
+        <w:t>Screenplays and film outcomes. Scripts were first used as inputs for forecasting return on investment and box-office revenue [1, 2]. Later studies turned to narrative structure: emotional arcs [3, 4], how characters are portrayed [5], MPAA age suitability and content severity [6, 7, 8], and tags inferred from plot synopses [9]. Closest to rating regression is predicting award nominations from the script [10], which shares its difficulty: the label is a collective judgement that the text explains only in part. Outside the script, forecasters have used production metadata [11], social-media and Wikipedia activity [12, 13, 14, 15], trailers [16], and the sentiment of reviews or tweets [17, 18]. Predicting ratings or success from tabular metadata is a routine applied exercise [19, 20, 21, 22, 23], yet papers rarely describe their partitions beyond a random seed. Vogel [24] points out that theatrical results hinge on release strategy, competition and marketing, and none of these appears in a script.</w:t>
       </w:r>
     </w:p>
     <w:p>
@@ -496,7 +438,7 @@
           <w:i w:val="0"/>
           <w:sz w:val="20"/>
         </w:rPr>
-        <w:t>Representations for long documents. Sentence-BERT [2] produces dense sentence-level embeddings from a Siamese objective and is the encoder we audit. Its native context is short, so document-level use requires either hierarchical attention [14], sparse attention over longer sequences [1], or chunk-and-pool aggregation. Chunk-and-pool is the pragmatic default: it needs no fine-tuning, runs on CPU, and scales linearly. Its cost is that the aggregation function is fixed rather than learned, and — as we measure in Section IV-B — that the chunk boundary is usually specified in a unit the encoder does not use.</w:t>
+        <w:t>Representations for long documents. Sentence-BERT [25] learns dense sentence embeddings with a Siamese objective; it is the encoder we audit. Its context window is short, so working at document level means hierarchical attention [26], sparse attention [27], or chunking and pooling. Chunk-and-pool needs no fine-tuning and runs on a CPU, but its pooling is fixed rather than learned and, as Section IV-B shows, its window length is often given in a unit the encoder does not count in.</w:t>
       </w:r>
     </w:p>
     <w:p>
@@ -510,7 +452,7 @@
           <w:i w:val="0"/>
           <w:sz w:val="20"/>
         </w:rPr>
-        <w:t>Leakage and split design. The methodological literature we lean on is not about films. System rankings reorder under alternative random splits, and split designs should stress the generalisation actually claimed [28, 29]; train–test overlap has been measured and formalised for NLP benchmarks [30, 31], and leakage taxonomies across disciplines argue for pre-registration of the split [32]. Temporal generalisation has its own line [33], as does documentation of corpus provenance [34, 35]. Applying these instruments to a screenplay corpus is, to our knowledge, new.</w:t>
+        <w:t>Leakage and split design. System rankings can flip under a different random split, and a split should test the kind of generalisation a paper claims [28, 29]. Train–test overlap has been quantified for NLP benchmarks [30, 31], a cross-disciplinary survey lists the main forms of leakage [32], and temporal generalisation [33] and corpus documentation [34, 35] each have a literature of their own. As far as we know, none of this has been applied to a screenplay corpus.</w:t>
       </w:r>
     </w:p>
     <w:p>
@@ -556,7 +498,7 @@
           <w:i w:val="0"/>
           <w:sz w:val="20"/>
         </w:rPr>
-        <w:t>The corpus joins full screenplay texts scraped from the Internet Movie Script Database (IMSDb) to IMDb metadata on a per-film basis. Each of the 5,204 joined records carries a title, release year, decade bin, IMDb identifier, runtime in minutes, an IMDb rating on the 1.0–10.0 scale at one-decimal resolution, and a path to the script file. Ratings have mean 5.98, median 5.80, and standard deviation 1.44.</w:t>
+        <w:t>The corpus links full screenplays from the Internet Movie Script Database (IMSDb), which several contributors compiled by hand, to IMDb metadata. Each of the 5,204 joined records has a title, release year, decade label, IMDb identifier, runtime, an IMDb rating between 1.0 and 10.0, and a path to the script file. Ratings have mean 5.98, median 5.80 and standard deviation 1.44. When the archived pipeline ran, every text was on disk; the current snapshot ships only 356 of them. Searching the repository history brought back 1,186 files: 1,177 joined records and nine files the metadata never references. They come from one contiguous block of the rating-ordered file list, so although they span release years 1958–2025, their ratings all lie between 5.0 and 5.7. Any analysis that needs raw text is limited to this subset.</w:t>
       </w:r>
     </w:p>
     <w:p>
@@ -570,23 +512,7 @@
           <w:i w:val="0"/>
           <w:sz w:val="20"/>
         </w:rPr>
-        <w:t xml:space="preserve">Deduplication is only as good as the notion of identity behind it, so we audit four keys of decreasing strictness. Content digest: for a script file with byte content </w:t>
-      </w:r>
-      <m:oMath>
-        <m:r>
-          <w:rPr>
-            <w:sz w:val="20"/>
-          </w:rPr>
-          <m:t>b</m:t>
-        </m:r>
-      </m:oMath>
-      <w:r>
-        <w:rPr>
-          <w:b w:val="0"/>
-          <w:i w:val="0"/>
-          <w:sz w:val="20"/>
-        </w:rPr>
-        <w:t xml:space="preserve">, the key is </w:t>
+        <w:t xml:space="preserve">We check four identity keys, from strictest to loosest. The content digest </w:t>
       </w:r>
       <m:oMath>
         <m:r>
@@ -648,7 +574,23 @@
           <w:i w:val="0"/>
           <w:sz w:val="20"/>
         </w:rPr>
-        <w:t>, which catches the re-upload-under-a-new-name case that no metadata key can see; collisions are resolved by retaining the earliest record in load order. IMDb identifier: the canonical film key. Title</w:t>
+        <w:t xml:space="preserve"> of a file with bytes </w:t>
+      </w:r>
+      <m:oMath>
+        <m:r>
+          <w:rPr>
+            <w:sz w:val="20"/>
+          </w:rPr>
+          <m:t>b</m:t>
+        </m:r>
+      </m:oMath>
+      <w:r>
+        <w:rPr>
+          <w:b w:val="0"/>
+          <w:i w:val="0"/>
+          <w:sz w:val="20"/>
+        </w:rPr>
+        <w:t xml:space="preserve"> catches the same script re-uploaded under a new name, which no metadata key would notice; when two files collide we keep whichever loaded first. The IMDb identifier is the canonical film key. Title</w:t>
       </w:r>
       <m:oMath>
         <m:r>
@@ -667,7 +609,7 @@
           <w:i w:val="0"/>
           <w:sz w:val="20"/>
         </w:rPr>
-        <w:t xml:space="preserve">year: a fallback for records whose identifier is missing or malformed. Title family: the loosest key, and the one that matters for split design. We normalise a title </w:t>
+        <w:t xml:space="preserve">year is a fallback for records whose identifier is missing or malformed. The title family is the loosest key and the one that matters for splitting. To build it we case-fold the title </w:t>
       </w:r>
       <m:oMath>
         <m:r>
@@ -683,7 +625,7 @@
           <w:i w:val="0"/>
           <w:sz w:val="20"/>
         </w:rPr>
-        <w:t xml:space="preserve"> by case-folding, stripping non-alphanumeric characters, removing a leading article, and iteratively deleting a trailing sequel marker — an Arabic numeral, a Roman numeral up to </w:t>
+        <w:t xml:space="preserve">, strip non-alphanumeric characters, drop a leading article, and keep deleting trailing sequel markers (an Arabic numeral, a Roman numeral up to </w:t>
       </w:r>
       <m:oMath>
         <m:r>
@@ -702,7 +644,7 @@
           <w:i w:val="0"/>
           <w:sz w:val="20"/>
         </w:rPr>
-        <w:t xml:space="preserve">, or a part </w:t>
+        <w:t xml:space="preserve">, or part </w:t>
       </w:r>
       <m:oMath>
         <m:r>
@@ -718,7 +660,7 @@
           <w:i w:val="0"/>
           <w:sz w:val="20"/>
         </w:rPr>
-        <w:t xml:space="preserve"> construction — to a fixed point. Toy Story and Toy Story 2 therefore map to the single family toy story, the grouping variable for Section IV-D.</w:t>
+        <w:t>) until nothing changes. Toy Story and Toy Story 2 both end up in the family toy story, the grouping variable of Section IV-D.</w:t>
       </w:r>
     </w:p>
     <w:p>
@@ -2171,7 +2113,39 @@
           <w:i w:val="0"/>
           <w:sz w:val="20"/>
         </w:rPr>
-        <w:t>The second arrow is an identity map on the subset over which the digest could be evaluated, not a corpus-wide null result: content hashing requires the raw text, and 356 of the 5,204 files are distributed with the code. The metadata keys, computable for all records, bound — without eliminating — the residual duplication that a full-corpus pass could still uncover.</w:t>
+        <w:t xml:space="preserve">On the 1,186 recovered files the digest finds two duplicate groups; in both, the second copy is one of the nine unreferenced files, so no joined record is lost. The check covers 1,177 of the 5,204 records (22.6%). The metadata keys can be computed for every record; they bound the remaining duplication but cannot rule it out. The length filter </w:t>
+      </w:r>
+      <m:oMath>
+        <m:sSub>
+          <m:e>
+            <m:r>
+              <w:rPr>
+                <w:sz w:val="20"/>
+              </w:rPr>
+              <m:t>π</m:t>
+            </m:r>
+          </m:e>
+          <m:sub>
+            <m:r>
+              <m:rPr>
+                <m:nor/>
+                <m:sty m:val="p"/>
+              </m:rPr>
+              <w:rPr>
+                <w:sz w:val="20"/>
+              </w:rPr>
+              <m:t>len</m:t>
+            </m:r>
+          </m:sub>
+        </m:sSub>
+      </m:oMath>
+      <w:r>
+        <w:rPr>
+          <w:b w:val="0"/>
+          <w:i w:val="0"/>
+          <w:sz w:val="20"/>
+        </w:rPr>
+        <w:t xml:space="preserve"> was applied when the archived pipeline ran, while every text was still available.</w:t>
       </w:r>
     </w:p>
     <w:p>
@@ -2238,14 +2212,14 @@
         <w:tblLook w:firstColumn="1" w:firstRow="1" w:lastColumn="0" w:lastRow="0" w:noHBand="0" w:noVBand="1" w:val="04A0"/>
       </w:tblPr>
       <w:tblGrid>
-        <w:gridCol w:w="3298"/>
+        <w:gridCol w:w="3223"/>
         <w:gridCol w:w="1117"/>
         <w:gridCol w:w="591"/>
       </w:tblGrid>
       <w:tr>
         <w:tc>
           <w:tcPr>
-            <w:tcW w:type="dxa" w:w="3298"/>
+            <w:tcW w:type="dxa" w:w="3223"/>
             <w:tcBorders>
               <w:bottom w:val="single" w:sz="4" w:space="0" w:color="000000"/>
             </w:tcBorders>
@@ -2319,7 +2293,7 @@
       <w:tr>
         <w:tc>
           <w:tcPr>
-            <w:tcW w:type="dxa" w:w="3298"/>
+            <w:tcW w:type="dxa" w:w="3223"/>
           </w:tcPr>
           <w:p>
             <w:pPr>
@@ -2404,7 +2378,7 @@
       <w:tr>
         <w:tc>
           <w:tcPr>
-            <w:tcW w:type="dxa" w:w="3298"/>
+            <w:tcW w:type="dxa" w:w="3223"/>
           </w:tcPr>
           <w:p>
             <w:pPr>
@@ -2469,7 +2443,7 @@
       <w:tr>
         <w:tc>
           <w:tcPr>
-            <w:tcW w:type="dxa" w:w="3298"/>
+            <w:tcW w:type="dxa" w:w="3223"/>
           </w:tcPr>
           <w:p>
             <w:pPr>
@@ -2554,7 +2528,7 @@
       <w:tr>
         <w:tc>
           <w:tcPr>
-            <w:tcW w:type="dxa" w:w="3298"/>
+            <w:tcW w:type="dxa" w:w="3223"/>
           </w:tcPr>
           <w:p>
             <w:pPr>
@@ -2619,7 +2593,7 @@
       <w:tr>
         <w:tc>
           <w:tcPr>
-            <w:tcW w:type="dxa" w:w="3298"/>
+            <w:tcW w:type="dxa" w:w="3223"/>
           </w:tcPr>
           <w:p>
             <w:pPr>
@@ -2634,7 +2608,7 @@
                 <w:i w:val="0"/>
                 <w:sz w:val="16"/>
               </w:rPr>
-              <w:t>SHA-256 duplicate digests (audited subset)</w:t>
+              <w:t>SHA-256 duplicate digests (1,177 rec.)</w:t>
             </w:r>
           </w:p>
         </w:tc>
@@ -2684,7 +2658,7 @@
       <w:tr>
         <w:tc>
           <w:tcPr>
-            <w:tcW w:type="dxa" w:w="3298"/>
+            <w:tcW w:type="dxa" w:w="3223"/>
           </w:tcPr>
           <w:p>
             <w:pPr>
@@ -2790,7 +2764,7 @@
       <w:tr>
         <w:tc>
           <w:tcPr>
-            <w:tcW w:type="dxa" w:w="3298"/>
+            <w:tcW w:type="dxa" w:w="3223"/>
           </w:tcPr>
           <w:p>
             <w:pPr>
@@ -2855,7 +2829,7 @@
       <w:tr>
         <w:tc>
           <w:tcPr>
-            <w:tcW w:type="dxa" w:w="3298"/>
+            <w:tcW w:type="dxa" w:w="3223"/>
           </w:tcPr>
           <w:p>
             <w:pPr>
@@ -2920,7 +2894,7 @@
       <w:tr>
         <w:tc>
           <w:tcPr>
-            <w:tcW w:type="dxa" w:w="3298"/>
+            <w:tcW w:type="dxa" w:w="3223"/>
           </w:tcPr>
           <w:p>
             <w:pPr>
@@ -2985,7 +2959,7 @@
       <w:tr>
         <w:tc>
           <w:tcPr>
-            <w:tcW w:type="dxa" w:w="3298"/>
+            <w:tcW w:type="dxa" w:w="3223"/>
           </w:tcPr>
           <w:p>
             <w:pPr>
@@ -3065,7 +3039,7 @@
           <w:i w:val="0"/>
           <w:sz w:val="20"/>
         </w:rPr>
-        <w:t>Table I is the full ledger for the flow of Section III-B. All 5,204 identifiers are distinct and no title</w:t>
+        <w:t>Table I gives the complete ledger for the flow in Section III-B. The 5,204 identifiers are all distinct and no title</w:t>
       </w:r>
       <m:oMath>
         <m:r>
@@ -3084,7 +3058,7 @@
           <w:i w:val="0"/>
           <w:sz w:val="20"/>
         </w:rPr>
-        <w:t>year pair repeats. This is a genuinely clean join, and it means the leakage channel in this corpus is not naive record duplication. Eighty titles appear more than once, spanning 165 records, but every collision pairs distinct identifiers and distinct years — these are remakes and same-title unrelated films, not duplicates. We retain them in a shared family. Four records carry release years of 1080 or 1088, transparently mis-typed 1980 and 1988; we drop them rather than silently repair them. The derived decade column is worse: the shipped label encoder holds 14 decade strings, among them 1080s and 1996s, encoded as an ordinal integer.</w:t>
+        <w:t>year pair occurs twice, so the join itself is clean and leakage here does not come from plain duplicate records. Eighty titles occur more than once (165 records), but each collision involves different identifiers and different years: these are remakes, or unrelated films that share a title, not copies, so they stay in the corpus as one family. Four records list release years of 1080 or 1088, obvious typos for 1980 and 1988; we remove them instead of guessing a repair. The derived decade column is in worse shape. The shipped label encoder knows 14 decade strings, 1080s and 1996s among them, and turns them into an ordinal integer.</w:t>
       </w:r>
     </w:p>
     <w:p>
@@ -3098,7 +3072,7 @@
           <w:i w:val="0"/>
           <w:sz w:val="20"/>
         </w:rPr>
-        <w:t xml:space="preserve">Twenty-seven further records are excluded for a reproducibility reason. The archived embedding matrix stores rows in loader order without a record key, so row </w:t>
+        <w:t xml:space="preserve">We exclude 27 more records for reproducibility reasons. The archived embedding matrix stores rows in loader order with no record key, so row </w:t>
       </w:r>
       <m:oMath>
         <m:r>
@@ -3114,7 +3088,7 @@
           <w:i w:val="0"/>
           <w:sz w:val="20"/>
         </w:rPr>
-        <w:t xml:space="preserve"> of the matrix is not record </w:t>
+        <w:t xml:space="preserve"> of the matrix need not be record </w:t>
       </w:r>
       <m:oMath>
         <m:r>
@@ -3130,7 +3104,7 @@
           <w:i w:val="0"/>
           <w:sz w:val="20"/>
         </w:rPr>
-        <w:t xml:space="preserve"> of the spreadsheet. We reconstruct the offset function from 1,559 anchors in the committed split bookkeeping; twenty-seven positions inside the reconstruction gaps admit more than one consistent assignment, and we drop them rather than guess.</w:t>
+        <w:t xml:space="preserve"> of the spreadsheet. We rebuilt the offset function from 1,559 anchors in the committed split bookkeeping. Inside the gaps of that reconstruction, 27 positions fit more than one assignment, and we drop them rather than guess.</w:t>
       </w:r>
     </w:p>
     <w:p>
@@ -3176,7 +3150,7 @@
           <w:i w:val="0"/>
           <w:sz w:val="20"/>
         </w:rPr>
-        <w:t>Sixteen statistics are computed from the raw, uncleaned script text: six size measures (char_count, word_count, line_count, sentence_count, scene_count, words_per_scene); three describing lexical sophistication (avg_word_length, unique_word_ratio, long_word_ratio); two describing sentence geometry (avg_sentence_length, sentence_length_std); two describing dialogue (dialogue_density, the share of lines that match an ALL-CAPS speaker-cue pattern, and unique_characters); two emotional proxies (exclamation_ratio, question_ratio); and one stage-direction proxy (action_density). Two of the sixteen are close to degenerate on this corpus. Mean dialogue_density is 0.0087 with standard deviation 0.0361, and mean unique_characters is 3.41. A feature film does not have three speaking parts. The speaker-cue regular expression assumes a NAME: convention that most IMSDb transcripts do not follow, so both features encode transcription format rather than dramaturgy.</w:t>
+        <w:t>Sixteen statistics are computed from the raw, uncleaned script text: six size measures (char_count, word_count, line_count, sentence_count, scene_count, words_per_scene); three describing lexical sophistication (avg_word_length, unique_word_ratio, long_word_ratio); two describing sentence geometry (avg_sentence_length, sentence_length_std); two describing dialogue (dialogue_density, the share of lines that match an ALL-CAPS speaker-cue pattern, and unique_characters); two emotional proxies (exclamation_ratio, question_ratio); and one stage-direction proxy (action_density). Two of the sixteen are close to degenerate on this corpus. Mean dialogue_density is 0.0087 with standard deviation 0.0361, and mean unique_characters is 3.41. A feature film has far more than three speaking parts. The speaker-cue regular expression assumes a NAME: convention that most IMSDb transcripts do not follow, so both features encode transcription format rather than dramaturgy.</w:t>
       </w:r>
     </w:p>
     <w:p>
@@ -4734,7 +4708,7 @@
           <w:i w:val="0"/>
           <w:sz w:val="20"/>
         </w:rPr>
-        <w:t xml:space="preserve"> as they decorrelate. With a median of 36 windows per script, no scene survives pooling as a distinguishable signal.</w:t>
+        <w:t xml:space="preserve"> as they decorrelate. With a median of 33 windows per recovered script, any single scene has little influence on the pooled vector.</w:t>
       </w:r>
     </w:p>
     <w:p>
@@ -5326,7 +5300,7 @@
           <w:i w:val="0"/>
           <w:sz w:val="20"/>
         </w:rPr>
-        <w:t xml:space="preserve">Running the encoder's own tokeniser over the pipeline's own windows on the 356 available scripts yields 14,558 windows with median length 371 tokens, 90th percentile 405, and maximum 613. The consequences: 98.45% of windows exceed </w:t>
+        <w:t xml:space="preserve">Running the encoder's own tokeniser over the pipeline's windows on the 1,186 recovered scripts yields 44,899 windows with median length 373 tokens, 90th percentile 409 and maximum 706. Of these, 98.4% exceed </w:t>
       </w:r>
       <m:oMath>
         <m:r>
@@ -5358,7 +5332,7 @@
           <w:i w:val="0"/>
           <w:sz w:val="20"/>
         </w:rPr>
-        <w:t xml:space="preserve"> evaluated corpus-wide is 0.3160, with a worst case of 0.4443. Roughly one word in three is written to a window that the encoder never reads. Nothing in the pipeline reports this.</w:t>
+        <w:t xml:space="preserve"> computed over all tokens is 0.319 (worst script 0.611). Roughly one word in three is written to a window position that the encoder never reads, and the pipeline reports nothing. The 356-file public slice gives almost the same figures (98.45% and 0.316), so the rate is stable across subsets, although the recovered files cover only ratings 5.0–5.7.</w:t>
       </w:r>
     </w:p>
     <w:p>
@@ -5439,7 +5413,7 @@
           <w:i w:val="0"/>
           <w:sz w:val="20"/>
         </w:rPr>
-        <w:t>. It is fed to the same gradient-boosted regressor as the semantic arm. This pairing is deliberate: SBERT and TF-IDF differ in representation and in nothing else, so their gap is attributable to semantics rather than to the learner.</w:t>
+        <w:t>. It uses the same gradient-boosted regressor as the semantic arm. In the archived runs, however, the TF-IDF arm received text alone, whereas the SBERT arm also received the sixteen structural statistics and the three metadata columns and was trained with inverse-frequency sample weights. Section V-C reports a like-for-like rerun.</w:t>
       </w:r>
     </w:p>
     <w:p>
@@ -5484,7 +5458,7 @@
           <w:i w:val="0"/>
           <w:sz w:val="20"/>
         </w:rPr>
-        <w:t>) on standardised embeddings. A constant-mean predictor anchors the bottom. For the stacked ensemble, a ridge meta-regressor is fitted over four base models — metadata OLS, structural OLS, TF-IDF+XGBoost, SBERT+XGBoost — using inner five-fold out-of-fold meta-features nested within each outer fold.</w:t>
+        <w:t>) on standardised embeddings. A constant-mean predictor anchors the bottom. For the stacked ensemble, a ridge meta-regressor is fitted over four base models — metadata OLS, structural OLS (sixteen statistics plus metadata), TF-IDF+XGBoost, SBERT+XGBoost — using inner five-fold out-of-fold meta-features nested within each outer fold. In Tables II– IV, SBERT + XGBoost uses the 384 embedding dimensions only, and SBERT + meta + XGBoost adds runtime, release year and the decade code (387 inputs).</w:t>
       </w:r>
     </w:p>
     <w:p>
@@ -5847,7 +5821,7 @@
           <w:i w:val="0"/>
           <w:sz w:val="20"/>
         </w:rPr>
-        <w:t>, assignment independent of every record attribute.</w:t>
+        <w:t>, assignment independent of every record attribute. Within each training pool, a random 18.75% slice is held out for early stopping; the same applies to P2.</w:t>
       </w:r>
     </w:p>
     <w:p>
@@ -6570,7 +6544,7 @@
           <w:i w:val="0"/>
           <w:sz w:val="20"/>
         </w:rPr>
-        <w:t>. Early stopping is thereby decided on films that are themselves in the future relative to the training set, so no forward-looking information enters through model selection. The realised sizes are 3,918 / 731 / 515.</w:t>
+        <w:t>. Early stopping is thereby decided on films that are themselves in the future relative to the training set, so no forward-looking information enters through model selection. The realised sizes are 3,918 / 731 / 515. All models, including the linear baselines, are fitted on the training years only.</w:t>
       </w:r>
     </w:p>
     <w:p>
@@ -8434,7 +8408,7 @@
           <w:i w:val="0"/>
           <w:sz w:val="20"/>
         </w:rPr>
-        <w:t>Table II isolates the cost of the group constraint; Table III isolates the cost of the temporal one. Five systems, one corpus, one learner configuration throughout.</w:t>
+        <w:t>Table II shows the cost of the group constraint and Table III the cost of the temporal one. The five systems, the corpus and the learner settings are the same throughout.</w:t>
       </w:r>
     </w:p>
     <w:p>
@@ -10747,14 +10721,60 @@
                 <w:i w:val="0"/>
                 <w:sz w:val="16"/>
               </w:rPr>
-              <w:t xml:space="preserve">Target: train </w:t>
+              <w:t xml:space="preserve">Target mean </w:t>
+            </w:r>
+            <m:oMath>
+              <m:r>
+                <m:rPr>
+                  <m:sty m:val="p"/>
+                </m:rPr>
+                <w:rPr>
+                  <w:sz w:val="16"/>
+                </w:rPr>
+                <m:t>±</m:t>
+              </m:r>
+            </m:oMath>
+            <w:r>
+              <w:rPr>
+                <w:rFonts w:ascii="Times New Roman" w:hAnsi="Times New Roman"/>
+                <w:b w:val="0"/>
+                <w:i w:val="0"/>
+                <w:sz w:val="16"/>
+              </w:rPr>
+              <w:t xml:space="preserve"> SD: train (</w:t>
+            </w:r>
+            <m:oMath>
+              <m:r>
+                <m:rPr>
+                  <m:sty m:val="p"/>
+                </m:rPr>
+                <w:rPr>
+                  <w:sz w:val="16"/>
+                </w:rPr>
+                <m:t>≤</m:t>
+              </m:r>
+              <m:r>
+                <w:rPr>
+                  <w:sz w:val="16"/>
+                </w:rPr>
+                <m:t>2015</m:t>
+              </m:r>
+            </m:oMath>
+            <w:r>
+              <w:rPr>
+                <w:rFonts w:ascii="Times New Roman" w:hAnsi="Times New Roman"/>
+                <w:b w:val="0"/>
+                <w:i w:val="0"/>
+                <w:sz w:val="16"/>
+              </w:rPr>
+              <w:t xml:space="preserve">) </w:t>
             </w:r>
             <m:oMath>
               <m:r>
                 <w:rPr>
                   <w:sz w:val="16"/>
                 </w:rPr>
-                <m:t>6.0119</m:t>
+                <m:t>6.11</m:t>
               </m:r>
               <m:r>
                 <m:rPr>
@@ -10769,7 +10789,7 @@
                 <w:rPr>
                   <w:sz w:val="16"/>
                 </w:rPr>
-                <m:t>1.4619</m:t>
+                <m:t>1.45</m:t>
               </m:r>
             </m:oMath>
             <w:r>
@@ -10779,14 +10799,38 @@
                 <w:i w:val="0"/>
                 <w:sz w:val="16"/>
               </w:rPr>
-              <w:t xml:space="preserve">, holdout </w:t>
+              <w:t>; pre-2020</w:t>
+            </w:r>
+          </w:p>
+        </w:tc>
+      </w:tr>
+      <w:tr>
+        <w:tc>
+          <w:tcPr>
+            <w:tcW w:type="dxa" w:w="3643"/>
+            <w:gridSpan w:val="4"/>
+          </w:tcPr>
+          <w:p>
+            <w:pPr>
+              <w:spacing w:line="190" w:lineRule="exact"/>
+              <w:ind w:firstLine="0"/>
+              <w:jc w:val="left"/>
+            </w:pPr>
+            <w:r>
+              <w:rPr>
+                <w:rFonts w:ascii="Times New Roman" w:hAnsi="Times New Roman"/>
+                <w:b w:val="0"/>
+                <w:i w:val="0"/>
+                <w:sz w:val="16"/>
+              </w:rPr>
+              <w:t xml:space="preserve">pool </w:t>
             </w:r>
             <m:oMath>
               <m:r>
                 <w:rPr>
                   <w:sz w:val="16"/>
                 </w:rPr>
-                <m:t>5.7546</m:t>
+                <m:t>6.01</m:t>
               </m:r>
               <m:r>
                 <m:rPr>
@@ -10801,7 +10845,39 @@
                 <w:rPr>
                   <w:sz w:val="16"/>
                 </w:rPr>
-                <m:t>1.1701</m:t>
+                <m:t>1.46</m:t>
+              </m:r>
+            </m:oMath>
+            <w:r>
+              <w:rPr>
+                <w:rFonts w:ascii="Times New Roman" w:hAnsi="Times New Roman"/>
+                <w:b w:val="0"/>
+                <w:i w:val="0"/>
+                <w:sz w:val="16"/>
+              </w:rPr>
+              <w:t xml:space="preserve">; holdout </w:t>
+            </w:r>
+            <m:oMath>
+              <m:r>
+                <w:rPr>
+                  <w:sz w:val="16"/>
+                </w:rPr>
+                <m:t>5.75</m:t>
+              </m:r>
+              <m:r>
+                <m:rPr>
+                  <m:sty m:val="p"/>
+                </m:rPr>
+                <w:rPr>
+                  <w:sz w:val="16"/>
+                </w:rPr>
+                <m:t>±</m:t>
+              </m:r>
+              <m:r>
+                <w:rPr>
+                  <w:sz w:val="16"/>
+                </w:rPr>
+                <m:t>1.17</m:t>
               </m:r>
             </m:oMath>
             <w:r>
@@ -10877,7 +10953,7 @@
           <w:i w:val="0"/>
           <w:sz w:val="20"/>
         </w:rPr>
-        <w:t xml:space="preserve"> to 0.5359, a drop of 0.0131, and the two bootstrap intervals overlap substantially. That is the expected result for a corpus in which only 164 families have more than one member and the largest has four. The interesting part is that the effect is consistently negative across every system that reads text — SBERT ridge loses 0.0125 </w:t>
+        <w:t xml:space="preserve"> to 0.5359, a drop of 0.0131, and the two bootstrap intervals overlap substantially. This is expected for a corpus in which only 164 families have more than one member and the largest has four. The direction of the change is nonetheless consistent: every system that reads text loses </w:t>
       </w:r>
       <m:oMath>
         <m:sSup>
@@ -10905,38 +10981,7 @@
           <w:i w:val="0"/>
           <w:sz w:val="20"/>
         </w:rPr>
-        <w:t>, SBERT+XGBoost loses 0.0127 — while the metadata-only probe is unmoved (</w:t>
-      </w:r>
-      <m:oMath>
-        <m:r>
-          <w:rPr>
-            <w:sz w:val="20"/>
-          </w:rPr>
-          <m:t>0.3888</m:t>
-        </m:r>
-        <m:r>
-          <m:rPr>
-            <m:sty m:val="p"/>
-          </m:rPr>
-          <w:rPr>
-            <w:sz w:val="20"/>
-          </w:rPr>
-          <m:t>→</m:t>
-        </m:r>
-        <m:r>
-          <w:rPr>
-            <w:sz w:val="20"/>
-          </w:rPr>
-          <m:t>0.3889</m:t>
-        </m:r>
-      </m:oMath>
-      <w:r>
-        <w:rPr>
-          <w:b w:val="0"/>
-          <w:i w:val="0"/>
-          <w:sz w:val="20"/>
-        </w:rPr>
-        <w:t>). Franchise leakage is a textual channel, and a metadata model cannot exploit it because it never sees the words.</w:t>
+        <w:t xml:space="preserve"> (SBERT ridge by 0.0125, SBERT + XGBoost by 0.0127), while the metadata-only probe does not move (0.3888 to 0.3889). Franchise leakage therefore enters through the text, which a metadata model never sees.</w:t>
       </w:r>
     </w:p>
     <w:p>
@@ -10950,7 +10995,7 @@
           <w:i w:val="0"/>
           <w:sz w:val="20"/>
         </w:rPr>
-        <w:t xml:space="preserve">Chronology costs a great deal. The same best system falls to </w:t>
+        <w:t xml:space="preserve">Chronology costs much more. The best system falls to </w:t>
       </w:r>
       <m:oMath>
         <m:sSup>
@@ -10993,7 +11038,7 @@
           <w:i w:val="0"/>
           <w:sz w:val="20"/>
         </w:rPr>
-        <w:t xml:space="preserve">, and the interval [0.1985, 0.4038] no longer overlaps either in-corpus estimate. The constant-mean predictor goes from </w:t>
+        <w:t xml:space="preserve">, and its interval [0.1985, 0.4038] no longer overlaps either in-corpus estimate. The constant-mean predictor drops from </w:t>
       </w:r>
       <m:oMath>
         <m:sSup>
@@ -11036,38 +11081,7 @@
           <w:i w:val="0"/>
           <w:sz w:val="20"/>
         </w:rPr>
-        <w:t xml:space="preserve"> to -0.0947, which is a pure distribution-shift effect: the training mean (6.11) is simply wrong for the holdout (5.75). And the metadata probe collapses hardest of all, from 0.3889 to 0.1473, losing 62% of its explanatory power, while the text-only SBERT model loses 35% (</w:t>
-      </w:r>
-      <m:oMath>
-        <m:r>
-          <w:rPr>
-            <w:sz w:val="20"/>
-          </w:rPr>
-          <m:t>0.4114</m:t>
-        </m:r>
-        <m:r>
-          <m:rPr>
-            <m:sty m:val="p"/>
-          </m:rPr>
-          <w:rPr>
-            <w:sz w:val="20"/>
-          </w:rPr>
-          <m:t>→</m:t>
-        </m:r>
-        <m:r>
-          <w:rPr>
-            <w:sz w:val="20"/>
-          </w:rPr>
-          <m:t>0.2671</m:t>
-        </m:r>
-      </m:oMath>
-      <w:r>
-        <w:rPr>
-          <w:b w:val="0"/>
-          <w:i w:val="0"/>
-          <w:sz w:val="20"/>
-        </w:rPr>
-        <w:t>). The representation that generalises worst across time is the one that was never about the film.</w:t>
+        <w:t xml:space="preserve"> to -0.0947, a pure distribution-shift effect: the training mean (6.11, films up to 2015) is too high for the holdout (5.75). The metadata probe degrades most, from 0.3889 to 0.1473, losing 62% of its explained variance, while the text-only SBERT + XGBoost model loses 35% (0.4114 to 0.2671). That text-only figure, 0.267, is also the most relevant number for screenplay-stage use, because it relies on nothing that becomes known only after production.</w:t>
       </w:r>
     </w:p>
     <w:p>
@@ -13098,7 +13112,23 @@
           <w:i w:val="0"/>
           <w:sz w:val="20"/>
         </w:rPr>
-        <w:t xml:space="preserve">The final row is the one that changes the story. Under P1 and P2, adding the three metadata columns to the embedding buys a highly significant 0.108–0.114 rating points of mean absolute error. Under P3 the same addition buys 0.0236 points, with an interval straddling zero and </w:t>
+        <w:t xml:space="preserve">The last row matters most. Under P1 and P2, adding the three metadata columns to the embedding lowers MAE by 0.108–0.114 rating points, with very small </w:t>
+      </w:r>
+      <m:oMath>
+        <m:r>
+          <w:rPr>
+            <w:sz w:val="20"/>
+          </w:rPr>
+          <m:t>p</m:t>
+        </m:r>
+      </m:oMath>
+      <w:r>
+        <w:rPr>
+          <w:b w:val="0"/>
+          <w:i w:val="0"/>
+          <w:sz w:val="20"/>
+        </w:rPr>
+        <w:t xml:space="preserve">-values. Under P3 the same addition lowers MAE by only 0.0236, the interval includes zero, and </w:t>
       </w:r>
       <m:oMath>
         <m:r>
@@ -13129,7 +13159,7 @@
           <w:i w:val="0"/>
           <w:sz w:val="20"/>
         </w:rPr>
-        <w:t xml:space="preserve">; the full statistics are </w:t>
+        <w:t xml:space="preserve"> (</w:t>
       </w:r>
       <m:oMath>
         <m:r>
@@ -13206,7 +13236,7 @@
           <w:i w:val="0"/>
           <w:sz w:val="20"/>
         </w:rPr>
-        <w:t xml:space="preserve"> pairs with no ties, rank-biserial </w:t>
+        <w:t xml:space="preserve"> pairs, no ties, rank-biserial </w:t>
       </w:r>
       <m:oMath>
         <m:r>
@@ -13246,23 +13276,7 @@
           <w:i w:val="0"/>
           <w:sz w:val="20"/>
         </w:rPr>
-        <w:t xml:space="preserve">. An effect size of 0.056 is negligible by any convention. The metadata block, worth two orders of magnitude in </w:t>
-      </w:r>
-      <m:oMath>
-        <m:r>
-          <w:rPr>
-            <w:sz w:val="20"/>
-          </w:rPr>
-          <m:t>p</m:t>
-        </m:r>
-      </m:oMath>
-      <w:r>
-        <w:rPr>
-          <w:b w:val="0"/>
-          <w:i w:val="0"/>
-          <w:sz w:val="20"/>
-        </w:rPr>
-        <w:t>-value under a random split, is not measurably useful when the test films are genuinely unseen.</w:t>
+        <w:t>). By the usual conventions that effect is negligible. Metadata that looks highly significant under random folds brings no measurable gain on future films.</w:t>
       </w:r>
     </w:p>
     <w:p>
@@ -13291,7 +13305,7 @@
           <w:i w:val="0"/>
           <w:sz w:val="20"/>
         </w:rPr>
-        <w:t xml:space="preserve">The lexical control and the structural-feature model can be evaluated only under the random protocol on this corpus, because reconstructing either representation requires the raw script text; the figures below are from archived 5-fold runs over 5,195 records and are not comparable to Tables II– III. Structural OLS reaches </w:t>
+        <w:t xml:space="preserve">The lexical arm and the structural model need raw text for the whole corpus, so they exist only as archived runs on the original random splits over 5,195 records: five folds, plus one 70/15/15 split whose test predictions were saved. The archived structural OLS uses the sixteen statistics together with the three metadata columns; it reaches </w:t>
       </w:r>
       <m:oMath>
         <m:sSup>
@@ -13349,7 +13363,65 @@
           <w:i w:val="0"/>
           <w:sz w:val="20"/>
         </w:rPr>
-        <w:t xml:space="preserve"> and TF-IDF+XGBoost </w:t>
+        <w:t xml:space="preserve"> against 0.382 for metadata alone, so the statistics add about 0.06. The archived SBERT arm also received all nineteen numeric columns, whereas TF-IDF + XGBoost saw text only, so its margin over TF-IDF mixed representation with metadata. For a fair comparison we retrained an SBERT-only model on the archived embeddings with the TF-IDF arm's exact recipe (300 trees, no early stopping, the same sample weights, folds and seeds). Over the five folds, SBERT-only reaches </w:t>
+      </w:r>
+      <m:oMath>
+        <m:sSup>
+          <m:e>
+            <m:r>
+              <w:rPr>
+                <w:sz w:val="20"/>
+              </w:rPr>
+              <m:t>R</m:t>
+            </m:r>
+          </m:e>
+          <m:sup>
+            <m:r>
+              <w:rPr>
+                <w:sz w:val="20"/>
+              </w:rPr>
+              <m:t>2</m:t>
+            </m:r>
+          </m:sup>
+        </m:sSup>
+        <m:r>
+          <m:rPr>
+            <m:sty m:val="p"/>
+          </m:rPr>
+          <w:rPr>
+            <w:sz w:val="20"/>
+          </w:rPr>
+          <m:t>=</m:t>
+        </m:r>
+        <m:r>
+          <w:rPr>
+            <w:sz w:val="20"/>
+          </w:rPr>
+          <m:t>0.372</m:t>
+        </m:r>
+        <m:r>
+          <m:rPr>
+            <m:sty m:val="p"/>
+          </m:rPr>
+          <w:rPr>
+            <w:sz w:val="20"/>
+          </w:rPr>
+          <m:t>±</m:t>
+        </m:r>
+        <m:r>
+          <w:rPr>
+            <w:sz w:val="20"/>
+          </w:rPr>
+          <m:t>0.012</m:t>
+        </m:r>
+      </m:oMath>
+      <w:r>
+        <w:rPr>
+          <w:b w:val="0"/>
+          <w:i w:val="0"/>
+          <w:sz w:val="20"/>
+        </w:rPr>
+        <w:t xml:space="preserve"> against </w:t>
       </w:r>
       <m:oMath>
         <m:r>
@@ -13380,65 +13452,7 @@
           <w:i w:val="0"/>
           <w:sz w:val="20"/>
         </w:rPr>
-        <w:t xml:space="preserve"> — 8,000 TF-IDF weights buy almost exactly what sixteen hand-counted statistics buy. The semantic arm beats the lexical one by </w:t>
-      </w:r>
-      <m:oMath>
-        <m:r>
-          <w:rPr>
-            <w:sz w:val="20"/>
-          </w:rPr>
-          <m:t>Δ</m:t>
-        </m:r>
-        <m:r>
-          <m:rPr>
-            <m:sty m:val="p"/>
-          </m:rPr>
-          <w:rPr>
-            <w:sz w:val="20"/>
-          </w:rPr>
-          <m:t>M</m:t>
-        </m:r>
-        <m:r>
-          <m:rPr>
-            <m:sty m:val="p"/>
-          </m:rPr>
-          <w:rPr>
-            <w:sz w:val="20"/>
-          </w:rPr>
-          <m:t>A</m:t>
-        </m:r>
-        <m:r>
-          <m:rPr>
-            <m:sty m:val="p"/>
-          </m:rPr>
-          <w:rPr>
-            <w:sz w:val="20"/>
-          </w:rPr>
-          <m:t>E</m:t>
-        </m:r>
-        <m:r>
-          <m:rPr>
-            <m:sty m:val="p"/>
-          </m:rPr>
-          <w:rPr>
-            <w:sz w:val="20"/>
-          </w:rPr>
-          <m:t>=</m:t>
-        </m:r>
-        <m:r>
-          <w:rPr>
-            <w:sz w:val="20"/>
-          </w:rPr>
-          <m:t>0.0514</m:t>
-        </m:r>
-      </m:oMath>
-      <w:r>
-        <w:rPr>
-          <w:b w:val="0"/>
-          <w:i w:val="0"/>
-          <w:sz w:val="20"/>
-        </w:rPr>
-        <w:t xml:space="preserve"> [0.034, 0.067], </w:t>
+        <w:t xml:space="preserve"> for TF-IDF (MAE 0.880 against 0.819). On the saved split, where errors can be paired over 780 test films, TF-IDF has lower MAE by 0.030 [-0.010, 0.069] (</w:t>
       </w:r>
       <m:oMath>
         <m:r>
@@ -13460,44 +13474,8 @@
           <w:rPr>
             <w:sz w:val="20"/>
           </w:rPr>
-          <m:t>2.6</m:t>
+          <m:t>0.088</m:t>
         </m:r>
-        <m:r>
-          <m:rPr>
-            <m:sty m:val="p"/>
-          </m:rPr>
-          <w:rPr>
-            <w:sz w:val="20"/>
-          </w:rPr>
-          <m:t>×</m:t>
-        </m:r>
-        <m:sSup>
-          <m:e>
-            <m:r>
-              <w:rPr>
-                <w:sz w:val="20"/>
-              </w:rPr>
-              <m:t>10</m:t>
-            </m:r>
-          </m:e>
-          <m:sup>
-            <m:r>
-              <m:rPr>
-                <m:sty m:val="p"/>
-              </m:rPr>
-              <w:rPr>
-                <w:sz w:val="20"/>
-              </w:rPr>
-              <m:t>−</m:t>
-            </m:r>
-            <m:r>
-              <w:rPr>
-                <w:sz w:val="20"/>
-              </w:rPr>
-              <m:t>5</m:t>
-            </m:r>
-          </m:sup>
-        </m:sSup>
       </m:oMath>
       <w:r>
         <w:rPr>
@@ -13505,7 +13483,7 @@
           <w:i w:val="0"/>
           <w:sz w:val="20"/>
         </w:rPr>
-        <w:t xml:space="preserve">, a real but modest margin. Inverse-frequency sample weighting, applied in the original pipeline to compensate for the rating imbalance, hurts: removing it improves MAE by 0.0482 [0.039, 0.057] at </w:t>
+        <w:t>). Mean-pooled sentence embeddings therefore do not outperform a bag-of-words model here; the archived advantage came from the metadata. In the original pipeline, inverse-frequency sample weighting hurts: removing it lowers MAE by 0.0482 [0.039, 0.057] (</w:t>
       </w:r>
       <m:oMath>
         <m:r>
@@ -13572,7 +13550,7 @@
           <w:i w:val="0"/>
           <w:sz w:val="20"/>
         </w:rPr>
-        <w:t>. The nested ridge stack (</w:t>
+        <w:t xml:space="preserve">). A nested ridge stack reaches </w:t>
       </w:r>
       <m:oMath>
         <m:sSup>
@@ -13630,7 +13608,7 @@
           <w:i w:val="0"/>
           <w:sz w:val="20"/>
         </w:rPr>
-        <w:t xml:space="preserve">) improves on its own strongest base by </w:t>
+        <w:t xml:space="preserve">, improving on its strongest base by </w:t>
       </w:r>
       <m:oMath>
         <m:r>
@@ -13688,74 +13666,7 @@
           <w:i w:val="0"/>
           <w:sz w:val="20"/>
         </w:rPr>
-        <w:t xml:space="preserve"> [0.008, 0.019], </w:t>
-      </w:r>
-      <m:oMath>
-        <m:r>
-          <w:rPr>
-            <w:sz w:val="20"/>
-          </w:rPr>
-          <m:t>p</m:t>
-        </m:r>
-        <m:r>
-          <m:rPr>
-            <m:sty m:val="p"/>
-          </m:rPr>
-          <w:rPr>
-            <w:sz w:val="20"/>
-          </w:rPr>
-          <m:t>=</m:t>
-        </m:r>
-        <m:r>
-          <w:rPr>
-            <w:sz w:val="20"/>
-          </w:rPr>
-          <m:t>4.2</m:t>
-        </m:r>
-        <m:r>
-          <m:rPr>
-            <m:sty m:val="p"/>
-          </m:rPr>
-          <w:rPr>
-            <w:sz w:val="20"/>
-          </w:rPr>
-          <m:t>×</m:t>
-        </m:r>
-        <m:sSup>
-          <m:e>
-            <m:r>
-              <w:rPr>
-                <w:sz w:val="20"/>
-              </w:rPr>
-              <m:t>10</m:t>
-            </m:r>
-          </m:e>
-          <m:sup>
-            <m:r>
-              <m:rPr>
-                <m:sty m:val="p"/>
-              </m:rPr>
-              <w:rPr>
-                <w:sz w:val="20"/>
-              </w:rPr>
-              <m:t>−</m:t>
-            </m:r>
-            <m:r>
-              <w:rPr>
-                <w:sz w:val="20"/>
-              </w:rPr>
-              <m:t>6</m:t>
-            </m:r>
-          </m:sup>
-        </m:sSup>
-      </m:oMath>
-      <w:r>
-        <w:rPr>
-          <w:b w:val="0"/>
-          <w:i w:val="0"/>
-          <w:sz w:val="20"/>
-        </w:rPr>
-        <w:t xml:space="preserve">, and a 100-trial TPE search on a single 80/20 split over the boosting head reaches test </w:t>
+        <w:t xml:space="preserve"> [0.008, 0.019], and a 100-trial TPE search reaches </w:t>
       </w:r>
       <m:oMath>
         <m:sSup>
@@ -13789,7 +13700,7 @@
           <w:rPr>
             <w:sz w:val="20"/>
           </w:rPr>
-          <m:t>0.5811</m:t>
+          <m:t>0.581</m:t>
         </m:r>
       </m:oMath>
       <w:r>
@@ -13798,7 +13709,7 @@
           <w:i w:val="0"/>
           <w:sz w:val="20"/>
         </w:rPr>
-        <w:t xml:space="preserve"> [0.5471, 0.6182]. Both gains are real and both are small next to the 0.240 </w:t>
+        <w:t xml:space="preserve"> [0.547, 0.618] on a single held-out split. Both gains are small next to the 0.240 gap in </w:t>
       </w:r>
       <m:oMath>
         <m:sSup>
@@ -13826,7 +13737,7 @@
           <w:i w:val="0"/>
           <w:sz w:val="20"/>
         </w:rPr>
-        <w:t xml:space="preserve"> that separates the random and chronological protocols. Ensembling and tuning move the third decimal; the split moves the first.</w:t>
+        <w:t xml:space="preserve"> between the random and chronological protocols.</w:t>
       </w:r>
     </w:p>
     <w:p>
@@ -13855,7 +13766,7 @@
           <w:i w:val="0"/>
           <w:sz w:val="20"/>
         </w:rPr>
-        <w:t xml:space="preserve">The holdout target is compressed relative to the training pool: standard deviation falls from 1.4619 to 1.1701, while the mean falls from 6.0119 to 5.7546. Part of the </w:t>
+        <w:t xml:space="preserve">The holdout target is compressed relative to the training years: standard deviation 1.17 against 1.45, mean 5.75 against 6.11. Part of the fall in </w:t>
       </w:r>
       <m:oMath>
         <m:sSup>
@@ -13883,7 +13794,7 @@
           <w:i w:val="0"/>
           <w:sz w:val="20"/>
         </w:rPr>
-        <w:t xml:space="preserve"> collapse is therefore arithmetic — the same absolute error against a narrower target yields a smaller </w:t>
+        <w:t xml:space="preserve"> is therefore arithmetic, since the same absolute error against a narrower target yields a lower </w:t>
       </w:r>
       <m:oMath>
         <m:sSup>
@@ -13911,75 +13822,7 @@
           <w:i w:val="0"/>
           <w:sz w:val="20"/>
         </w:rPr>
-        <w:t xml:space="preserve"> — and part is genuine degradation. Mean absolute error separates them: it is 0.7276 under P1 and 0.7232 under P3, statistically indistinguishable. What collapses is how much of the (now narrower) variance it can order. Regressing prediction on truth over the holdout gives slope 0.4634 </w:t>
-      </w:r>
-      <m:oMath>
-        <m:d>
-          <m:dPr>
-            <m:begChr m:val="("/>
-            <m:endChr m:val=")"/>
-            <m:sepChr m:val=""/>
-            <m:grow/>
-          </m:dPr>
-          <m:e>
-            <m:r>
-              <m:rPr>
-                <m:sty m:val="p"/>
-              </m:rPr>
-              <w:rPr>
-                <w:sz w:val="20"/>
-              </w:rPr>
-              <m:t>s</m:t>
-            </m:r>
-            <m:r>
-              <m:rPr>
-                <m:sty m:val="p"/>
-              </m:rPr>
-              <w:rPr>
-                <w:sz w:val="20"/>
-              </w:rPr>
-              <m:t>.</m:t>
-            </m:r>
-            <m:r>
-              <m:rPr>
-                <m:sty m:val="p"/>
-              </m:rPr>
-              <w:rPr>
-                <w:sz w:val="20"/>
-              </w:rPr>
-              <m:t>e</m:t>
-            </m:r>
-            <m:r>
-              <m:rPr>
-                <m:sty m:val="p"/>
-              </m:rPr>
-              <w:rPr>
-                <w:sz w:val="20"/>
-              </w:rPr>
-              <m:t>.</m:t>
-            </m:r>
-            <m:r>
-              <w:rPr>
-                <w:sz w:val="20"/>
-              </w:rPr>
-              <m:t> </m:t>
-            </m:r>
-            <m:r>
-              <w:rPr>
-                <w:sz w:val="20"/>
-              </w:rPr>
-              <m:t>0.0278</m:t>
-            </m:r>
-          </m:e>
-        </m:d>
-      </m:oMath>
-      <w:r>
-        <w:rPr>
-          <w:b w:val="0"/>
-          <w:i w:val="0"/>
-          <w:sz w:val="20"/>
-        </w:rPr>
-        <w:t xml:space="preserve"> and intercept 3.1745, against an ideal slope of 1. The system is heavily shrunk toward the centre — it identifies which films are above or below average and declines to commit to how far.</w:t>
+        <w:t>. MAE alone does not settle the matter: the best system's MAE is 0.7276 under P1 and 0.7232 under P3, but the constant predictor's MAE also falls, from 1.176 to 0.976. Relative to that baseline, the best system removes 38% of baseline MAE under P1 and only 26% under P3, so accuracy does degrade on future films. Regressing prediction on truth over the holdout gives slope 0.463 (s.e. 0.028): the model separates above-average from below-average films but underestimates how far they lie from the mean.</w:t>
       </w:r>
     </w:p>
     <w:p>
@@ -14025,7 +13868,7 @@
           <w:i w:val="0"/>
           <w:sz w:val="20"/>
         </w:rPr>
-        <w:t>In the shipped model's total split gain, the 384 embedding dimensions take 55.5%, the three metadata columns take 36.6%, and the sixteen structural statistics take 8.0%. Per dimension the picture inverts: the single largest embedding dimension contributes 1.68% and the mean dimension 0.14%, whereas movie_length alone contributes 25.50% and year 11.01%. One tabular column outweighs all sixteen structural statistics by a factor of three.</w:t>
+        <w:t>Split gain here comes from the archived SBERT model that saw all nineteen numeric inputs (403 features in total, random split). Embedding dimensions account for 55.5% of the total gain, the metadata columns for 36.6% (movie_length 25.5%, year 11.0%, decade_encoded 0.06%) and the structural statistics for 8.0%. Looked at per input, the order flips. The strongest embedding dimension contributes 1.68% and a typical one 0.14%, while runtime on its own is worth three times as much as all sixteen structural statistics put together.</w:t>
       </w:r>
     </w:p>
     <w:p>
@@ -14054,7 +13897,7 @@
           <w:i w:val="0"/>
           <w:sz w:val="20"/>
         </w:rPr>
-        <w:t xml:space="preserve">Gain is computed on training splits and therefore inherits every in-sample advantage. Permutation on the holdout does not. We shuffle each feature block across the 515 holdout films, re-predict, and record the increase in MAE over 20 repetitions; the baseline is </w:t>
+        <w:t xml:space="preserve">Gain is measured on training splits, so it keeps every in-sample advantage; permutation on the holdout does not. For the P3 SBERT + meta + XGBoost model we shuffled each feature block across the 515 holdout films, re-predicted, and recorded the rise in MAE over 20 repetitions (baseline </w:t>
       </w:r>
       <m:oMath>
         <m:r>
@@ -14106,7 +13949,7 @@
           <w:i w:val="0"/>
           <w:sz w:val="20"/>
         </w:rPr>
-        <w:t>:</w:t>
+        <w:t>):</w:t>
       </w:r>
     </w:p>
     <w:p>
@@ -14415,7 +14258,7 @@
           <w:i w:val="0"/>
           <w:sz w:val="20"/>
         </w:rPr>
-        <w:t>The two zeros are not rounding. Every holdout film was released in 2020–2025, and the model was fitted on films up to 2015, so every holdout value of year lies beyond the largest training split threshold. A tree ensemble routes all of them down the same branch; shuffling values that already share a leaf changes nothing. The feature carrying 11% of in-sample gain becomes a constant at deployment.</w:t>
+        <w:t>Neither zero is a rounding artefact. All holdout films came out in 2020–2025 and the model only saw films up to 2015, so every holdout value of year falls past the largest split threshold in the training data. The trees send all of them down the same branch, and shuffling values that already land in the same leaf has no effect. A feature that carries 11% of in-sample gain is, at deployment, a constant.</w:t>
       </w:r>
     </w:p>
     <w:p>
@@ -14429,7 +14272,7 @@
           <w:i w:val="0"/>
           <w:sz w:val="20"/>
         </w:rPr>
-        <w:t>Runtime is the opposite case. It transfers cleanly, because a 130-minute film in 2023 occupies the same region of feature space as a 130-minute film in 1994, and it alone reproduces the predictive value of the entire semantic block. That the embedding block contributes as much as it does, after 31.6% truncation and the smoothing of Eq. (8), is the more surprising half of the result.</w:t>
+        <w:t>Runtime behaves differently. A 130-minute film from 2023 sits in the same part of feature space as a 130-minute film from 1994, so runtime carries over across time, and by itself it is worth as much as the whole embedding block. But runtime belongs to the finished film and is unknown while a screenplay is assessed, so it cannot help screenplay-stage prediction.</w:t>
       </w:r>
     </w:p>
     <w:p>
@@ -14460,7 +14303,7 @@
           <w:i w:val="0"/>
           <w:sz w:val="20"/>
         </w:rPr>
-        <w:t>TF-IDF and the structural statistics require raw text and were evaluated only under P1. Selection effects in IMSDb are severe and not correctable: the mean rating falls monotonically from 7.87 in the 1920s to 5.48 in the 2010s, which is a statement about who uploads what, not about film quality, and P3 is the protocol that refuses to reward it. The holdout is one window; rolling-origin evaluation would estimate the decay rate. A screenplay-stage predictor does not know the runtime, because the film has not been cut — or shot. Finally, we audit only mean-pooled all-MiniLM-L6-v2; holding the representation fixed is what makes the protocol comparison clean.</w:t>
+        <w:t>Raw text survives for just 1,177 of the 5,204 records, all rated 5.0–5.7, so the hash audit and the truncation estimate rest on a narrow rating range, and TF-IDF and the structural statistics exist only as archived random-split runs. The embedding matrix cannot be rebuilt from the current snapshot either. IMSDb's selection bias cannot be corrected after the fact: the mean rating drops from 7.87 for 1920s films to 5.48 for the 2010s, which says more about what people chose to upload than about the films. We evaluate on a single holdout window; rolling-origin evaluation would show how quickly accuracy decays. Title families miss remakes and spin-offs released under a different title, so P2 removes only part of the franchise overlap. Finally, we audit only mean-pooled all-MiniLM-L6-v2, and other encoders may truncate differently.</w:t>
       </w:r>
     </w:p>
     <w:p>
@@ -14491,7 +14334,7 @@
           <w:i w:val="0"/>
           <w:sz w:val="20"/>
         </w:rPr>
-        <w:t xml:space="preserve">We audited a screenplay-to-rating pipeline instead of extending it. The corpus turned out to be clean at the record level, but to carry 164 multi-member title families, four corrupt release years, and a corrupt ordinal decade vocabulary that reaches the feature matrix intact. The chunking configuration turned out to discard 31.60% of WordPiece tokens without warning. And the headline metric turned out to depend on the partition far more than on the model: </w:t>
+        <w:t xml:space="preserve">We set out to audit a screenplay-to-rating pipeline, not to improve it. At the record level the corpus is clean, but it holds 164 multi-member title families, four corrupt release years and a broken decade vocabulary that passes into the feature matrix untouched. The chunking setup silently throws away about 32% of WordPiece tokens, and when trained the same way the sentence embeddings do not beat TF-IDF. Above all, the headline metric depends more on the partition than on the model: </w:t>
       </w:r>
       <m:oMath>
         <m:sSup>
@@ -14534,35 +14377,7 @@
           <w:i w:val="0"/>
           <w:sz w:val="20"/>
         </w:rPr>
-        <w:t xml:space="preserve"> under random folds, 0.536 once franchises are kept together, 0.309 when the test films are drawn from years the model never saw. Runtime transfers; semantics transfer; the calendar does not. For anyone building a screenplay-stage predictor, the operational recommendations are narrow and concrete: group by title family, hold out by release year, report MAE next to </w:t>
-      </w:r>
-      <m:oMath>
-        <m:sSup>
-          <m:e>
-            <m:r>
-              <w:rPr>
-                <w:sz w:val="20"/>
-              </w:rPr>
-              <m:t>R</m:t>
-            </m:r>
-          </m:e>
-          <m:sup>
-            <m:r>
-              <w:rPr>
-                <w:sz w:val="20"/>
-              </w:rPr>
-              <m:t>2</m:t>
-            </m:r>
-          </m:sup>
-        </m:sSup>
-      </m:oMath>
-      <w:r>
-        <w:rPr>
-          <w:b w:val="0"/>
-          <w:i w:val="0"/>
-          <w:sz w:val="20"/>
-        </w:rPr>
-        <w:t xml:space="preserve"> when the target distribution shifts, align the chunk to the tokeniser rather than to whitespace, and store an immutable record key beside every cached representation.</w:t>
+        <w:t xml:space="preserve"> with random folds, 0.536 with franchises kept together, 0.309 on unseen years and 0.267 from text alone. We recommend grouping by title family, holding out by release year, reporting baseline-relative error under target shift, aligning chunks with the tokeniser, and keeping an immutable record key next to every cached representation.</w:t>
       </w:r>
     </w:p>
     <w:p>
@@ -14593,7 +14408,7 @@
           <w:i w:val="0"/>
           <w:sz w:val="20"/>
         </w:rPr>
-        <w:t>All audit and evaluation code is released with the paper; every number is regenerated from the committed JSON artifacts. The random seed is 42 throughout.</w:t>
+        <w:t>Code, the archived embeddings and all result files are at https://github.com/efazulkarim/imdb-predictor/tree/sbert; every number regenerates from the committed JSON artifacts (seed 42). The screenplays are not redistributed, but IMDb identifiers and SHA-256 digests are enough to rebuild the corpus.</w:t>
       </w:r>
     </w:p>
     <w:p>
@@ -14629,7 +14444,7 @@
         </w:rPr>
         <w:t>[1]</w:t>
         <w:tab/>
-        <w:t>I. Beltagy, M. E. Peters, and A. Cohan, “Longformer: The long-document transformer,” arXiv:2004.05150, 2020.</w:t>
+        <w:t>J. Eliashberg, S. K. Hui, and Z. J. Zhang, “Assessing box office performance using movie scripts: A kernel-based approach,” IEEE Trans. Knowl. Data Eng., vol. 26, no. 11, pp. 2639–2648, 2014.</w:t>
       </w:r>
     </w:p>
     <w:p>
@@ -14648,7 +14463,7 @@
         </w:rPr>
         <w:t>[2]</w:t>
         <w:tab/>
-        <w:t>N. Reimers and I. Gurevych, “Sentence-BERT: Sentence embeddings using Siamese BERT-networks,” in Proc. EMNLP, 2019.</w:t>
+        <w:t>S. D. Hunter, S. Smith, and S. Singh, “Predicting box office from the screenplay: A text analytical approach,” J. Screenwriting, vol. 7, no. 2, 2016.</w:t>
       </w:r>
     </w:p>
     <w:p>
@@ -14667,7 +14482,7 @@
         </w:rPr>
         <w:t>[3]</w:t>
         <w:tab/>
-        <w:t>J. Eliashberg, S. K. Hui, and Z. J. Zhang, “Assessing box office performance using movie scripts: A kernel-based approach,” IEEE Trans. Knowl. Data Eng., vol. 26, no. 11, 2014.</w:t>
+        <w:t>A. J. Reagan, L. Mitchell, D. Kiley, C. M. Danforth, and P. S. Dodds, “The emotional arcs of stories are dominated by six basic shapes,” EPJ Data Science, vol. 5, no. 31, 2016.</w:t>
       </w:r>
     </w:p>
     <w:p>
@@ -14686,7 +14501,7 @@
         </w:rPr>
         <w:t>[4]</w:t>
         <w:tab/>
-        <w:t>S. D. Hunter, S. Smith, and S. Singh, “Predicting box office from the screenplay: A text analytical approach,” West East Institute, 2016.</w:t>
+        <w:t>E. Chu and D. Roy, “Audio-visual sentiment analysis for learning emotional arcs in movies,” in Proc. IEEE ICDM, 2017.</w:t>
       </w:r>
     </w:p>
     <w:p>
@@ -14705,7 +14520,7 @@
         </w:rPr>
         <w:t>[5]</w:t>
         <w:tab/>
-        <w:t>A. J. Reagan, L. Mitchell, D. Kiley, C. M. Danforth, and P. S. Dodds, “The emotional arcs of stories are dominated by six basic shapes,” EPJ Data Science, vol. 5, no. 31, 2016.</w:t>
+        <w:t>A. Ramakrishna, V. R. Martínez, N. Malandrakis, K. Singla, and S. Narayanan, “Linguistic analysis of differences in portrayal of movie characters,” in Proc. ACL, 2017.</w:t>
       </w:r>
     </w:p>
     <w:p>
@@ -14724,7 +14539,7 @@
         </w:rPr>
         <w:t>[6]</w:t>
         <w:tab/>
-        <w:t>A. Ramakrishna, V. R. Martínez, N. Malandrakis, K. Singla, and S. Narayanan, “Linguistic analysis of differences in portrayal of movie characters,” in Proc. ACL, 2017.</w:t>
+        <w:t>M. Shafaei, N. Safi Samghabadi, S. Kar, and T. Solorio, “Age suitability rating: Predicting the MPAA rating based on movie dialogues,” in Proc. LREC, 2020, pp. 1327–1335.</w:t>
       </w:r>
     </w:p>
     <w:p>
@@ -14743,7 +14558,7 @@
         </w:rPr>
         <w:t>[7]</w:t>
         <w:tab/>
-        <w:t>M. Shafaei, C. Smailis, I. Kakadiaris, and T. Solorio, “Age suitability rating: Predicting MPAA ratings based on movie dialogues,” in Proc. LREC, 2020.</w:t>
+        <w:t>E. Mohamed and L. A. Ha, “A first dataset for film age appropriateness investigation,” in Proc. LREC, 2020, pp. 1311–1317.</w:t>
       </w:r>
     </w:p>
     <w:p>
@@ -14762,7 +14577,7 @@
         </w:rPr>
         <w:t>[8]</w:t>
         <w:tab/>
-        <w:t>Y. Zhang, M. Shafaei, and T. Solorio, “From none to severe: Predicting severity in movie scripts,” in Findings of EMNLP, 2021.</w:t>
+        <w:t>Y. Zhang, M. Shafaei, F. González, and T. Solorio, “From none to severe: Predicting severity in movie scripts,” in Findings of EMNLP, 2021, pp. 3951–3956.</w:t>
       </w:r>
     </w:p>
     <w:p>
@@ -14781,7 +14596,7 @@
         </w:rPr>
         <w:t>[9]</w:t>
         <w:tab/>
-        <w:t>E. Chu, D. Roy, and J. Glass, “Audio-visual sentiment analysis for learning emotional arcs in movies,” in Proc. ICCV, 2017.</w:t>
+        <w:t>S. Kar, S. Maharjan, and T. Solorio, “Folksonomication: Predicting tags for movies from plot synopses using emotion flow encoded neural network,” in Proc. COLING, 2018.</w:t>
       </w:r>
     </w:p>
     <w:p>
@@ -14800,7 +14615,7 @@
         </w:rPr>
         <w:t>[10]</w:t>
         <w:tab/>
-        <w:t>R. Sharda and D. Delen, “Predicting box-office success of motion pictures with neural networks,” Expert Systems with Applications, vol. 30, no. 2, 2006.</w:t>
+        <w:t>M.-C. Chiu, T. Feng, X. Ren, and S. Narayanan, “Screenplay quality assessment: Can we predict who gets nominated?” in Proc. 1st Joint Workshop Narrative Understanding, Storylines, and Events (NUSE), 2020.</w:t>
       </w:r>
     </w:p>
     <w:p>
@@ -14819,7 +14634,7 @@
         </w:rPr>
         <w:t>[11]</w:t>
         <w:tab/>
-        <w:t>C. T. Madongo, Z. Tang, and J. Hassan, “Movie box-office revenue prediction model by mining deep features from trailers using recurrent neural networks,” J. Adv. Inf. Technol., 2024.</w:t>
+        <w:t>R. Sharda and D. Delen, “Predicting box-office success of motion pictures with neural networks,” Expert Systems with Applications, vol. 30, no. 2, 2006.</w:t>
       </w:r>
     </w:p>
     <w:p>
@@ -14838,7 +14653,7 @@
         </w:rPr>
         <w:t>[12]</w:t>
         <w:tab/>
-        <w:t>A. Bhadrashetty and S. Patil, “Movie success and rating prediction using data mining,” J. Sci. Res. Technol., 2024.</w:t>
+        <w:t>S. Asur and B. A. Huberman, “Predicting the future with social media,” in Proc. IEEE/WIC/ACM Web Intelligence, 2010.</w:t>
       </w:r>
     </w:p>
     <w:p>
@@ -14857,7 +14672,7 @@
         </w:rPr>
         <w:t>[13]</w:t>
         <w:tab/>
-        <w:t>M. Z. Naeem, F. Rustam, A. Mehmood, I. Ashraf, and G. S. Choi, “Classification of movie reviews using term frequency-inverse document frequency and optimized machine learning algorithms,” PeerJ Comput. Sci., 2022.</w:t>
+        <w:t>A. Oghina, M. Breuss, M. Tsagkias, and M. de Rijke, “Predicting IMDb movie ratings using social media,” in Proc. ECIR, 2012.</w:t>
       </w:r>
     </w:p>
     <w:p>
@@ -14876,7 +14691,7 @@
         </w:rPr>
         <w:t>[14]</w:t>
         <w:tab/>
-        <w:t>I. Chalkidis, X. Dai, M. Fergadiotis, P. Malakasiotis, and D. Elliott, “An exploration of hierarchical attention transformers for efficient long document classification,” arXiv:2210.05529, 2022.</w:t>
+        <w:t>G. Mishne and N. Glance, “Predicting movie sales from blogger sentiment,” in AAAI Spring Symposium, 2006.</w:t>
       </w:r>
     </w:p>
     <w:p>
@@ -14895,7 +14710,7 @@
         </w:rPr>
         <w:t>[15]</w:t>
         <w:tab/>
-        <w:t>S. Asur and B. A. Huberman, “Predicting the future with social media,” in Proc. IEEE/WIC/ACM Web Intelligence, 2010.</w:t>
+        <w:t>M. Mestyán, T. Yasseri, and J. Kertész, “Early prediction of movie box office success based on Wikipedia activity big data,” PLoS ONE, vol. 8, no. 8, 2013.</w:t>
       </w:r>
     </w:p>
     <w:p>
@@ -14914,7 +14729,7 @@
         </w:rPr>
         <w:t>[16]</w:t>
         <w:tab/>
-        <w:t>A. Oghina, M. Breuss, M. Tsagkias, and M. de Rijke, “Predicting IMDb movie ratings using social media,” in Proc. ECIR, 2012.</w:t>
+        <w:t>C. T. Madongo, Z. Tang, and J. Hassan, “Movie box-office revenue prediction model by mining deep features from trailers using recurrent neural networks,” J. Adv. Inf. Technol., 2024.</w:t>
       </w:r>
     </w:p>
     <w:p>
@@ -14933,7 +14748,7 @@
         </w:rPr>
         <w:t>[17]</w:t>
         <w:tab/>
-        <w:t>G. Mishne and N. Glance, “Predicting movie sales from blogger sentiment,” in AAAI Spring Symposium, 2006.</w:t>
+        <w:t>M. Z. Naeem, F. Rustam, A. Mehmood, I. Ashraf, and G. S. Choi, “Classification of movie reviews using term frequency-inverse document frequency and optimized machine learning algorithms,” PeerJ Comput. Sci., 2022.</w:t>
       </w:r>
     </w:p>
     <w:p>
@@ -14952,7 +14767,7 @@
         </w:rPr>
         <w:t>[18]</w:t>
         <w:tab/>
-        <w:t>M. Mestyán, T. Yasseri, and J. Kertész, “Early prediction of movie box office success based on Wikipedia activity big data,” PLoS ONE, vol. 8, no. 8, 2013.</w:t>
+        <w:t>J. Tripathi, S. Tiwari, A. Saini, and S. Kumari, “Prediction of movie success based on machine learning and Twitter sentiment analysis using internet movie database data,” Indonesian J. Elect. Eng. Comput. Sci., vol. 29, no. 3, pp. 1750–1757, 2023.</w:t>
       </w:r>
     </w:p>
     <w:p>
@@ -14971,7 +14786,7 @@
         </w:rPr>
         <w:t>[19]</w:t>
         <w:tab/>
-        <w:t>H. L. Vogel, Entertainment Industry Economics, 10th ed. Cambridge, U.K.: Cambridge Univ. Press, 2020.</w:t>
+        <w:t>K. Lee, J. Park, I. Kim, and Y. Choi, “Predicting movie success with machine learning techniques: Ways to improve accuracy,” Inf. Syst. Front., vol. 20, pp. 577–588, 2018.</w:t>
       </w:r>
     </w:p>
     <w:p>
@@ -15009,7 +14824,7 @@
         </w:rPr>
         <w:t>[21]</w:t>
         <w:tab/>
-        <w:t>A. L. Gomes, M. Ribeiro, and P. Quaresma, “Predicting IMDb rating of TV series with deep learning: The case of Arrow,” arXiv:2211.03388, 2022.</w:t>
+        <w:t>A. L. Gomes, G. Vianna, T. Escovedo, and M. Kalinowski, “Predicting IMDb rating of TV series with deep learning: The case of Arrow,” in Proc. Brazilian Symp. Inf. Syst. (SBSI), 2022.</w:t>
       </w:r>
     </w:p>
     <w:p>
@@ -15028,7 +14843,7 @@
         </w:rPr>
         <w:t>[22]</w:t>
         <w:tab/>
-        <w:t>J. Ramos, A. Pereira, and L. Cruz, “Movie rating prediction using sentiment features,” in Proc. SALLD, 2022.</w:t>
+        <w:t>V. Udandarao and P. Gupta, “Movie revenue prediction using machine learning models,” arXiv:2405.11651, 2024.</w:t>
       </w:r>
     </w:p>
     <w:p>
@@ -15047,7 +14862,7 @@
         </w:rPr>
         <w:t>[23]</w:t>
         <w:tab/>
-        <w:t>V. Udandarao, A. Gupta, and S. Bhattacharya, “Movie revenue prediction using machine learning models,” arXiv:2405.11651, 2024.</w:t>
+        <w:t>W. Xie, “Predicting movie success with multi-task learning: A hybrid framework combining GPT-based sentiment analysis and SIR propagation,” arXiv:2509.02809, 2025.</w:t>
       </w:r>
     </w:p>
     <w:p>
@@ -15066,7 +14881,7 @@
         </w:rPr>
         <w:t>[24]</w:t>
         <w:tab/>
-        <w:t>W. Xie, Y. Liu, and H. Chen, “Predicting movie success with multi-task learning: GPT-based sentiment and SIR propagation,” arXiv preprint, 2025.</w:t>
+        <w:t>H. L. Vogel, Entertainment Industry Economics, 10th ed. Cambridge, U.K.: Cambridge Univ. Press, 2020.</w:t>
       </w:r>
     </w:p>
     <w:p>
@@ -15085,7 +14900,7 @@
         </w:rPr>
         <w:t>[25]</w:t>
         <w:tab/>
-        <w:t>E. Mohamed, M. Shafaei, and T. Solorio, “A first dataset for film age appropriateness investigation,” in Proc. LREC, 2020.</w:t>
+        <w:t>N. Reimers and I. Gurevych, “Sentence-BERT: Sentence embeddings using Siamese BERT-networks,” in Proc. EMNLP, 2019.</w:t>
       </w:r>
     </w:p>
     <w:p>
@@ -15104,7 +14919,7 @@
         </w:rPr>
         <w:t>[26]</w:t>
         <w:tab/>
-        <w:t>S. Kar, S. Maharjan, and T. Solorio, “Folksonomication: Predicting tags for movies from plot synopses using emotion flow encoded neural network,” in Proc. COLING, 2018.</w:t>
+        <w:t>I. Chalkidis, X. Dai, M. Fergadiotis, P. Malakasiotis, and D. Elliott, “An exploration of hierarchical attention transformers for efficient long document classification,” arXiv:2210.05529, 2022.</w:t>
       </w:r>
     </w:p>
     <w:p>
@@ -15123,7 +14938,7 @@
         </w:rPr>
         <w:t>[27]</w:t>
         <w:tab/>
-        <w:t>M. C. Chiu, S. Lin, and W. Chen, “Screenplay quality assessment: Can we predict who gets nominated?” Nat. Univ. Singapore, Tech. Rep., 2020.</w:t>
+        <w:t>I. Beltagy, M. E. Peters, and A. Cohan, “Longformer: The long-document transformer,” arXiv:2004.05150, 2020.</w:t>
       </w:r>
     </w:p>
     <w:p>

</xml_diff>